<commit_message>
Added Objectives, aim, page numbers, header
</commit_message>
<xml_diff>
--- a/Capstone_Project_2026.docx
+++ b/Capstone_Project_2026.docx
@@ -1302,14 +1302,182 @@
       <w:pPr>
         <w:jc w:val="both"/>
       </w:pPr>
+      <w:r>
+        <w:br w:type="page"/>
+      </w:r>
     </w:p>
     <w:p>
       <w:pPr>
-        <w:jc w:val="both"/>
-      </w:pPr>
+        <w:pStyle w:val="Heading1"/>
+      </w:pPr>
+      <w:r>
+        <w:lastRenderedPageBreak/>
+        <w:t xml:space="preserve">Aim and Objectives </w:t>
+      </w:r>
     </w:p>
+    <w:p>
+      <w:pPr>
+        <w:pStyle w:val="Heading2"/>
+      </w:pPr>
+      <w:r>
+        <w:t>Aim</w:t>
+      </w:r>
+    </w:p>
+    <w:p>
+      <w:r>
+        <w:t>The aim of this project is to use data analytics and machine learning to analyse the Online Shoppers Purchasing Intention dataset, identify browsing patterns associated with purchases, and develop and evaluate predictive models that classify shopping sessions as purchases or non-purchases. The findings will support data-driven recommendations to help online retailers improve customer engagement, identify sales opportunities and improve conversion strategies.</w:t>
+      </w:r>
+    </w:p>
+    <w:p/>
+    <w:p>
+      <w:pPr>
+        <w:pStyle w:val="Heading2"/>
+      </w:pPr>
+      <w:r>
+        <w:t>Project Objectives</w:t>
+      </w:r>
+    </w:p>
+    <w:p/>
+    <w:p>
+      <w:pPr>
+        <w:pStyle w:val="Heading3"/>
+      </w:pPr>
+      <w:r>
+        <w:t>Objective #1</w:t>
+      </w:r>
+    </w:p>
+    <w:p>
+      <w:r>
+        <w:rPr>
+          <w:b/>
+          <w:bCs/>
+        </w:rPr>
+        <w:t>Data Exploration:</w:t>
+      </w:r>
+      <w:r>
+        <w:t xml:space="preserve"> To analyse the Online Shoppers Purchasing Intention dataset and identify patterns associated with </w:t>
+      </w:r>
+      <w:r>
+        <w:t>completed purchases.</w:t>
+      </w:r>
+    </w:p>
+    <w:p/>
+    <w:p>
+      <w:pPr>
+        <w:pStyle w:val="Heading3"/>
+      </w:pPr>
+      <w:r>
+        <w:t>Objective #2</w:t>
+      </w:r>
+    </w:p>
+    <w:p>
+      <w:r>
+        <w:rPr>
+          <w:b/>
+          <w:bCs/>
+        </w:rPr>
+        <w:t>Data Preparation:</w:t>
+      </w:r>
+      <w:r>
+        <w:t xml:space="preserve"> To clean and prepare the dataset for machine learning, including checking data quality, </w:t>
+      </w:r>
+      <w:r>
+        <w:t xml:space="preserve">null values, duplicates, </w:t>
+      </w:r>
+      <w:r>
+        <w:t xml:space="preserve">processing variables and </w:t>
+      </w:r>
+      <w:r>
+        <w:t xml:space="preserve">examining </w:t>
+      </w:r>
+      <w:r>
+        <w:t>class imbalance.</w:t>
+      </w:r>
+    </w:p>
+    <w:p/>
+    <w:p>
+      <w:pPr>
+        <w:pStyle w:val="Heading3"/>
+      </w:pPr>
+      <w:r>
+        <w:t>Objective #3</w:t>
+      </w:r>
+    </w:p>
+    <w:p>
+      <w:r>
+        <w:rPr>
+          <w:b/>
+          <w:bCs/>
+        </w:rPr>
+        <w:t>Predictive Modelling:</w:t>
+      </w:r>
+      <w:r>
+        <w:t xml:space="preserve"> To develop and compare three machine learning classification models: Logistic Regression, Decision Tree and Random Forest.</w:t>
+      </w:r>
+    </w:p>
+    <w:p/>
+    <w:p>
+      <w:pPr>
+        <w:pStyle w:val="Heading3"/>
+      </w:pPr>
+      <w:r>
+        <w:t>Objective #4</w:t>
+      </w:r>
+    </w:p>
+    <w:p>
+      <w:r>
+        <w:rPr>
+          <w:b/>
+          <w:bCs/>
+        </w:rPr>
+        <w:t>Model Evaluation:</w:t>
+      </w:r>
+      <w:r>
+        <w:t xml:space="preserve"> To evaluate model performance using precision, recall, F1-score, and confusion matrices to determine which model is most suitable for predicting purchases.</w:t>
+      </w:r>
+    </w:p>
+    <w:p/>
+    <w:p>
+      <w:pPr>
+        <w:pStyle w:val="Heading3"/>
+      </w:pPr>
+      <w:r>
+        <w:t>Objective #5</w:t>
+      </w:r>
+    </w:p>
+    <w:p>
+      <w:r>
+        <w:rPr>
+          <w:b/>
+          <w:bCs/>
+        </w:rPr>
+        <w:t>Business Insights and Recommendations:</w:t>
+      </w:r>
+      <w:r>
+        <w:t xml:space="preserve"> To interpret the findings and provide data-driven recommendations that online retailers could test to improve customer engagement, marketing decisions and conversion rates.</w:t>
+      </w:r>
+    </w:p>
+    <w:p/>
+    <w:p>
+      <w:pPr>
+        <w:pStyle w:val="Heading3"/>
+      </w:pPr>
+      <w:r>
+        <w:t>Business objective</w:t>
+      </w:r>
+    </w:p>
+    <w:p>
+      <w:r>
+        <w:t>To identify browsing patterns associated with purchases and use these findings to recommend ways online retailers could improve their conversion strategies and identify additional sales opportunities.</w:t>
+      </w:r>
+    </w:p>
+    <w:p/>
+    <w:p/>
+    <w:p/>
     <w:sectPr>
-      <w:headerReference w:type="first" r:id="rId7"/>
+      <w:headerReference w:type="default" r:id="rId7"/>
+      <w:footerReference w:type="default" r:id="rId8"/>
+      <w:headerReference w:type="first" r:id="rId9"/>
       <w:pgSz w:w="11906" w:h="16838"/>
       <w:pgMar w:top="1440" w:right="1440" w:bottom="1440" w:left="1440" w:header="708" w:footer="708" w:gutter="0"/>
       <w:pgNumType w:start="0"/>
@@ -1346,6 +1514,59 @@
 </w:endnotes>
 </file>
 
+<file path=word/footer1.xml><?xml version="1.0" encoding="utf-8"?>
+<w:ftr xmlns:wpc="http://schemas.microsoft.com/office/word/2010/wordprocessingCanvas" xmlns:cx="http://schemas.microsoft.com/office/drawing/2014/chartex" xmlns:cx1="http://schemas.microsoft.com/office/drawing/2015/9/8/chartex" xmlns:cx2="http://schemas.microsoft.com/office/drawing/2015/10/21/chartex" xmlns:cx3="http://schemas.microsoft.com/office/drawing/2016/5/9/chartex" xmlns:cx4="http://schemas.microsoft.com/office/drawing/2016/5/10/chartex" xmlns:cx5="http://schemas.microsoft.com/office/drawing/2016/5/11/chartex" xmlns:cx6="http://schemas.microsoft.com/office/drawing/2016/5/12/chartex" xmlns:cx7="http://schemas.microsoft.com/office/drawing/2016/5/13/chartex" xmlns:cx8="http://schemas.microsoft.com/office/drawing/2016/5/14/chartex" xmlns:mc="http://schemas.openxmlformats.org/markup-compatibility/2006" xmlns:aink="http://schemas.microsoft.com/office/drawing/2016/ink" xmlns:am3d="http://schemas.microsoft.com/office/drawing/2017/model3d" xmlns:o="urn:schemas-microsoft-com:office:office" xmlns:oel="http://schemas.microsoft.com/office/2019/extlst" xmlns:r="http://schemas.openxmlformats.org/officeDocument/2006/relationships" xmlns:m="http://schemas.openxmlformats.org/officeDocument/2006/math" xmlns:v="urn:schemas-microsoft-com:vml" xmlns:wp14="http://schemas.microsoft.com/office/word/2010/wordprocessingDrawing" xmlns:wp="http://schemas.openxmlformats.org/drawingml/2006/wordprocessingDrawing" xmlns:w10="urn:schemas-microsoft-com:office:word" xmlns:w="http://schemas.openxmlformats.org/wordprocessingml/2006/main" xmlns:w14="http://schemas.microsoft.com/office/word/2010/wordml" xmlns:w15="http://schemas.microsoft.com/office/word/2012/wordml" xmlns:w16cex="http://schemas.microsoft.com/office/word/2018/wordml/cex" xmlns:w16cid="http://schemas.microsoft.com/office/word/2016/wordml/cid" xmlns:w16="http://schemas.microsoft.com/office/word/2018/wordml" xmlns:w16du="http://schemas.microsoft.com/office/word/2023/wordml/word16du" xmlns:w16sdtdh="http://schemas.microsoft.com/office/word/2020/wordml/sdtdatahash" xmlns:w16sdtfl="http://schemas.microsoft.com/office/word/2024/wordml/sdtformatlock" xmlns:w16se="http://schemas.microsoft.com/office/word/2015/wordml/symex" xmlns:wpg="http://schemas.microsoft.com/office/word/2010/wordprocessingGroup" xmlns:wpi="http://schemas.microsoft.com/office/word/2010/wordprocessingInk" xmlns:wne="http://schemas.microsoft.com/office/word/2006/wordml" xmlns:wps="http://schemas.microsoft.com/office/word/2010/wordprocessingShape" mc:Ignorable="w14 w15 w16se w16cid w16 w16cex w16sdtdh w16sdtfl w16du wp14">
+  <w:sdt>
+    <w:sdtPr>
+      <w:id w:val="1186876748"/>
+      <w:docPartObj>
+        <w:docPartGallery w:val="Page Numbers (Bottom of Page)"/>
+        <w:docPartUnique/>
+      </w:docPartObj>
+    </w:sdtPr>
+    <w:sdtEndPr>
+      <w:rPr>
+        <w:noProof/>
+      </w:rPr>
+    </w:sdtEndPr>
+    <w:sdtContent>
+      <w:p>
+        <w:pPr>
+          <w:pStyle w:val="Footer"/>
+          <w:jc w:val="center"/>
+        </w:pPr>
+        <w:r>
+          <w:fldChar w:fldCharType="begin"/>
+        </w:r>
+        <w:r>
+          <w:instrText xml:space="preserve"> PAGE   \* MERGEFORMAT </w:instrText>
+        </w:r>
+        <w:r>
+          <w:fldChar w:fldCharType="separate"/>
+        </w:r>
+        <w:r>
+          <w:rPr>
+            <w:noProof/>
+          </w:rPr>
+          <w:t>2</w:t>
+        </w:r>
+        <w:r>
+          <w:rPr>
+            <w:noProof/>
+          </w:rPr>
+          <w:fldChar w:fldCharType="end"/>
+        </w:r>
+      </w:p>
+    </w:sdtContent>
+  </w:sdt>
+  <w:p>
+    <w:pPr>
+      <w:pStyle w:val="Footer"/>
+    </w:pPr>
+  </w:p>
+</w:ftr>
+</file>
+
 <file path=word/footnotes.xml><?xml version="1.0" encoding="utf-8"?>
 <w:footnotes xmlns:wpc="http://schemas.microsoft.com/office/word/2010/wordprocessingCanvas" xmlns:cx="http://schemas.microsoft.com/office/drawing/2014/chartex" xmlns:cx1="http://schemas.microsoft.com/office/drawing/2015/9/8/chartex" xmlns:cx2="http://schemas.microsoft.com/office/drawing/2015/10/21/chartex" xmlns:cx3="http://schemas.microsoft.com/office/drawing/2016/5/9/chartex" xmlns:cx4="http://schemas.microsoft.com/office/drawing/2016/5/10/chartex" xmlns:cx5="http://schemas.microsoft.com/office/drawing/2016/5/11/chartex" xmlns:cx6="http://schemas.microsoft.com/office/drawing/2016/5/12/chartex" xmlns:cx7="http://schemas.microsoft.com/office/drawing/2016/5/13/chartex" xmlns:cx8="http://schemas.microsoft.com/office/drawing/2016/5/14/chartex" xmlns:mc="http://schemas.openxmlformats.org/markup-compatibility/2006" xmlns:aink="http://schemas.microsoft.com/office/drawing/2016/ink" xmlns:am3d="http://schemas.microsoft.com/office/drawing/2017/model3d" xmlns:o="urn:schemas-microsoft-com:office:office" xmlns:oel="http://schemas.microsoft.com/office/2019/extlst" xmlns:r="http://schemas.openxmlformats.org/officeDocument/2006/relationships" xmlns:m="http://schemas.openxmlformats.org/officeDocument/2006/math" xmlns:v="urn:schemas-microsoft-com:vml" xmlns:wp14="http://schemas.microsoft.com/office/word/2010/wordprocessingDrawing" xmlns:wp="http://schemas.openxmlformats.org/drawingml/2006/wordprocessingDrawing" xmlns:w10="urn:schemas-microsoft-com:office:word" xmlns:w="http://schemas.openxmlformats.org/wordprocessingml/2006/main" xmlns:w14="http://schemas.microsoft.com/office/word/2010/wordml" xmlns:w15="http://schemas.microsoft.com/office/word/2012/wordml" xmlns:w16cex="http://schemas.microsoft.com/office/word/2018/wordml/cex" xmlns:w16cid="http://schemas.microsoft.com/office/word/2016/wordml/cid" xmlns:w16="http://schemas.microsoft.com/office/word/2018/wordml" xmlns:w16du="http://schemas.microsoft.com/office/word/2023/wordml/word16du" xmlns:w16sdtdh="http://schemas.microsoft.com/office/word/2020/wordml/sdtdatahash" xmlns:w16sdtfl="http://schemas.microsoft.com/office/word/2024/wordml/sdtformatlock" xmlns:w16se="http://schemas.microsoft.com/office/word/2015/wordml/symex" xmlns:wpg="http://schemas.microsoft.com/office/word/2010/wordprocessingGroup" xmlns:wpi="http://schemas.microsoft.com/office/word/2010/wordprocessingInk" xmlns:wne="http://schemas.microsoft.com/office/word/2006/wordml" xmlns:wps="http://schemas.microsoft.com/office/word/2010/wordprocessingShape" mc:Ignorable="w14 w15 w16se w16cid w16 w16cex w16sdtdh w16sdtfl w16du wp14">
   <w:footnote w:type="separator" w:id="-1">
@@ -1372,6 +1593,114 @@
 </file>
 
 <file path=word/header1.xml><?xml version="1.0" encoding="utf-8"?>
+<w:hdr xmlns:wpc="http://schemas.microsoft.com/office/word/2010/wordprocessingCanvas" xmlns:cx="http://schemas.microsoft.com/office/drawing/2014/chartex" xmlns:cx1="http://schemas.microsoft.com/office/drawing/2015/9/8/chartex" xmlns:cx2="http://schemas.microsoft.com/office/drawing/2015/10/21/chartex" xmlns:cx3="http://schemas.microsoft.com/office/drawing/2016/5/9/chartex" xmlns:cx4="http://schemas.microsoft.com/office/drawing/2016/5/10/chartex" xmlns:cx5="http://schemas.microsoft.com/office/drawing/2016/5/11/chartex" xmlns:cx6="http://schemas.microsoft.com/office/drawing/2016/5/12/chartex" xmlns:cx7="http://schemas.microsoft.com/office/drawing/2016/5/13/chartex" xmlns:cx8="http://schemas.microsoft.com/office/drawing/2016/5/14/chartex" xmlns:mc="http://schemas.openxmlformats.org/markup-compatibility/2006" xmlns:aink="http://schemas.microsoft.com/office/drawing/2016/ink" xmlns:am3d="http://schemas.microsoft.com/office/drawing/2017/model3d" xmlns:o="urn:schemas-microsoft-com:office:office" xmlns:oel="http://schemas.microsoft.com/office/2019/extlst" xmlns:r="http://schemas.openxmlformats.org/officeDocument/2006/relationships" xmlns:m="http://schemas.openxmlformats.org/officeDocument/2006/math" xmlns:v="urn:schemas-microsoft-com:vml" xmlns:wp14="http://schemas.microsoft.com/office/word/2010/wordprocessingDrawing" xmlns:wp="http://schemas.openxmlformats.org/drawingml/2006/wordprocessingDrawing" xmlns:w10="urn:schemas-microsoft-com:office:word" xmlns:w="http://schemas.openxmlformats.org/wordprocessingml/2006/main" xmlns:w14="http://schemas.microsoft.com/office/word/2010/wordml" xmlns:w15="http://schemas.microsoft.com/office/word/2012/wordml" xmlns:w16cex="http://schemas.microsoft.com/office/word/2018/wordml/cex" xmlns:w16cid="http://schemas.microsoft.com/office/word/2016/wordml/cid" xmlns:w16="http://schemas.microsoft.com/office/word/2018/wordml" xmlns:w16du="http://schemas.microsoft.com/office/word/2023/wordml/word16du" xmlns:w16sdtdh="http://schemas.microsoft.com/office/word/2020/wordml/sdtdatahash" xmlns:w16sdtfl="http://schemas.microsoft.com/office/word/2024/wordml/sdtformatlock" xmlns:w16se="http://schemas.microsoft.com/office/word/2015/wordml/symex" xmlns:wpg="http://schemas.microsoft.com/office/word/2010/wordprocessingGroup" xmlns:wpi="http://schemas.microsoft.com/office/word/2010/wordprocessingInk" xmlns:wne="http://schemas.microsoft.com/office/word/2006/wordml" xmlns:wps="http://schemas.microsoft.com/office/word/2010/wordprocessingShape" mc:Ignorable="w14 w15 w16se w16cid w16 w16cex w16sdtdh w16sdtfl w16du wp14">
+  <w:p>
+    <w:pPr>
+      <w:pStyle w:val="Header"/>
+      <w:rPr>
+        <w:sz w:val="16"/>
+        <w:szCs w:val="16"/>
+      </w:rPr>
+    </w:pPr>
+    <w:r>
+      <w:rPr>
+        <w:sz w:val="16"/>
+        <w:szCs w:val="16"/>
+      </w:rPr>
+      <w:t xml:space="preserve">CA-1 </w:t>
+    </w:r>
+    <w:r>
+      <w:rPr>
+        <w:sz w:val="16"/>
+        <w:szCs w:val="16"/>
+      </w:rPr>
+      <w:t>Capstone</w:t>
+    </w:r>
+    <w:r>
+      <w:rPr>
+        <w:sz w:val="16"/>
+        <w:szCs w:val="16"/>
+      </w:rPr>
+      <w:t xml:space="preserve"> </w:t>
+    </w:r>
+    <w:r>
+      <w:rPr>
+        <w:sz w:val="16"/>
+        <w:szCs w:val="16"/>
+      </w:rPr>
+      <w:t xml:space="preserve">Project </w:t>
+    </w:r>
+    <w:r>
+      <w:rPr>
+        <w:sz w:val="16"/>
+        <w:szCs w:val="16"/>
+      </w:rPr>
+      <w:t xml:space="preserve"> </w:t>
+    </w:r>
+    <w:r>
+      <w:rPr>
+        <w:sz w:val="16"/>
+        <w:szCs w:val="16"/>
+      </w:rPr>
+      <w:t>Proposal</w:t>
+    </w:r>
+    <w:r>
+      <w:rPr>
+        <w:sz w:val="16"/>
+        <w:szCs w:val="16"/>
+      </w:rPr>
+      <w:t xml:space="preserve"> </w:t>
+    </w:r>
+    <w:r>
+      <w:rPr>
+        <w:sz w:val="16"/>
+        <w:szCs w:val="16"/>
+      </w:rPr>
+      <w:ptab w:relativeTo="margin" w:alignment="center" w:leader="none"/>
+    </w:r>
+    <w:sdt>
+      <w:sdtPr>
+        <w:rPr>
+          <w:sz w:val="16"/>
+          <w:szCs w:val="16"/>
+        </w:rPr>
+        <w:id w:val="968859947"/>
+        <w:placeholder>
+          <w:docPart w:val="F099E52B622147899990FA8EB9929F0F"/>
+        </w:placeholder>
+        <w:temporary/>
+        <w:showingPlcHdr/>
+        <w15:appearance w15:val="hidden"/>
+      </w:sdtPr>
+      <w:sdtContent>
+        <w:r>
+          <w:rPr>
+            <w:sz w:val="16"/>
+            <w:szCs w:val="16"/>
+          </w:rPr>
+          <w:t>[Type here]</w:t>
+        </w:r>
+      </w:sdtContent>
+    </w:sdt>
+    <w:r>
+      <w:rPr>
+        <w:sz w:val="16"/>
+        <w:szCs w:val="16"/>
+      </w:rPr>
+      <w:ptab w:relativeTo="margin" w:alignment="right" w:leader="none"/>
+    </w:r>
+    <w:r>
+      <w:rPr>
+        <w:sz w:val="16"/>
+        <w:szCs w:val="16"/>
+      </w:rPr>
+      <w:t>Mariana Garcia</w:t>
+    </w:r>
+  </w:p>
+</w:hdr>
+</file>
+
+<file path=word/header2.xml><?xml version="1.0" encoding="utf-8"?>
 <w:hdr xmlns:wpc="http://schemas.microsoft.com/office/word/2010/wordprocessingCanvas" xmlns:cx="http://schemas.microsoft.com/office/drawing/2014/chartex" xmlns:cx1="http://schemas.microsoft.com/office/drawing/2015/9/8/chartex" xmlns:cx2="http://schemas.microsoft.com/office/drawing/2015/10/21/chartex" xmlns:cx3="http://schemas.microsoft.com/office/drawing/2016/5/9/chartex" xmlns:cx4="http://schemas.microsoft.com/office/drawing/2016/5/10/chartex" xmlns:cx5="http://schemas.microsoft.com/office/drawing/2016/5/11/chartex" xmlns:cx6="http://schemas.microsoft.com/office/drawing/2016/5/12/chartex" xmlns:cx7="http://schemas.microsoft.com/office/drawing/2016/5/13/chartex" xmlns:cx8="http://schemas.microsoft.com/office/drawing/2016/5/14/chartex" xmlns:mc="http://schemas.openxmlformats.org/markup-compatibility/2006" xmlns:aink="http://schemas.microsoft.com/office/drawing/2016/ink" xmlns:am3d="http://schemas.microsoft.com/office/drawing/2017/model3d" xmlns:o="urn:schemas-microsoft-com:office:office" xmlns:oel="http://schemas.microsoft.com/office/2019/extlst" xmlns:r="http://schemas.openxmlformats.org/officeDocument/2006/relationships" xmlns:m="http://schemas.openxmlformats.org/officeDocument/2006/math" xmlns:v="urn:schemas-microsoft-com:vml" xmlns:wp14="http://schemas.microsoft.com/office/word/2010/wordprocessingDrawing" xmlns:wp="http://schemas.openxmlformats.org/drawingml/2006/wordprocessingDrawing" xmlns:w10="urn:schemas-microsoft-com:office:word" xmlns:w="http://schemas.openxmlformats.org/wordprocessingml/2006/main" xmlns:w14="http://schemas.microsoft.com/office/word/2010/wordml" xmlns:w15="http://schemas.microsoft.com/office/word/2012/wordml" xmlns:w16cex="http://schemas.microsoft.com/office/word/2018/wordml/cex" xmlns:w16cid="http://schemas.microsoft.com/office/word/2016/wordml/cid" xmlns:w16="http://schemas.microsoft.com/office/word/2018/wordml" xmlns:w16du="http://schemas.microsoft.com/office/word/2023/wordml/word16du" xmlns:w16sdtdh="http://schemas.microsoft.com/office/word/2020/wordml/sdtdatahash" xmlns:w16sdtfl="http://schemas.microsoft.com/office/word/2024/wordml/sdtformatlock" xmlns:w16se="http://schemas.microsoft.com/office/word/2015/wordml/symex" xmlns:wpg="http://schemas.microsoft.com/office/word/2010/wordprocessingGroup" xmlns:wpi="http://schemas.microsoft.com/office/word/2010/wordprocessingInk" xmlns:wne="http://schemas.microsoft.com/office/word/2006/wordml" xmlns:wps="http://schemas.microsoft.com/office/word/2010/wordprocessingShape" mc:Ignorable="w14 w15 w16se w16cid w16 w16cex w16sdtdh w16sdtfl w16du wp14">
   <w:p>
     <w:pPr>
@@ -1396,7 +1725,93 @@
   <w:abstractNum w:abstractNumId="0" w15:restartNumberingAfterBreak="0">
     <w:nsid w:val="07434A6D"/>
     <w:multiLevelType w:val="multilevel"/>
-    <w:tmpl w:val="7BB2C62A"/>
+    <w:tmpl w:val="3EB05186"/>
+    <w:lvl w:ilvl="0">
+      <w:start w:val="1"/>
+      <w:numFmt w:val="decimal"/>
+      <w:lvlText w:val="%1"/>
+      <w:lvlJc w:val="left"/>
+      <w:pPr>
+        <w:ind w:left="432" w:hanging="432"/>
+      </w:pPr>
+    </w:lvl>
+    <w:lvl w:ilvl="1">
+      <w:start w:val="1"/>
+      <w:numFmt w:val="decimal"/>
+      <w:lvlText w:val="%1.%2"/>
+      <w:lvlJc w:val="left"/>
+      <w:pPr>
+        <w:ind w:left="576" w:hanging="576"/>
+      </w:pPr>
+    </w:lvl>
+    <w:lvl w:ilvl="2">
+      <w:start w:val="1"/>
+      <w:numFmt w:val="decimal"/>
+      <w:lvlText w:val="%1.%2.%3"/>
+      <w:lvlJc w:val="left"/>
+      <w:pPr>
+        <w:ind w:left="720" w:hanging="720"/>
+      </w:pPr>
+    </w:lvl>
+    <w:lvl w:ilvl="3">
+      <w:start w:val="1"/>
+      <w:numFmt w:val="decimal"/>
+      <w:lvlText w:val="%1.%2.%3.%4"/>
+      <w:lvlJc w:val="left"/>
+      <w:pPr>
+        <w:ind w:left="864" w:hanging="864"/>
+      </w:pPr>
+    </w:lvl>
+    <w:lvl w:ilvl="4">
+      <w:start w:val="1"/>
+      <w:numFmt w:val="decimal"/>
+      <w:lvlText w:val="%1.%2.%3.%4.%5"/>
+      <w:lvlJc w:val="left"/>
+      <w:pPr>
+        <w:ind w:left="1008" w:hanging="1008"/>
+      </w:pPr>
+    </w:lvl>
+    <w:lvl w:ilvl="5">
+      <w:start w:val="1"/>
+      <w:numFmt w:val="decimal"/>
+      <w:lvlText w:val="%1.%2.%3.%4.%5.%6"/>
+      <w:lvlJc w:val="left"/>
+      <w:pPr>
+        <w:ind w:left="1152" w:hanging="1152"/>
+      </w:pPr>
+    </w:lvl>
+    <w:lvl w:ilvl="6">
+      <w:start w:val="1"/>
+      <w:numFmt w:val="decimal"/>
+      <w:lvlText w:val="%1.%2.%3.%4.%5.%6.%7"/>
+      <w:lvlJc w:val="left"/>
+      <w:pPr>
+        <w:ind w:left="1296" w:hanging="1296"/>
+      </w:pPr>
+    </w:lvl>
+    <w:lvl w:ilvl="7">
+      <w:start w:val="1"/>
+      <w:numFmt w:val="decimal"/>
+      <w:lvlText w:val="%1.%2.%3.%4.%5.%6.%7.%8"/>
+      <w:lvlJc w:val="left"/>
+      <w:pPr>
+        <w:ind w:left="1440" w:hanging="1440"/>
+      </w:pPr>
+    </w:lvl>
+    <w:lvl w:ilvl="8">
+      <w:start w:val="1"/>
+      <w:numFmt w:val="decimal"/>
+      <w:lvlText w:val="%1.%2.%3.%4.%5.%6.%7.%8.%9"/>
+      <w:lvlJc w:val="left"/>
+      <w:pPr>
+        <w:ind w:left="1584" w:hanging="1584"/>
+      </w:pPr>
+    </w:lvl>
+  </w:abstractNum>
+  <w:abstractNum w:abstractNumId="1" w15:restartNumberingAfterBreak="0">
+    <w:nsid w:val="165A2448"/>
+    <w:multiLevelType w:val="multilevel"/>
+    <w:tmpl w:val="18090025"/>
     <w:lvl w:ilvl="0">
       <w:start w:val="1"/>
       <w:numFmt w:val="decimal"/>
@@ -1488,8 +1903,115 @@
       </w:pPr>
     </w:lvl>
   </w:abstractNum>
+  <w:abstractNum w:abstractNumId="2" w15:restartNumberingAfterBreak="0">
+    <w:nsid w:val="5BB90BF9"/>
+    <w:multiLevelType w:val="multilevel"/>
+    <w:tmpl w:val="F642DCEE"/>
+    <w:styleLink w:val="WWOutlineListStyle"/>
+    <w:lvl w:ilvl="0">
+      <w:start w:val="1"/>
+      <w:numFmt w:val="decimal"/>
+      <w:lvlText w:val="%1"/>
+      <w:lvlJc w:val="left"/>
+      <w:pPr>
+        <w:ind w:left="1850" w:hanging="432"/>
+      </w:pPr>
+    </w:lvl>
+    <w:lvl w:ilvl="1">
+      <w:start w:val="1"/>
+      <w:numFmt w:val="decimal"/>
+      <w:lvlText w:val="%1.%2"/>
+      <w:lvlJc w:val="left"/>
+      <w:pPr>
+        <w:ind w:left="576" w:hanging="576"/>
+      </w:pPr>
+    </w:lvl>
+    <w:lvl w:ilvl="2">
+      <w:start w:val="1"/>
+      <w:numFmt w:val="decimal"/>
+      <w:lvlText w:val="%1.%2.%3"/>
+      <w:lvlJc w:val="left"/>
+      <w:pPr>
+        <w:ind w:left="720" w:hanging="720"/>
+      </w:pPr>
+    </w:lvl>
+    <w:lvl w:ilvl="3">
+      <w:start w:val="1"/>
+      <w:numFmt w:val="decimal"/>
+      <w:lvlText w:val="%1.%2.%3.%4"/>
+      <w:lvlJc w:val="left"/>
+      <w:pPr>
+        <w:ind w:left="864" w:hanging="864"/>
+      </w:pPr>
+    </w:lvl>
+    <w:lvl w:ilvl="4">
+      <w:start w:val="1"/>
+      <w:numFmt w:val="decimal"/>
+      <w:lvlText w:val="%1.%2.%3.%4.%5"/>
+      <w:lvlJc w:val="left"/>
+      <w:pPr>
+        <w:ind w:left="1008" w:hanging="1008"/>
+      </w:pPr>
+    </w:lvl>
+    <w:lvl w:ilvl="5">
+      <w:start w:val="1"/>
+      <w:numFmt w:val="decimal"/>
+      <w:lvlText w:val="%1.%2.%3.%4.%5.%6"/>
+      <w:lvlJc w:val="left"/>
+      <w:pPr>
+        <w:ind w:left="1152" w:hanging="1152"/>
+      </w:pPr>
+    </w:lvl>
+    <w:lvl w:ilvl="6">
+      <w:start w:val="1"/>
+      <w:numFmt w:val="decimal"/>
+      <w:lvlText w:val="%1.%2.%3.%4.%5.%6.%7"/>
+      <w:lvlJc w:val="left"/>
+      <w:pPr>
+        <w:ind w:left="1296" w:hanging="1296"/>
+      </w:pPr>
+    </w:lvl>
+    <w:lvl w:ilvl="7">
+      <w:start w:val="1"/>
+      <w:numFmt w:val="decimal"/>
+      <w:lvlText w:val="%1.%2.%3.%4.%5.%6.%7.%8"/>
+      <w:lvlJc w:val="left"/>
+      <w:pPr>
+        <w:ind w:left="1440" w:hanging="1440"/>
+      </w:pPr>
+    </w:lvl>
+    <w:lvl w:ilvl="8">
+      <w:start w:val="1"/>
+      <w:numFmt w:val="decimal"/>
+      <w:lvlText w:val="%1.%2.%3.%4.%5.%6.%7.%8.%9"/>
+      <w:lvlJc w:val="left"/>
+      <w:pPr>
+        <w:ind w:left="1584" w:hanging="1584"/>
+      </w:pPr>
+    </w:lvl>
+  </w:abstractNum>
   <w:num w:numId="1" w16cid:durableId="1132360671">
     <w:abstractNumId w:val="0"/>
+  </w:num>
+  <w:num w:numId="2" w16cid:durableId="371420007">
+    <w:abstractNumId w:val="2"/>
+    <w:lvlOverride w:ilvl="2">
+      <w:lvl w:ilvl="2">
+        <w:start w:val="1"/>
+        <w:numFmt w:val="decimal"/>
+        <w:lvlText w:val="%1.%2.%3"/>
+        <w:lvlJc w:val="left"/>
+        <w:pPr>
+          <w:ind w:left="2422" w:hanging="720"/>
+        </w:pPr>
+      </w:lvl>
+    </w:lvlOverride>
+  </w:num>
+  <w:num w:numId="3" w16cid:durableId="1008874821">
+    <w:abstractNumId w:val="2"/>
+  </w:num>
+  <w:num w:numId="4" w16cid:durableId="685447713">
+    <w:abstractNumId w:val="1"/>
   </w:num>
 </w:numbering>
 </file>
@@ -1911,14 +2433,15 @@
     <w:autoRedefine/>
     <w:uiPriority w:val="9"/>
     <w:qFormat/>
-    <w:rsid w:val="000322FE"/>
+    <w:rsid w:val="000D2F00"/>
     <w:pPr>
       <w:keepNext/>
       <w:keepLines/>
       <w:numPr>
-        <w:numId w:val="1"/>
+        <w:numId w:val="4"/>
       </w:numPr>
       <w:spacing w:before="360" w:after="80"/>
+      <w:jc w:val="both"/>
       <w:outlineLvl w:val="0"/>
     </w:pPr>
     <w:rPr>
@@ -1934,25 +2457,25 @@
     <w:basedOn w:val="Normal"/>
     <w:next w:val="Normal"/>
     <w:link w:val="Heading2Char"/>
+    <w:autoRedefine/>
     <w:uiPriority w:val="9"/>
-    <w:semiHidden/>
     <w:unhideWhenUsed/>
     <w:qFormat/>
-    <w:rsid w:val="00514062"/>
+    <w:rsid w:val="000D2F00"/>
     <w:pPr>
       <w:keepNext/>
       <w:keepLines/>
       <w:numPr>
         <w:ilvl w:val="1"/>
-        <w:numId w:val="1"/>
+        <w:numId w:val="4"/>
       </w:numPr>
       <w:spacing w:before="160" w:after="80"/>
       <w:outlineLvl w:val="1"/>
     </w:pPr>
     <w:rPr>
-      <w:rFonts w:asciiTheme="majorHAnsi" w:eastAsiaTheme="majorEastAsia" w:hAnsiTheme="majorHAnsi" w:cstheme="majorBidi"/>
+      <w:rFonts w:eastAsiaTheme="majorEastAsia" w:cstheme="majorBidi"/>
+      <w:b/>
       <w:color w:val="2F5496" w:themeColor="accent1" w:themeShade="BF"/>
-      <w:sz w:val="32"/>
       <w:szCs w:val="32"/>
     </w:rPr>
   </w:style>
@@ -1962,16 +2485,15 @@
     <w:next w:val="Normal"/>
     <w:link w:val="Heading3Char"/>
     <w:uiPriority w:val="9"/>
-    <w:semiHidden/>
     <w:unhideWhenUsed/>
     <w:qFormat/>
-    <w:rsid w:val="00514062"/>
+    <w:rsid w:val="000D2F00"/>
     <w:pPr>
       <w:keepNext/>
       <w:keepLines/>
       <w:numPr>
         <w:ilvl w:val="2"/>
-        <w:numId w:val="1"/>
+        <w:numId w:val="4"/>
       </w:numPr>
       <w:spacing w:before="160" w:after="80"/>
       <w:outlineLvl w:val="2"/>
@@ -1979,7 +2501,6 @@
     <w:rPr>
       <w:rFonts w:eastAsiaTheme="majorEastAsia" w:cstheme="majorBidi"/>
       <w:color w:val="2F5496" w:themeColor="accent1" w:themeShade="BF"/>
-      <w:sz w:val="28"/>
       <w:szCs w:val="28"/>
     </w:rPr>
   </w:style>
@@ -1988,6 +2509,7 @@
     <w:basedOn w:val="Normal"/>
     <w:next w:val="Normal"/>
     <w:link w:val="Heading4Char"/>
+    <w:autoRedefine/>
     <w:uiPriority w:val="9"/>
     <w:semiHidden/>
     <w:unhideWhenUsed/>
@@ -1998,7 +2520,7 @@
       <w:keepLines/>
       <w:numPr>
         <w:ilvl w:val="3"/>
-        <w:numId w:val="1"/>
+        <w:numId w:val="4"/>
       </w:numPr>
       <w:spacing w:before="80" w:after="40"/>
       <w:outlineLvl w:val="3"/>
@@ -2025,7 +2547,7 @@
       <w:keepLines/>
       <w:numPr>
         <w:ilvl w:val="4"/>
-        <w:numId w:val="1"/>
+        <w:numId w:val="4"/>
       </w:numPr>
       <w:spacing w:before="80" w:after="40"/>
       <w:outlineLvl w:val="4"/>
@@ -2050,7 +2572,7 @@
       <w:keepLines/>
       <w:numPr>
         <w:ilvl w:val="5"/>
-        <w:numId w:val="1"/>
+        <w:numId w:val="4"/>
       </w:numPr>
       <w:spacing w:before="40" w:after="0"/>
       <w:outlineLvl w:val="5"/>
@@ -2068,7 +2590,6 @@
     <w:next w:val="Normal"/>
     <w:link w:val="Heading7Char"/>
     <w:uiPriority w:val="9"/>
-    <w:semiHidden/>
     <w:unhideWhenUsed/>
     <w:qFormat/>
     <w:rsid w:val="00514062"/>
@@ -2077,7 +2598,7 @@
       <w:keepLines/>
       <w:numPr>
         <w:ilvl w:val="6"/>
-        <w:numId w:val="1"/>
+        <w:numId w:val="4"/>
       </w:numPr>
       <w:spacing w:before="40" w:after="0"/>
       <w:outlineLvl w:val="6"/>
@@ -2093,7 +2614,6 @@
     <w:next w:val="Normal"/>
     <w:link w:val="Heading8Char"/>
     <w:uiPriority w:val="9"/>
-    <w:semiHidden/>
     <w:unhideWhenUsed/>
     <w:qFormat/>
     <w:rsid w:val="00514062"/>
@@ -2102,7 +2622,7 @@
       <w:keepLines/>
       <w:numPr>
         <w:ilvl w:val="7"/>
-        <w:numId w:val="1"/>
+        <w:numId w:val="4"/>
       </w:numPr>
       <w:spacing w:after="0"/>
       <w:outlineLvl w:val="7"/>
@@ -2120,7 +2640,6 @@
     <w:next w:val="Normal"/>
     <w:link w:val="Heading9Char"/>
     <w:uiPriority w:val="9"/>
-    <w:semiHidden/>
     <w:unhideWhenUsed/>
     <w:qFormat/>
     <w:rsid w:val="00514062"/>
@@ -2129,7 +2648,7 @@
       <w:keepLines/>
       <w:numPr>
         <w:ilvl w:val="8"/>
-        <w:numId w:val="1"/>
+        <w:numId w:val="4"/>
       </w:numPr>
       <w:spacing w:after="0"/>
       <w:outlineLvl w:val="8"/>
@@ -2171,7 +2690,7 @@
     <w:basedOn w:val="DefaultParagraphFont"/>
     <w:link w:val="Heading1"/>
     <w:uiPriority w:val="9"/>
-    <w:rsid w:val="000322FE"/>
+    <w:rsid w:val="000D2F00"/>
     <w:rPr>
       <w:rFonts w:ascii="Times New Roman" w:eastAsiaTheme="majorEastAsia" w:hAnsi="Times New Roman" w:cstheme="majorBidi"/>
       <w:b/>
@@ -2185,12 +2704,12 @@
     <w:basedOn w:val="DefaultParagraphFont"/>
     <w:link w:val="Heading2"/>
     <w:uiPriority w:val="9"/>
-    <w:semiHidden/>
-    <w:rsid w:val="00514062"/>
+    <w:rsid w:val="000D2F00"/>
     <w:rPr>
-      <w:rFonts w:asciiTheme="majorHAnsi" w:eastAsiaTheme="majorEastAsia" w:hAnsiTheme="majorHAnsi" w:cstheme="majorBidi"/>
+      <w:rFonts w:ascii="Times New Roman" w:eastAsiaTheme="majorEastAsia" w:hAnsi="Times New Roman" w:cstheme="majorBidi"/>
+      <w:b/>
       <w:color w:val="2F5496" w:themeColor="accent1" w:themeShade="BF"/>
-      <w:sz w:val="32"/>
+      <w:sz w:val="24"/>
       <w:szCs w:val="32"/>
     </w:rPr>
   </w:style>
@@ -2199,12 +2718,11 @@
     <w:basedOn w:val="DefaultParagraphFont"/>
     <w:link w:val="Heading3"/>
     <w:uiPriority w:val="9"/>
-    <w:semiHidden/>
-    <w:rsid w:val="00514062"/>
+    <w:rsid w:val="000D2F00"/>
     <w:rPr>
-      <w:rFonts w:eastAsiaTheme="majorEastAsia" w:cstheme="majorBidi"/>
+      <w:rFonts w:ascii="Times New Roman" w:eastAsiaTheme="majorEastAsia" w:hAnsi="Times New Roman" w:cstheme="majorBidi"/>
       <w:color w:val="2F5496" w:themeColor="accent1" w:themeShade="BF"/>
-      <w:sz w:val="28"/>
+      <w:sz w:val="24"/>
       <w:szCs w:val="28"/>
     </w:rPr>
   </w:style>
@@ -2561,7 +3079,6 @@
     <w:name w:val="Normal (Web)"/>
     <w:basedOn w:val="Normal"/>
     <w:uiPriority w:val="99"/>
-    <w:semiHidden/>
     <w:unhideWhenUsed/>
     <w:rsid w:val="00B656FA"/>
     <w:pPr>
@@ -2575,7 +3092,578 @@
       <w:lang w:eastAsia="en-IE"/>
     </w:rPr>
   </w:style>
+  <w:style w:type="numbering" w:customStyle="1" w:styleId="WWOutlineListStyle">
+    <w:name w:val="WW_OutlineListStyle"/>
+    <w:basedOn w:val="NoList"/>
+    <w:rsid w:val="000D2F00"/>
+    <w:pPr>
+      <w:numPr>
+        <w:numId w:val="2"/>
+      </w:numPr>
+    </w:pPr>
+  </w:style>
 </w:styles>
+</file>
+
+<file path=word/glossary/document.xml><?xml version="1.0" encoding="utf-8"?>
+<w:glossaryDocument xmlns:wpc="http://schemas.microsoft.com/office/word/2010/wordprocessingCanvas" xmlns:cx="http://schemas.microsoft.com/office/drawing/2014/chartex" xmlns:cx1="http://schemas.microsoft.com/office/drawing/2015/9/8/chartex" xmlns:cx2="http://schemas.microsoft.com/office/drawing/2015/10/21/chartex" xmlns:cx3="http://schemas.microsoft.com/office/drawing/2016/5/9/chartex" xmlns:cx4="http://schemas.microsoft.com/office/drawing/2016/5/10/chartex" xmlns:cx5="http://schemas.microsoft.com/office/drawing/2016/5/11/chartex" xmlns:cx6="http://schemas.microsoft.com/office/drawing/2016/5/12/chartex" xmlns:cx7="http://schemas.microsoft.com/office/drawing/2016/5/13/chartex" xmlns:cx8="http://schemas.microsoft.com/office/drawing/2016/5/14/chartex" xmlns:mc="http://schemas.openxmlformats.org/markup-compatibility/2006" xmlns:aink="http://schemas.microsoft.com/office/drawing/2016/ink" xmlns:am3d="http://schemas.microsoft.com/office/drawing/2017/model3d" xmlns:o="urn:schemas-microsoft-com:office:office" xmlns:oel="http://schemas.microsoft.com/office/2019/extlst" xmlns:r="http://schemas.openxmlformats.org/officeDocument/2006/relationships" xmlns:m="http://schemas.openxmlformats.org/officeDocument/2006/math" xmlns:v="urn:schemas-microsoft-com:vml" xmlns:wp14="http://schemas.microsoft.com/office/word/2010/wordprocessingDrawing" xmlns:wp="http://schemas.openxmlformats.org/drawingml/2006/wordprocessingDrawing" xmlns:w10="urn:schemas-microsoft-com:office:word" xmlns:w="http://schemas.openxmlformats.org/wordprocessingml/2006/main" xmlns:w14="http://schemas.microsoft.com/office/word/2010/wordml" xmlns:w15="http://schemas.microsoft.com/office/word/2012/wordml" xmlns:w16cex="http://schemas.microsoft.com/office/word/2018/wordml/cex" xmlns:w16cid="http://schemas.microsoft.com/office/word/2016/wordml/cid" xmlns:w16="http://schemas.microsoft.com/office/word/2018/wordml" xmlns:w16du="http://schemas.microsoft.com/office/word/2023/wordml/word16du" xmlns:w16sdtdh="http://schemas.microsoft.com/office/word/2020/wordml/sdtdatahash" xmlns:w16sdtfl="http://schemas.microsoft.com/office/word/2024/wordml/sdtformatlock" xmlns:w16se="http://schemas.microsoft.com/office/word/2015/wordml/symex" xmlns:wpg="http://schemas.microsoft.com/office/word/2010/wordprocessingGroup" xmlns:wpi="http://schemas.microsoft.com/office/word/2010/wordprocessingInk" xmlns:wne="http://schemas.microsoft.com/office/word/2006/wordml" xmlns:wps="http://schemas.microsoft.com/office/word/2010/wordprocessingShape" mc:Ignorable="w14 w15 w16se w16cid w16 w16cex w16sdtdh w16sdtfl w16du wp14">
+  <w:docParts>
+    <w:docPart>
+      <w:docPartPr>
+        <w:name w:val="F099E52B622147899990FA8EB9929F0F"/>
+        <w:category>
+          <w:name w:val="General"/>
+          <w:gallery w:val="placeholder"/>
+        </w:category>
+        <w:types>
+          <w:type w:val="bbPlcHdr"/>
+        </w:types>
+        <w:behaviors>
+          <w:behavior w:val="content"/>
+        </w:behaviors>
+        <w:guid w:val="{45505313-4613-4D5E-8092-90B5AF989865}"/>
+      </w:docPartPr>
+      <w:docPartBody>
+        <w:p>
+          <w:pPr>
+            <w:pStyle w:val="F099E52B622147899990FA8EB9929F0F"/>
+          </w:pPr>
+          <w:r>
+            <w:t>[Type here]</w:t>
+          </w:r>
+        </w:p>
+      </w:docPartBody>
+    </w:docPart>
+  </w:docParts>
+</w:glossaryDocument>
+</file>
+
+<file path=word/glossary/fontTable.xml><?xml version="1.0" encoding="utf-8"?>
+<w:fonts xmlns:mc="http://schemas.openxmlformats.org/markup-compatibility/2006" xmlns:r="http://schemas.openxmlformats.org/officeDocument/2006/relationships" xmlns:w="http://schemas.openxmlformats.org/wordprocessingml/2006/main" xmlns:w14="http://schemas.microsoft.com/office/word/2010/wordml" xmlns:w15="http://schemas.microsoft.com/office/word/2012/wordml" xmlns:w16cex="http://schemas.microsoft.com/office/word/2018/wordml/cex" xmlns:w16cid="http://schemas.microsoft.com/office/word/2016/wordml/cid" xmlns:w16="http://schemas.microsoft.com/office/word/2018/wordml" xmlns:w16du="http://schemas.microsoft.com/office/word/2023/wordml/word16du" xmlns:w16sdtdh="http://schemas.microsoft.com/office/word/2020/wordml/sdtdatahash" xmlns:w16sdtfl="http://schemas.microsoft.com/office/word/2024/wordml/sdtformatlock" xmlns:w16se="http://schemas.microsoft.com/office/word/2015/wordml/symex" mc:Ignorable="w14 w15 w16se w16cid w16 w16cex w16sdtdh w16sdtfl w16du">
+  <w:font w:name="Times New Roman">
+    <w:panose1 w:val="02020603050405020304"/>
+    <w:charset w:val="00"/>
+    <w:family w:val="roman"/>
+    <w:pitch w:val="variable"/>
+    <w:sig w:usb0="E0002EFF" w:usb1="C000785B" w:usb2="00000009" w:usb3="00000000" w:csb0="000001FF" w:csb1="00000000"/>
+  </w:font>
+  <w:font w:name="Calibri">
+    <w:panose1 w:val="020F0502020204030204"/>
+    <w:charset w:val="00"/>
+    <w:family w:val="swiss"/>
+    <w:pitch w:val="variable"/>
+    <w:sig w:usb0="E4002EFF" w:usb1="C200247B" w:usb2="00000009" w:usb3="00000000" w:csb0="000001FF" w:csb1="00000000"/>
+  </w:font>
+  <w:font w:name="Calibri Light">
+    <w:panose1 w:val="020F0302020204030204"/>
+    <w:charset w:val="00"/>
+    <w:family w:val="swiss"/>
+    <w:pitch w:val="variable"/>
+    <w:sig w:usb0="E4002EFF" w:usb1="C200247B" w:usb2="00000009" w:usb3="00000000" w:csb0="000001FF" w:csb1="00000000"/>
+  </w:font>
+  <w:font w:name="Arial">
+    <w:panose1 w:val="020B0604020202020204"/>
+    <w:charset w:val="00"/>
+    <w:family w:val="swiss"/>
+    <w:pitch w:val="variable"/>
+    <w:sig w:usb0="E0002EFF" w:usb1="C000785B" w:usb2="00000009" w:usb3="00000000" w:csb0="000001FF" w:csb1="00000000"/>
+  </w:font>
+  <w:font w:name="Aptos">
+    <w:charset w:val="00"/>
+    <w:family w:val="swiss"/>
+    <w:pitch w:val="variable"/>
+    <w:sig w:usb0="20000287" w:usb1="00000003" w:usb2="00000000" w:usb3="00000000" w:csb0="0000019F" w:csb1="00000000"/>
+  </w:font>
+  <w:font w:name="Aptos Display">
+    <w:charset w:val="00"/>
+    <w:family w:val="swiss"/>
+    <w:pitch w:val="variable"/>
+    <w:sig w:usb0="20000287" w:usb1="00000003" w:usb2="00000000" w:usb3="00000000" w:csb0="0000019F" w:csb1="00000000"/>
+  </w:font>
+</w:fonts>
+</file>
+
+<file path=word/glossary/settings.xml><?xml version="1.0" encoding="utf-8"?>
+<w:settings xmlns:mc="http://schemas.openxmlformats.org/markup-compatibility/2006" xmlns:o="urn:schemas-microsoft-com:office:office" xmlns:r="http://schemas.openxmlformats.org/officeDocument/2006/relationships" xmlns:m="http://schemas.openxmlformats.org/officeDocument/2006/math" xmlns:v="urn:schemas-microsoft-com:vml" xmlns:w10="urn:schemas-microsoft-com:office:word" xmlns:w="http://schemas.openxmlformats.org/wordprocessingml/2006/main" xmlns:w14="http://schemas.microsoft.com/office/word/2010/wordml" xmlns:w15="http://schemas.microsoft.com/office/word/2012/wordml" xmlns:w16cex="http://schemas.microsoft.com/office/word/2018/wordml/cex" xmlns:w16cid="http://schemas.microsoft.com/office/word/2016/wordml/cid" xmlns:w16="http://schemas.microsoft.com/office/word/2018/wordml" xmlns:w16du="http://schemas.microsoft.com/office/word/2023/wordml/word16du" xmlns:w16sdtdh="http://schemas.microsoft.com/office/word/2020/wordml/sdtdatahash" xmlns:w16sdtfl="http://schemas.microsoft.com/office/word/2024/wordml/sdtformatlock" xmlns:w16se="http://schemas.microsoft.com/office/word/2015/wordml/symex" xmlns:sl="http://schemas.openxmlformats.org/schemaLibrary/2006/main" mc:Ignorable="w14 w15 w16se w16cid w16 w16cex w16sdtdh w16sdtfl w16du">
+  <w:view w:val="normal"/>
+  <w:defaultTabStop w:val="720"/>
+  <w:characterSpacingControl w:val="doNotCompress"/>
+  <w:compat>
+    <w:useFELayout/>
+    <w:compatSetting w:name="compatibilityMode" w:uri="http://schemas.microsoft.com/office/word" w:val="15"/>
+    <w:compatSetting w:name="overrideTableStyleFontSizeAndJustification" w:uri="http://schemas.microsoft.com/office/word" w:val="1"/>
+    <w:compatSetting w:name="enableOpenTypeFeatures" w:uri="http://schemas.microsoft.com/office/word" w:val="1"/>
+    <w:compatSetting w:name="doNotFlipMirrorIndents" w:uri="http://schemas.microsoft.com/office/word" w:val="1"/>
+    <w:compatSetting w:name="differentiateMultirowTableHeaders" w:uri="http://schemas.microsoft.com/office/word" w:val="1"/>
+    <w:compatSetting w:name="useWord2013TrackBottomHyphenation" w:uri="http://schemas.microsoft.com/office/word" w:val="0"/>
+  </w:compat>
+  <w:rsids>
+    <w:rsidRoot w:val="0028766F"/>
+    <w:rsid w:val="0028766F"/>
+    <w:rsid w:val="003A7EE9"/>
+    <w:rsid w:val="00977BC4"/>
+  </w:rsids>
+  <m:mathPr>
+    <m:mathFont m:val="Cambria Math"/>
+    <m:brkBin m:val="before"/>
+    <m:brkBinSub m:val="--"/>
+    <m:smallFrac m:val="0"/>
+    <m:dispDef/>
+    <m:lMargin m:val="0"/>
+    <m:rMargin m:val="0"/>
+    <m:defJc m:val="centerGroup"/>
+    <m:wrapIndent m:val="1440"/>
+    <m:intLim m:val="subSup"/>
+    <m:naryLim m:val="undOvr"/>
+  </m:mathPr>
+  <w:themeFontLang w:val="en-IE"/>
+  <w:clrSchemeMapping w:bg1="light1" w:t1="dark1" w:bg2="light2" w:t2="dark2" w:accent1="accent1" w:accent2="accent2" w:accent3="accent3" w:accent4="accent4" w:accent5="accent5" w:accent6="accent6" w:hyperlink="hyperlink" w:followedHyperlink="followedHyperlink"/>
+  <w:decimalSymbol w:val="."/>
+  <w:listSeparator w:val=","/>
+  <w15:chartTrackingRefBased/>
+</w:settings>
+</file>
+
+<file path=word/glossary/styles.xml><?xml version="1.0" encoding="utf-8"?>
+<w:styles xmlns:mc="http://schemas.openxmlformats.org/markup-compatibility/2006" xmlns:r="http://schemas.openxmlformats.org/officeDocument/2006/relationships" xmlns:w="http://schemas.openxmlformats.org/wordprocessingml/2006/main" xmlns:w14="http://schemas.microsoft.com/office/word/2010/wordml" xmlns:w15="http://schemas.microsoft.com/office/word/2012/wordml" xmlns:w16cex="http://schemas.microsoft.com/office/word/2018/wordml/cex" xmlns:w16cid="http://schemas.microsoft.com/office/word/2016/wordml/cid" xmlns:w16="http://schemas.microsoft.com/office/word/2018/wordml" xmlns:w16du="http://schemas.microsoft.com/office/word/2023/wordml/word16du" xmlns:w16sdtdh="http://schemas.microsoft.com/office/word/2020/wordml/sdtdatahash" xmlns:w16sdtfl="http://schemas.microsoft.com/office/word/2024/wordml/sdtformatlock" xmlns:w16se="http://schemas.microsoft.com/office/word/2015/wordml/symex" mc:Ignorable="w14 w15 w16se w16cid w16 w16cex w16sdtdh w16sdtfl w16du">
+  <w:docDefaults>
+    <w:rPrDefault>
+      <w:rPr>
+        <w:rFonts w:asciiTheme="minorHAnsi" w:eastAsiaTheme="minorEastAsia" w:hAnsiTheme="minorHAnsi" w:cstheme="minorBidi"/>
+        <w:kern w:val="2"/>
+        <w:sz w:val="24"/>
+        <w:szCs w:val="24"/>
+        <w:lang w:val="en-IE" w:eastAsia="en-IE" w:bidi="ar-SA"/>
+        <w14:ligatures w14:val="standardContextual"/>
+      </w:rPr>
+    </w:rPrDefault>
+    <w:pPrDefault>
+      <w:pPr>
+        <w:spacing w:after="160" w:line="278" w:lineRule="auto"/>
+      </w:pPr>
+    </w:pPrDefault>
+  </w:docDefaults>
+  <w:latentStyles w:defLockedState="0" w:defUIPriority="99" w:defSemiHidden="0" w:defUnhideWhenUsed="0" w:defQFormat="0" w:count="376">
+    <w:lsdException w:name="Normal" w:uiPriority="0" w:qFormat="1"/>
+    <w:lsdException w:name="heading 1" w:uiPriority="9" w:qFormat="1"/>
+    <w:lsdException w:name="heading 2" w:semiHidden="1" w:uiPriority="9" w:unhideWhenUsed="1" w:qFormat="1"/>
+    <w:lsdException w:name="heading 3" w:semiHidden="1" w:uiPriority="9" w:unhideWhenUsed="1" w:qFormat="1"/>
+    <w:lsdException w:name="heading 4" w:semiHidden="1" w:uiPriority="9" w:unhideWhenUsed="1" w:qFormat="1"/>
+    <w:lsdException w:name="heading 5" w:semiHidden="1" w:uiPriority="9" w:unhideWhenUsed="1" w:qFormat="1"/>
+    <w:lsdException w:name="heading 6" w:semiHidden="1" w:uiPriority="9" w:unhideWhenUsed="1" w:qFormat="1"/>
+    <w:lsdException w:name="heading 7" w:semiHidden="1" w:uiPriority="9" w:unhideWhenUsed="1" w:qFormat="1"/>
+    <w:lsdException w:name="heading 8" w:semiHidden="1" w:uiPriority="9" w:unhideWhenUsed="1" w:qFormat="1"/>
+    <w:lsdException w:name="heading 9" w:semiHidden="1" w:uiPriority="9" w:unhideWhenUsed="1" w:qFormat="1"/>
+    <w:lsdException w:name="index 1" w:semiHidden="1" w:unhideWhenUsed="1"/>
+    <w:lsdException w:name="index 2" w:semiHidden="1" w:unhideWhenUsed="1"/>
+    <w:lsdException w:name="index 3" w:semiHidden="1" w:unhideWhenUsed="1"/>
+    <w:lsdException w:name="index 4" w:semiHidden="1" w:unhideWhenUsed="1"/>
+    <w:lsdException w:name="index 5" w:semiHidden="1" w:unhideWhenUsed="1"/>
+    <w:lsdException w:name="index 6" w:semiHidden="1" w:unhideWhenUsed="1"/>
+    <w:lsdException w:name="index 7" w:semiHidden="1" w:unhideWhenUsed="1"/>
+    <w:lsdException w:name="index 8" w:semiHidden="1" w:unhideWhenUsed="1"/>
+    <w:lsdException w:name="index 9" w:semiHidden="1" w:unhideWhenUsed="1"/>
+    <w:lsdException w:name="toc 1" w:semiHidden="1" w:uiPriority="39" w:unhideWhenUsed="1"/>
+    <w:lsdException w:name="toc 2" w:semiHidden="1" w:uiPriority="39" w:unhideWhenUsed="1"/>
+    <w:lsdException w:name="toc 3" w:semiHidden="1" w:uiPriority="39" w:unhideWhenUsed="1"/>
+    <w:lsdException w:name="toc 4" w:semiHidden="1" w:uiPriority="39" w:unhideWhenUsed="1"/>
+    <w:lsdException w:name="toc 5" w:semiHidden="1" w:uiPriority="39" w:unhideWhenUsed="1"/>
+    <w:lsdException w:name="toc 6" w:semiHidden="1" w:uiPriority="39" w:unhideWhenUsed="1"/>
+    <w:lsdException w:name="toc 7" w:semiHidden="1" w:uiPriority="39" w:unhideWhenUsed="1"/>
+    <w:lsdException w:name="toc 8" w:semiHidden="1" w:uiPriority="39" w:unhideWhenUsed="1"/>
+    <w:lsdException w:name="toc 9" w:semiHidden="1" w:uiPriority="39" w:unhideWhenUsed="1"/>
+    <w:lsdException w:name="Normal Indent" w:semiHidden="1" w:unhideWhenUsed="1"/>
+    <w:lsdException w:name="footnote text" w:semiHidden="1" w:unhideWhenUsed="1"/>
+    <w:lsdException w:name="annotation text" w:semiHidden="1" w:unhideWhenUsed="1"/>
+    <w:lsdException w:name="header" w:semiHidden="1" w:unhideWhenUsed="1"/>
+    <w:lsdException w:name="footer" w:semiHidden="1" w:unhideWhenUsed="1"/>
+    <w:lsdException w:name="index heading" w:semiHidden="1" w:unhideWhenUsed="1"/>
+    <w:lsdException w:name="caption" w:semiHidden="1" w:uiPriority="35" w:unhideWhenUsed="1" w:qFormat="1"/>
+    <w:lsdException w:name="table of figures" w:semiHidden="1" w:unhideWhenUsed="1"/>
+    <w:lsdException w:name="envelope address" w:semiHidden="1" w:unhideWhenUsed="1"/>
+    <w:lsdException w:name="envelope return" w:semiHidden="1" w:unhideWhenUsed="1"/>
+    <w:lsdException w:name="footnote reference" w:semiHidden="1" w:unhideWhenUsed="1"/>
+    <w:lsdException w:name="annotation reference" w:semiHidden="1" w:unhideWhenUsed="1"/>
+    <w:lsdException w:name="line number" w:semiHidden="1" w:unhideWhenUsed="1"/>
+    <w:lsdException w:name="page number" w:semiHidden="1" w:unhideWhenUsed="1"/>
+    <w:lsdException w:name="endnote reference" w:semiHidden="1" w:unhideWhenUsed="1"/>
+    <w:lsdException w:name="endnote text" w:semiHidden="1" w:unhideWhenUsed="1"/>
+    <w:lsdException w:name="table of authorities" w:semiHidden="1" w:unhideWhenUsed="1"/>
+    <w:lsdException w:name="macro" w:semiHidden="1" w:unhideWhenUsed="1"/>
+    <w:lsdException w:name="toa heading" w:semiHidden="1" w:unhideWhenUsed="1"/>
+    <w:lsdException w:name="List" w:semiHidden="1" w:unhideWhenUsed="1"/>
+    <w:lsdException w:name="List Bullet" w:semiHidden="1" w:unhideWhenUsed="1"/>
+    <w:lsdException w:name="List Number" w:semiHidden="1" w:unhideWhenUsed="1"/>
+    <w:lsdException w:name="List 2" w:semiHidden="1" w:unhideWhenUsed="1"/>
+    <w:lsdException w:name="List 3" w:semiHidden="1" w:unhideWhenUsed="1"/>
+    <w:lsdException w:name="List 4" w:semiHidden="1" w:unhideWhenUsed="1"/>
+    <w:lsdException w:name="List 5" w:semiHidden="1" w:unhideWhenUsed="1"/>
+    <w:lsdException w:name="List Bullet 2" w:semiHidden="1" w:unhideWhenUsed="1"/>
+    <w:lsdException w:name="List Bullet 3" w:semiHidden="1" w:unhideWhenUsed="1"/>
+    <w:lsdException w:name="List Bullet 4" w:semiHidden="1" w:unhideWhenUsed="1"/>
+    <w:lsdException w:name="List Bullet 5" w:semiHidden="1" w:unhideWhenUsed="1"/>
+    <w:lsdException w:name="List Number 2" w:semiHidden="1" w:unhideWhenUsed="1"/>
+    <w:lsdException w:name="List Number 3" w:semiHidden="1" w:unhideWhenUsed="1"/>
+    <w:lsdException w:name="List Number 4" w:semiHidden="1" w:unhideWhenUsed="1"/>
+    <w:lsdException w:name="List Number 5" w:semiHidden="1" w:unhideWhenUsed="1"/>
+    <w:lsdException w:name="Title" w:uiPriority="10" w:qFormat="1"/>
+    <w:lsdException w:name="Closing" w:semiHidden="1" w:unhideWhenUsed="1"/>
+    <w:lsdException w:name="Signature" w:semiHidden="1" w:unhideWhenUsed="1"/>
+    <w:lsdException w:name="Default Paragraph Font" w:semiHidden="1" w:uiPriority="1" w:unhideWhenUsed="1"/>
+    <w:lsdException w:name="Body Text" w:semiHidden="1" w:unhideWhenUsed="1"/>
+    <w:lsdException w:name="Body Text Indent" w:semiHidden="1" w:unhideWhenUsed="1"/>
+    <w:lsdException w:name="List Continue" w:semiHidden="1" w:unhideWhenUsed="1"/>
+    <w:lsdException w:name="List Continue 2" w:semiHidden="1" w:unhideWhenUsed="1"/>
+    <w:lsdException w:name="List Continue 3" w:semiHidden="1" w:unhideWhenUsed="1"/>
+    <w:lsdException w:name="List Continue 4" w:semiHidden="1" w:unhideWhenUsed="1"/>
+    <w:lsdException w:name="List Continue 5" w:semiHidden="1" w:unhideWhenUsed="1"/>
+    <w:lsdException w:name="Message Header" w:semiHidden="1" w:unhideWhenUsed="1"/>
+    <w:lsdException w:name="Subtitle" w:uiPriority="11" w:qFormat="1"/>
+    <w:lsdException w:name="Salutation" w:semiHidden="1" w:unhideWhenUsed="1"/>
+    <w:lsdException w:name="Date" w:semiHidden="1" w:unhideWhenUsed="1"/>
+    <w:lsdException w:name="Body Text First Indent" w:semiHidden="1" w:unhideWhenUsed="1"/>
+    <w:lsdException w:name="Body Text First Indent 2" w:semiHidden="1" w:unhideWhenUsed="1"/>
+    <w:lsdException w:name="Note Heading" w:semiHidden="1" w:unhideWhenUsed="1"/>
+    <w:lsdException w:name="Body Text 2" w:semiHidden="1" w:unhideWhenUsed="1"/>
+    <w:lsdException w:name="Body Text 3" w:semiHidden="1" w:unhideWhenUsed="1"/>
+    <w:lsdException w:name="Body Text Indent 2" w:semiHidden="1" w:unhideWhenUsed="1"/>
+    <w:lsdException w:name="Body Text Indent 3" w:semiHidden="1" w:unhideWhenUsed="1"/>
+    <w:lsdException w:name="Block Text" w:semiHidden="1" w:unhideWhenUsed="1"/>
+    <w:lsdException w:name="Hyperlink" w:semiHidden="1" w:unhideWhenUsed="1"/>
+    <w:lsdException w:name="FollowedHyperlink" w:semiHidden="1" w:unhideWhenUsed="1"/>
+    <w:lsdException w:name="Strong" w:uiPriority="22" w:qFormat="1"/>
+    <w:lsdException w:name="Emphasis" w:uiPriority="20" w:qFormat="1"/>
+    <w:lsdException w:name="Document Map" w:semiHidden="1" w:unhideWhenUsed="1"/>
+    <w:lsdException w:name="Plain Text" w:semiHidden="1" w:unhideWhenUsed="1"/>
+    <w:lsdException w:name="E-mail Signature" w:semiHidden="1" w:unhideWhenUsed="1"/>
+    <w:lsdException w:name="HTML Top of Form" w:semiHidden="1" w:unhideWhenUsed="1"/>
+    <w:lsdException w:name="HTML Bottom of Form" w:semiHidden="1" w:unhideWhenUsed="1"/>
+    <w:lsdException w:name="Normal (Web)" w:semiHidden="1" w:unhideWhenUsed="1"/>
+    <w:lsdException w:name="HTML Acronym" w:semiHidden="1" w:unhideWhenUsed="1"/>
+    <w:lsdException w:name="HTML Address" w:semiHidden="1" w:unhideWhenUsed="1"/>
+    <w:lsdException w:name="HTML Cite" w:semiHidden="1" w:unhideWhenUsed="1"/>
+    <w:lsdException w:name="HTML Code" w:semiHidden="1" w:unhideWhenUsed="1"/>
+    <w:lsdException w:name="HTML Definition" w:semiHidden="1" w:unhideWhenUsed="1"/>
+    <w:lsdException w:name="HTML Keyboard" w:semiHidden="1" w:unhideWhenUsed="1"/>
+    <w:lsdException w:name="HTML Preformatted" w:semiHidden="1" w:unhideWhenUsed="1"/>
+    <w:lsdException w:name="HTML Sample" w:semiHidden="1" w:unhideWhenUsed="1"/>
+    <w:lsdException w:name="HTML Typewriter" w:semiHidden="1" w:unhideWhenUsed="1"/>
+    <w:lsdException w:name="HTML Variable" w:semiHidden="1" w:unhideWhenUsed="1"/>
+    <w:lsdException w:name="Normal Table" w:semiHidden="1" w:unhideWhenUsed="1"/>
+    <w:lsdException w:name="annotation subject" w:semiHidden="1" w:unhideWhenUsed="1"/>
+    <w:lsdException w:name="No List" w:semiHidden="1" w:unhideWhenUsed="1"/>
+    <w:lsdException w:name="Outline List 1" w:semiHidden="1" w:unhideWhenUsed="1"/>
+    <w:lsdException w:name="Outline List 2" w:semiHidden="1" w:unhideWhenUsed="1"/>
+    <w:lsdException w:name="Outline List 3" w:semiHidden="1" w:unhideWhenUsed="1"/>
+    <w:lsdException w:name="Table Simple 1" w:semiHidden="1" w:unhideWhenUsed="1"/>
+    <w:lsdException w:name="Table Simple 2" w:semiHidden="1" w:unhideWhenUsed="1"/>
+    <w:lsdException w:name="Table Simple 3" w:semiHidden="1" w:unhideWhenUsed="1"/>
+    <w:lsdException w:name="Table Classic 1" w:semiHidden="1" w:unhideWhenUsed="1"/>
+    <w:lsdException w:name="Table Classic 2" w:semiHidden="1" w:unhideWhenUsed="1"/>
+    <w:lsdException w:name="Table Classic 3" w:semiHidden="1" w:unhideWhenUsed="1"/>
+    <w:lsdException w:name="Table Classic 4" w:semiHidden="1" w:unhideWhenUsed="1"/>
+    <w:lsdException w:name="Table Colorful 1" w:semiHidden="1" w:unhideWhenUsed="1"/>
+    <w:lsdException w:name="Table Colorful 2" w:semiHidden="1" w:unhideWhenUsed="1"/>
+    <w:lsdException w:name="Table Colorful 3" w:semiHidden="1" w:unhideWhenUsed="1"/>
+    <w:lsdException w:name="Table Columns 1" w:semiHidden="1" w:unhideWhenUsed="1"/>
+    <w:lsdException w:name="Table Columns 2" w:semiHidden="1" w:unhideWhenUsed="1"/>
+    <w:lsdException w:name="Table Columns 3" w:semiHidden="1" w:unhideWhenUsed="1"/>
+    <w:lsdException w:name="Table Columns 4" w:semiHidden="1" w:unhideWhenUsed="1"/>
+    <w:lsdException w:name="Table Columns 5" w:semiHidden="1" w:unhideWhenUsed="1"/>
+    <w:lsdException w:name="Table Grid 1" w:semiHidden="1" w:unhideWhenUsed="1"/>
+    <w:lsdException w:name="Table Grid 2" w:semiHidden="1" w:unhideWhenUsed="1"/>
+    <w:lsdException w:name="Table Grid 3" w:semiHidden="1" w:unhideWhenUsed="1"/>
+    <w:lsdException w:name="Table Grid 4" w:semiHidden="1" w:unhideWhenUsed="1"/>
+    <w:lsdException w:name="Table Grid 5" w:semiHidden="1" w:unhideWhenUsed="1"/>
+    <w:lsdException w:name="Table Grid 6" w:semiHidden="1" w:unhideWhenUsed="1"/>
+    <w:lsdException w:name="Table Grid 7" w:semiHidden="1" w:unhideWhenUsed="1"/>
+    <w:lsdException w:name="Table Grid 8" w:semiHidden="1" w:unhideWhenUsed="1"/>
+    <w:lsdException w:name="Table List 1" w:semiHidden="1" w:unhideWhenUsed="1"/>
+    <w:lsdException w:name="Table List 2" w:semiHidden="1" w:unhideWhenUsed="1"/>
+    <w:lsdException w:name="Table List 3" w:semiHidden="1" w:unhideWhenUsed="1"/>
+    <w:lsdException w:name="Table List 4" w:semiHidden="1" w:unhideWhenUsed="1"/>
+    <w:lsdException w:name="Table List 5" w:semiHidden="1" w:unhideWhenUsed="1"/>
+    <w:lsdException w:name="Table List 6" w:semiHidden="1" w:unhideWhenUsed="1"/>
+    <w:lsdException w:name="Table List 7" w:semiHidden="1" w:unhideWhenUsed="1"/>
+    <w:lsdException w:name="Table List 8" w:semiHidden="1" w:unhideWhenUsed="1"/>
+    <w:lsdException w:name="Table 3D effects 1" w:semiHidden="1" w:unhideWhenUsed="1"/>
+    <w:lsdException w:name="Table 3D effects 2" w:semiHidden="1" w:unhideWhenUsed="1"/>
+    <w:lsdException w:name="Table 3D effects 3" w:semiHidden="1" w:unhideWhenUsed="1"/>
+    <w:lsdException w:name="Table Contemporary" w:semiHidden="1" w:unhideWhenUsed="1"/>
+    <w:lsdException w:name="Table Elegant" w:semiHidden="1" w:unhideWhenUsed="1"/>
+    <w:lsdException w:name="Table Professional" w:semiHidden="1" w:unhideWhenUsed="1"/>
+    <w:lsdException w:name="Table Subtle 1" w:semiHidden="1" w:unhideWhenUsed="1"/>
+    <w:lsdException w:name="Table Subtle 2" w:semiHidden="1" w:unhideWhenUsed="1"/>
+    <w:lsdException w:name="Table Web 1" w:semiHidden="1" w:unhideWhenUsed="1"/>
+    <w:lsdException w:name="Table Web 2" w:semiHidden="1" w:unhideWhenUsed="1"/>
+    <w:lsdException w:name="Table Web 3" w:semiHidden="1" w:unhideWhenUsed="1"/>
+    <w:lsdException w:name="Balloon Text" w:semiHidden="1" w:unhideWhenUsed="1"/>
+    <w:lsdException w:name="Table Grid" w:uiPriority="39"/>
+    <w:lsdException w:name="Table Theme" w:semiHidden="1" w:unhideWhenUsed="1"/>
+    <w:lsdException w:name="Placeholder Text" w:semiHidden="1"/>
+    <w:lsdException w:name="No Spacing" w:uiPriority="1" w:qFormat="1"/>
+    <w:lsdException w:name="Light Shading" w:uiPriority="60"/>
+    <w:lsdException w:name="Light List" w:uiPriority="61"/>
+    <w:lsdException w:name="Light Grid" w:uiPriority="62"/>
+    <w:lsdException w:name="Medium Shading 1" w:uiPriority="63"/>
+    <w:lsdException w:name="Medium Shading 2" w:uiPriority="64"/>
+    <w:lsdException w:name="Medium List 1" w:uiPriority="65"/>
+    <w:lsdException w:name="Medium List 2" w:uiPriority="66"/>
+    <w:lsdException w:name="Medium Grid 1" w:uiPriority="67"/>
+    <w:lsdException w:name="Medium Grid 2" w:uiPriority="68"/>
+    <w:lsdException w:name="Medium Grid 3" w:uiPriority="69"/>
+    <w:lsdException w:name="Dark List" w:uiPriority="70"/>
+    <w:lsdException w:name="Colorful Shading" w:uiPriority="71"/>
+    <w:lsdException w:name="Colorful List" w:uiPriority="72"/>
+    <w:lsdException w:name="Colorful Grid" w:uiPriority="73"/>
+    <w:lsdException w:name="Light Shading Accent 1" w:uiPriority="60"/>
+    <w:lsdException w:name="Light List Accent 1" w:uiPriority="61"/>
+    <w:lsdException w:name="Light Grid Accent 1" w:uiPriority="62"/>
+    <w:lsdException w:name="Medium Shading 1 Accent 1" w:uiPriority="63"/>
+    <w:lsdException w:name="Medium Shading 2 Accent 1" w:uiPriority="64"/>
+    <w:lsdException w:name="Medium List 1 Accent 1" w:uiPriority="65"/>
+    <w:lsdException w:name="Revision" w:semiHidden="1"/>
+    <w:lsdException w:name="List Paragraph" w:uiPriority="34" w:qFormat="1"/>
+    <w:lsdException w:name="Quote" w:uiPriority="29" w:qFormat="1"/>
+    <w:lsdException w:name="Intense Quote" w:uiPriority="30" w:qFormat="1"/>
+    <w:lsdException w:name="Medium List 2 Accent 1" w:uiPriority="66"/>
+    <w:lsdException w:name="Medium Grid 1 Accent 1" w:uiPriority="67"/>
+    <w:lsdException w:name="Medium Grid 2 Accent 1" w:uiPriority="68"/>
+    <w:lsdException w:name="Medium Grid 3 Accent 1" w:uiPriority="69"/>
+    <w:lsdException w:name="Dark List Accent 1" w:uiPriority="70"/>
+    <w:lsdException w:name="Colorful Shading Accent 1" w:uiPriority="71"/>
+    <w:lsdException w:name="Colorful List Accent 1" w:uiPriority="72"/>
+    <w:lsdException w:name="Colorful Grid Accent 1" w:uiPriority="73"/>
+    <w:lsdException w:name="Light Shading Accent 2" w:uiPriority="60"/>
+    <w:lsdException w:name="Light List Accent 2" w:uiPriority="61"/>
+    <w:lsdException w:name="Light Grid Accent 2" w:uiPriority="62"/>
+    <w:lsdException w:name="Medium Shading 1 Accent 2" w:uiPriority="63"/>
+    <w:lsdException w:name="Medium Shading 2 Accent 2" w:uiPriority="64"/>
+    <w:lsdException w:name="Medium List 1 Accent 2" w:uiPriority="65"/>
+    <w:lsdException w:name="Medium List 2 Accent 2" w:uiPriority="66"/>
+    <w:lsdException w:name="Medium Grid 1 Accent 2" w:uiPriority="67"/>
+    <w:lsdException w:name="Medium Grid 2 Accent 2" w:uiPriority="68"/>
+    <w:lsdException w:name="Medium Grid 3 Accent 2" w:uiPriority="69"/>
+    <w:lsdException w:name="Dark List Accent 2" w:uiPriority="70"/>
+    <w:lsdException w:name="Colorful Shading Accent 2" w:uiPriority="71"/>
+    <w:lsdException w:name="Colorful List Accent 2" w:uiPriority="72"/>
+    <w:lsdException w:name="Colorful Grid Accent 2" w:uiPriority="73"/>
+    <w:lsdException w:name="Light Shading Accent 3" w:uiPriority="60"/>
+    <w:lsdException w:name="Light List Accent 3" w:uiPriority="61"/>
+    <w:lsdException w:name="Light Grid Accent 3" w:uiPriority="62"/>
+    <w:lsdException w:name="Medium Shading 1 Accent 3" w:uiPriority="63"/>
+    <w:lsdException w:name="Medium Shading 2 Accent 3" w:uiPriority="64"/>
+    <w:lsdException w:name="Medium List 1 Accent 3" w:uiPriority="65"/>
+    <w:lsdException w:name="Medium List 2 Accent 3" w:uiPriority="66"/>
+    <w:lsdException w:name="Medium Grid 1 Accent 3" w:uiPriority="67"/>
+    <w:lsdException w:name="Medium Grid 2 Accent 3" w:uiPriority="68"/>
+    <w:lsdException w:name="Medium Grid 3 Accent 3" w:uiPriority="69"/>
+    <w:lsdException w:name="Dark List Accent 3" w:uiPriority="70"/>
+    <w:lsdException w:name="Colorful Shading Accent 3" w:uiPriority="71"/>
+    <w:lsdException w:name="Colorful List Accent 3" w:uiPriority="72"/>
+    <w:lsdException w:name="Colorful Grid Accent 3" w:uiPriority="73"/>
+    <w:lsdException w:name="Light Shading Accent 4" w:uiPriority="60"/>
+    <w:lsdException w:name="Light List Accent 4" w:uiPriority="61"/>
+    <w:lsdException w:name="Light Grid Accent 4" w:uiPriority="62"/>
+    <w:lsdException w:name="Medium Shading 1 Accent 4" w:uiPriority="63"/>
+    <w:lsdException w:name="Medium Shading 2 Accent 4" w:uiPriority="64"/>
+    <w:lsdException w:name="Medium List 1 Accent 4" w:uiPriority="65"/>
+    <w:lsdException w:name="Medium List 2 Accent 4" w:uiPriority="66"/>
+    <w:lsdException w:name="Medium Grid 1 Accent 4" w:uiPriority="67"/>
+    <w:lsdException w:name="Medium Grid 2 Accent 4" w:uiPriority="68"/>
+    <w:lsdException w:name="Medium Grid 3 Accent 4" w:uiPriority="69"/>
+    <w:lsdException w:name="Dark List Accent 4" w:uiPriority="70"/>
+    <w:lsdException w:name="Colorful Shading Accent 4" w:uiPriority="71"/>
+    <w:lsdException w:name="Colorful List Accent 4" w:uiPriority="72"/>
+    <w:lsdException w:name="Colorful Grid Accent 4" w:uiPriority="73"/>
+    <w:lsdException w:name="Light Shading Accent 5" w:uiPriority="60"/>
+    <w:lsdException w:name="Light List Accent 5" w:uiPriority="61"/>
+    <w:lsdException w:name="Light Grid Accent 5" w:uiPriority="62"/>
+    <w:lsdException w:name="Medium Shading 1 Accent 5" w:uiPriority="63"/>
+    <w:lsdException w:name="Medium Shading 2 Accent 5" w:uiPriority="64"/>
+    <w:lsdException w:name="Medium List 1 Accent 5" w:uiPriority="65"/>
+    <w:lsdException w:name="Medium List 2 Accent 5" w:uiPriority="66"/>
+    <w:lsdException w:name="Medium Grid 1 Accent 5" w:uiPriority="67"/>
+    <w:lsdException w:name="Medium Grid 2 Accent 5" w:uiPriority="68"/>
+    <w:lsdException w:name="Medium Grid 3 Accent 5" w:uiPriority="69"/>
+    <w:lsdException w:name="Dark List Accent 5" w:uiPriority="70"/>
+    <w:lsdException w:name="Colorful Shading Accent 5" w:uiPriority="71"/>
+    <w:lsdException w:name="Colorful List Accent 5" w:uiPriority="72"/>
+    <w:lsdException w:name="Colorful Grid Accent 5" w:uiPriority="73"/>
+    <w:lsdException w:name="Light Shading Accent 6" w:uiPriority="60"/>
+    <w:lsdException w:name="Light List Accent 6" w:uiPriority="61"/>
+    <w:lsdException w:name="Light Grid Accent 6" w:uiPriority="62"/>
+    <w:lsdException w:name="Medium Shading 1 Accent 6" w:uiPriority="63"/>
+    <w:lsdException w:name="Medium Shading 2 Accent 6" w:uiPriority="64"/>
+    <w:lsdException w:name="Medium List 1 Accent 6" w:uiPriority="65"/>
+    <w:lsdException w:name="Medium List 2 Accent 6" w:uiPriority="66"/>
+    <w:lsdException w:name="Medium Grid 1 Accent 6" w:uiPriority="67"/>
+    <w:lsdException w:name="Medium Grid 2 Accent 6" w:uiPriority="68"/>
+    <w:lsdException w:name="Medium Grid 3 Accent 6" w:uiPriority="69"/>
+    <w:lsdException w:name="Dark List Accent 6" w:uiPriority="70"/>
+    <w:lsdException w:name="Colorful Shading Accent 6" w:uiPriority="71"/>
+    <w:lsdException w:name="Colorful List Accent 6" w:uiPriority="72"/>
+    <w:lsdException w:name="Colorful Grid Accent 6" w:uiPriority="73"/>
+    <w:lsdException w:name="Subtle Emphasis" w:uiPriority="19" w:qFormat="1"/>
+    <w:lsdException w:name="Intense Emphasis" w:uiPriority="21" w:qFormat="1"/>
+    <w:lsdException w:name="Subtle Reference" w:uiPriority="31" w:qFormat="1"/>
+    <w:lsdException w:name="Intense Reference" w:uiPriority="32" w:qFormat="1"/>
+    <w:lsdException w:name="Book Title" w:uiPriority="33" w:qFormat="1"/>
+    <w:lsdException w:name="Bibliography" w:semiHidden="1" w:uiPriority="37" w:unhideWhenUsed="1"/>
+    <w:lsdException w:name="TOC Heading" w:semiHidden="1" w:uiPriority="39" w:unhideWhenUsed="1" w:qFormat="1"/>
+    <w:lsdException w:name="Plain Table 1" w:uiPriority="41"/>
+    <w:lsdException w:name="Plain Table 2" w:uiPriority="42"/>
+    <w:lsdException w:name="Plain Table 3" w:uiPriority="43"/>
+    <w:lsdException w:name="Plain Table 4" w:uiPriority="44"/>
+    <w:lsdException w:name="Plain Table 5" w:uiPriority="45"/>
+    <w:lsdException w:name="Grid Table Light" w:uiPriority="40"/>
+    <w:lsdException w:name="Grid Table 1 Light" w:uiPriority="46"/>
+    <w:lsdException w:name="Grid Table 2" w:uiPriority="47"/>
+    <w:lsdException w:name="Grid Table 3" w:uiPriority="48"/>
+    <w:lsdException w:name="Grid Table 4" w:uiPriority="49"/>
+    <w:lsdException w:name="Grid Table 5 Dark" w:uiPriority="50"/>
+    <w:lsdException w:name="Grid Table 6 Colorful" w:uiPriority="51"/>
+    <w:lsdException w:name="Grid Table 7 Colorful" w:uiPriority="52"/>
+    <w:lsdException w:name="Grid Table 1 Light Accent 1" w:uiPriority="46"/>
+    <w:lsdException w:name="Grid Table 2 Accent 1" w:uiPriority="47"/>
+    <w:lsdException w:name="Grid Table 3 Accent 1" w:uiPriority="48"/>
+    <w:lsdException w:name="Grid Table 4 Accent 1" w:uiPriority="49"/>
+    <w:lsdException w:name="Grid Table 5 Dark Accent 1" w:uiPriority="50"/>
+    <w:lsdException w:name="Grid Table 6 Colorful Accent 1" w:uiPriority="51"/>
+    <w:lsdException w:name="Grid Table 7 Colorful Accent 1" w:uiPriority="52"/>
+    <w:lsdException w:name="Grid Table 1 Light Accent 2" w:uiPriority="46"/>
+    <w:lsdException w:name="Grid Table 2 Accent 2" w:uiPriority="47"/>
+    <w:lsdException w:name="Grid Table 3 Accent 2" w:uiPriority="48"/>
+    <w:lsdException w:name="Grid Table 4 Accent 2" w:uiPriority="49"/>
+    <w:lsdException w:name="Grid Table 5 Dark Accent 2" w:uiPriority="50"/>
+    <w:lsdException w:name="Grid Table 6 Colorful Accent 2" w:uiPriority="51"/>
+    <w:lsdException w:name="Grid Table 7 Colorful Accent 2" w:uiPriority="52"/>
+    <w:lsdException w:name="Grid Table 1 Light Accent 3" w:uiPriority="46"/>
+    <w:lsdException w:name="Grid Table 2 Accent 3" w:uiPriority="47"/>
+    <w:lsdException w:name="Grid Table 3 Accent 3" w:uiPriority="48"/>
+    <w:lsdException w:name="Grid Table 4 Accent 3" w:uiPriority="49"/>
+    <w:lsdException w:name="Grid Table 5 Dark Accent 3" w:uiPriority="50"/>
+    <w:lsdException w:name="Grid Table 6 Colorful Accent 3" w:uiPriority="51"/>
+    <w:lsdException w:name="Grid Table 7 Colorful Accent 3" w:uiPriority="52"/>
+    <w:lsdException w:name="Grid Table 1 Light Accent 4" w:uiPriority="46"/>
+    <w:lsdException w:name="Grid Table 2 Accent 4" w:uiPriority="47"/>
+    <w:lsdException w:name="Grid Table 3 Accent 4" w:uiPriority="48"/>
+    <w:lsdException w:name="Grid Table 4 Accent 4" w:uiPriority="49"/>
+    <w:lsdException w:name="Grid Table 5 Dark Accent 4" w:uiPriority="50"/>
+    <w:lsdException w:name="Grid Table 6 Colorful Accent 4" w:uiPriority="51"/>
+    <w:lsdException w:name="Grid Table 7 Colorful Accent 4" w:uiPriority="52"/>
+    <w:lsdException w:name="Grid Table 1 Light Accent 5" w:uiPriority="46"/>
+    <w:lsdException w:name="Grid Table 2 Accent 5" w:uiPriority="47"/>
+    <w:lsdException w:name="Grid Table 3 Accent 5" w:uiPriority="48"/>
+    <w:lsdException w:name="Grid Table 4 Accent 5" w:uiPriority="49"/>
+    <w:lsdException w:name="Grid Table 5 Dark Accent 5" w:uiPriority="50"/>
+    <w:lsdException w:name="Grid Table 6 Colorful Accent 5" w:uiPriority="51"/>
+    <w:lsdException w:name="Grid Table 7 Colorful Accent 5" w:uiPriority="52"/>
+    <w:lsdException w:name="Grid Table 1 Light Accent 6" w:uiPriority="46"/>
+    <w:lsdException w:name="Grid Table 2 Accent 6" w:uiPriority="47"/>
+    <w:lsdException w:name="Grid Table 3 Accent 6" w:uiPriority="48"/>
+    <w:lsdException w:name="Grid Table 4 Accent 6" w:uiPriority="49"/>
+    <w:lsdException w:name="Grid Table 5 Dark Accent 6" w:uiPriority="50"/>
+    <w:lsdException w:name="Grid Table 6 Colorful Accent 6" w:uiPriority="51"/>
+    <w:lsdException w:name="Grid Table 7 Colorful Accent 6" w:uiPriority="52"/>
+    <w:lsdException w:name="List Table 1 Light" w:uiPriority="46"/>
+    <w:lsdException w:name="List Table 2" w:uiPriority="47"/>
+    <w:lsdException w:name="List Table 3" w:uiPriority="48"/>
+    <w:lsdException w:name="List Table 4" w:uiPriority="49"/>
+    <w:lsdException w:name="List Table 5 Dark" w:uiPriority="50"/>
+    <w:lsdException w:name="List Table 6 Colorful" w:uiPriority="51"/>
+    <w:lsdException w:name="List Table 7 Colorful" w:uiPriority="52"/>
+    <w:lsdException w:name="List Table 1 Light Accent 1" w:uiPriority="46"/>
+    <w:lsdException w:name="List Table 2 Accent 1" w:uiPriority="47"/>
+    <w:lsdException w:name="List Table 3 Accent 1" w:uiPriority="48"/>
+    <w:lsdException w:name="List Table 4 Accent 1" w:uiPriority="49"/>
+    <w:lsdException w:name="List Table 5 Dark Accent 1" w:uiPriority="50"/>
+    <w:lsdException w:name="List Table 6 Colorful Accent 1" w:uiPriority="51"/>
+    <w:lsdException w:name="List Table 7 Colorful Accent 1" w:uiPriority="52"/>
+    <w:lsdException w:name="List Table 1 Light Accent 2" w:uiPriority="46"/>
+    <w:lsdException w:name="List Table 2 Accent 2" w:uiPriority="47"/>
+    <w:lsdException w:name="List Table 3 Accent 2" w:uiPriority="48"/>
+    <w:lsdException w:name="List Table 4 Accent 2" w:uiPriority="49"/>
+    <w:lsdException w:name="List Table 5 Dark Accent 2" w:uiPriority="50"/>
+    <w:lsdException w:name="List Table 6 Colorful Accent 2" w:uiPriority="51"/>
+    <w:lsdException w:name="List Table 7 Colorful Accent 2" w:uiPriority="52"/>
+    <w:lsdException w:name="List Table 1 Light Accent 3" w:uiPriority="46"/>
+    <w:lsdException w:name="List Table 2 Accent 3" w:uiPriority="47"/>
+    <w:lsdException w:name="List Table 3 Accent 3" w:uiPriority="48"/>
+    <w:lsdException w:name="List Table 4 Accent 3" w:uiPriority="49"/>
+    <w:lsdException w:name="List Table 5 Dark Accent 3" w:uiPriority="50"/>
+    <w:lsdException w:name="List Table 6 Colorful Accent 3" w:uiPriority="51"/>
+    <w:lsdException w:name="List Table 7 Colorful Accent 3" w:uiPriority="52"/>
+    <w:lsdException w:name="List Table 1 Light Accent 4" w:uiPriority="46"/>
+    <w:lsdException w:name="List Table 2 Accent 4" w:uiPriority="47"/>
+    <w:lsdException w:name="List Table 3 Accent 4" w:uiPriority="48"/>
+    <w:lsdException w:name="List Table 4 Accent 4" w:uiPriority="49"/>
+    <w:lsdException w:name="List Table 5 Dark Accent 4" w:uiPriority="50"/>
+    <w:lsdException w:name="List Table 6 Colorful Accent 4" w:uiPriority="51"/>
+    <w:lsdException w:name="List Table 7 Colorful Accent 4" w:uiPriority="52"/>
+    <w:lsdException w:name="List Table 1 Light Accent 5" w:uiPriority="46"/>
+    <w:lsdException w:name="List Table 2 Accent 5" w:uiPriority="47"/>
+    <w:lsdException w:name="List Table 3 Accent 5" w:uiPriority="48"/>
+    <w:lsdException w:name="List Table 4 Accent 5" w:uiPriority="49"/>
+    <w:lsdException w:name="List Table 5 Dark Accent 5" w:uiPriority="50"/>
+    <w:lsdException w:name="List Table 6 Colorful Accent 5" w:uiPriority="51"/>
+    <w:lsdException w:name="List Table 7 Colorful Accent 5" w:uiPriority="52"/>
+    <w:lsdException w:name="List Table 1 Light Accent 6" w:uiPriority="46"/>
+    <w:lsdException w:name="List Table 2 Accent 6" w:uiPriority="47"/>
+    <w:lsdException w:name="List Table 3 Accent 6" w:uiPriority="48"/>
+    <w:lsdException w:name="List Table 4 Accent 6" w:uiPriority="49"/>
+    <w:lsdException w:name="List Table 5 Dark Accent 6" w:uiPriority="50"/>
+    <w:lsdException w:name="List Table 6 Colorful Accent 6" w:uiPriority="51"/>
+    <w:lsdException w:name="List Table 7 Colorful Accent 6" w:uiPriority="52"/>
+    <w:lsdException w:name="Mention" w:semiHidden="1" w:unhideWhenUsed="1"/>
+    <w:lsdException w:name="Smart Hyperlink" w:semiHidden="1" w:unhideWhenUsed="1"/>
+    <w:lsdException w:name="Hashtag" w:semiHidden="1" w:unhideWhenUsed="1"/>
+    <w:lsdException w:name="Unresolved Mention" w:semiHidden="1" w:unhideWhenUsed="1"/>
+    <w:lsdException w:name="Smart Link" w:semiHidden="1" w:unhideWhenUsed="1"/>
+  </w:latentStyles>
+  <w:style w:type="paragraph" w:default="1" w:styleId="Normal">
+    <w:name w:val="Normal"/>
+    <w:qFormat/>
+  </w:style>
+  <w:style w:type="character" w:default="1" w:styleId="DefaultParagraphFont">
+    <w:name w:val="Default Paragraph Font"/>
+    <w:uiPriority w:val="1"/>
+    <w:semiHidden/>
+    <w:unhideWhenUsed/>
+  </w:style>
+  <w:style w:type="table" w:default="1" w:styleId="TableNormal">
+    <w:name w:val="Normal Table"/>
+    <w:uiPriority w:val="99"/>
+    <w:semiHidden/>
+    <w:unhideWhenUsed/>
+    <w:tblPr>
+      <w:tblInd w:w="0" w:type="dxa"/>
+      <w:tblCellMar>
+        <w:top w:w="0" w:type="dxa"/>
+        <w:left w:w="108" w:type="dxa"/>
+        <w:bottom w:w="0" w:type="dxa"/>
+        <w:right w:w="108" w:type="dxa"/>
+      </w:tblCellMar>
+    </w:tblPr>
+  </w:style>
+  <w:style w:type="numbering" w:default="1" w:styleId="NoList">
+    <w:name w:val="No List"/>
+    <w:uiPriority w:val="99"/>
+    <w:semiHidden/>
+    <w:unhideWhenUsed/>
+  </w:style>
+  <w:style w:type="paragraph" w:customStyle="1" w:styleId="F099E52B622147899990FA8EB9929F0F">
+    <w:name w:val="F099E52B622147899990FA8EB9929F0F"/>
+    <w:rsid w:val="0028766F"/>
+  </w:style>
+</w:styles>
+</file>
+
+<file path=word/glossary/webSettings.xml><?xml version="1.0" encoding="utf-8"?>
+<w:webSettings xmlns:mc="http://schemas.openxmlformats.org/markup-compatibility/2006" xmlns:r="http://schemas.openxmlformats.org/officeDocument/2006/relationships" xmlns:w="http://schemas.openxmlformats.org/wordprocessingml/2006/main" xmlns:w14="http://schemas.microsoft.com/office/word/2010/wordml" xmlns:w15="http://schemas.microsoft.com/office/word/2012/wordml" xmlns:w16cex="http://schemas.microsoft.com/office/word/2018/wordml/cex" xmlns:w16cid="http://schemas.microsoft.com/office/word/2016/wordml/cid" xmlns:w16="http://schemas.microsoft.com/office/word/2018/wordml" xmlns:w16du="http://schemas.microsoft.com/office/word/2023/wordml/word16du" xmlns:w16sdtdh="http://schemas.microsoft.com/office/word/2020/wordml/sdtdatahash" xmlns:w16sdtfl="http://schemas.microsoft.com/office/word/2024/wordml/sdtformatlock" xmlns:w16se="http://schemas.microsoft.com/office/word/2015/wordml/symex" mc:Ignorable="w14 w15 w16se w16cid w16 w16cex w16sdtdh w16sdtfl w16du">
+  <w:optimizeForBrowser/>
+  <w:allowPNG/>
+</w:webSettings>
 </file>
 
 <file path=word/theme/theme1.xml><?xml version="1.0" encoding="utf-8"?>

</xml_diff>

<commit_message>
added high-level architectural diagram
</commit_message>
<xml_diff>
--- a/Capstone_Project_2026.docx
+++ b/Capstone_Project_2026.docx
@@ -2084,18 +2084,141 @@
       </w:r>
     </w:p>
     <w:p>
-      <w:r>
-        <w:t>The proposed architecture illustrates the process from data collection to business reporting. The UCI dataset will be analysed and prepared using Python to develop and evaluate machine learning classification models. The findings will be presented through a Tableau dashboard and final report, supporting data-driven business recommendations.</w:t>
+      <w:pPr>
+        <w:jc w:val="both"/>
+      </w:pPr>
+      <w:r>
+        <w:t>Figure 1 illustrates the proposed workflow from data acquisition to business reporting. The UCI dataset will be explored and prepared using Python before developing and evaluating three machine learning classification models. The results will be presented through a Tableau dashboard and final report, supporting recommendations to improve marketing decisions, conversion strategies and sales opportunities. Live system integration is outside the project scope.</w:t>
+      </w:r>
+      <w:r>
+        <w:br w:type="page"/>
+      </w:r>
+    </w:p>
+    <w:p>
+      <w:pPr>
+        <w:jc w:val="center"/>
+        <w:rPr>
+          <w:b/>
+          <w:bCs/>
+          <w:sz w:val="32"/>
+          <w:szCs w:val="32"/>
+        </w:rPr>
+      </w:pPr>
+      <w:r>
+        <w:rPr>
+          <w:b/>
+          <w:bCs/>
+          <w:sz w:val="32"/>
+          <w:szCs w:val="32"/>
+        </w:rPr>
+        <w:lastRenderedPageBreak/>
+        <w:t>Online Purchase Intention Prediction</w:t>
+      </w:r>
+    </w:p>
+    <w:p>
+      <w:pPr>
+        <w:jc w:val="center"/>
+        <w:rPr>
+          <w:b/>
+          <w:bCs/>
+          <w:sz w:val="32"/>
+          <w:szCs w:val="32"/>
+        </w:rPr>
+      </w:pPr>
+      <w:r>
+        <w:rPr>
+          <w:b/>
+          <w:bCs/>
+          <w:sz w:val="32"/>
+          <w:szCs w:val="32"/>
+        </w:rPr>
+        <w:t>Proposed High-Level System Architecture</w:t>
       </w:r>
     </w:p>
     <w:p/>
-    <w:p/>
+    <w:p>
+      <w:pPr>
+        <w:keepNext/>
+      </w:pPr>
+      <w:r>
+        <w:rPr>
+          <w:noProof/>
+        </w:rPr>
+        <w:drawing>
+          <wp:inline distT="0" distB="0" distL="0" distR="0" wp14:anchorId="6A343D5C" wp14:editId="7A67FFCF">
+            <wp:extent cx="6913245" cy="5505450"/>
+            <wp:effectExtent l="0" t="0" r="0" b="0"/>
+            <wp:docPr id="489784198" name="Picture 4"/>
+            <wp:cNvGraphicFramePr>
+              <a:graphicFrameLocks xmlns:a="http://schemas.openxmlformats.org/drawingml/2006/main" noChangeAspect="1"/>
+            </wp:cNvGraphicFramePr>
+            <a:graphic xmlns:a="http://schemas.openxmlformats.org/drawingml/2006/main">
+              <a:graphicData uri="http://schemas.openxmlformats.org/drawingml/2006/picture">
+                <pic:pic xmlns:pic="http://schemas.openxmlformats.org/drawingml/2006/picture">
+                  <pic:nvPicPr>
+                    <pic:cNvPr id="0" name="Picture 2"/>
+                    <pic:cNvPicPr>
+                      <a:picLocks noChangeAspect="1" noChangeArrowheads="1"/>
+                    </pic:cNvPicPr>
+                  </pic:nvPicPr>
+                  <pic:blipFill>
+                    <a:blip r:embed="rId7">
+                      <a:extLst>
+                        <a:ext uri="{28A0092B-C50C-407E-A947-70E740481C1C}">
+                          <a14:useLocalDpi xmlns:a14="http://schemas.microsoft.com/office/drawing/2010/main" val="0"/>
+                        </a:ext>
+                      </a:extLst>
+                    </a:blip>
+                    <a:srcRect/>
+                    <a:stretch>
+                      <a:fillRect/>
+                    </a:stretch>
+                  </pic:blipFill>
+                  <pic:spPr bwMode="auto">
+                    <a:xfrm>
+                      <a:off x="0" y="0"/>
+                      <a:ext cx="6913245" cy="5505450"/>
+                    </a:xfrm>
+                    <a:prstGeom prst="rect">
+                      <a:avLst/>
+                    </a:prstGeom>
+                    <a:noFill/>
+                  </pic:spPr>
+                </pic:pic>
+              </a:graphicData>
+            </a:graphic>
+          </wp:inline>
+        </w:drawing>
+      </w:r>
+    </w:p>
+    <w:p>
+      <w:pPr>
+        <w:pStyle w:val="Caption"/>
+      </w:pPr>
+      <w:r>
+        <w:t xml:space="preserve">Figure </w:t>
+      </w:r>
+      <w:fldSimple w:instr=" SEQ Figure \* ARABIC ">
+        <w:r>
+          <w:rPr>
+            <w:noProof/>
+          </w:rPr>
+          <w:t>1</w:t>
+        </w:r>
+      </w:fldSimple>
+      <w:r>
+        <w:t xml:space="preserve"> H</w:t>
+      </w:r>
+      <w:r>
+        <w:t>igh-level architectural diagram</w:t>
+      </w:r>
+    </w:p>
     <w:p/>
     <w:p/>
     <w:sectPr>
-      <w:headerReference w:type="default" r:id="rId7"/>
-      <w:footerReference w:type="default" r:id="rId8"/>
-      <w:headerReference w:type="first" r:id="rId9"/>
+      <w:headerReference w:type="default" r:id="rId8"/>
+      <w:footerReference w:type="default" r:id="rId9"/>
+      <w:headerReference w:type="first" r:id="rId10"/>
       <w:pgSz w:w="11906" w:h="16838"/>
       <w:pgMar w:top="1440" w:right="1440" w:bottom="1440" w:left="1440" w:header="708" w:footer="708" w:gutter="0"/>
       <w:pgNumType w:start="0"/>
@@ -5037,7 +5160,6 @@
   <w:style w:type="character" w:default="1" w:styleId="DefaultParagraphFont">
     <w:name w:val="Default Paragraph Font"/>
     <w:uiPriority w:val="1"/>
-    <w:semiHidden/>
     <w:unhideWhenUsed/>
   </w:style>
   <w:style w:type="table" w:default="1" w:styleId="TableNormal">
@@ -5477,6 +5599,25 @@
       </w:numPr>
     </w:pPr>
   </w:style>
+  <w:style w:type="paragraph" w:styleId="Caption">
+    <w:name w:val="caption"/>
+    <w:basedOn w:val="Normal"/>
+    <w:next w:val="Normal"/>
+    <w:uiPriority w:val="35"/>
+    <w:unhideWhenUsed/>
+    <w:qFormat/>
+    <w:rsid w:val="005C5DC1"/>
+    <w:pPr>
+      <w:spacing w:after="200" w:line="240" w:lineRule="auto"/>
+    </w:pPr>
+    <w:rPr>
+      <w:i/>
+      <w:iCs/>
+      <w:color w:val="44546A" w:themeColor="text2"/>
+      <w:sz w:val="18"/>
+      <w:szCs w:val="18"/>
+    </w:rPr>
+  </w:style>
 </w:styles>
 </file>
 
@@ -5595,6 +5736,7 @@
   </w:compat>
   <w:rsids>
     <w:rsidRoot w:val="0028766F"/>
+    <w:rsid w:val="000F4124"/>
     <w:rsid w:val="0028766F"/>
     <w:rsid w:val="003A7EE9"/>
     <w:rsid w:val="006F1605"/>

</xml_diff>

<commit_message>
Added Ethical and Legal Considerations References
</commit_message>
<xml_diff>
--- a/Capstone_Project_2026.docx
+++ b/Capstone_Project_2026.docx
@@ -2240,27 +2240,14 @@
       <w:r>
         <w:t xml:space="preserve">Figure </w:t>
       </w:r>
-      <w:r>
-        <w:fldChar w:fldCharType="begin"/>
-      </w:r>
-      <w:r>
-        <w:instrText xml:space="preserve"> SEQ Figure \* ARABIC </w:instrText>
-      </w:r>
-      <w:r>
-        <w:fldChar w:fldCharType="separate"/>
-      </w:r>
-      <w:r>
-        <w:rPr>
-          <w:noProof/>
-        </w:rPr>
-        <w:t>1</w:t>
-      </w:r>
-      <w:r>
-        <w:rPr>
-          <w:noProof/>
-        </w:rPr>
-        <w:fldChar w:fldCharType="end"/>
-      </w:r>
+      <w:fldSimple w:instr=" SEQ Figure \* ARABIC ">
+        <w:r>
+          <w:rPr>
+            <w:noProof/>
+          </w:rPr>
+          <w:t>1</w:t>
+        </w:r>
+      </w:fldSimple>
       <w:r>
         <w:t xml:space="preserve"> H</w:t>
       </w:r>
@@ -2360,6 +2347,9 @@
         <w:keepNext/>
       </w:pPr>
       <w:r>
+        <w:rPr>
+          <w:noProof/>
+        </w:rPr>
         <w:drawing>
           <wp:inline distT="0" distB="0" distL="0" distR="0" wp14:anchorId="3FE08B5A" wp14:editId="244ED550">
             <wp:extent cx="2838596" cy="3149762"/>
@@ -2404,24 +2394,14 @@
       <w:r>
         <w:t xml:space="preserve">Figure </w:t>
       </w:r>
-      <w:r>
-        <w:fldChar w:fldCharType="begin"/>
-      </w:r>
-      <w:r>
-        <w:instrText xml:space="preserve"> SEQ Figure \* ARABIC </w:instrText>
-      </w:r>
-      <w:r>
-        <w:fldChar w:fldCharType="separate"/>
-      </w:r>
-      <w:r>
-        <w:rPr>
-          <w:noProof/>
-        </w:rPr>
-        <w:t>2</w:t>
-      </w:r>
-      <w:r>
-        <w:fldChar w:fldCharType="end"/>
-      </w:r>
+      <w:fldSimple w:instr=" SEQ Figure \* ARABIC ">
+        <w:r>
+          <w:rPr>
+            <w:noProof/>
+          </w:rPr>
+          <w:t>2</w:t>
+        </w:r>
+      </w:fldSimple>
       <w:r>
         <w:t xml:space="preserve"> </w:t>
       </w:r>
@@ -2756,6 +2736,9 @@
         <w:t xml:space="preserve"> </w:t>
       </w:r>
       <w:r>
+        <w:rPr>
+          <w:noProof/>
+        </w:rPr>
         <w:drawing>
           <wp:inline distT="0" distB="0" distL="0" distR="0" wp14:anchorId="3F257EF7" wp14:editId="12002EE7">
             <wp:extent cx="5657850" cy="3220278"/>
@@ -2800,27 +2783,80 @@
       <w:r>
         <w:t xml:space="preserve">Figure </w:t>
       </w:r>
-      <w:r>
-        <w:fldChar w:fldCharType="begin"/>
-      </w:r>
-      <w:r>
-        <w:instrText xml:space="preserve"> SEQ Figure \* ARABIC </w:instrText>
-      </w:r>
-      <w:r>
-        <w:fldChar w:fldCharType="separate"/>
-      </w:r>
-      <w:r>
+      <w:fldSimple w:instr=" SEQ Figure \* ARABIC ">
+        <w:r>
+          <w:rPr>
+            <w:noProof/>
+          </w:rPr>
+          <w:t>3</w:t>
+        </w:r>
+      </w:fldSimple>
+      <w:r>
+        <w:t xml:space="preserve"> Gantt chart</w:t>
+      </w:r>
+    </w:p>
+    <w:p>
+      <w:pPr>
+        <w:suppressAutoHyphens w:val="0"/>
+        <w:autoSpaceDN/>
+        <w:spacing w:line="259" w:lineRule="auto"/>
         <w:rPr>
-          <w:noProof/>
+          <w:i/>
+          <w:iCs/>
+          <w:color w:val="44546A" w:themeColor="text2"/>
+          <w:sz w:val="18"/>
+          <w:szCs w:val="18"/>
         </w:rPr>
-        <w:t>3</w:t>
-      </w:r>
-      <w:r>
-        <w:fldChar w:fldCharType="end"/>
-      </w:r>
-      <w:r>
-        <w:t xml:space="preserve"> Gantt chart</w:t>
-      </w:r>
+      </w:pPr>
+      <w:r>
+        <w:br w:type="page"/>
+      </w:r>
+    </w:p>
+    <w:p>
+      <w:pPr>
+        <w:pStyle w:val="Heading1"/>
+      </w:pPr>
+      <w:r>
+        <w:lastRenderedPageBreak/>
+        <w:t>Ethical and Legal Considerations References</w:t>
+      </w:r>
+    </w:p>
+    <w:p>
+      <w:pPr>
+        <w:jc w:val="both"/>
+      </w:pPr>
+      <w:r>
+        <w:t>The project will use a publicly available dataset without collecting personal customer information or direct identifiers.</w:t>
+      </w:r>
+    </w:p>
+    <w:p>
+      <w:pPr>
+        <w:jc w:val="both"/>
+      </w:pPr>
+      <w:r>
+        <w:t>GDPR principles, including data minimisation, purpose limitation and secure storage, will guide responsible data handling (European Union, 2016). The dataset's CC BY 4.0 licence will be respected through proper attribution, and GitHub uploads will be checked for confidential information.</w:t>
+      </w:r>
+    </w:p>
+    <w:p>
+      <w:pPr>
+        <w:jc w:val="both"/>
+      </w:pPr>
+      <w:r>
+        <w:t>Ethical considerations will include class imbalance, potential model bias, misleading predictions and data leakage.</w:t>
+      </w:r>
+    </w:p>
+    <w:p>
+      <w:pPr>
+        <w:jc w:val="both"/>
+      </w:pPr>
+      <w:r>
+        <w:t>As the dataset is historical, findings may not fully reflect current e-commerce behaviour. Recommendations will therefore be evidence-based rather than guarantees of increased sales.</w:t>
+      </w:r>
+    </w:p>
+    <w:p>
+      <w:pPr>
+        <w:pStyle w:val="Caption"/>
+      </w:pPr>
     </w:p>
     <w:p/>
     <w:sectPr>
@@ -2965,30 +3001,9 @@
       </w:rPr>
       <w:ptab w:relativeTo="margin" w:alignment="center" w:leader="none"/>
     </w:r>
-    <w:sdt>
-      <w:sdtPr>
-        <w:rPr>
-          <w:sz w:val="16"/>
-          <w:szCs w:val="16"/>
-        </w:rPr>
-        <w:id w:val="968859947"/>
-        <w:placeholder>
-          <w:docPart w:val="F099E52B622147899990FA8EB9929F0F"/>
-        </w:placeholder>
-        <w:temporary/>
-        <w:showingPlcHdr/>
-        <w15:appearance w15:val="hidden"/>
-      </w:sdtPr>
-      <w:sdtContent>
-        <w:r>
-          <w:rPr>
-            <w:sz w:val="16"/>
-            <w:szCs w:val="16"/>
-          </w:rPr>
-          <w:t>[Type here]</w:t>
-        </w:r>
-      </w:sdtContent>
-    </w:sdt>
+    <w:r>
+      <w:t xml:space="preserve">sba25049 </w:t>
+    </w:r>
     <w:r>
       <w:rPr>
         <w:sz w:val="16"/>
@@ -3910,6 +3925,119 @@
     </w:lvl>
   </w:abstractNum>
   <w:abstractNum w:abstractNumId="8" w15:restartNumberingAfterBreak="0">
+    <w:nsid w:val="1DDC3853"/>
+    <w:multiLevelType w:val="multilevel"/>
+    <w:tmpl w:val="11EE51D4"/>
+    <w:lvl w:ilvl="0">
+      <w:start w:val="1"/>
+      <w:numFmt w:val="decimal"/>
+      <w:lvlText w:val="%1."/>
+      <w:lvlJc w:val="left"/>
+      <w:pPr>
+        <w:tabs>
+          <w:tab w:val="num" w:pos="720"/>
+        </w:tabs>
+        <w:ind w:left="720" w:hanging="360"/>
+      </w:pPr>
+    </w:lvl>
+    <w:lvl w:ilvl="1" w:tentative="1">
+      <w:start w:val="1"/>
+      <w:numFmt w:val="decimal"/>
+      <w:lvlText w:val="%2."/>
+      <w:lvlJc w:val="left"/>
+      <w:pPr>
+        <w:tabs>
+          <w:tab w:val="num" w:pos="1440"/>
+        </w:tabs>
+        <w:ind w:left="1440" w:hanging="360"/>
+      </w:pPr>
+    </w:lvl>
+    <w:lvl w:ilvl="2" w:tentative="1">
+      <w:start w:val="1"/>
+      <w:numFmt w:val="decimal"/>
+      <w:lvlText w:val="%3."/>
+      <w:lvlJc w:val="left"/>
+      <w:pPr>
+        <w:tabs>
+          <w:tab w:val="num" w:pos="2160"/>
+        </w:tabs>
+        <w:ind w:left="2160" w:hanging="360"/>
+      </w:pPr>
+    </w:lvl>
+    <w:lvl w:ilvl="3" w:tentative="1">
+      <w:start w:val="1"/>
+      <w:numFmt w:val="decimal"/>
+      <w:lvlText w:val="%4."/>
+      <w:lvlJc w:val="left"/>
+      <w:pPr>
+        <w:tabs>
+          <w:tab w:val="num" w:pos="2880"/>
+        </w:tabs>
+        <w:ind w:left="2880" w:hanging="360"/>
+      </w:pPr>
+    </w:lvl>
+    <w:lvl w:ilvl="4" w:tentative="1">
+      <w:start w:val="1"/>
+      <w:numFmt w:val="decimal"/>
+      <w:lvlText w:val="%5."/>
+      <w:lvlJc w:val="left"/>
+      <w:pPr>
+        <w:tabs>
+          <w:tab w:val="num" w:pos="3600"/>
+        </w:tabs>
+        <w:ind w:left="3600" w:hanging="360"/>
+      </w:pPr>
+    </w:lvl>
+    <w:lvl w:ilvl="5" w:tentative="1">
+      <w:start w:val="1"/>
+      <w:numFmt w:val="decimal"/>
+      <w:lvlText w:val="%6."/>
+      <w:lvlJc w:val="left"/>
+      <w:pPr>
+        <w:tabs>
+          <w:tab w:val="num" w:pos="4320"/>
+        </w:tabs>
+        <w:ind w:left="4320" w:hanging="360"/>
+      </w:pPr>
+    </w:lvl>
+    <w:lvl w:ilvl="6" w:tentative="1">
+      <w:start w:val="1"/>
+      <w:numFmt w:val="decimal"/>
+      <w:lvlText w:val="%7."/>
+      <w:lvlJc w:val="left"/>
+      <w:pPr>
+        <w:tabs>
+          <w:tab w:val="num" w:pos="5040"/>
+        </w:tabs>
+        <w:ind w:left="5040" w:hanging="360"/>
+      </w:pPr>
+    </w:lvl>
+    <w:lvl w:ilvl="7" w:tentative="1">
+      <w:start w:val="1"/>
+      <w:numFmt w:val="decimal"/>
+      <w:lvlText w:val="%8."/>
+      <w:lvlJc w:val="left"/>
+      <w:pPr>
+        <w:tabs>
+          <w:tab w:val="num" w:pos="5760"/>
+        </w:tabs>
+        <w:ind w:left="5760" w:hanging="360"/>
+      </w:pPr>
+    </w:lvl>
+    <w:lvl w:ilvl="8" w:tentative="1">
+      <w:start w:val="1"/>
+      <w:numFmt w:val="decimal"/>
+      <w:lvlText w:val="%9."/>
+      <w:lvlJc w:val="left"/>
+      <w:pPr>
+        <w:tabs>
+          <w:tab w:val="num" w:pos="6480"/>
+        </w:tabs>
+        <w:ind w:left="6480" w:hanging="360"/>
+      </w:pPr>
+    </w:lvl>
+  </w:abstractNum>
+  <w:abstractNum w:abstractNumId="9" w15:restartNumberingAfterBreak="0">
     <w:nsid w:val="1FB75C42"/>
     <w:multiLevelType w:val="hybridMultilevel"/>
     <w:tmpl w:val="49CC9580"/>
@@ -3995,7 +4123,7 @@
       </w:pPr>
     </w:lvl>
   </w:abstractNum>
-  <w:abstractNum w:abstractNumId="9" w15:restartNumberingAfterBreak="0">
+  <w:abstractNum w:abstractNumId="10" w15:restartNumberingAfterBreak="0">
     <w:nsid w:val="23CD32C2"/>
     <w:multiLevelType w:val="multilevel"/>
     <w:tmpl w:val="18090025"/>
@@ -4081,7 +4209,7 @@
       </w:pPr>
     </w:lvl>
   </w:abstractNum>
-  <w:abstractNum w:abstractNumId="10" w15:restartNumberingAfterBreak="0">
+  <w:abstractNum w:abstractNumId="11" w15:restartNumberingAfterBreak="0">
     <w:nsid w:val="36E7080E"/>
     <w:multiLevelType w:val="hybridMultilevel"/>
     <w:tmpl w:val="4C5CD92E"/>
@@ -4194,7 +4322,7 @@
       </w:rPr>
     </w:lvl>
   </w:abstractNum>
-  <w:abstractNum w:abstractNumId="11" w15:restartNumberingAfterBreak="0">
+  <w:abstractNum w:abstractNumId="12" w15:restartNumberingAfterBreak="0">
     <w:nsid w:val="40082318"/>
     <w:multiLevelType w:val="multilevel"/>
     <w:tmpl w:val="F2427B26"/>
@@ -4343,7 +4471,7 @@
       </w:rPr>
     </w:lvl>
   </w:abstractNum>
-  <w:abstractNum w:abstractNumId="12" w15:restartNumberingAfterBreak="0">
+  <w:abstractNum w:abstractNumId="13" w15:restartNumberingAfterBreak="0">
     <w:nsid w:val="4B775AD4"/>
     <w:multiLevelType w:val="multilevel"/>
     <w:tmpl w:val="F2427B26"/>
@@ -4492,7 +4620,7 @@
       </w:rPr>
     </w:lvl>
   </w:abstractNum>
-  <w:abstractNum w:abstractNumId="13" w15:restartNumberingAfterBreak="0">
+  <w:abstractNum w:abstractNumId="14" w15:restartNumberingAfterBreak="0">
     <w:nsid w:val="4C3E34D7"/>
     <w:multiLevelType w:val="multilevel"/>
     <w:tmpl w:val="68E8ED24"/>
@@ -4578,7 +4706,7 @@
       </w:pPr>
     </w:lvl>
   </w:abstractNum>
-  <w:abstractNum w:abstractNumId="14" w15:restartNumberingAfterBreak="0">
+  <w:abstractNum w:abstractNumId="15" w15:restartNumberingAfterBreak="0">
     <w:nsid w:val="4ED03715"/>
     <w:multiLevelType w:val="multilevel"/>
     <w:tmpl w:val="82F8DA2A"/>
@@ -4664,7 +4792,7 @@
       </w:pPr>
     </w:lvl>
   </w:abstractNum>
-  <w:abstractNum w:abstractNumId="15" w15:restartNumberingAfterBreak="0">
+  <w:abstractNum w:abstractNumId="16" w15:restartNumberingAfterBreak="0">
     <w:nsid w:val="55585EEA"/>
     <w:multiLevelType w:val="hybridMultilevel"/>
     <w:tmpl w:val="E48EA1E0"/>
@@ -4777,7 +4905,7 @@
       </w:rPr>
     </w:lvl>
   </w:abstractNum>
-  <w:abstractNum w:abstractNumId="16" w15:restartNumberingAfterBreak="0">
+  <w:abstractNum w:abstractNumId="17" w15:restartNumberingAfterBreak="0">
     <w:nsid w:val="5BB90BF9"/>
     <w:multiLevelType w:val="multilevel"/>
     <w:tmpl w:val="FA0A0490"/>
@@ -4864,7 +4992,7 @@
       </w:pPr>
     </w:lvl>
   </w:abstractNum>
-  <w:abstractNum w:abstractNumId="17" w15:restartNumberingAfterBreak="0">
+  <w:abstractNum w:abstractNumId="18" w15:restartNumberingAfterBreak="0">
     <w:nsid w:val="6B1D01B3"/>
     <w:multiLevelType w:val="hybridMultilevel"/>
     <w:tmpl w:val="BA98D752"/>
@@ -4977,7 +5105,7 @@
       </w:rPr>
     </w:lvl>
   </w:abstractNum>
-  <w:abstractNum w:abstractNumId="18" w15:restartNumberingAfterBreak="0">
+  <w:abstractNum w:abstractNumId="19" w15:restartNumberingAfterBreak="0">
     <w:nsid w:val="70E437A6"/>
     <w:multiLevelType w:val="hybridMultilevel"/>
     <w:tmpl w:val="36E4189E"/>
@@ -5063,7 +5191,7 @@
       </w:pPr>
     </w:lvl>
   </w:abstractNum>
-  <w:abstractNum w:abstractNumId="19" w15:restartNumberingAfterBreak="0">
+  <w:abstractNum w:abstractNumId="20" w15:restartNumberingAfterBreak="0">
     <w:nsid w:val="76253744"/>
     <w:multiLevelType w:val="multilevel"/>
     <w:tmpl w:val="423C7548"/>
@@ -5149,7 +5277,7 @@
       </w:pPr>
     </w:lvl>
   </w:abstractNum>
-  <w:abstractNum w:abstractNumId="20" w15:restartNumberingAfterBreak="0">
+  <w:abstractNum w:abstractNumId="21" w15:restartNumberingAfterBreak="0">
     <w:nsid w:val="764D314C"/>
     <w:multiLevelType w:val="multilevel"/>
     <w:tmpl w:val="F2427B26"/>
@@ -5298,7 +5426,7 @@
       </w:rPr>
     </w:lvl>
   </w:abstractNum>
-  <w:abstractNum w:abstractNumId="21" w15:restartNumberingAfterBreak="0">
+  <w:abstractNum w:abstractNumId="22" w15:restartNumberingAfterBreak="0">
     <w:nsid w:val="76737565"/>
     <w:multiLevelType w:val="hybridMultilevel"/>
     <w:tmpl w:val="E3A4BA88"/>
@@ -5411,7 +5539,7 @@
       </w:rPr>
     </w:lvl>
   </w:abstractNum>
-  <w:abstractNum w:abstractNumId="22" w15:restartNumberingAfterBreak="0">
+  <w:abstractNum w:abstractNumId="23" w15:restartNumberingAfterBreak="0">
     <w:nsid w:val="79075C2B"/>
     <w:multiLevelType w:val="hybridMultilevel"/>
     <w:tmpl w:val="3B28CA4E"/>
@@ -5528,7 +5656,7 @@
     <w:abstractNumId w:val="2"/>
   </w:num>
   <w:num w:numId="2" w16cid:durableId="371420007">
-    <w:abstractNumId w:val="16"/>
+    <w:abstractNumId w:val="17"/>
     <w:lvlOverride w:ilvl="0">
       <w:lvl w:ilvl="0">
         <w:start w:val="1"/>
@@ -5630,37 +5758,37 @@
     </w:lvlOverride>
   </w:num>
   <w:num w:numId="3" w16cid:durableId="1008874821">
-    <w:abstractNumId w:val="16"/>
+    <w:abstractNumId w:val="17"/>
   </w:num>
   <w:num w:numId="4" w16cid:durableId="685447713">
     <w:abstractNumId w:val="5"/>
   </w:num>
   <w:num w:numId="5" w16cid:durableId="936714474">
+    <w:abstractNumId w:val="22"/>
+  </w:num>
+  <w:num w:numId="6" w16cid:durableId="1715882434">
+    <w:abstractNumId w:val="18"/>
+  </w:num>
+  <w:num w:numId="7" w16cid:durableId="2133857912">
     <w:abstractNumId w:val="21"/>
   </w:num>
-  <w:num w:numId="6" w16cid:durableId="1715882434">
-    <w:abstractNumId w:val="17"/>
-  </w:num>
-  <w:num w:numId="7" w16cid:durableId="2133857912">
-    <w:abstractNumId w:val="20"/>
-  </w:num>
   <w:num w:numId="8" w16cid:durableId="920069637">
-    <w:abstractNumId w:val="11"/>
+    <w:abstractNumId w:val="12"/>
   </w:num>
   <w:num w:numId="9" w16cid:durableId="782194550">
-    <w:abstractNumId w:val="8"/>
+    <w:abstractNumId w:val="9"/>
   </w:num>
   <w:num w:numId="10" w16cid:durableId="1686783558">
-    <w:abstractNumId w:val="9"/>
+    <w:abstractNumId w:val="10"/>
   </w:num>
   <w:num w:numId="11" w16cid:durableId="702947228">
-    <w:abstractNumId w:val="13"/>
+    <w:abstractNumId w:val="14"/>
   </w:num>
   <w:num w:numId="12" w16cid:durableId="1029377723">
-    <w:abstractNumId w:val="14"/>
+    <w:abstractNumId w:val="15"/>
   </w:num>
   <w:num w:numId="13" w16cid:durableId="786655747">
-    <w:abstractNumId w:val="15"/>
+    <w:abstractNumId w:val="16"/>
   </w:num>
   <w:num w:numId="14" w16cid:durableId="616837293">
     <w:abstractNumId w:val="3"/>
@@ -5672,16 +5800,16 @@
     <w:abstractNumId w:val="0"/>
   </w:num>
   <w:num w:numId="17" w16cid:durableId="1780561158">
-    <w:abstractNumId w:val="19"/>
+    <w:abstractNumId w:val="20"/>
   </w:num>
   <w:num w:numId="18" w16cid:durableId="1952086178">
-    <w:abstractNumId w:val="10"/>
+    <w:abstractNumId w:val="11"/>
   </w:num>
   <w:num w:numId="19" w16cid:durableId="179587092">
-    <w:abstractNumId w:val="22"/>
+    <w:abstractNumId w:val="23"/>
   </w:num>
   <w:num w:numId="20" w16cid:durableId="201359231">
-    <w:abstractNumId w:val="18"/>
+    <w:abstractNumId w:val="19"/>
   </w:num>
   <w:num w:numId="21" w16cid:durableId="1069306221">
     <w:abstractNumId w:val="4"/>
@@ -5690,10 +5818,13 @@
     <w:abstractNumId w:val="6"/>
   </w:num>
   <w:num w:numId="23" w16cid:durableId="1164129083">
-    <w:abstractNumId w:val="12"/>
+    <w:abstractNumId w:val="13"/>
   </w:num>
   <w:num w:numId="24" w16cid:durableId="406808265">
     <w:abstractNumId w:val="7"/>
+  </w:num>
+  <w:num w:numId="25" w16cid:durableId="1359509216">
+    <w:abstractNumId w:val="8"/>
   </w:num>
 </w:numbering>
 </file>
@@ -6342,6 +6473,7 @@
   <w:style w:type="character" w:default="1" w:styleId="DefaultParagraphFont">
     <w:name w:val="Default Paragraph Font"/>
     <w:uiPriority w:val="1"/>
+    <w:semiHidden/>
     <w:unhideWhenUsed/>
   </w:style>
   <w:style w:type="table" w:default="1" w:styleId="TableNormal">
@@ -6803,593 +6935,6 @@
 </w:styles>
 </file>
 
-<file path=word/glossary/document.xml><?xml version="1.0" encoding="utf-8"?>
-<w:glossaryDocument xmlns:wpc="http://schemas.microsoft.com/office/word/2010/wordprocessingCanvas" xmlns:cx="http://schemas.microsoft.com/office/drawing/2014/chartex" xmlns:cx1="http://schemas.microsoft.com/office/drawing/2015/9/8/chartex" xmlns:cx2="http://schemas.microsoft.com/office/drawing/2015/10/21/chartex" xmlns:cx3="http://schemas.microsoft.com/office/drawing/2016/5/9/chartex" xmlns:cx4="http://schemas.microsoft.com/office/drawing/2016/5/10/chartex" xmlns:cx5="http://schemas.microsoft.com/office/drawing/2016/5/11/chartex" xmlns:cx6="http://schemas.microsoft.com/office/drawing/2016/5/12/chartex" xmlns:cx7="http://schemas.microsoft.com/office/drawing/2016/5/13/chartex" xmlns:cx8="http://schemas.microsoft.com/office/drawing/2016/5/14/chartex" xmlns:mc="http://schemas.openxmlformats.org/markup-compatibility/2006" xmlns:aink="http://schemas.microsoft.com/office/drawing/2016/ink" xmlns:am3d="http://schemas.microsoft.com/office/drawing/2017/model3d" xmlns:o="urn:schemas-microsoft-com:office:office" xmlns:oel="http://schemas.microsoft.com/office/2019/extlst" xmlns:r="http://schemas.openxmlformats.org/officeDocument/2006/relationships" xmlns:m="http://schemas.openxmlformats.org/officeDocument/2006/math" xmlns:v="urn:schemas-microsoft-com:vml" xmlns:wp14="http://schemas.microsoft.com/office/word/2010/wordprocessingDrawing" xmlns:wp="http://schemas.openxmlformats.org/drawingml/2006/wordprocessingDrawing" xmlns:w10="urn:schemas-microsoft-com:office:word" xmlns:w="http://schemas.openxmlformats.org/wordprocessingml/2006/main" xmlns:w14="http://schemas.microsoft.com/office/word/2010/wordml" xmlns:w15="http://schemas.microsoft.com/office/word/2012/wordml" xmlns:w16cex="http://schemas.microsoft.com/office/word/2018/wordml/cex" xmlns:w16cid="http://schemas.microsoft.com/office/word/2016/wordml/cid" xmlns:w16="http://schemas.microsoft.com/office/word/2018/wordml" xmlns:w16du="http://schemas.microsoft.com/office/word/2023/wordml/word16du" xmlns:w16sdtdh="http://schemas.microsoft.com/office/word/2020/wordml/sdtdatahash" xmlns:w16sdtfl="http://schemas.microsoft.com/office/word/2024/wordml/sdtformatlock" xmlns:w16se="http://schemas.microsoft.com/office/word/2015/wordml/symex" xmlns:wpg="http://schemas.microsoft.com/office/word/2010/wordprocessingGroup" xmlns:wpi="http://schemas.microsoft.com/office/word/2010/wordprocessingInk" xmlns:wne="http://schemas.microsoft.com/office/word/2006/wordml" xmlns:wps="http://schemas.microsoft.com/office/word/2010/wordprocessingShape" mc:Ignorable="w14 w15 w16se w16cid w16 w16cex w16sdtdh w16sdtfl w16du wp14">
-  <w:docParts>
-    <w:docPart>
-      <w:docPartPr>
-        <w:name w:val="F099E52B622147899990FA8EB9929F0F"/>
-        <w:category>
-          <w:name w:val="General"/>
-          <w:gallery w:val="placeholder"/>
-        </w:category>
-        <w:types>
-          <w:type w:val="bbPlcHdr"/>
-        </w:types>
-        <w:behaviors>
-          <w:behavior w:val="content"/>
-        </w:behaviors>
-        <w:guid w:val="{45505313-4613-4D5E-8092-90B5AF989865}"/>
-      </w:docPartPr>
-      <w:docPartBody>
-        <w:p>
-          <w:pPr>
-            <w:pStyle w:val="F099E52B622147899990FA8EB9929F0F"/>
-          </w:pPr>
-          <w:r>
-            <w:t>[Type here]</w:t>
-          </w:r>
-        </w:p>
-      </w:docPartBody>
-    </w:docPart>
-  </w:docParts>
-</w:glossaryDocument>
-</file>
-
-<file path=word/glossary/fontTable.xml><?xml version="1.0" encoding="utf-8"?>
-<w:fonts xmlns:mc="http://schemas.openxmlformats.org/markup-compatibility/2006" xmlns:r="http://schemas.openxmlformats.org/officeDocument/2006/relationships" xmlns:w="http://schemas.openxmlformats.org/wordprocessingml/2006/main" xmlns:w14="http://schemas.microsoft.com/office/word/2010/wordml" xmlns:w15="http://schemas.microsoft.com/office/word/2012/wordml" xmlns:w16cex="http://schemas.microsoft.com/office/word/2018/wordml/cex" xmlns:w16cid="http://schemas.microsoft.com/office/word/2016/wordml/cid" xmlns:w16="http://schemas.microsoft.com/office/word/2018/wordml" xmlns:w16du="http://schemas.microsoft.com/office/word/2023/wordml/word16du" xmlns:w16sdtdh="http://schemas.microsoft.com/office/word/2020/wordml/sdtdatahash" xmlns:w16sdtfl="http://schemas.microsoft.com/office/word/2024/wordml/sdtformatlock" xmlns:w16se="http://schemas.microsoft.com/office/word/2015/wordml/symex" mc:Ignorable="w14 w15 w16se w16cid w16 w16cex w16sdtdh w16sdtfl w16du">
-  <w:font w:name="Symbol">
-    <w:panose1 w:val="05050102010706020507"/>
-    <w:charset w:val="02"/>
-    <w:family w:val="roman"/>
-    <w:pitch w:val="variable"/>
-    <w:sig w:usb0="00000000" w:usb1="10000000" w:usb2="00000000" w:usb3="00000000" w:csb0="80000000" w:csb1="00000000"/>
-  </w:font>
-  <w:font w:name="Times New Roman">
-    <w:panose1 w:val="02020603050405020304"/>
-    <w:charset w:val="00"/>
-    <w:family w:val="roman"/>
-    <w:pitch w:val="variable"/>
-    <w:sig w:usb0="E0002EFF" w:usb1="C000785B" w:usb2="00000009" w:usb3="00000000" w:csb0="000001FF" w:csb1="00000000"/>
-  </w:font>
-  <w:font w:name="Courier New">
-    <w:panose1 w:val="02070309020205020404"/>
-    <w:charset w:val="00"/>
-    <w:family w:val="modern"/>
-    <w:pitch w:val="fixed"/>
-    <w:sig w:usb0="E0002EFF" w:usb1="C0007843" w:usb2="00000009" w:usb3="00000000" w:csb0="000001FF" w:csb1="00000000"/>
-  </w:font>
-  <w:font w:name="Wingdings">
-    <w:panose1 w:val="05000000000000000000"/>
-    <w:charset w:val="02"/>
-    <w:family w:val="auto"/>
-    <w:pitch w:val="variable"/>
-    <w:sig w:usb0="00000000" w:usb1="10000000" w:usb2="00000000" w:usb3="00000000" w:csb0="80000000" w:csb1="00000000"/>
-  </w:font>
-  <w:font w:name="Calibri">
-    <w:panose1 w:val="020F0502020204030204"/>
-    <w:charset w:val="00"/>
-    <w:family w:val="swiss"/>
-    <w:pitch w:val="variable"/>
-    <w:sig w:usb0="E4002EFF" w:usb1="C200247B" w:usb2="00000009" w:usb3="00000000" w:csb0="000001FF" w:csb1="00000000"/>
-  </w:font>
-  <w:font w:name="Calibri Light">
-    <w:panose1 w:val="020F0302020204030204"/>
-    <w:charset w:val="00"/>
-    <w:family w:val="swiss"/>
-    <w:pitch w:val="variable"/>
-    <w:sig w:usb0="E4002EFF" w:usb1="C200247B" w:usb2="00000009" w:usb3="00000000" w:csb0="000001FF" w:csb1="00000000"/>
-  </w:font>
-  <w:font w:name="Arial">
-    <w:panose1 w:val="020B0604020202020204"/>
-    <w:charset w:val="00"/>
-    <w:family w:val="swiss"/>
-    <w:pitch w:val="variable"/>
-    <w:sig w:usb0="E0002EFF" w:usb1="C000785B" w:usb2="00000009" w:usb3="00000000" w:csb0="000001FF" w:csb1="00000000"/>
-  </w:font>
-  <w:font w:name="Aptos">
-    <w:charset w:val="00"/>
-    <w:family w:val="swiss"/>
-    <w:pitch w:val="variable"/>
-    <w:sig w:usb0="20000287" w:usb1="00000003" w:usb2="00000000" w:usb3="00000000" w:csb0="0000019F" w:csb1="00000000"/>
-  </w:font>
-  <w:font w:name="Aptos Display">
-    <w:charset w:val="00"/>
-    <w:family w:val="swiss"/>
-    <w:pitch w:val="variable"/>
-    <w:sig w:usb0="20000287" w:usb1="00000003" w:usb2="00000000" w:usb3="00000000" w:csb0="0000019F" w:csb1="00000000"/>
-  </w:font>
-</w:fonts>
-</file>
-
-<file path=word/glossary/settings.xml><?xml version="1.0" encoding="utf-8"?>
-<w:settings xmlns:mc="http://schemas.openxmlformats.org/markup-compatibility/2006" xmlns:o="urn:schemas-microsoft-com:office:office" xmlns:r="http://schemas.openxmlformats.org/officeDocument/2006/relationships" xmlns:m="http://schemas.openxmlformats.org/officeDocument/2006/math" xmlns:v="urn:schemas-microsoft-com:vml" xmlns:w10="urn:schemas-microsoft-com:office:word" xmlns:w="http://schemas.openxmlformats.org/wordprocessingml/2006/main" xmlns:w14="http://schemas.microsoft.com/office/word/2010/wordml" xmlns:w15="http://schemas.microsoft.com/office/word/2012/wordml" xmlns:w16cex="http://schemas.microsoft.com/office/word/2018/wordml/cex" xmlns:w16cid="http://schemas.microsoft.com/office/word/2016/wordml/cid" xmlns:w16="http://schemas.microsoft.com/office/word/2018/wordml" xmlns:w16du="http://schemas.microsoft.com/office/word/2023/wordml/word16du" xmlns:w16sdtdh="http://schemas.microsoft.com/office/word/2020/wordml/sdtdatahash" xmlns:w16sdtfl="http://schemas.microsoft.com/office/word/2024/wordml/sdtformatlock" xmlns:w16se="http://schemas.microsoft.com/office/word/2015/wordml/symex" xmlns:sl="http://schemas.openxmlformats.org/schemaLibrary/2006/main" mc:Ignorable="w14 w15 w16se w16cid w16 w16cex w16sdtdh w16sdtfl w16du">
-  <w:view w:val="normal"/>
-  <w:defaultTabStop w:val="720"/>
-  <w:characterSpacingControl w:val="doNotCompress"/>
-  <w:compat>
-    <w:useFELayout/>
-    <w:compatSetting w:name="compatibilityMode" w:uri="http://schemas.microsoft.com/office/word" w:val="15"/>
-    <w:compatSetting w:name="overrideTableStyleFontSizeAndJustification" w:uri="http://schemas.microsoft.com/office/word" w:val="1"/>
-    <w:compatSetting w:name="enableOpenTypeFeatures" w:uri="http://schemas.microsoft.com/office/word" w:val="1"/>
-    <w:compatSetting w:name="doNotFlipMirrorIndents" w:uri="http://schemas.microsoft.com/office/word" w:val="1"/>
-    <w:compatSetting w:name="differentiateMultirowTableHeaders" w:uri="http://schemas.microsoft.com/office/word" w:val="1"/>
-    <w:compatSetting w:name="useWord2013TrackBottomHyphenation" w:uri="http://schemas.microsoft.com/office/word" w:val="0"/>
-  </w:compat>
-  <w:rsids>
-    <w:rsidRoot w:val="0028766F"/>
-    <w:rsid w:val="000F4124"/>
-    <w:rsid w:val="0028766F"/>
-    <w:rsid w:val="003A7EE9"/>
-    <w:rsid w:val="006F1605"/>
-    <w:rsid w:val="00742BAC"/>
-    <w:rsid w:val="008828F7"/>
-    <w:rsid w:val="00977BC4"/>
-    <w:rsid w:val="00CA4A96"/>
-  </w:rsids>
-  <m:mathPr>
-    <m:mathFont m:val="Cambria Math"/>
-    <m:brkBin m:val="before"/>
-    <m:brkBinSub m:val="--"/>
-    <m:smallFrac m:val="0"/>
-    <m:dispDef/>
-    <m:lMargin m:val="0"/>
-    <m:rMargin m:val="0"/>
-    <m:defJc m:val="centerGroup"/>
-    <m:wrapIndent m:val="1440"/>
-    <m:intLim m:val="subSup"/>
-    <m:naryLim m:val="undOvr"/>
-  </m:mathPr>
-  <w:themeFontLang w:val="en-IE"/>
-  <w:clrSchemeMapping w:bg1="light1" w:t1="dark1" w:bg2="light2" w:t2="dark2" w:accent1="accent1" w:accent2="accent2" w:accent3="accent3" w:accent4="accent4" w:accent5="accent5" w:accent6="accent6" w:hyperlink="hyperlink" w:followedHyperlink="followedHyperlink"/>
-  <w:decimalSymbol w:val="."/>
-  <w:listSeparator w:val=","/>
-  <w15:chartTrackingRefBased/>
-</w:settings>
-</file>
-
-<file path=word/glossary/styles.xml><?xml version="1.0" encoding="utf-8"?>
-<w:styles xmlns:mc="http://schemas.openxmlformats.org/markup-compatibility/2006" xmlns:r="http://schemas.openxmlformats.org/officeDocument/2006/relationships" xmlns:w="http://schemas.openxmlformats.org/wordprocessingml/2006/main" xmlns:w14="http://schemas.microsoft.com/office/word/2010/wordml" xmlns:w15="http://schemas.microsoft.com/office/word/2012/wordml" xmlns:w16cex="http://schemas.microsoft.com/office/word/2018/wordml/cex" xmlns:w16cid="http://schemas.microsoft.com/office/word/2016/wordml/cid" xmlns:w16="http://schemas.microsoft.com/office/word/2018/wordml" xmlns:w16du="http://schemas.microsoft.com/office/word/2023/wordml/word16du" xmlns:w16sdtdh="http://schemas.microsoft.com/office/word/2020/wordml/sdtdatahash" xmlns:w16sdtfl="http://schemas.microsoft.com/office/word/2024/wordml/sdtformatlock" xmlns:w16se="http://schemas.microsoft.com/office/word/2015/wordml/symex" mc:Ignorable="w14 w15 w16se w16cid w16 w16cex w16sdtdh w16sdtfl w16du">
-  <w:docDefaults>
-    <w:rPrDefault>
-      <w:rPr>
-        <w:rFonts w:asciiTheme="minorHAnsi" w:eastAsiaTheme="minorEastAsia" w:hAnsiTheme="minorHAnsi" w:cstheme="minorBidi"/>
-        <w:kern w:val="2"/>
-        <w:sz w:val="24"/>
-        <w:szCs w:val="24"/>
-        <w:lang w:val="en-IE" w:eastAsia="en-IE" w:bidi="ar-SA"/>
-        <w14:ligatures w14:val="standardContextual"/>
-      </w:rPr>
-    </w:rPrDefault>
-    <w:pPrDefault>
-      <w:pPr>
-        <w:spacing w:after="160" w:line="278" w:lineRule="auto"/>
-      </w:pPr>
-    </w:pPrDefault>
-  </w:docDefaults>
-  <w:latentStyles w:defLockedState="0" w:defUIPriority="99" w:defSemiHidden="0" w:defUnhideWhenUsed="0" w:defQFormat="0" w:count="376">
-    <w:lsdException w:name="Normal" w:uiPriority="0" w:qFormat="1"/>
-    <w:lsdException w:name="heading 1" w:uiPriority="9" w:qFormat="1"/>
-    <w:lsdException w:name="heading 2" w:semiHidden="1" w:uiPriority="9" w:unhideWhenUsed="1" w:qFormat="1"/>
-    <w:lsdException w:name="heading 3" w:semiHidden="1" w:uiPriority="9" w:unhideWhenUsed="1" w:qFormat="1"/>
-    <w:lsdException w:name="heading 4" w:semiHidden="1" w:uiPriority="9" w:unhideWhenUsed="1" w:qFormat="1"/>
-    <w:lsdException w:name="heading 5" w:semiHidden="1" w:uiPriority="9" w:unhideWhenUsed="1" w:qFormat="1"/>
-    <w:lsdException w:name="heading 6" w:semiHidden="1" w:uiPriority="9" w:unhideWhenUsed="1" w:qFormat="1"/>
-    <w:lsdException w:name="heading 7" w:semiHidden="1" w:uiPriority="9" w:unhideWhenUsed="1" w:qFormat="1"/>
-    <w:lsdException w:name="heading 8" w:semiHidden="1" w:uiPriority="9" w:unhideWhenUsed="1" w:qFormat="1"/>
-    <w:lsdException w:name="heading 9" w:semiHidden="1" w:uiPriority="9" w:unhideWhenUsed="1" w:qFormat="1"/>
-    <w:lsdException w:name="index 1" w:semiHidden="1" w:unhideWhenUsed="1"/>
-    <w:lsdException w:name="index 2" w:semiHidden="1" w:unhideWhenUsed="1"/>
-    <w:lsdException w:name="index 3" w:semiHidden="1" w:unhideWhenUsed="1"/>
-    <w:lsdException w:name="index 4" w:semiHidden="1" w:unhideWhenUsed="1"/>
-    <w:lsdException w:name="index 5" w:semiHidden="1" w:unhideWhenUsed="1"/>
-    <w:lsdException w:name="index 6" w:semiHidden="1" w:unhideWhenUsed="1"/>
-    <w:lsdException w:name="index 7" w:semiHidden="1" w:unhideWhenUsed="1"/>
-    <w:lsdException w:name="index 8" w:semiHidden="1" w:unhideWhenUsed="1"/>
-    <w:lsdException w:name="index 9" w:semiHidden="1" w:unhideWhenUsed="1"/>
-    <w:lsdException w:name="toc 1" w:semiHidden="1" w:uiPriority="39" w:unhideWhenUsed="1"/>
-    <w:lsdException w:name="toc 2" w:semiHidden="1" w:uiPriority="39" w:unhideWhenUsed="1"/>
-    <w:lsdException w:name="toc 3" w:semiHidden="1" w:uiPriority="39" w:unhideWhenUsed="1"/>
-    <w:lsdException w:name="toc 4" w:semiHidden="1" w:uiPriority="39" w:unhideWhenUsed="1"/>
-    <w:lsdException w:name="toc 5" w:semiHidden="1" w:uiPriority="39" w:unhideWhenUsed="1"/>
-    <w:lsdException w:name="toc 6" w:semiHidden="1" w:uiPriority="39" w:unhideWhenUsed="1"/>
-    <w:lsdException w:name="toc 7" w:semiHidden="1" w:uiPriority="39" w:unhideWhenUsed="1"/>
-    <w:lsdException w:name="toc 8" w:semiHidden="1" w:uiPriority="39" w:unhideWhenUsed="1"/>
-    <w:lsdException w:name="toc 9" w:semiHidden="1" w:uiPriority="39" w:unhideWhenUsed="1"/>
-    <w:lsdException w:name="Normal Indent" w:semiHidden="1" w:unhideWhenUsed="1"/>
-    <w:lsdException w:name="footnote text" w:semiHidden="1" w:unhideWhenUsed="1"/>
-    <w:lsdException w:name="annotation text" w:semiHidden="1" w:unhideWhenUsed="1"/>
-    <w:lsdException w:name="header" w:semiHidden="1" w:unhideWhenUsed="1"/>
-    <w:lsdException w:name="footer" w:semiHidden="1" w:unhideWhenUsed="1"/>
-    <w:lsdException w:name="index heading" w:semiHidden="1" w:unhideWhenUsed="1"/>
-    <w:lsdException w:name="caption" w:semiHidden="1" w:uiPriority="35" w:unhideWhenUsed="1" w:qFormat="1"/>
-    <w:lsdException w:name="table of figures" w:semiHidden="1" w:unhideWhenUsed="1"/>
-    <w:lsdException w:name="envelope address" w:semiHidden="1" w:unhideWhenUsed="1"/>
-    <w:lsdException w:name="envelope return" w:semiHidden="1" w:unhideWhenUsed="1"/>
-    <w:lsdException w:name="footnote reference" w:semiHidden="1" w:unhideWhenUsed="1"/>
-    <w:lsdException w:name="annotation reference" w:semiHidden="1" w:unhideWhenUsed="1"/>
-    <w:lsdException w:name="line number" w:semiHidden="1" w:unhideWhenUsed="1"/>
-    <w:lsdException w:name="page number" w:semiHidden="1" w:unhideWhenUsed="1"/>
-    <w:lsdException w:name="endnote reference" w:semiHidden="1" w:unhideWhenUsed="1"/>
-    <w:lsdException w:name="endnote text" w:semiHidden="1" w:unhideWhenUsed="1"/>
-    <w:lsdException w:name="table of authorities" w:semiHidden="1" w:unhideWhenUsed="1"/>
-    <w:lsdException w:name="macro" w:semiHidden="1" w:unhideWhenUsed="1"/>
-    <w:lsdException w:name="toa heading" w:semiHidden="1" w:unhideWhenUsed="1"/>
-    <w:lsdException w:name="List" w:semiHidden="1" w:unhideWhenUsed="1"/>
-    <w:lsdException w:name="List Bullet" w:semiHidden="1" w:unhideWhenUsed="1"/>
-    <w:lsdException w:name="List Number" w:semiHidden="1" w:unhideWhenUsed="1"/>
-    <w:lsdException w:name="List 2" w:semiHidden="1" w:unhideWhenUsed="1"/>
-    <w:lsdException w:name="List 3" w:semiHidden="1" w:unhideWhenUsed="1"/>
-    <w:lsdException w:name="List 4" w:semiHidden="1" w:unhideWhenUsed="1"/>
-    <w:lsdException w:name="List 5" w:semiHidden="1" w:unhideWhenUsed="1"/>
-    <w:lsdException w:name="List Bullet 2" w:semiHidden="1" w:unhideWhenUsed="1"/>
-    <w:lsdException w:name="List Bullet 3" w:semiHidden="1" w:unhideWhenUsed="1"/>
-    <w:lsdException w:name="List Bullet 4" w:semiHidden="1" w:unhideWhenUsed="1"/>
-    <w:lsdException w:name="List Bullet 5" w:semiHidden="1" w:unhideWhenUsed="1"/>
-    <w:lsdException w:name="List Number 2" w:semiHidden="1" w:unhideWhenUsed="1"/>
-    <w:lsdException w:name="List Number 3" w:semiHidden="1" w:unhideWhenUsed="1"/>
-    <w:lsdException w:name="List Number 4" w:semiHidden="1" w:unhideWhenUsed="1"/>
-    <w:lsdException w:name="List Number 5" w:semiHidden="1" w:unhideWhenUsed="1"/>
-    <w:lsdException w:name="Title" w:uiPriority="10" w:qFormat="1"/>
-    <w:lsdException w:name="Closing" w:semiHidden="1" w:unhideWhenUsed="1"/>
-    <w:lsdException w:name="Signature" w:semiHidden="1" w:unhideWhenUsed="1"/>
-    <w:lsdException w:name="Default Paragraph Font" w:semiHidden="1" w:uiPriority="1" w:unhideWhenUsed="1"/>
-    <w:lsdException w:name="Body Text" w:semiHidden="1" w:unhideWhenUsed="1"/>
-    <w:lsdException w:name="Body Text Indent" w:semiHidden="1" w:unhideWhenUsed="1"/>
-    <w:lsdException w:name="List Continue" w:semiHidden="1" w:unhideWhenUsed="1"/>
-    <w:lsdException w:name="List Continue 2" w:semiHidden="1" w:unhideWhenUsed="1"/>
-    <w:lsdException w:name="List Continue 3" w:semiHidden="1" w:unhideWhenUsed="1"/>
-    <w:lsdException w:name="List Continue 4" w:semiHidden="1" w:unhideWhenUsed="1"/>
-    <w:lsdException w:name="List Continue 5" w:semiHidden="1" w:unhideWhenUsed="1"/>
-    <w:lsdException w:name="Message Header" w:semiHidden="1" w:unhideWhenUsed="1"/>
-    <w:lsdException w:name="Subtitle" w:uiPriority="11" w:qFormat="1"/>
-    <w:lsdException w:name="Salutation" w:semiHidden="1" w:unhideWhenUsed="1"/>
-    <w:lsdException w:name="Date" w:semiHidden="1" w:unhideWhenUsed="1"/>
-    <w:lsdException w:name="Body Text First Indent" w:semiHidden="1" w:unhideWhenUsed="1"/>
-    <w:lsdException w:name="Body Text First Indent 2" w:semiHidden="1" w:unhideWhenUsed="1"/>
-    <w:lsdException w:name="Note Heading" w:semiHidden="1" w:unhideWhenUsed="1"/>
-    <w:lsdException w:name="Body Text 2" w:semiHidden="1" w:unhideWhenUsed="1"/>
-    <w:lsdException w:name="Body Text 3" w:semiHidden="1" w:unhideWhenUsed="1"/>
-    <w:lsdException w:name="Body Text Indent 2" w:semiHidden="1" w:unhideWhenUsed="1"/>
-    <w:lsdException w:name="Body Text Indent 3" w:semiHidden="1" w:unhideWhenUsed="1"/>
-    <w:lsdException w:name="Block Text" w:semiHidden="1" w:unhideWhenUsed="1"/>
-    <w:lsdException w:name="Hyperlink" w:semiHidden="1" w:unhideWhenUsed="1"/>
-    <w:lsdException w:name="FollowedHyperlink" w:semiHidden="1" w:unhideWhenUsed="1"/>
-    <w:lsdException w:name="Strong" w:uiPriority="22" w:qFormat="1"/>
-    <w:lsdException w:name="Emphasis" w:uiPriority="20" w:qFormat="1"/>
-    <w:lsdException w:name="Document Map" w:semiHidden="1" w:unhideWhenUsed="1"/>
-    <w:lsdException w:name="Plain Text" w:semiHidden="1" w:unhideWhenUsed="1"/>
-    <w:lsdException w:name="E-mail Signature" w:semiHidden="1" w:unhideWhenUsed="1"/>
-    <w:lsdException w:name="HTML Top of Form" w:semiHidden="1" w:unhideWhenUsed="1"/>
-    <w:lsdException w:name="HTML Bottom of Form" w:semiHidden="1" w:unhideWhenUsed="1"/>
-    <w:lsdException w:name="Normal (Web)" w:semiHidden="1" w:unhideWhenUsed="1"/>
-    <w:lsdException w:name="HTML Acronym" w:semiHidden="1" w:unhideWhenUsed="1"/>
-    <w:lsdException w:name="HTML Address" w:semiHidden="1" w:unhideWhenUsed="1"/>
-    <w:lsdException w:name="HTML Cite" w:semiHidden="1" w:unhideWhenUsed="1"/>
-    <w:lsdException w:name="HTML Code" w:semiHidden="1" w:unhideWhenUsed="1"/>
-    <w:lsdException w:name="HTML Definition" w:semiHidden="1" w:unhideWhenUsed="1"/>
-    <w:lsdException w:name="HTML Keyboard" w:semiHidden="1" w:unhideWhenUsed="1"/>
-    <w:lsdException w:name="HTML Preformatted" w:semiHidden="1" w:unhideWhenUsed="1"/>
-    <w:lsdException w:name="HTML Sample" w:semiHidden="1" w:unhideWhenUsed="1"/>
-    <w:lsdException w:name="HTML Typewriter" w:semiHidden="1" w:unhideWhenUsed="1"/>
-    <w:lsdException w:name="HTML Variable" w:semiHidden="1" w:unhideWhenUsed="1"/>
-    <w:lsdException w:name="Normal Table" w:semiHidden="1" w:unhideWhenUsed="1"/>
-    <w:lsdException w:name="annotation subject" w:semiHidden="1" w:unhideWhenUsed="1"/>
-    <w:lsdException w:name="No List" w:semiHidden="1" w:unhideWhenUsed="1"/>
-    <w:lsdException w:name="Outline List 1" w:semiHidden="1" w:unhideWhenUsed="1"/>
-    <w:lsdException w:name="Outline List 2" w:semiHidden="1" w:unhideWhenUsed="1"/>
-    <w:lsdException w:name="Outline List 3" w:semiHidden="1" w:unhideWhenUsed="1"/>
-    <w:lsdException w:name="Table Simple 1" w:semiHidden="1" w:unhideWhenUsed="1"/>
-    <w:lsdException w:name="Table Simple 2" w:semiHidden="1" w:unhideWhenUsed="1"/>
-    <w:lsdException w:name="Table Simple 3" w:semiHidden="1" w:unhideWhenUsed="1"/>
-    <w:lsdException w:name="Table Classic 1" w:semiHidden="1" w:unhideWhenUsed="1"/>
-    <w:lsdException w:name="Table Classic 2" w:semiHidden="1" w:unhideWhenUsed="1"/>
-    <w:lsdException w:name="Table Classic 3" w:semiHidden="1" w:unhideWhenUsed="1"/>
-    <w:lsdException w:name="Table Classic 4" w:semiHidden="1" w:unhideWhenUsed="1"/>
-    <w:lsdException w:name="Table Colorful 1" w:semiHidden="1" w:unhideWhenUsed="1"/>
-    <w:lsdException w:name="Table Colorful 2" w:semiHidden="1" w:unhideWhenUsed="1"/>
-    <w:lsdException w:name="Table Colorful 3" w:semiHidden="1" w:unhideWhenUsed="1"/>
-    <w:lsdException w:name="Table Columns 1" w:semiHidden="1" w:unhideWhenUsed="1"/>
-    <w:lsdException w:name="Table Columns 2" w:semiHidden="1" w:unhideWhenUsed="1"/>
-    <w:lsdException w:name="Table Columns 3" w:semiHidden="1" w:unhideWhenUsed="1"/>
-    <w:lsdException w:name="Table Columns 4" w:semiHidden="1" w:unhideWhenUsed="1"/>
-    <w:lsdException w:name="Table Columns 5" w:semiHidden="1" w:unhideWhenUsed="1"/>
-    <w:lsdException w:name="Table Grid 1" w:semiHidden="1" w:unhideWhenUsed="1"/>
-    <w:lsdException w:name="Table Grid 2" w:semiHidden="1" w:unhideWhenUsed="1"/>
-    <w:lsdException w:name="Table Grid 3" w:semiHidden="1" w:unhideWhenUsed="1"/>
-    <w:lsdException w:name="Table Grid 4" w:semiHidden="1" w:unhideWhenUsed="1"/>
-    <w:lsdException w:name="Table Grid 5" w:semiHidden="1" w:unhideWhenUsed="1"/>
-    <w:lsdException w:name="Table Grid 6" w:semiHidden="1" w:unhideWhenUsed="1"/>
-    <w:lsdException w:name="Table Grid 7" w:semiHidden="1" w:unhideWhenUsed="1"/>
-    <w:lsdException w:name="Table Grid 8" w:semiHidden="1" w:unhideWhenUsed="1"/>
-    <w:lsdException w:name="Table List 1" w:semiHidden="1" w:unhideWhenUsed="1"/>
-    <w:lsdException w:name="Table List 2" w:semiHidden="1" w:unhideWhenUsed="1"/>
-    <w:lsdException w:name="Table List 3" w:semiHidden="1" w:unhideWhenUsed="1"/>
-    <w:lsdException w:name="Table List 4" w:semiHidden="1" w:unhideWhenUsed="1"/>
-    <w:lsdException w:name="Table List 5" w:semiHidden="1" w:unhideWhenUsed="1"/>
-    <w:lsdException w:name="Table List 6" w:semiHidden="1" w:unhideWhenUsed="1"/>
-    <w:lsdException w:name="Table List 7" w:semiHidden="1" w:unhideWhenUsed="1"/>
-    <w:lsdException w:name="Table List 8" w:semiHidden="1" w:unhideWhenUsed="1"/>
-    <w:lsdException w:name="Table 3D effects 1" w:semiHidden="1" w:unhideWhenUsed="1"/>
-    <w:lsdException w:name="Table 3D effects 2" w:semiHidden="1" w:unhideWhenUsed="1"/>
-    <w:lsdException w:name="Table 3D effects 3" w:semiHidden="1" w:unhideWhenUsed="1"/>
-    <w:lsdException w:name="Table Contemporary" w:semiHidden="1" w:unhideWhenUsed="1"/>
-    <w:lsdException w:name="Table Elegant" w:semiHidden="1" w:unhideWhenUsed="1"/>
-    <w:lsdException w:name="Table Professional" w:semiHidden="1" w:unhideWhenUsed="1"/>
-    <w:lsdException w:name="Table Subtle 1" w:semiHidden="1" w:unhideWhenUsed="1"/>
-    <w:lsdException w:name="Table Subtle 2" w:semiHidden="1" w:unhideWhenUsed="1"/>
-    <w:lsdException w:name="Table Web 1" w:semiHidden="1" w:unhideWhenUsed="1"/>
-    <w:lsdException w:name="Table Web 2" w:semiHidden="1" w:unhideWhenUsed="1"/>
-    <w:lsdException w:name="Table Web 3" w:semiHidden="1" w:unhideWhenUsed="1"/>
-    <w:lsdException w:name="Balloon Text" w:semiHidden="1" w:unhideWhenUsed="1"/>
-    <w:lsdException w:name="Table Grid" w:uiPriority="39"/>
-    <w:lsdException w:name="Table Theme" w:semiHidden="1" w:unhideWhenUsed="1"/>
-    <w:lsdException w:name="Placeholder Text" w:semiHidden="1"/>
-    <w:lsdException w:name="No Spacing" w:uiPriority="1" w:qFormat="1"/>
-    <w:lsdException w:name="Light Shading" w:uiPriority="60"/>
-    <w:lsdException w:name="Light List" w:uiPriority="61"/>
-    <w:lsdException w:name="Light Grid" w:uiPriority="62"/>
-    <w:lsdException w:name="Medium Shading 1" w:uiPriority="63"/>
-    <w:lsdException w:name="Medium Shading 2" w:uiPriority="64"/>
-    <w:lsdException w:name="Medium List 1" w:uiPriority="65"/>
-    <w:lsdException w:name="Medium List 2" w:uiPriority="66"/>
-    <w:lsdException w:name="Medium Grid 1" w:uiPriority="67"/>
-    <w:lsdException w:name="Medium Grid 2" w:uiPriority="68"/>
-    <w:lsdException w:name="Medium Grid 3" w:uiPriority="69"/>
-    <w:lsdException w:name="Dark List" w:uiPriority="70"/>
-    <w:lsdException w:name="Colorful Shading" w:uiPriority="71"/>
-    <w:lsdException w:name="Colorful List" w:uiPriority="72"/>
-    <w:lsdException w:name="Colorful Grid" w:uiPriority="73"/>
-    <w:lsdException w:name="Light Shading Accent 1" w:uiPriority="60"/>
-    <w:lsdException w:name="Light List Accent 1" w:uiPriority="61"/>
-    <w:lsdException w:name="Light Grid Accent 1" w:uiPriority="62"/>
-    <w:lsdException w:name="Medium Shading 1 Accent 1" w:uiPriority="63"/>
-    <w:lsdException w:name="Medium Shading 2 Accent 1" w:uiPriority="64"/>
-    <w:lsdException w:name="Medium List 1 Accent 1" w:uiPriority="65"/>
-    <w:lsdException w:name="Revision" w:semiHidden="1"/>
-    <w:lsdException w:name="List Paragraph" w:uiPriority="34" w:qFormat="1"/>
-    <w:lsdException w:name="Quote" w:uiPriority="29" w:qFormat="1"/>
-    <w:lsdException w:name="Intense Quote" w:uiPriority="30" w:qFormat="1"/>
-    <w:lsdException w:name="Medium List 2 Accent 1" w:uiPriority="66"/>
-    <w:lsdException w:name="Medium Grid 1 Accent 1" w:uiPriority="67"/>
-    <w:lsdException w:name="Medium Grid 2 Accent 1" w:uiPriority="68"/>
-    <w:lsdException w:name="Medium Grid 3 Accent 1" w:uiPriority="69"/>
-    <w:lsdException w:name="Dark List Accent 1" w:uiPriority="70"/>
-    <w:lsdException w:name="Colorful Shading Accent 1" w:uiPriority="71"/>
-    <w:lsdException w:name="Colorful List Accent 1" w:uiPriority="72"/>
-    <w:lsdException w:name="Colorful Grid Accent 1" w:uiPriority="73"/>
-    <w:lsdException w:name="Light Shading Accent 2" w:uiPriority="60"/>
-    <w:lsdException w:name="Light List Accent 2" w:uiPriority="61"/>
-    <w:lsdException w:name="Light Grid Accent 2" w:uiPriority="62"/>
-    <w:lsdException w:name="Medium Shading 1 Accent 2" w:uiPriority="63"/>
-    <w:lsdException w:name="Medium Shading 2 Accent 2" w:uiPriority="64"/>
-    <w:lsdException w:name="Medium List 1 Accent 2" w:uiPriority="65"/>
-    <w:lsdException w:name="Medium List 2 Accent 2" w:uiPriority="66"/>
-    <w:lsdException w:name="Medium Grid 1 Accent 2" w:uiPriority="67"/>
-    <w:lsdException w:name="Medium Grid 2 Accent 2" w:uiPriority="68"/>
-    <w:lsdException w:name="Medium Grid 3 Accent 2" w:uiPriority="69"/>
-    <w:lsdException w:name="Dark List Accent 2" w:uiPriority="70"/>
-    <w:lsdException w:name="Colorful Shading Accent 2" w:uiPriority="71"/>
-    <w:lsdException w:name="Colorful List Accent 2" w:uiPriority="72"/>
-    <w:lsdException w:name="Colorful Grid Accent 2" w:uiPriority="73"/>
-    <w:lsdException w:name="Light Shading Accent 3" w:uiPriority="60"/>
-    <w:lsdException w:name="Light List Accent 3" w:uiPriority="61"/>
-    <w:lsdException w:name="Light Grid Accent 3" w:uiPriority="62"/>
-    <w:lsdException w:name="Medium Shading 1 Accent 3" w:uiPriority="63"/>
-    <w:lsdException w:name="Medium Shading 2 Accent 3" w:uiPriority="64"/>
-    <w:lsdException w:name="Medium List 1 Accent 3" w:uiPriority="65"/>
-    <w:lsdException w:name="Medium List 2 Accent 3" w:uiPriority="66"/>
-    <w:lsdException w:name="Medium Grid 1 Accent 3" w:uiPriority="67"/>
-    <w:lsdException w:name="Medium Grid 2 Accent 3" w:uiPriority="68"/>
-    <w:lsdException w:name="Medium Grid 3 Accent 3" w:uiPriority="69"/>
-    <w:lsdException w:name="Dark List Accent 3" w:uiPriority="70"/>
-    <w:lsdException w:name="Colorful Shading Accent 3" w:uiPriority="71"/>
-    <w:lsdException w:name="Colorful List Accent 3" w:uiPriority="72"/>
-    <w:lsdException w:name="Colorful Grid Accent 3" w:uiPriority="73"/>
-    <w:lsdException w:name="Light Shading Accent 4" w:uiPriority="60"/>
-    <w:lsdException w:name="Light List Accent 4" w:uiPriority="61"/>
-    <w:lsdException w:name="Light Grid Accent 4" w:uiPriority="62"/>
-    <w:lsdException w:name="Medium Shading 1 Accent 4" w:uiPriority="63"/>
-    <w:lsdException w:name="Medium Shading 2 Accent 4" w:uiPriority="64"/>
-    <w:lsdException w:name="Medium List 1 Accent 4" w:uiPriority="65"/>
-    <w:lsdException w:name="Medium List 2 Accent 4" w:uiPriority="66"/>
-    <w:lsdException w:name="Medium Grid 1 Accent 4" w:uiPriority="67"/>
-    <w:lsdException w:name="Medium Grid 2 Accent 4" w:uiPriority="68"/>
-    <w:lsdException w:name="Medium Grid 3 Accent 4" w:uiPriority="69"/>
-    <w:lsdException w:name="Dark List Accent 4" w:uiPriority="70"/>
-    <w:lsdException w:name="Colorful Shading Accent 4" w:uiPriority="71"/>
-    <w:lsdException w:name="Colorful List Accent 4" w:uiPriority="72"/>
-    <w:lsdException w:name="Colorful Grid Accent 4" w:uiPriority="73"/>
-    <w:lsdException w:name="Light Shading Accent 5" w:uiPriority="60"/>
-    <w:lsdException w:name="Light List Accent 5" w:uiPriority="61"/>
-    <w:lsdException w:name="Light Grid Accent 5" w:uiPriority="62"/>
-    <w:lsdException w:name="Medium Shading 1 Accent 5" w:uiPriority="63"/>
-    <w:lsdException w:name="Medium Shading 2 Accent 5" w:uiPriority="64"/>
-    <w:lsdException w:name="Medium List 1 Accent 5" w:uiPriority="65"/>
-    <w:lsdException w:name="Medium List 2 Accent 5" w:uiPriority="66"/>
-    <w:lsdException w:name="Medium Grid 1 Accent 5" w:uiPriority="67"/>
-    <w:lsdException w:name="Medium Grid 2 Accent 5" w:uiPriority="68"/>
-    <w:lsdException w:name="Medium Grid 3 Accent 5" w:uiPriority="69"/>
-    <w:lsdException w:name="Dark List Accent 5" w:uiPriority="70"/>
-    <w:lsdException w:name="Colorful Shading Accent 5" w:uiPriority="71"/>
-    <w:lsdException w:name="Colorful List Accent 5" w:uiPriority="72"/>
-    <w:lsdException w:name="Colorful Grid Accent 5" w:uiPriority="73"/>
-    <w:lsdException w:name="Light Shading Accent 6" w:uiPriority="60"/>
-    <w:lsdException w:name="Light List Accent 6" w:uiPriority="61"/>
-    <w:lsdException w:name="Light Grid Accent 6" w:uiPriority="62"/>
-    <w:lsdException w:name="Medium Shading 1 Accent 6" w:uiPriority="63"/>
-    <w:lsdException w:name="Medium Shading 2 Accent 6" w:uiPriority="64"/>
-    <w:lsdException w:name="Medium List 1 Accent 6" w:uiPriority="65"/>
-    <w:lsdException w:name="Medium List 2 Accent 6" w:uiPriority="66"/>
-    <w:lsdException w:name="Medium Grid 1 Accent 6" w:uiPriority="67"/>
-    <w:lsdException w:name="Medium Grid 2 Accent 6" w:uiPriority="68"/>
-    <w:lsdException w:name="Medium Grid 3 Accent 6" w:uiPriority="69"/>
-    <w:lsdException w:name="Dark List Accent 6" w:uiPriority="70"/>
-    <w:lsdException w:name="Colorful Shading Accent 6" w:uiPriority="71"/>
-    <w:lsdException w:name="Colorful List Accent 6" w:uiPriority="72"/>
-    <w:lsdException w:name="Colorful Grid Accent 6" w:uiPriority="73"/>
-    <w:lsdException w:name="Subtle Emphasis" w:uiPriority="19" w:qFormat="1"/>
-    <w:lsdException w:name="Intense Emphasis" w:uiPriority="21" w:qFormat="1"/>
-    <w:lsdException w:name="Subtle Reference" w:uiPriority="31" w:qFormat="1"/>
-    <w:lsdException w:name="Intense Reference" w:uiPriority="32" w:qFormat="1"/>
-    <w:lsdException w:name="Book Title" w:uiPriority="33" w:qFormat="1"/>
-    <w:lsdException w:name="Bibliography" w:semiHidden="1" w:uiPriority="37" w:unhideWhenUsed="1"/>
-    <w:lsdException w:name="TOC Heading" w:semiHidden="1" w:uiPriority="39" w:unhideWhenUsed="1" w:qFormat="1"/>
-    <w:lsdException w:name="Plain Table 1" w:uiPriority="41"/>
-    <w:lsdException w:name="Plain Table 2" w:uiPriority="42"/>
-    <w:lsdException w:name="Plain Table 3" w:uiPriority="43"/>
-    <w:lsdException w:name="Plain Table 4" w:uiPriority="44"/>
-    <w:lsdException w:name="Plain Table 5" w:uiPriority="45"/>
-    <w:lsdException w:name="Grid Table Light" w:uiPriority="40"/>
-    <w:lsdException w:name="Grid Table 1 Light" w:uiPriority="46"/>
-    <w:lsdException w:name="Grid Table 2" w:uiPriority="47"/>
-    <w:lsdException w:name="Grid Table 3" w:uiPriority="48"/>
-    <w:lsdException w:name="Grid Table 4" w:uiPriority="49"/>
-    <w:lsdException w:name="Grid Table 5 Dark" w:uiPriority="50"/>
-    <w:lsdException w:name="Grid Table 6 Colorful" w:uiPriority="51"/>
-    <w:lsdException w:name="Grid Table 7 Colorful" w:uiPriority="52"/>
-    <w:lsdException w:name="Grid Table 1 Light Accent 1" w:uiPriority="46"/>
-    <w:lsdException w:name="Grid Table 2 Accent 1" w:uiPriority="47"/>
-    <w:lsdException w:name="Grid Table 3 Accent 1" w:uiPriority="48"/>
-    <w:lsdException w:name="Grid Table 4 Accent 1" w:uiPriority="49"/>
-    <w:lsdException w:name="Grid Table 5 Dark Accent 1" w:uiPriority="50"/>
-    <w:lsdException w:name="Grid Table 6 Colorful Accent 1" w:uiPriority="51"/>
-    <w:lsdException w:name="Grid Table 7 Colorful Accent 1" w:uiPriority="52"/>
-    <w:lsdException w:name="Grid Table 1 Light Accent 2" w:uiPriority="46"/>
-    <w:lsdException w:name="Grid Table 2 Accent 2" w:uiPriority="47"/>
-    <w:lsdException w:name="Grid Table 3 Accent 2" w:uiPriority="48"/>
-    <w:lsdException w:name="Grid Table 4 Accent 2" w:uiPriority="49"/>
-    <w:lsdException w:name="Grid Table 5 Dark Accent 2" w:uiPriority="50"/>
-    <w:lsdException w:name="Grid Table 6 Colorful Accent 2" w:uiPriority="51"/>
-    <w:lsdException w:name="Grid Table 7 Colorful Accent 2" w:uiPriority="52"/>
-    <w:lsdException w:name="Grid Table 1 Light Accent 3" w:uiPriority="46"/>
-    <w:lsdException w:name="Grid Table 2 Accent 3" w:uiPriority="47"/>
-    <w:lsdException w:name="Grid Table 3 Accent 3" w:uiPriority="48"/>
-    <w:lsdException w:name="Grid Table 4 Accent 3" w:uiPriority="49"/>
-    <w:lsdException w:name="Grid Table 5 Dark Accent 3" w:uiPriority="50"/>
-    <w:lsdException w:name="Grid Table 6 Colorful Accent 3" w:uiPriority="51"/>
-    <w:lsdException w:name="Grid Table 7 Colorful Accent 3" w:uiPriority="52"/>
-    <w:lsdException w:name="Grid Table 1 Light Accent 4" w:uiPriority="46"/>
-    <w:lsdException w:name="Grid Table 2 Accent 4" w:uiPriority="47"/>
-    <w:lsdException w:name="Grid Table 3 Accent 4" w:uiPriority="48"/>
-    <w:lsdException w:name="Grid Table 4 Accent 4" w:uiPriority="49"/>
-    <w:lsdException w:name="Grid Table 5 Dark Accent 4" w:uiPriority="50"/>
-    <w:lsdException w:name="Grid Table 6 Colorful Accent 4" w:uiPriority="51"/>
-    <w:lsdException w:name="Grid Table 7 Colorful Accent 4" w:uiPriority="52"/>
-    <w:lsdException w:name="Grid Table 1 Light Accent 5" w:uiPriority="46"/>
-    <w:lsdException w:name="Grid Table 2 Accent 5" w:uiPriority="47"/>
-    <w:lsdException w:name="Grid Table 3 Accent 5" w:uiPriority="48"/>
-    <w:lsdException w:name="Grid Table 4 Accent 5" w:uiPriority="49"/>
-    <w:lsdException w:name="Grid Table 5 Dark Accent 5" w:uiPriority="50"/>
-    <w:lsdException w:name="Grid Table 6 Colorful Accent 5" w:uiPriority="51"/>
-    <w:lsdException w:name="Grid Table 7 Colorful Accent 5" w:uiPriority="52"/>
-    <w:lsdException w:name="Grid Table 1 Light Accent 6" w:uiPriority="46"/>
-    <w:lsdException w:name="Grid Table 2 Accent 6" w:uiPriority="47"/>
-    <w:lsdException w:name="Grid Table 3 Accent 6" w:uiPriority="48"/>
-    <w:lsdException w:name="Grid Table 4 Accent 6" w:uiPriority="49"/>
-    <w:lsdException w:name="Grid Table 5 Dark Accent 6" w:uiPriority="50"/>
-    <w:lsdException w:name="Grid Table 6 Colorful Accent 6" w:uiPriority="51"/>
-    <w:lsdException w:name="Grid Table 7 Colorful Accent 6" w:uiPriority="52"/>
-    <w:lsdException w:name="List Table 1 Light" w:uiPriority="46"/>
-    <w:lsdException w:name="List Table 2" w:uiPriority="47"/>
-    <w:lsdException w:name="List Table 3" w:uiPriority="48"/>
-    <w:lsdException w:name="List Table 4" w:uiPriority="49"/>
-    <w:lsdException w:name="List Table 5 Dark" w:uiPriority="50"/>
-    <w:lsdException w:name="List Table 6 Colorful" w:uiPriority="51"/>
-    <w:lsdException w:name="List Table 7 Colorful" w:uiPriority="52"/>
-    <w:lsdException w:name="List Table 1 Light Accent 1" w:uiPriority="46"/>
-    <w:lsdException w:name="List Table 2 Accent 1" w:uiPriority="47"/>
-    <w:lsdException w:name="List Table 3 Accent 1" w:uiPriority="48"/>
-    <w:lsdException w:name="List Table 4 Accent 1" w:uiPriority="49"/>
-    <w:lsdException w:name="List Table 5 Dark Accent 1" w:uiPriority="50"/>
-    <w:lsdException w:name="List Table 6 Colorful Accent 1" w:uiPriority="51"/>
-    <w:lsdException w:name="List Table 7 Colorful Accent 1" w:uiPriority="52"/>
-    <w:lsdException w:name="List Table 1 Light Accent 2" w:uiPriority="46"/>
-    <w:lsdException w:name="List Table 2 Accent 2" w:uiPriority="47"/>
-    <w:lsdException w:name="List Table 3 Accent 2" w:uiPriority="48"/>
-    <w:lsdException w:name="List Table 4 Accent 2" w:uiPriority="49"/>
-    <w:lsdException w:name="List Table 5 Dark Accent 2" w:uiPriority="50"/>
-    <w:lsdException w:name="List Table 6 Colorful Accent 2" w:uiPriority="51"/>
-    <w:lsdException w:name="List Table 7 Colorful Accent 2" w:uiPriority="52"/>
-    <w:lsdException w:name="List Table 1 Light Accent 3" w:uiPriority="46"/>
-    <w:lsdException w:name="List Table 2 Accent 3" w:uiPriority="47"/>
-    <w:lsdException w:name="List Table 3 Accent 3" w:uiPriority="48"/>
-    <w:lsdException w:name="List Table 4 Accent 3" w:uiPriority="49"/>
-    <w:lsdException w:name="List Table 5 Dark Accent 3" w:uiPriority="50"/>
-    <w:lsdException w:name="List Table 6 Colorful Accent 3" w:uiPriority="51"/>
-    <w:lsdException w:name="List Table 7 Colorful Accent 3" w:uiPriority="52"/>
-    <w:lsdException w:name="List Table 1 Light Accent 4" w:uiPriority="46"/>
-    <w:lsdException w:name="List Table 2 Accent 4" w:uiPriority="47"/>
-    <w:lsdException w:name="List Table 3 Accent 4" w:uiPriority="48"/>
-    <w:lsdException w:name="List Table 4 Accent 4" w:uiPriority="49"/>
-    <w:lsdException w:name="List Table 5 Dark Accent 4" w:uiPriority="50"/>
-    <w:lsdException w:name="List Table 6 Colorful Accent 4" w:uiPriority="51"/>
-    <w:lsdException w:name="List Table 7 Colorful Accent 4" w:uiPriority="52"/>
-    <w:lsdException w:name="List Table 1 Light Accent 5" w:uiPriority="46"/>
-    <w:lsdException w:name="List Table 2 Accent 5" w:uiPriority="47"/>
-    <w:lsdException w:name="List Table 3 Accent 5" w:uiPriority="48"/>
-    <w:lsdException w:name="List Table 4 Accent 5" w:uiPriority="49"/>
-    <w:lsdException w:name="List Table 5 Dark Accent 5" w:uiPriority="50"/>
-    <w:lsdException w:name="List Table 6 Colorful Accent 5" w:uiPriority="51"/>
-    <w:lsdException w:name="List Table 7 Colorful Accent 5" w:uiPriority="52"/>
-    <w:lsdException w:name="List Table 1 Light Accent 6" w:uiPriority="46"/>
-    <w:lsdException w:name="List Table 2 Accent 6" w:uiPriority="47"/>
-    <w:lsdException w:name="List Table 3 Accent 6" w:uiPriority="48"/>
-    <w:lsdException w:name="List Table 4 Accent 6" w:uiPriority="49"/>
-    <w:lsdException w:name="List Table 5 Dark Accent 6" w:uiPriority="50"/>
-    <w:lsdException w:name="List Table 6 Colorful Accent 6" w:uiPriority="51"/>
-    <w:lsdException w:name="List Table 7 Colorful Accent 6" w:uiPriority="52"/>
-    <w:lsdException w:name="Mention" w:semiHidden="1" w:unhideWhenUsed="1"/>
-    <w:lsdException w:name="Smart Hyperlink" w:semiHidden="1" w:unhideWhenUsed="1"/>
-    <w:lsdException w:name="Hashtag" w:semiHidden="1" w:unhideWhenUsed="1"/>
-    <w:lsdException w:name="Unresolved Mention" w:semiHidden="1" w:unhideWhenUsed="1"/>
-    <w:lsdException w:name="Smart Link" w:semiHidden="1" w:unhideWhenUsed="1"/>
-  </w:latentStyles>
-  <w:style w:type="paragraph" w:default="1" w:styleId="Normal">
-    <w:name w:val="Normal"/>
-    <w:qFormat/>
-  </w:style>
-  <w:style w:type="character" w:default="1" w:styleId="DefaultParagraphFont">
-    <w:name w:val="Default Paragraph Font"/>
-    <w:uiPriority w:val="1"/>
-    <w:semiHidden/>
-    <w:unhideWhenUsed/>
-  </w:style>
-  <w:style w:type="table" w:default="1" w:styleId="TableNormal">
-    <w:name w:val="Normal Table"/>
-    <w:uiPriority w:val="99"/>
-    <w:semiHidden/>
-    <w:unhideWhenUsed/>
-    <w:tblPr>
-      <w:tblInd w:w="0" w:type="dxa"/>
-      <w:tblCellMar>
-        <w:top w:w="0" w:type="dxa"/>
-        <w:left w:w="108" w:type="dxa"/>
-        <w:bottom w:w="0" w:type="dxa"/>
-        <w:right w:w="108" w:type="dxa"/>
-      </w:tblCellMar>
-    </w:tblPr>
-  </w:style>
-  <w:style w:type="numbering" w:default="1" w:styleId="NoList">
-    <w:name w:val="No List"/>
-    <w:uiPriority w:val="99"/>
-    <w:semiHidden/>
-    <w:unhideWhenUsed/>
-  </w:style>
-  <w:style w:type="paragraph" w:customStyle="1" w:styleId="F099E52B622147899990FA8EB9929F0F">
-    <w:name w:val="F099E52B622147899990FA8EB9929F0F"/>
-    <w:rsid w:val="0028766F"/>
-  </w:style>
-</w:styles>
-</file>
-
-<file path=word/glossary/webSettings.xml><?xml version="1.0" encoding="utf-8"?>
-<w:webSettings xmlns:mc="http://schemas.openxmlformats.org/markup-compatibility/2006" xmlns:r="http://schemas.openxmlformats.org/officeDocument/2006/relationships" xmlns:w="http://schemas.openxmlformats.org/wordprocessingml/2006/main" xmlns:w14="http://schemas.microsoft.com/office/word/2010/wordml" xmlns:w15="http://schemas.microsoft.com/office/word/2012/wordml" xmlns:w16cex="http://schemas.microsoft.com/office/word/2018/wordml/cex" xmlns:w16cid="http://schemas.microsoft.com/office/word/2016/wordml/cid" xmlns:w16="http://schemas.microsoft.com/office/word/2018/wordml" xmlns:w16du="http://schemas.microsoft.com/office/word/2023/wordml/word16du" xmlns:w16sdtdh="http://schemas.microsoft.com/office/word/2020/wordml/sdtdatahash" xmlns:w16sdtfl="http://schemas.microsoft.com/office/word/2024/wordml/sdtformatlock" xmlns:w16se="http://schemas.microsoft.com/office/word/2015/wordml/symex" mc:Ignorable="w14 w15 w16se w16cid w16 w16cex w16sdtdh w16sdtfl w16du">
-  <w:optimizeForBrowser/>
-  <w:allowPNG/>
-</w:webSettings>
-</file>
-
 <file path=word/theme/theme1.xml><?xml version="1.0" encoding="utf-8"?>
 <a:theme xmlns:a="http://schemas.openxmlformats.org/drawingml/2006/main" name="Office Theme">
   <a:themeElements>

</xml_diff>

<commit_message>
Modified High-level architectural diagram
</commit_message>
<xml_diff>
--- a/Capstone_Project_2026.docx
+++ b/Capstone_Project_2026.docx
@@ -484,6 +484,9 @@
                   <w:spacing w:line="240" w:lineRule="auto"/>
                   <w:jc w:val="both"/>
                 </w:pPr>
+                <w:r>
+                  <w:t>Saturday, 24 October 2026, 11:00 AM</w:t>
+                </w:r>
               </w:p>
             </w:tc>
           </w:tr>
@@ -1144,6 +1147,13 @@
     </w:p>
     <w:sdt>
       <w:sdtPr>
+        <w:rPr>
+          <w:rFonts w:ascii="Times New Roman" w:eastAsia="Calibri" w:hAnsi="Times New Roman" w:cs="Times New Roman"/>
+          <w:color w:val="auto"/>
+          <w:sz w:val="24"/>
+          <w:szCs w:val="22"/>
+          <w:lang w:val="en-IE"/>
+        </w:rPr>
         <w:id w:val="-1350630491"/>
         <w:docPartObj>
           <w:docPartGallery w:val="Table of Contents"/>
@@ -1152,14 +1162,9 @@
       </w:sdtPr>
       <w:sdtEndPr>
         <w:rPr>
-          <w:rFonts w:ascii="Times New Roman" w:eastAsia="Calibri" w:hAnsi="Times New Roman" w:cs="Times New Roman"/>
           <w:b/>
           <w:bCs/>
           <w:noProof/>
-          <w:color w:val="auto"/>
-          <w:sz w:val="24"/>
-          <w:szCs w:val="22"/>
-          <w:lang w:val="en-IE"/>
         </w:rPr>
       </w:sdtEndPr>
       <w:sdtContent>
@@ -5040,7 +5045,13 @@
         </w:numPr>
       </w:pPr>
       <w:r>
-        <w:t xml:space="preserve">Python, Pandas and NumPy will be used for data preparation and analysis, </w:t>
+        <w:t>Python, Pandas and NumPy will be used for data preparation and analysis</w:t>
+      </w:r>
+      <w:r>
+        <w:t>.</w:t>
+      </w:r>
+      <w:r>
+        <w:t xml:space="preserve"> </w:t>
       </w:r>
     </w:p>
     <w:p>
@@ -5066,6 +5077,9 @@
       <w:r>
         <w:t>Scikit-learn will support model development and evaluation</w:t>
       </w:r>
+      <w:r>
+        <w:t>.</w:t>
+      </w:r>
     </w:p>
     <w:p>
       <w:pPr>
@@ -5079,6 +5093,9 @@
         <w:lastRenderedPageBreak/>
         <w:t>Jupyter Notebook will document the analysis</w:t>
       </w:r>
+      <w:r>
+        <w:t>.</w:t>
+      </w:r>
     </w:p>
     <w:p>
       <w:pPr>
@@ -5147,59 +5164,15 @@
     </w:p>
     <w:p>
       <w:pPr>
-        <w:jc w:val="center"/>
-        <w:rPr>
-          <w:b/>
-          <w:bCs/>
-          <w:sz w:val="32"/>
-          <w:szCs w:val="32"/>
-        </w:rPr>
-      </w:pPr>
-      <w:r>
-        <w:rPr>
-          <w:b/>
-          <w:bCs/>
-          <w:sz w:val="32"/>
-          <w:szCs w:val="32"/>
-        </w:rPr>
+        <w:keepNext/>
+      </w:pPr>
+      <w:r>
         <w:lastRenderedPageBreak/>
-        <w:t>Online Purchase Intention Prediction</w:t>
-      </w:r>
-    </w:p>
-    <w:p>
-      <w:pPr>
-        <w:jc w:val="center"/>
-        <w:rPr>
-          <w:b/>
-          <w:bCs/>
-          <w:sz w:val="32"/>
-          <w:szCs w:val="32"/>
-        </w:rPr>
-      </w:pPr>
-      <w:r>
-        <w:rPr>
-          <w:b/>
-          <w:bCs/>
-          <w:sz w:val="32"/>
-          <w:szCs w:val="32"/>
-        </w:rPr>
-        <w:t>Proposed High-Level System Architecture</w:t>
-      </w:r>
-    </w:p>
-    <w:p/>
-    <w:p>
-      <w:pPr>
-        <w:keepNext/>
-      </w:pPr>
-      <w:r>
-        <w:rPr>
-          <w:noProof/>
-        </w:rPr>
         <w:drawing>
-          <wp:inline distT="0" distB="0" distL="0" distR="0" wp14:anchorId="6A343D5C" wp14:editId="7A67FFCF">
-            <wp:extent cx="6913245" cy="5505450"/>
-            <wp:effectExtent l="0" t="0" r="0" b="0"/>
-            <wp:docPr id="489784198" name="Picture 4"/>
+          <wp:inline distT="0" distB="0" distL="0" distR="0" wp14:anchorId="350F162B" wp14:editId="5BC58C1D">
+            <wp:extent cx="5731510" cy="6489700"/>
+            <wp:effectExtent l="0" t="0" r="2540" b="0"/>
+            <wp:docPr id="244346418" name="Picture 6"/>
             <wp:cNvGraphicFramePr>
               <a:graphicFrameLocks xmlns:a="http://schemas.openxmlformats.org/drawingml/2006/main" noChangeAspect="1"/>
             </wp:cNvGraphicFramePr>
@@ -5207,7 +5180,7 @@
               <a:graphicData uri="http://schemas.openxmlformats.org/drawingml/2006/picture">
                 <pic:pic xmlns:pic="http://schemas.openxmlformats.org/drawingml/2006/picture">
                   <pic:nvPicPr>
-                    <pic:cNvPr id="0" name="Picture 2"/>
+                    <pic:cNvPr id="0" name="Picture 3"/>
                     <pic:cNvPicPr>
                       <a:picLocks noChangeAspect="1" noChangeArrowheads="1"/>
                     </pic:cNvPicPr>
@@ -5228,12 +5201,15 @@
                   <pic:spPr bwMode="auto">
                     <a:xfrm>
                       <a:off x="0" y="0"/>
-                      <a:ext cx="6913245" cy="5505450"/>
+                      <a:ext cx="5731510" cy="6489700"/>
                     </a:xfrm>
                     <a:prstGeom prst="rect">
                       <a:avLst/>
                     </a:prstGeom>
                     <a:noFill/>
+                    <a:ln>
+                      <a:noFill/>
+                    </a:ln>
                   </pic:spPr>
                 </pic:pic>
               </a:graphicData>
@@ -5246,7 +5222,6 @@
       <w:pPr>
         <w:pStyle w:val="Caption"/>
       </w:pPr>
-      <w:bookmarkStart w:id="25" w:name="_Toc242874953"/>
       <w:r>
         <w:t xml:space="preserve">Figure </w:t>
       </w:r>
@@ -5259,12 +5234,16 @@
         </w:r>
       </w:fldSimple>
       <w:r>
-        <w:t xml:space="preserve"> H</w:t>
-      </w:r>
-      <w:r>
-        <w:t>igh-level architectural diagram</w:t>
-      </w:r>
-      <w:bookmarkEnd w:id="25"/>
+        <w:t xml:space="preserve"> </w:t>
+      </w:r>
+      <w:r>
+        <w:t>High-level architectural diagram</w:t>
+      </w:r>
+    </w:p>
+    <w:p>
+      <w:pPr>
+        <w:keepNext/>
+      </w:pPr>
     </w:p>
     <w:p/>
     <w:p>
@@ -5281,12 +5260,12 @@
       <w:pPr>
         <w:pStyle w:val="Heading1"/>
       </w:pPr>
-      <w:bookmarkStart w:id="26" w:name="_Toc242875109"/>
+      <w:bookmarkStart w:id="25" w:name="_Toc242875109"/>
       <w:r>
         <w:lastRenderedPageBreak/>
         <w:t>Data Sources</w:t>
       </w:r>
-      <w:bookmarkEnd w:id="26"/>
+      <w:bookmarkEnd w:id="25"/>
     </w:p>
     <w:p>
       <w:pPr>
@@ -5404,7 +5383,7 @@
       <w:pPr>
         <w:pStyle w:val="Caption"/>
       </w:pPr>
-      <w:bookmarkStart w:id="27" w:name="_Toc242874954"/>
+      <w:bookmarkStart w:id="26" w:name="_Toc242874954"/>
       <w:r>
         <w:t xml:space="preserve">Figure </w:t>
       </w:r>
@@ -5422,7 +5401,7 @@
       <w:r>
         <w:t xml:space="preserve"> Data Info</w:t>
       </w:r>
-      <w:bookmarkEnd w:id="27"/>
+      <w:bookmarkEnd w:id="26"/>
     </w:p>
     <w:p>
       <w:r>
@@ -5443,12 +5422,12 @@
       <w:pPr>
         <w:pStyle w:val="Heading1"/>
       </w:pPr>
-      <w:bookmarkStart w:id="28" w:name="_Toc242875110"/>
+      <w:bookmarkStart w:id="27" w:name="_Toc242875110"/>
       <w:r>
         <w:lastRenderedPageBreak/>
         <w:t>Expected Deliverables</w:t>
       </w:r>
-      <w:bookmarkEnd w:id="28"/>
+      <w:bookmarkEnd w:id="27"/>
       <w:r>
         <w:t xml:space="preserve"> </w:t>
       </w:r>
@@ -5561,12 +5540,12 @@
       <w:pPr>
         <w:pStyle w:val="Heading1"/>
       </w:pPr>
-      <w:bookmarkStart w:id="29" w:name="_Toc242875111"/>
+      <w:bookmarkStart w:id="28" w:name="_Toc242875111"/>
       <w:r>
         <w:lastRenderedPageBreak/>
         <w:t>Project Timeline</w:t>
       </w:r>
-      <w:bookmarkEnd w:id="29"/>
+      <w:bookmarkEnd w:id="28"/>
     </w:p>
     <w:p>
       <w:pPr>
@@ -5802,7 +5781,7 @@
       <w:pPr>
         <w:pStyle w:val="Caption"/>
       </w:pPr>
-      <w:bookmarkStart w:id="30" w:name="_Toc242874955"/>
+      <w:bookmarkStart w:id="29" w:name="_Toc242874955"/>
       <w:r>
         <w:t xml:space="preserve">Figure </w:t>
       </w:r>
@@ -5817,7 +5796,7 @@
       <w:r>
         <w:t xml:space="preserve"> Gantt chart</w:t>
       </w:r>
-      <w:bookmarkEnd w:id="30"/>
+      <w:bookmarkEnd w:id="29"/>
     </w:p>
     <w:p>
       <w:pPr>
@@ -5840,12 +5819,12 @@
       <w:pPr>
         <w:pStyle w:val="Heading1"/>
       </w:pPr>
-      <w:bookmarkStart w:id="31" w:name="_Toc242875112"/>
+      <w:bookmarkStart w:id="30" w:name="_Toc242875112"/>
       <w:r>
         <w:lastRenderedPageBreak/>
         <w:t>Ethical and Legal Considerations References</w:t>
       </w:r>
-      <w:bookmarkEnd w:id="31"/>
+      <w:bookmarkEnd w:id="30"/>
     </w:p>
     <w:p>
       <w:pPr>
@@ -9588,7 +9567,6 @@
   <w:style w:type="character" w:default="1" w:styleId="DefaultParagraphFont">
     <w:name w:val="Default Paragraph Font"/>
     <w:uiPriority w:val="1"/>
-    <w:semiHidden/>
     <w:unhideWhenUsed/>
   </w:style>
   <w:style w:type="table" w:default="1" w:styleId="TableNormal">

</xml_diff>

<commit_message>
Added header, change paragraphs
</commit_message>
<xml_diff>
--- a/Capstone_Project_2026.docx
+++ b/Capstone_Project_2026.docx
@@ -36,7 +36,6 @@
         </w:p>
         <w:p>
           <w:pPr>
-            <w:jc w:val="both"/>
             <w:rPr>
               <w:rFonts w:cs="Arial"/>
               <w:b/>
@@ -50,7 +49,6 @@
             <w:pBdr>
               <w:bottom w:val="single" w:sz="12" w:space="1" w:color="auto"/>
             </w:pBdr>
-            <w:jc w:val="both"/>
             <w:rPr>
               <w:rFonts w:cs="Arial"/>
               <w:b/>
@@ -73,7 +71,6 @@
             <w:pBdr>
               <w:bottom w:val="single" w:sz="12" w:space="1" w:color="auto"/>
             </w:pBdr>
-            <w:jc w:val="both"/>
             <w:rPr>
               <w:rFonts w:cs="Arial"/>
               <w:bCs/>
@@ -98,7 +95,6 @@
             <w:pBdr>
               <w:bottom w:val="single" w:sz="12" w:space="1" w:color="auto"/>
             </w:pBdr>
-            <w:jc w:val="both"/>
             <w:rPr>
               <w:rFonts w:cs="Arial"/>
               <w:b/>
@@ -107,11 +103,7 @@
             </w:rPr>
           </w:pPr>
         </w:p>
-        <w:p>
-          <w:pPr>
-            <w:jc w:val="both"/>
-          </w:pPr>
-        </w:p>
+        <w:p/>
         <w:tbl>
           <w:tblPr>
             <w:tblStyle w:val="TableGrid"/>
@@ -130,7 +122,6 @@
               <w:p>
                 <w:pPr>
                   <w:spacing w:line="240" w:lineRule="auto"/>
-                  <w:jc w:val="both"/>
                   <w:rPr>
                     <w:b/>
                     <w:bCs/>
@@ -147,7 +138,6 @@
               <w:p>
                 <w:pPr>
                   <w:spacing w:line="240" w:lineRule="auto"/>
-                  <w:jc w:val="both"/>
                   <w:rPr>
                     <w:b/>
                     <w:bCs/>
@@ -162,13 +152,11 @@
               <w:p>
                 <w:pPr>
                   <w:spacing w:line="240" w:lineRule="auto"/>
-                  <w:jc w:val="both"/>
                 </w:pPr>
               </w:p>
               <w:p>
                 <w:pPr>
                   <w:spacing w:line="240" w:lineRule="auto"/>
-                  <w:jc w:val="both"/>
                 </w:pPr>
                 <w:r>
                   <w:t>HDSDAB Sep26 PT SB -  Strategic Thinking</w:t>
@@ -177,7 +165,6 @@
               <w:p>
                 <w:pPr>
                   <w:spacing w:line="240" w:lineRule="auto"/>
-                  <w:jc w:val="both"/>
                 </w:pPr>
               </w:p>
             </w:tc>
@@ -190,7 +177,6 @@
               <w:p>
                 <w:pPr>
                   <w:spacing w:line="240" w:lineRule="auto"/>
-                  <w:jc w:val="both"/>
                   <w:rPr>
                     <w:b/>
                     <w:bCs/>
@@ -207,7 +193,6 @@
               <w:p>
                 <w:pPr>
                   <w:spacing w:line="240" w:lineRule="auto"/>
-                  <w:jc w:val="both"/>
                   <w:rPr>
                     <w:b/>
                     <w:bCs/>
@@ -222,7 +207,6 @@
               <w:p>
                 <w:pPr>
                   <w:spacing w:line="240" w:lineRule="auto"/>
-                  <w:jc w:val="both"/>
                 </w:pPr>
                 <w:r>
                   <w:rPr>
@@ -241,7 +225,6 @@
               <w:p>
                 <w:pPr>
                   <w:spacing w:line="240" w:lineRule="auto"/>
-                  <w:jc w:val="both"/>
                   <w:rPr>
                     <w:b/>
                     <w:bCs/>
@@ -258,7 +241,6 @@
               <w:p>
                 <w:pPr>
                   <w:spacing w:line="240" w:lineRule="auto"/>
-                  <w:jc w:val="both"/>
                   <w:rPr>
                     <w:b/>
                     <w:bCs/>
@@ -276,16 +258,23 @@
                     <w:tab w:val="left" w:pos="1277"/>
                   </w:tabs>
                   <w:spacing w:line="240" w:lineRule="auto"/>
-                  <w:jc w:val="both"/>
                   <w:rPr>
                     <w:rFonts w:cstheme="minorHAnsi"/>
                   </w:rPr>
                 </w:pPr>
+                <w:proofErr w:type="spellStart"/>
                 <w:r>
                   <w:rPr>
                     <w:rFonts w:cstheme="minorHAnsi"/>
                   </w:rPr>
-                  <w:t>Taufique Ahmed</w:t>
+                  <w:t>Taufique</w:t>
+                </w:r>
+                <w:proofErr w:type="spellEnd"/>
+                <w:r>
+                  <w:rPr>
+                    <w:rFonts w:cstheme="minorHAnsi"/>
+                  </w:rPr>
+                  <w:t xml:space="preserve"> Ahmed</w:t>
                 </w:r>
               </w:p>
             </w:tc>
@@ -298,7 +287,6 @@
               <w:p>
                 <w:pPr>
                   <w:spacing w:line="240" w:lineRule="auto"/>
-                  <w:jc w:val="both"/>
                   <w:rPr>
                     <w:b/>
                     <w:bCs/>
@@ -315,7 +303,6 @@
               <w:p>
                 <w:pPr>
                   <w:spacing w:line="240" w:lineRule="auto"/>
-                  <w:jc w:val="both"/>
                   <w:rPr>
                     <w:b/>
                     <w:bCs/>
@@ -330,7 +317,6 @@
               <w:p>
                 <w:pPr>
                   <w:spacing w:line="240" w:lineRule="auto"/>
-                  <w:jc w:val="both"/>
                 </w:pPr>
                 <w:r>
                   <w:t>Mariana Garcia</w:t>
@@ -346,7 +332,6 @@
               <w:p>
                 <w:pPr>
                   <w:spacing w:line="240" w:lineRule="auto"/>
-                  <w:jc w:val="both"/>
                   <w:rPr>
                     <w:b/>
                     <w:bCs/>
@@ -363,7 +348,6 @@
               <w:p>
                 <w:pPr>
                   <w:spacing w:line="240" w:lineRule="auto"/>
-                  <w:jc w:val="both"/>
                   <w:rPr>
                     <w:b/>
                     <w:bCs/>
@@ -378,7 +362,6 @@
               <w:p>
                 <w:pPr>
                   <w:spacing w:line="240" w:lineRule="auto"/>
-                  <w:jc w:val="both"/>
                 </w:pPr>
                 <w:r>
                   <w:t xml:space="preserve">sba25049 </w:t>
@@ -394,7 +377,6 @@
               <w:p>
                 <w:pPr>
                   <w:spacing w:line="240" w:lineRule="auto"/>
-                  <w:jc w:val="both"/>
                   <w:rPr>
                     <w:b/>
                     <w:bCs/>
@@ -411,7 +393,6 @@
               <w:p>
                 <w:pPr>
                   <w:spacing w:line="240" w:lineRule="auto"/>
-                  <w:jc w:val="both"/>
                   <w:rPr>
                     <w:b/>
                     <w:bCs/>
@@ -426,7 +407,6 @@
               <w:p>
                 <w:pPr>
                   <w:spacing w:line="240" w:lineRule="auto"/>
-                  <w:jc w:val="both"/>
                 </w:pPr>
                 <w:r>
                   <w:t>Sunday, 25 October 2026, 11:59 PM</w:t>
@@ -442,7 +422,6 @@
               <w:p>
                 <w:pPr>
                   <w:spacing w:line="240" w:lineRule="auto"/>
-                  <w:jc w:val="both"/>
                   <w:rPr>
                     <w:b/>
                     <w:bCs/>
@@ -459,7 +438,6 @@
               <w:p>
                 <w:pPr>
                   <w:spacing w:line="240" w:lineRule="auto"/>
-                  <w:jc w:val="both"/>
                   <w:rPr>
                     <w:b/>
                     <w:bCs/>
@@ -474,7 +452,6 @@
               <w:p>
                 <w:pPr>
                   <w:spacing w:line="240" w:lineRule="auto"/>
-                  <w:jc w:val="both"/>
                 </w:pPr>
                 <w:r>
                   <w:t>Saturday, 24 October 2026, 11:00 AM</w:t>
@@ -483,17 +460,12 @@
             </w:tc>
           </w:tr>
         </w:tbl>
-        <w:p>
-          <w:pPr>
-            <w:jc w:val="both"/>
-          </w:pPr>
-        </w:p>
+        <w:p/>
         <w:p>
           <w:pPr>
             <w:pBdr>
               <w:bottom w:val="single" w:sz="12" w:space="31" w:color="auto"/>
             </w:pBdr>
-            <w:jc w:val="both"/>
             <w:rPr>
               <w:rFonts w:cs="Arial"/>
               <w:b/>
@@ -506,7 +478,6 @@
             <w:pBdr>
               <w:bottom w:val="single" w:sz="12" w:space="31" w:color="auto"/>
             </w:pBdr>
-            <w:jc w:val="both"/>
             <w:rPr>
               <w:rFonts w:cs="Arial"/>
               <w:b/>
@@ -516,7 +487,6 @@
         </w:p>
         <w:p>
           <w:pPr>
-            <w:jc w:val="both"/>
             <w:rPr>
               <w:rFonts w:cs="Arial"/>
               <w:b/>
@@ -526,7 +496,6 @@
         </w:p>
         <w:p>
           <w:pPr>
-            <w:jc w:val="both"/>
             <w:rPr>
               <w:rFonts w:cs="Arial"/>
               <w:b/>
@@ -544,7 +513,6 @@
         </w:p>
         <w:p>
           <w:pPr>
-            <w:jc w:val="both"/>
             <w:rPr>
               <w:rFonts w:cs="Arial"/>
               <w:sz w:val="20"/>
@@ -592,7 +560,6 @@
               <w:p>
                 <w:pPr>
                   <w:spacing w:line="240" w:lineRule="auto"/>
-                  <w:jc w:val="both"/>
                   <w:rPr>
                     <w:rFonts w:cs="Arial"/>
                   </w:rPr>
@@ -607,7 +574,6 @@
               <w:p>
                 <w:pPr>
                   <w:spacing w:line="240" w:lineRule="auto"/>
-                  <w:jc w:val="both"/>
                   <w:rPr>
                     <w:rFonts w:cs="Arial"/>
                     <w:sz w:val="20"/>
@@ -619,7 +585,6 @@
         </w:tbl>
         <w:p>
           <w:pPr>
-            <w:jc w:val="both"/>
             <w:rPr>
               <w:rFonts w:cs="Arial"/>
               <w:sz w:val="20"/>
@@ -633,13 +598,11 @@
               <w:tab w:val="right" w:pos="9026"/>
             </w:tabs>
             <w:spacing w:after="0" w:line="240" w:lineRule="auto"/>
-            <w:jc w:val="both"/>
           </w:pPr>
         </w:p>
         <w:p>
           <w:pPr>
             <w:suppressAutoHyphens w:val="0"/>
-            <w:jc w:val="both"/>
             <w:rPr>
               <w:noProof/>
             </w:rPr>
@@ -647,7 +610,6 @@
         </w:p>
         <w:p>
           <w:pPr>
-            <w:jc w:val="both"/>
             <w:rPr>
               <w:rFonts w:ascii="Calibri" w:eastAsia="Times New Roman" w:hAnsi="Calibri"/>
               <w:color w:val="FFFFFF" w:themeColor="background1"/>
@@ -1081,7 +1043,6 @@
         </w:p>
         <w:p>
           <w:pPr>
-            <w:jc w:val="both"/>
             <w:rPr>
               <w:rFonts w:ascii="Calibri" w:eastAsia="Times New Roman" w:hAnsi="Calibri"/>
               <w:color w:val="FFFFFF" w:themeColor="background1"/>
@@ -1092,7 +1053,6 @@
         </w:p>
         <w:p>
           <w:pPr>
-            <w:jc w:val="both"/>
             <w:rPr>
               <w:rFonts w:ascii="Calibri" w:eastAsia="Times New Roman" w:hAnsi="Calibri"/>
               <w:color w:val="FFFFFF" w:themeColor="background1"/>
@@ -1103,7 +1063,6 @@
         </w:p>
         <w:p>
           <w:pPr>
-            <w:jc w:val="both"/>
             <w:rPr>
               <w:noProof/>
               <w:color w:val="4472C4"/>
@@ -1122,7 +1081,6 @@
     <w:p>
       <w:pPr>
         <w:suppressAutoHyphens w:val="0"/>
-        <w:jc w:val="both"/>
         <w:rPr>
           <w:noProof/>
           <w:color w:val="4472C4"/>
@@ -1137,16 +1095,10 @@
         <w:br w:type="page"/>
       </w:r>
     </w:p>
+    <w:bookmarkStart w:id="0" w:name="_Toc243430763" w:displacedByCustomXml="next"/>
     <w:sdt>
       <w:sdtPr>
-        <w:rPr>
-          <w:rFonts w:ascii="Times New Roman" w:eastAsia="Calibri" w:hAnsi="Times New Roman" w:cs="Times New Roman"/>
-          <w:color w:val="auto"/>
-          <w:sz w:val="24"/>
-          <w:szCs w:val="22"/>
-          <w:lang w:val="en-IE"/>
-        </w:rPr>
-        <w:id w:val="-1350630491"/>
+        <w:id w:val="-1935191373"/>
         <w:docPartObj>
           <w:docPartGallery w:val="Table of Contents"/>
           <w:docPartUnique/>
@@ -1154,9 +1106,14 @@
       </w:sdtPr>
       <w:sdtEndPr>
         <w:rPr>
+          <w:rFonts w:ascii="Times New Roman" w:eastAsia="Calibri" w:hAnsi="Times New Roman" w:cs="Times New Roman"/>
           <w:b/>
           <w:bCs/>
           <w:noProof/>
+          <w:color w:val="auto"/>
+          <w:sz w:val="24"/>
+          <w:szCs w:val="22"/>
+          <w:lang w:val="en-IE"/>
         </w:rPr>
       </w:sdtEndPr>
       <w:sdtContent>
@@ -1165,7 +1122,7 @@
             <w:pStyle w:val="TOCHeading"/>
           </w:pPr>
           <w:r>
-            <w:t>Table of Contents</w:t>
+            <w:t>Contents</w:t>
           </w:r>
         </w:p>
         <w:p>
@@ -1189,7 +1146,7 @@
           <w:r>
             <w:fldChar w:fldCharType="separate"/>
           </w:r>
-          <w:hyperlink w:anchor="_Toc242875084" w:history="1">
+          <w:hyperlink w:anchor="_Toc243431117" w:history="1">
             <w:r>
               <w:rPr>
                 <w:rStyle w:val="Hyperlink"/>
@@ -1213,7 +1170,7 @@
                 <w:rStyle w:val="Hyperlink"/>
                 <w:noProof/>
               </w:rPr>
-              <w:t>Introduction</w:t>
+              <w:t>Project Title</w:t>
             </w:r>
             <w:r>
               <w:rPr>
@@ -1234,7 +1191,7 @@
                 <w:noProof/>
                 <w:webHidden/>
               </w:rPr>
-              <w:instrText xml:space="preserve"> PAGEREF _Toc242875084 \h </w:instrText>
+              <w:instrText xml:space="preserve"> PAGEREF _Toc243431117 \h </w:instrText>
             </w:r>
             <w:r>
               <w:rPr>
@@ -1254,7 +1211,7 @@
                 <w:noProof/>
                 <w:webHidden/>
               </w:rPr>
-              <w:t>5</w:t>
+              <w:t>4</w:t>
             </w:r>
             <w:r>
               <w:rPr>
@@ -1277,7 +1234,7 @@
               <w14:ligatures w14:val="standardContextual"/>
             </w:rPr>
           </w:pPr>
-          <w:hyperlink w:anchor="_Toc242875085" w:history="1">
+          <w:hyperlink w:anchor="_Toc243431118" w:history="1">
             <w:r>
               <w:rPr>
                 <w:rStyle w:val="Hyperlink"/>
@@ -1301,7 +1258,7 @@
                 <w:rStyle w:val="Hyperlink"/>
                 <w:noProof/>
               </w:rPr>
-              <w:t>Project Title</w:t>
+              <w:t>Problem Definition</w:t>
             </w:r>
             <w:r>
               <w:rPr>
@@ -1322,7 +1279,7 @@
                 <w:noProof/>
                 <w:webHidden/>
               </w:rPr>
-              <w:instrText xml:space="preserve"> PAGEREF _Toc242875085 \h </w:instrText>
+              <w:instrText xml:space="preserve"> PAGEREF _Toc243431118 \h </w:instrText>
             </w:r>
             <w:r>
               <w:rPr>
@@ -1342,7 +1299,7 @@
                 <w:noProof/>
                 <w:webHidden/>
               </w:rPr>
-              <w:t>6</w:t>
+              <w:t>5</w:t>
             </w:r>
             <w:r>
               <w:rPr>
@@ -1365,7 +1322,7 @@
               <w14:ligatures w14:val="standardContextual"/>
             </w:rPr>
           </w:pPr>
-          <w:hyperlink w:anchor="_Toc242875086" w:history="1">
+          <w:hyperlink w:anchor="_Toc243431119" w:history="1">
             <w:r>
               <w:rPr>
                 <w:rStyle w:val="Hyperlink"/>
@@ -1389,7 +1346,7 @@
                 <w:rStyle w:val="Hyperlink"/>
                 <w:noProof/>
               </w:rPr>
-              <w:t>Problem Definition</w:t>
+              <w:t>Aim and Objectives</w:t>
             </w:r>
             <w:r>
               <w:rPr>
@@ -1410,7 +1367,7 @@
                 <w:noProof/>
                 <w:webHidden/>
               </w:rPr>
-              <w:instrText xml:space="preserve"> PAGEREF _Toc242875086 \h </w:instrText>
+              <w:instrText xml:space="preserve"> PAGEREF _Toc243431119 \h </w:instrText>
             </w:r>
             <w:r>
               <w:rPr>
@@ -1430,95 +1387,7 @@
                 <w:noProof/>
                 <w:webHidden/>
               </w:rPr>
-              <w:t>7</w:t>
-            </w:r>
-            <w:r>
-              <w:rPr>
-                <w:noProof/>
-                <w:webHidden/>
-              </w:rPr>
-              <w:fldChar w:fldCharType="end"/>
-            </w:r>
-          </w:hyperlink>
-        </w:p>
-        <w:p>
-          <w:pPr>
-            <w:pStyle w:val="TOC1"/>
-            <w:rPr>
-              <w:rFonts w:asciiTheme="minorHAnsi" w:eastAsiaTheme="minorEastAsia" w:hAnsiTheme="minorHAnsi" w:cstheme="minorBidi"/>
-              <w:noProof/>
-              <w:kern w:val="2"/>
-              <w:szCs w:val="24"/>
-              <w:lang w:eastAsia="en-IE"/>
-              <w14:ligatures w14:val="standardContextual"/>
-            </w:rPr>
-          </w:pPr>
-          <w:hyperlink w:anchor="_Toc242875087" w:history="1">
-            <w:r>
-              <w:rPr>
-                <w:rStyle w:val="Hyperlink"/>
-                <w:noProof/>
-              </w:rPr>
-              <w:t>4</w:t>
-            </w:r>
-            <w:r>
-              <w:rPr>
-                <w:rFonts w:asciiTheme="minorHAnsi" w:eastAsiaTheme="minorEastAsia" w:hAnsiTheme="minorHAnsi" w:cstheme="minorBidi"/>
-                <w:noProof/>
-                <w:kern w:val="2"/>
-                <w:szCs w:val="24"/>
-                <w:lang w:eastAsia="en-IE"/>
-                <w14:ligatures w14:val="standardContextual"/>
-              </w:rPr>
-              <w:tab/>
-            </w:r>
-            <w:r>
-              <w:rPr>
-                <w:rStyle w:val="Hyperlink"/>
-                <w:noProof/>
-              </w:rPr>
-              <w:t>Aim and Objectives</w:t>
-            </w:r>
-            <w:r>
-              <w:rPr>
-                <w:noProof/>
-                <w:webHidden/>
-              </w:rPr>
-              <w:tab/>
-            </w:r>
-            <w:r>
-              <w:rPr>
-                <w:noProof/>
-                <w:webHidden/>
-              </w:rPr>
-              <w:fldChar w:fldCharType="begin"/>
-            </w:r>
-            <w:r>
-              <w:rPr>
-                <w:noProof/>
-                <w:webHidden/>
-              </w:rPr>
-              <w:instrText xml:space="preserve"> PAGEREF _Toc242875087 \h </w:instrText>
-            </w:r>
-            <w:r>
-              <w:rPr>
-                <w:noProof/>
-                <w:webHidden/>
-              </w:rPr>
-            </w:r>
-            <w:r>
-              <w:rPr>
-                <w:noProof/>
-                <w:webHidden/>
-              </w:rPr>
-              <w:fldChar w:fldCharType="separate"/>
-            </w:r>
-            <w:r>
-              <w:rPr>
-                <w:noProof/>
-                <w:webHidden/>
-              </w:rPr>
-              <w:t>8</w:t>
+              <w:t>6</w:t>
             </w:r>
             <w:r>
               <w:rPr>
@@ -1545,13 +1414,13 @@
               <w14:ligatures w14:val="standardContextual"/>
             </w:rPr>
           </w:pPr>
-          <w:hyperlink w:anchor="_Toc242875088" w:history="1">
+          <w:hyperlink w:anchor="_Toc243431120" w:history="1">
             <w:r>
               <w:rPr>
                 <w:rStyle w:val="Hyperlink"/>
                 <w:noProof/>
               </w:rPr>
-              <w:t>4.1</w:t>
+              <w:t>3.1</w:t>
             </w:r>
             <w:r>
               <w:rPr>
@@ -1590,7 +1459,7 @@
                 <w:noProof/>
                 <w:webHidden/>
               </w:rPr>
-              <w:instrText xml:space="preserve"> PAGEREF _Toc242875088 \h </w:instrText>
+              <w:instrText xml:space="preserve"> PAGEREF _Toc243431120 \h </w:instrText>
             </w:r>
             <w:r>
               <w:rPr>
@@ -1610,7 +1479,7 @@
                 <w:noProof/>
                 <w:webHidden/>
               </w:rPr>
-              <w:t>8</w:t>
+              <w:t>6</w:t>
             </w:r>
             <w:r>
               <w:rPr>
@@ -1637,13 +1506,13 @@
               <w14:ligatures w14:val="standardContextual"/>
             </w:rPr>
           </w:pPr>
-          <w:hyperlink w:anchor="_Toc242875089" w:history="1">
+          <w:hyperlink w:anchor="_Toc243431121" w:history="1">
             <w:r>
               <w:rPr>
                 <w:rStyle w:val="Hyperlink"/>
                 <w:noProof/>
               </w:rPr>
-              <w:t>4.2</w:t>
+              <w:t>3.2</w:t>
             </w:r>
             <w:r>
               <w:rPr>
@@ -1682,7 +1551,7 @@
                 <w:noProof/>
                 <w:webHidden/>
               </w:rPr>
-              <w:instrText xml:space="preserve"> PAGEREF _Toc242875089 \h </w:instrText>
+              <w:instrText xml:space="preserve"> PAGEREF _Toc243431121 \h </w:instrText>
             </w:r>
             <w:r>
               <w:rPr>
@@ -1702,7 +1571,7 @@
                 <w:noProof/>
                 <w:webHidden/>
               </w:rPr>
-              <w:t>8</w:t>
+              <w:t>6</w:t>
             </w:r>
             <w:r>
               <w:rPr>
@@ -1729,13 +1598,13 @@
               <w14:ligatures w14:val="standardContextual"/>
             </w:rPr>
           </w:pPr>
-          <w:hyperlink w:anchor="_Toc242875090" w:history="1">
+          <w:hyperlink w:anchor="_Toc243431122" w:history="1">
             <w:r>
               <w:rPr>
                 <w:rStyle w:val="Hyperlink"/>
                 <w:noProof/>
               </w:rPr>
-              <w:t>4.2.1</w:t>
+              <w:t>3.2.1</w:t>
             </w:r>
             <w:r>
               <w:rPr>
@@ -1774,7 +1643,7 @@
                 <w:noProof/>
                 <w:webHidden/>
               </w:rPr>
-              <w:instrText xml:space="preserve"> PAGEREF _Toc242875090 \h </w:instrText>
+              <w:instrText xml:space="preserve"> PAGEREF _Toc243431122 \h </w:instrText>
             </w:r>
             <w:r>
               <w:rPr>
@@ -1794,7 +1663,7 @@
                 <w:noProof/>
                 <w:webHidden/>
               </w:rPr>
-              <w:t>8</w:t>
+              <w:t>6</w:t>
             </w:r>
             <w:r>
               <w:rPr>
@@ -1821,13 +1690,13 @@
               <w14:ligatures w14:val="standardContextual"/>
             </w:rPr>
           </w:pPr>
-          <w:hyperlink w:anchor="_Toc242875091" w:history="1">
+          <w:hyperlink w:anchor="_Toc243431123" w:history="1">
             <w:r>
               <w:rPr>
                 <w:rStyle w:val="Hyperlink"/>
                 <w:noProof/>
               </w:rPr>
-              <w:t>4.2.2</w:t>
+              <w:t>3.2.2</w:t>
             </w:r>
             <w:r>
               <w:rPr>
@@ -1866,7 +1735,7 @@
                 <w:noProof/>
                 <w:webHidden/>
               </w:rPr>
-              <w:instrText xml:space="preserve"> PAGEREF _Toc242875091 \h </w:instrText>
+              <w:instrText xml:space="preserve"> PAGEREF _Toc243431123 \h </w:instrText>
             </w:r>
             <w:r>
               <w:rPr>
@@ -1886,7 +1755,7 @@
                 <w:noProof/>
                 <w:webHidden/>
               </w:rPr>
-              <w:t>8</w:t>
+              <w:t>6</w:t>
             </w:r>
             <w:r>
               <w:rPr>
@@ -1913,13 +1782,13 @@
               <w14:ligatures w14:val="standardContextual"/>
             </w:rPr>
           </w:pPr>
-          <w:hyperlink w:anchor="_Toc242875092" w:history="1">
+          <w:hyperlink w:anchor="_Toc243431124" w:history="1">
             <w:r>
               <w:rPr>
                 <w:rStyle w:val="Hyperlink"/>
                 <w:noProof/>
               </w:rPr>
-              <w:t>4.2.3</w:t>
+              <w:t>3.2.3</w:t>
             </w:r>
             <w:r>
               <w:rPr>
@@ -1958,7 +1827,7 @@
                 <w:noProof/>
                 <w:webHidden/>
               </w:rPr>
-              <w:instrText xml:space="preserve"> PAGEREF _Toc242875092 \h </w:instrText>
+              <w:instrText xml:space="preserve"> PAGEREF _Toc243431124 \h </w:instrText>
             </w:r>
             <w:r>
               <w:rPr>
@@ -1978,7 +1847,7 @@
                 <w:noProof/>
                 <w:webHidden/>
               </w:rPr>
-              <w:t>8</w:t>
+              <w:t>6</w:t>
             </w:r>
             <w:r>
               <w:rPr>
@@ -2005,13 +1874,13 @@
               <w14:ligatures w14:val="standardContextual"/>
             </w:rPr>
           </w:pPr>
-          <w:hyperlink w:anchor="_Toc242875093" w:history="1">
+          <w:hyperlink w:anchor="_Toc243431125" w:history="1">
             <w:r>
               <w:rPr>
                 <w:rStyle w:val="Hyperlink"/>
                 <w:noProof/>
               </w:rPr>
-              <w:t>4.2.4</w:t>
+              <w:t>3.2.4</w:t>
             </w:r>
             <w:r>
               <w:rPr>
@@ -2050,7 +1919,7 @@
                 <w:noProof/>
                 <w:webHidden/>
               </w:rPr>
-              <w:instrText xml:space="preserve"> PAGEREF _Toc242875093 \h </w:instrText>
+              <w:instrText xml:space="preserve"> PAGEREF _Toc243431125 \h </w:instrText>
             </w:r>
             <w:r>
               <w:rPr>
@@ -2070,7 +1939,7 @@
                 <w:noProof/>
                 <w:webHidden/>
               </w:rPr>
-              <w:t>8</w:t>
+              <w:t>6</w:t>
             </w:r>
             <w:r>
               <w:rPr>
@@ -2097,13 +1966,13 @@
               <w14:ligatures w14:val="standardContextual"/>
             </w:rPr>
           </w:pPr>
-          <w:hyperlink w:anchor="_Toc242875094" w:history="1">
+          <w:hyperlink w:anchor="_Toc243431126" w:history="1">
             <w:r>
               <w:rPr>
                 <w:rStyle w:val="Hyperlink"/>
                 <w:noProof/>
               </w:rPr>
-              <w:t>4.2.5</w:t>
+              <w:t>3.2.5</w:t>
             </w:r>
             <w:r>
               <w:rPr>
@@ -2142,7 +2011,7 @@
                 <w:noProof/>
                 <w:webHidden/>
               </w:rPr>
-              <w:instrText xml:space="preserve"> PAGEREF _Toc242875094 \h </w:instrText>
+              <w:instrText xml:space="preserve"> PAGEREF _Toc243431126 \h </w:instrText>
             </w:r>
             <w:r>
               <w:rPr>
@@ -2162,7 +2031,7 @@
                 <w:noProof/>
                 <w:webHidden/>
               </w:rPr>
-              <w:t>8</w:t>
+              <w:t>6</w:t>
             </w:r>
             <w:r>
               <w:rPr>
@@ -2189,13 +2058,13 @@
               <w14:ligatures w14:val="standardContextual"/>
             </w:rPr>
           </w:pPr>
-          <w:hyperlink w:anchor="_Toc242875095" w:history="1">
+          <w:hyperlink w:anchor="_Toc243431127" w:history="1">
             <w:r>
               <w:rPr>
                 <w:rStyle w:val="Hyperlink"/>
                 <w:noProof/>
               </w:rPr>
-              <w:t>4.3</w:t>
+              <w:t>3.3</w:t>
             </w:r>
             <w:r>
               <w:rPr>
@@ -2234,7 +2103,7 @@
                 <w:noProof/>
                 <w:webHidden/>
               </w:rPr>
-              <w:instrText xml:space="preserve"> PAGEREF _Toc242875095 \h </w:instrText>
+              <w:instrText xml:space="preserve"> PAGEREF _Toc243431127 \h </w:instrText>
             </w:r>
             <w:r>
               <w:rPr>
@@ -2254,7 +2123,7 @@
                 <w:noProof/>
                 <w:webHidden/>
               </w:rPr>
-              <w:t>8</w:t>
+              <w:t>6</w:t>
             </w:r>
             <w:r>
               <w:rPr>
@@ -2277,13 +2146,13 @@
               <w14:ligatures w14:val="standardContextual"/>
             </w:rPr>
           </w:pPr>
-          <w:hyperlink w:anchor="_Toc242875096" w:history="1">
+          <w:hyperlink w:anchor="_Toc243431128" w:history="1">
             <w:r>
               <w:rPr>
                 <w:rStyle w:val="Hyperlink"/>
                 <w:noProof/>
               </w:rPr>
-              <w:t>5</w:t>
+              <w:t>4</w:t>
             </w:r>
             <w:r>
               <w:rPr>
@@ -2322,7 +2191,7 @@
                 <w:noProof/>
                 <w:webHidden/>
               </w:rPr>
-              <w:instrText xml:space="preserve"> PAGEREF _Toc242875096 \h </w:instrText>
+              <w:instrText xml:space="preserve"> PAGEREF _Toc243431128 \h </w:instrText>
             </w:r>
             <w:r>
               <w:rPr>
@@ -2342,7 +2211,7 @@
                 <w:noProof/>
                 <w:webHidden/>
               </w:rPr>
-              <w:t>9</w:t>
+              <w:t>7</w:t>
             </w:r>
             <w:r>
               <w:rPr>
@@ -2369,13 +2238,13 @@
               <w14:ligatures w14:val="standardContextual"/>
             </w:rPr>
           </w:pPr>
-          <w:hyperlink w:anchor="_Toc242875097" w:history="1">
+          <w:hyperlink w:anchor="_Toc243431129" w:history="1">
             <w:r>
               <w:rPr>
                 <w:rStyle w:val="Hyperlink"/>
                 <w:noProof/>
               </w:rPr>
-              <w:t>5.1</w:t>
+              <w:t>4.1</w:t>
             </w:r>
             <w:r>
               <w:rPr>
@@ -2414,7 +2283,7 @@
                 <w:noProof/>
                 <w:webHidden/>
               </w:rPr>
-              <w:instrText xml:space="preserve"> PAGEREF _Toc242875097 \h </w:instrText>
+              <w:instrText xml:space="preserve"> PAGEREF _Toc243431129 \h </w:instrText>
             </w:r>
             <w:r>
               <w:rPr>
@@ -2434,7 +2303,7 @@
                 <w:noProof/>
                 <w:webHidden/>
               </w:rPr>
-              <w:t>9</w:t>
+              <w:t>7</w:t>
             </w:r>
             <w:r>
               <w:rPr>
@@ -2461,13 +2330,13 @@
               <w14:ligatures w14:val="standardContextual"/>
             </w:rPr>
           </w:pPr>
-          <w:hyperlink w:anchor="_Toc242875098" w:history="1">
+          <w:hyperlink w:anchor="_Toc243431130" w:history="1">
             <w:r>
               <w:rPr>
                 <w:rStyle w:val="Hyperlink"/>
                 <w:noProof/>
               </w:rPr>
-              <w:t>5.2</w:t>
+              <w:t>4.2</w:t>
             </w:r>
             <w:r>
               <w:rPr>
@@ -2506,7 +2375,7 @@
                 <w:noProof/>
                 <w:webHidden/>
               </w:rPr>
-              <w:instrText xml:space="preserve"> PAGEREF _Toc242875098 \h </w:instrText>
+              <w:instrText xml:space="preserve"> PAGEREF _Toc243431130 \h </w:instrText>
             </w:r>
             <w:r>
               <w:rPr>
@@ -2526,7 +2395,7 @@
                 <w:noProof/>
                 <w:webHidden/>
               </w:rPr>
-              <w:t>9</w:t>
+              <w:t>7</w:t>
             </w:r>
             <w:r>
               <w:rPr>
@@ -2553,13 +2422,13 @@
               <w14:ligatures w14:val="standardContextual"/>
             </w:rPr>
           </w:pPr>
-          <w:hyperlink w:anchor="_Toc242875099" w:history="1">
+          <w:hyperlink w:anchor="_Toc243431131" w:history="1">
             <w:r>
               <w:rPr>
                 <w:rStyle w:val="Hyperlink"/>
                 <w:noProof/>
               </w:rPr>
-              <w:t>5.3</w:t>
+              <w:t>4.3</w:t>
             </w:r>
             <w:r>
               <w:rPr>
@@ -2598,7 +2467,7 @@
                 <w:noProof/>
                 <w:webHidden/>
               </w:rPr>
-              <w:instrText xml:space="preserve"> PAGEREF _Toc242875099 \h </w:instrText>
+              <w:instrText xml:space="preserve"> PAGEREF _Toc243431131 \h </w:instrText>
             </w:r>
             <w:r>
               <w:rPr>
@@ -2618,7 +2487,7 @@
                 <w:noProof/>
                 <w:webHidden/>
               </w:rPr>
-              <w:t>9</w:t>
+              <w:t>7</w:t>
             </w:r>
             <w:r>
               <w:rPr>
@@ -2641,13 +2510,13 @@
               <w14:ligatures w14:val="standardContextual"/>
             </w:rPr>
           </w:pPr>
-          <w:hyperlink w:anchor="_Toc242875100" w:history="1">
+          <w:hyperlink w:anchor="_Toc243431132" w:history="1">
             <w:r>
               <w:rPr>
                 <w:rStyle w:val="Hyperlink"/>
                 <w:noProof/>
               </w:rPr>
-              <w:t>6</w:t>
+              <w:t>5</w:t>
             </w:r>
             <w:r>
               <w:rPr>
@@ -2686,7 +2555,7 @@
                 <w:noProof/>
                 <w:webHidden/>
               </w:rPr>
-              <w:instrText xml:space="preserve"> PAGEREF _Toc242875100 \h </w:instrText>
+              <w:instrText xml:space="preserve"> PAGEREF _Toc243431132 \h </w:instrText>
             </w:r>
             <w:r>
               <w:rPr>
@@ -2706,7 +2575,7 @@
                 <w:noProof/>
                 <w:webHidden/>
               </w:rPr>
-              <w:t>10</w:t>
+              <w:t>8</w:t>
             </w:r>
             <w:r>
               <w:rPr>
@@ -2733,7 +2602,7 @@
               <w14:ligatures w14:val="standardContextual"/>
             </w:rPr>
           </w:pPr>
-          <w:hyperlink w:anchor="_Toc242875101" w:history="1">
+          <w:hyperlink w:anchor="_Toc243431133" w:history="1">
             <w:r>
               <w:rPr>
                 <w:rStyle w:val="Hyperlink"/>
@@ -2779,7 +2648,7 @@
                 <w:noProof/>
                 <w:webHidden/>
               </w:rPr>
-              <w:instrText xml:space="preserve"> PAGEREF _Toc242875101 \h </w:instrText>
+              <w:instrText xml:space="preserve"> PAGEREF _Toc243431133 \h </w:instrText>
             </w:r>
             <w:r>
               <w:rPr>
@@ -2799,7 +2668,7 @@
                 <w:noProof/>
                 <w:webHidden/>
               </w:rPr>
-              <w:t>10</w:t>
+              <w:t>8</w:t>
             </w:r>
             <w:r>
               <w:rPr>
@@ -2826,7 +2695,7 @@
               <w14:ligatures w14:val="standardContextual"/>
             </w:rPr>
           </w:pPr>
-          <w:hyperlink w:anchor="_Toc242875102" w:history="1">
+          <w:hyperlink w:anchor="_Toc243431134" w:history="1">
             <w:r>
               <w:rPr>
                 <w:rStyle w:val="Hyperlink"/>
@@ -2872,7 +2741,7 @@
                 <w:noProof/>
                 <w:webHidden/>
               </w:rPr>
-              <w:instrText xml:space="preserve"> PAGEREF _Toc242875102 \h </w:instrText>
+              <w:instrText xml:space="preserve"> PAGEREF _Toc243431134 \h </w:instrText>
             </w:r>
             <w:r>
               <w:rPr>
@@ -2892,7 +2761,7 @@
                 <w:noProof/>
                 <w:webHidden/>
               </w:rPr>
-              <w:t>10</w:t>
+              <w:t>8</w:t>
             </w:r>
             <w:r>
               <w:rPr>
@@ -2919,7 +2788,7 @@
               <w14:ligatures w14:val="standardContextual"/>
             </w:rPr>
           </w:pPr>
-          <w:hyperlink w:anchor="_Toc242875103" w:history="1">
+          <w:hyperlink w:anchor="_Toc243431135" w:history="1">
             <w:r>
               <w:rPr>
                 <w:rStyle w:val="Hyperlink"/>
@@ -2965,7 +2834,7 @@
                 <w:noProof/>
                 <w:webHidden/>
               </w:rPr>
-              <w:instrText xml:space="preserve"> PAGEREF _Toc242875103 \h </w:instrText>
+              <w:instrText xml:space="preserve"> PAGEREF _Toc243431135 \h </w:instrText>
             </w:r>
             <w:r>
               <w:rPr>
@@ -2985,7 +2854,7 @@
                 <w:noProof/>
                 <w:webHidden/>
               </w:rPr>
-              <w:t>10</w:t>
+              <w:t>8</w:t>
             </w:r>
             <w:r>
               <w:rPr>
@@ -3012,7 +2881,7 @@
               <w14:ligatures w14:val="standardContextual"/>
             </w:rPr>
           </w:pPr>
-          <w:hyperlink w:anchor="_Toc242875104" w:history="1">
+          <w:hyperlink w:anchor="_Toc243431136" w:history="1">
             <w:r>
               <w:rPr>
                 <w:rStyle w:val="Hyperlink"/>
@@ -3058,7 +2927,7 @@
                 <w:noProof/>
                 <w:webHidden/>
               </w:rPr>
-              <w:instrText xml:space="preserve"> PAGEREF _Toc242875104 \h </w:instrText>
+              <w:instrText xml:space="preserve"> PAGEREF _Toc243431136 \h </w:instrText>
             </w:r>
             <w:r>
               <w:rPr>
@@ -3078,7 +2947,7 @@
                 <w:noProof/>
                 <w:webHidden/>
               </w:rPr>
-              <w:t>10</w:t>
+              <w:t>8</w:t>
             </w:r>
             <w:r>
               <w:rPr>
@@ -3105,7 +2974,7 @@
               <w14:ligatures w14:val="standardContextual"/>
             </w:rPr>
           </w:pPr>
-          <w:hyperlink w:anchor="_Toc242875105" w:history="1">
+          <w:hyperlink w:anchor="_Toc243431137" w:history="1">
             <w:r>
               <w:rPr>
                 <w:rStyle w:val="Hyperlink"/>
@@ -3151,7 +3020,7 @@
                 <w:noProof/>
                 <w:webHidden/>
               </w:rPr>
-              <w:instrText xml:space="preserve"> PAGEREF _Toc242875105 \h </w:instrText>
+              <w:instrText xml:space="preserve"> PAGEREF _Toc243431137 \h </w:instrText>
             </w:r>
             <w:r>
               <w:rPr>
@@ -3171,7 +3040,7 @@
                 <w:noProof/>
                 <w:webHidden/>
               </w:rPr>
-              <w:t>10</w:t>
+              <w:t>8</w:t>
             </w:r>
             <w:r>
               <w:rPr>
@@ -3198,7 +3067,7 @@
               <w14:ligatures w14:val="standardContextual"/>
             </w:rPr>
           </w:pPr>
-          <w:hyperlink w:anchor="_Toc242875106" w:history="1">
+          <w:hyperlink w:anchor="_Toc243431138" w:history="1">
             <w:r>
               <w:rPr>
                 <w:rStyle w:val="Hyperlink"/>
@@ -3244,7 +3113,7 @@
                 <w:noProof/>
                 <w:webHidden/>
               </w:rPr>
-              <w:instrText xml:space="preserve"> PAGEREF _Toc242875106 \h </w:instrText>
+              <w:instrText xml:space="preserve"> PAGEREF _Toc243431138 \h </w:instrText>
             </w:r>
             <w:r>
               <w:rPr>
@@ -3264,7 +3133,7 @@
                 <w:noProof/>
                 <w:webHidden/>
               </w:rPr>
-              <w:t>10</w:t>
+              <w:t>8</w:t>
             </w:r>
             <w:r>
               <w:rPr>
@@ -3291,13 +3160,13 @@
               <w14:ligatures w14:val="standardContextual"/>
             </w:rPr>
           </w:pPr>
-          <w:hyperlink w:anchor="_Toc242875107" w:history="1">
+          <w:hyperlink w:anchor="_Toc243431139" w:history="1">
             <w:r>
               <w:rPr>
                 <w:rStyle w:val="Hyperlink"/>
                 <w:noProof/>
               </w:rPr>
-              <w:t>6.1</w:t>
+              <w:t>5.1</w:t>
             </w:r>
             <w:r>
               <w:rPr>
@@ -3336,7 +3205,7 @@
                 <w:noProof/>
                 <w:webHidden/>
               </w:rPr>
-              <w:instrText xml:space="preserve"> PAGEREF _Toc242875107 \h </w:instrText>
+              <w:instrText xml:space="preserve"> PAGEREF _Toc243431139 \h </w:instrText>
             </w:r>
             <w:r>
               <w:rPr>
@@ -3356,7 +3225,7 @@
                 <w:noProof/>
                 <w:webHidden/>
               </w:rPr>
-              <w:t>10</w:t>
+              <w:t>9</w:t>
             </w:r>
             <w:r>
               <w:rPr>
@@ -3383,13 +3252,13 @@
               <w14:ligatures w14:val="standardContextual"/>
             </w:rPr>
           </w:pPr>
-          <w:hyperlink w:anchor="_Toc242875108" w:history="1">
+          <w:hyperlink w:anchor="_Toc243431140" w:history="1">
             <w:r>
               <w:rPr>
                 <w:rStyle w:val="Hyperlink"/>
                 <w:noProof/>
               </w:rPr>
-              <w:t>6.2</w:t>
+              <w:t>5.2</w:t>
             </w:r>
             <w:r>
               <w:rPr>
@@ -3428,7 +3297,7 @@
                 <w:noProof/>
                 <w:webHidden/>
               </w:rPr>
-              <w:instrText xml:space="preserve"> PAGEREF _Toc242875108 \h </w:instrText>
+              <w:instrText xml:space="preserve"> PAGEREF _Toc243431140 \h </w:instrText>
             </w:r>
             <w:r>
               <w:rPr>
@@ -3448,7 +3317,7 @@
                 <w:noProof/>
                 <w:webHidden/>
               </w:rPr>
-              <w:t>11</w:t>
+              <w:t>9</w:t>
             </w:r>
             <w:r>
               <w:rPr>
@@ -3471,13 +3340,13 @@
               <w14:ligatures w14:val="standardContextual"/>
             </w:rPr>
           </w:pPr>
-          <w:hyperlink w:anchor="_Toc242875109" w:history="1">
+          <w:hyperlink w:anchor="_Toc243431141" w:history="1">
             <w:r>
               <w:rPr>
                 <w:rStyle w:val="Hyperlink"/>
                 <w:noProof/>
               </w:rPr>
-              <w:t>7</w:t>
+              <w:t>6</w:t>
             </w:r>
             <w:r>
               <w:rPr>
@@ -3516,7 +3385,7 @@
                 <w:noProof/>
                 <w:webHidden/>
               </w:rPr>
-              <w:instrText xml:space="preserve"> PAGEREF _Toc242875109 \h </w:instrText>
+              <w:instrText xml:space="preserve"> PAGEREF _Toc243431141 \h </w:instrText>
             </w:r>
             <w:r>
               <w:rPr>
@@ -3536,7 +3405,7 @@
                 <w:noProof/>
                 <w:webHidden/>
               </w:rPr>
-              <w:t>13</w:t>
+              <w:t>11</w:t>
             </w:r>
             <w:r>
               <w:rPr>
@@ -3559,13 +3428,13 @@
               <w14:ligatures w14:val="standardContextual"/>
             </w:rPr>
           </w:pPr>
-          <w:hyperlink w:anchor="_Toc242875110" w:history="1">
+          <w:hyperlink w:anchor="_Toc243431142" w:history="1">
             <w:r>
               <w:rPr>
                 <w:rStyle w:val="Hyperlink"/>
                 <w:noProof/>
               </w:rPr>
-              <w:t>8</w:t>
+              <w:t>7</w:t>
             </w:r>
             <w:r>
               <w:rPr>
@@ -3604,7 +3473,7 @@
                 <w:noProof/>
                 <w:webHidden/>
               </w:rPr>
-              <w:instrText xml:space="preserve"> PAGEREF _Toc242875110 \h </w:instrText>
+              <w:instrText xml:space="preserve"> PAGEREF _Toc243431142 \h </w:instrText>
             </w:r>
             <w:r>
               <w:rPr>
@@ -3624,7 +3493,7 @@
                 <w:noProof/>
                 <w:webHidden/>
               </w:rPr>
-              <w:t>14</w:t>
+              <w:t>12</w:t>
             </w:r>
             <w:r>
               <w:rPr>
@@ -3647,13 +3516,13 @@
               <w14:ligatures w14:val="standardContextual"/>
             </w:rPr>
           </w:pPr>
-          <w:hyperlink w:anchor="_Toc242875111" w:history="1">
+          <w:hyperlink w:anchor="_Toc243431143" w:history="1">
             <w:r>
               <w:rPr>
                 <w:rStyle w:val="Hyperlink"/>
                 <w:noProof/>
               </w:rPr>
-              <w:t>9</w:t>
+              <w:t>8</w:t>
             </w:r>
             <w:r>
               <w:rPr>
@@ -3692,7 +3561,7 @@
                 <w:noProof/>
                 <w:webHidden/>
               </w:rPr>
-              <w:instrText xml:space="preserve"> PAGEREF _Toc242875111 \h </w:instrText>
+              <w:instrText xml:space="preserve"> PAGEREF _Toc243431143 \h </w:instrText>
             </w:r>
             <w:r>
               <w:rPr>
@@ -3712,7 +3581,7 @@
                 <w:noProof/>
                 <w:webHidden/>
               </w:rPr>
-              <w:t>15</w:t>
+              <w:t>13</w:t>
             </w:r>
             <w:r>
               <w:rPr>
@@ -3735,13 +3604,13 @@
               <w14:ligatures w14:val="standardContextual"/>
             </w:rPr>
           </w:pPr>
-          <w:hyperlink w:anchor="_Toc242875112" w:history="1">
+          <w:hyperlink w:anchor="_Toc243431144" w:history="1">
             <w:r>
               <w:rPr>
                 <w:rStyle w:val="Hyperlink"/>
                 <w:noProof/>
               </w:rPr>
-              <w:t>10</w:t>
+              <w:t>9</w:t>
             </w:r>
             <w:r>
               <w:rPr>
@@ -3759,7 +3628,7 @@
                 <w:rStyle w:val="Hyperlink"/>
                 <w:noProof/>
               </w:rPr>
-              <w:t>Ethical and Legal Considerations References</w:t>
+              <w:t>Ethical and Legal Considerations</w:t>
             </w:r>
             <w:r>
               <w:rPr>
@@ -3780,7 +3649,7 @@
                 <w:noProof/>
                 <w:webHidden/>
               </w:rPr>
-              <w:instrText xml:space="preserve"> PAGEREF _Toc242875112 \h </w:instrText>
+              <w:instrText xml:space="preserve"> PAGEREF _Toc243431144 \h </w:instrText>
             </w:r>
             <w:r>
               <w:rPr>
@@ -3800,7 +3669,95 @@
                 <w:noProof/>
                 <w:webHidden/>
               </w:rPr>
-              <w:t>16</w:t>
+              <w:t>14</w:t>
+            </w:r>
+            <w:r>
+              <w:rPr>
+                <w:noProof/>
+                <w:webHidden/>
+              </w:rPr>
+              <w:fldChar w:fldCharType="end"/>
+            </w:r>
+          </w:hyperlink>
+        </w:p>
+        <w:p>
+          <w:pPr>
+            <w:pStyle w:val="TOC1"/>
+            <w:rPr>
+              <w:rFonts w:asciiTheme="minorHAnsi" w:eastAsiaTheme="minorEastAsia" w:hAnsiTheme="minorHAnsi" w:cstheme="minorBidi"/>
+              <w:noProof/>
+              <w:kern w:val="2"/>
+              <w:szCs w:val="24"/>
+              <w:lang w:eastAsia="en-IE"/>
+              <w14:ligatures w14:val="standardContextual"/>
+            </w:rPr>
+          </w:pPr>
+          <w:hyperlink w:anchor="_Toc243431145" w:history="1">
+            <w:r>
+              <w:rPr>
+                <w:rStyle w:val="Hyperlink"/>
+                <w:noProof/>
+              </w:rPr>
+              <w:t>10</w:t>
+            </w:r>
+            <w:r>
+              <w:rPr>
+                <w:rFonts w:asciiTheme="minorHAnsi" w:eastAsiaTheme="minorEastAsia" w:hAnsiTheme="minorHAnsi" w:cstheme="minorBidi"/>
+                <w:noProof/>
+                <w:kern w:val="2"/>
+                <w:szCs w:val="24"/>
+                <w:lang w:eastAsia="en-IE"/>
+                <w14:ligatures w14:val="standardContextual"/>
+              </w:rPr>
+              <w:tab/>
+            </w:r>
+            <w:r>
+              <w:rPr>
+                <w:rStyle w:val="Hyperlink"/>
+                <w:noProof/>
+              </w:rPr>
+              <w:t>References</w:t>
+            </w:r>
+            <w:r>
+              <w:rPr>
+                <w:noProof/>
+                <w:webHidden/>
+              </w:rPr>
+              <w:tab/>
+            </w:r>
+            <w:r>
+              <w:rPr>
+                <w:noProof/>
+                <w:webHidden/>
+              </w:rPr>
+              <w:fldChar w:fldCharType="begin"/>
+            </w:r>
+            <w:r>
+              <w:rPr>
+                <w:noProof/>
+                <w:webHidden/>
+              </w:rPr>
+              <w:instrText xml:space="preserve"> PAGEREF _Toc243431145 \h </w:instrText>
+            </w:r>
+            <w:r>
+              <w:rPr>
+                <w:noProof/>
+                <w:webHidden/>
+              </w:rPr>
+            </w:r>
+            <w:r>
+              <w:rPr>
+                <w:noProof/>
+                <w:webHidden/>
+              </w:rPr>
+              <w:fldChar w:fldCharType="separate"/>
+            </w:r>
+            <w:r>
+              <w:rPr>
+                <w:noProof/>
+                <w:webHidden/>
+              </w:rPr>
+              <w:t>15</w:t>
             </w:r>
             <w:r>
               <w:rPr>
@@ -3825,21 +3782,59 @@
     </w:sdt>
     <w:p>
       <w:pPr>
-        <w:suppressAutoHyphens w:val="0"/>
-        <w:autoSpaceDN/>
-        <w:spacing w:line="259" w:lineRule="auto"/>
-        <w:rPr>
-          <w:noProof/>
-          <w:color w:val="4472C4"/>
-        </w:rPr>
-      </w:pPr>
-      <w:r>
-        <w:rPr>
-          <w:noProof/>
-          <w:color w:val="4472C4"/>
-        </w:rPr>
-        <w:br w:type="page"/>
-      </w:r>
+        <w:pStyle w:val="TableofFigures"/>
+        <w:tabs>
+          <w:tab w:val="right" w:leader="dot" w:pos="9016"/>
+        </w:tabs>
+      </w:pPr>
+    </w:p>
+    <w:p>
+      <w:pPr>
+        <w:pStyle w:val="TableofFigures"/>
+        <w:tabs>
+          <w:tab w:val="right" w:leader="dot" w:pos="9016"/>
+        </w:tabs>
+      </w:pPr>
+    </w:p>
+    <w:p>
+      <w:pPr>
+        <w:pStyle w:val="TableofFigures"/>
+        <w:tabs>
+          <w:tab w:val="right" w:leader="dot" w:pos="9016"/>
+        </w:tabs>
+      </w:pPr>
+    </w:p>
+    <w:p>
+      <w:pPr>
+        <w:pStyle w:val="TableofFigures"/>
+        <w:tabs>
+          <w:tab w:val="right" w:leader="dot" w:pos="9016"/>
+        </w:tabs>
+      </w:pPr>
+    </w:p>
+    <w:p>
+      <w:pPr>
+        <w:pStyle w:val="TableofFigures"/>
+        <w:tabs>
+          <w:tab w:val="right" w:leader="dot" w:pos="9016"/>
+        </w:tabs>
+      </w:pPr>
+    </w:p>
+    <w:p>
+      <w:pPr>
+        <w:pStyle w:val="TableofFigures"/>
+        <w:tabs>
+          <w:tab w:val="right" w:leader="dot" w:pos="9016"/>
+        </w:tabs>
+      </w:pPr>
+    </w:p>
+    <w:p>
+      <w:pPr>
+        <w:pStyle w:val="TableofFigures"/>
+        <w:tabs>
+          <w:tab w:val="right" w:leader="dot" w:pos="9016"/>
+        </w:tabs>
+      </w:pPr>
     </w:p>
     <w:p>
       <w:pPr>
@@ -3848,32 +3843,24 @@
           <w:tab w:val="right" w:leader="dot" w:pos="9016"/>
         </w:tabs>
         <w:rPr>
+          <w:rFonts w:asciiTheme="minorHAnsi" w:eastAsiaTheme="minorEastAsia" w:hAnsiTheme="minorHAnsi" w:cstheme="minorBidi"/>
           <w:noProof/>
+          <w:kern w:val="2"/>
+          <w:szCs w:val="24"/>
+          <w:lang w:eastAsia="en-IE"/>
+          <w14:ligatures w14:val="standardContextual"/>
         </w:rPr>
       </w:pPr>
       <w:r>
-        <w:rPr>
-          <w:noProof/>
-          <w:color w:val="4472C4"/>
-        </w:rPr>
-        <w:lastRenderedPageBreak/>
         <w:fldChar w:fldCharType="begin"/>
       </w:r>
       <w:r>
-        <w:rPr>
-          <w:noProof/>
-          <w:color w:val="4472C4"/>
-        </w:rPr>
         <w:instrText xml:space="preserve"> TOC \h \z \c "Figure" </w:instrText>
       </w:r>
       <w:r>
-        <w:rPr>
-          <w:noProof/>
-          <w:color w:val="4472C4"/>
-        </w:rPr>
         <w:fldChar w:fldCharType="separate"/>
       </w:r>
-      <w:hyperlink w:anchor="_Toc242874953" w:history="1">
+      <w:hyperlink w:anchor="_Toc243431198" w:history="1">
         <w:r>
           <w:rPr>
             <w:rStyle w:val="Hyperlink"/>
@@ -3900,7 +3887,7 @@
             <w:noProof/>
             <w:webHidden/>
           </w:rPr>
-          <w:instrText xml:space="preserve"> PAGEREF _Toc242874953 \h </w:instrText>
+          <w:instrText xml:space="preserve"> PAGEREF _Toc243431198 \h </w:instrText>
         </w:r>
         <w:r>
           <w:rPr>
@@ -3920,7 +3907,7 @@
             <w:noProof/>
             <w:webHidden/>
           </w:rPr>
-          <w:t>11</w:t>
+          <w:t>13</w:t>
         </w:r>
         <w:r>
           <w:rPr>
@@ -3938,10 +3925,15 @@
           <w:tab w:val="right" w:leader="dot" w:pos="9016"/>
         </w:tabs>
         <w:rPr>
+          <w:rFonts w:asciiTheme="minorHAnsi" w:eastAsiaTheme="minorEastAsia" w:hAnsiTheme="minorHAnsi" w:cstheme="minorBidi"/>
           <w:noProof/>
+          <w:kern w:val="2"/>
+          <w:szCs w:val="24"/>
+          <w:lang w:eastAsia="en-IE"/>
+          <w14:ligatures w14:val="standardContextual"/>
         </w:rPr>
       </w:pPr>
-      <w:hyperlink w:anchor="_Toc242874954" w:history="1">
+      <w:hyperlink w:anchor="_Toc243431199" w:history="1">
         <w:r>
           <w:rPr>
             <w:rStyle w:val="Hyperlink"/>
@@ -3968,75 +3960,7 @@
             <w:noProof/>
             <w:webHidden/>
           </w:rPr>
-          <w:instrText xml:space="preserve"> PAGEREF _Toc242874954 \h </w:instrText>
-        </w:r>
-        <w:r>
-          <w:rPr>
-            <w:noProof/>
-            <w:webHidden/>
-          </w:rPr>
-        </w:r>
-        <w:r>
-          <w:rPr>
-            <w:noProof/>
-            <w:webHidden/>
-          </w:rPr>
-          <w:fldChar w:fldCharType="separate"/>
-        </w:r>
-        <w:r>
-          <w:rPr>
-            <w:noProof/>
-            <w:webHidden/>
-          </w:rPr>
-          <w:t>12</w:t>
-        </w:r>
-        <w:r>
-          <w:rPr>
-            <w:noProof/>
-            <w:webHidden/>
-          </w:rPr>
-          <w:fldChar w:fldCharType="end"/>
-        </w:r>
-      </w:hyperlink>
-    </w:p>
-    <w:p>
-      <w:pPr>
-        <w:pStyle w:val="TableofFigures"/>
-        <w:tabs>
-          <w:tab w:val="right" w:leader="dot" w:pos="9016"/>
-        </w:tabs>
-        <w:rPr>
-          <w:noProof/>
-        </w:rPr>
-      </w:pPr>
-      <w:hyperlink w:anchor="_Toc242874955" w:history="1">
-        <w:r>
-          <w:rPr>
-            <w:rStyle w:val="Hyperlink"/>
-            <w:noProof/>
-          </w:rPr>
-          <w:t>Figure 3 Gantt chart</w:t>
-        </w:r>
-        <w:r>
-          <w:rPr>
-            <w:noProof/>
-            <w:webHidden/>
-          </w:rPr>
-          <w:tab/>
-        </w:r>
-        <w:r>
-          <w:rPr>
-            <w:noProof/>
-            <w:webHidden/>
-          </w:rPr>
-          <w:fldChar w:fldCharType="begin"/>
-        </w:r>
-        <w:r>
-          <w:rPr>
-            <w:noProof/>
-            <w:webHidden/>
-          </w:rPr>
-          <w:instrText xml:space="preserve"> PAGEREF _Toc242874955 \h </w:instrText>
+          <w:instrText xml:space="preserve"> PAGEREF _Toc243431199 \h </w:instrText>
         </w:r>
         <w:r>
           <w:rPr>
@@ -4069,16 +3993,88 @@
     </w:p>
     <w:p>
       <w:pPr>
-        <w:jc w:val="both"/>
+        <w:pStyle w:val="TableofFigures"/>
+        <w:tabs>
+          <w:tab w:val="right" w:leader="dot" w:pos="9016"/>
+        </w:tabs>
         <w:rPr>
+          <w:rFonts w:asciiTheme="minorHAnsi" w:eastAsiaTheme="minorEastAsia" w:hAnsiTheme="minorHAnsi" w:cstheme="minorBidi"/>
           <w:noProof/>
-          <w:color w:val="4472C4"/>
+          <w:kern w:val="2"/>
+          <w:szCs w:val="24"/>
+          <w:lang w:eastAsia="en-IE"/>
+          <w14:ligatures w14:val="standardContextual"/>
         </w:rPr>
       </w:pPr>
+      <w:hyperlink w:anchor="_Toc243431200" w:history="1">
+        <w:r>
+          <w:rPr>
+            <w:rStyle w:val="Hyperlink"/>
+            <w:noProof/>
+          </w:rPr>
+          <w:t>Figure 3 Gantt chart</w:t>
+        </w:r>
+        <w:r>
+          <w:rPr>
+            <w:noProof/>
+            <w:webHidden/>
+          </w:rPr>
+          <w:tab/>
+        </w:r>
+        <w:r>
+          <w:rPr>
+            <w:noProof/>
+            <w:webHidden/>
+          </w:rPr>
+          <w:fldChar w:fldCharType="begin"/>
+        </w:r>
+        <w:r>
+          <w:rPr>
+            <w:noProof/>
+            <w:webHidden/>
+          </w:rPr>
+          <w:instrText xml:space="preserve"> PAGEREF _Toc243431200 \h </w:instrText>
+        </w:r>
+        <w:r>
+          <w:rPr>
+            <w:noProof/>
+            <w:webHidden/>
+          </w:rPr>
+        </w:r>
+        <w:r>
+          <w:rPr>
+            <w:noProof/>
+            <w:webHidden/>
+          </w:rPr>
+          <w:fldChar w:fldCharType="separate"/>
+        </w:r>
+        <w:r>
+          <w:rPr>
+            <w:noProof/>
+            <w:webHidden/>
+          </w:rPr>
+          <w:t>16</w:t>
+        </w:r>
+        <w:r>
+          <w:rPr>
+            <w:noProof/>
+            <w:webHidden/>
+          </w:rPr>
+          <w:fldChar w:fldCharType="end"/>
+        </w:r>
+      </w:hyperlink>
+    </w:p>
+    <w:p>
+      <w:pPr>
+        <w:pStyle w:val="TOCHeading"/>
+      </w:pPr>
       <w:r>
         <w:rPr>
-          <w:noProof/>
-          <w:color w:val="4472C4"/>
+          <w:rFonts w:ascii="Times New Roman" w:eastAsia="Calibri" w:hAnsi="Times New Roman" w:cs="Times New Roman"/>
+          <w:color w:val="auto"/>
+          <w:sz w:val="24"/>
+          <w:szCs w:val="22"/>
+          <w:lang w:val="en-IE"/>
         </w:rPr>
         <w:fldChar w:fldCharType="end"/>
       </w:r>
@@ -4086,25 +4082,30 @@
     <w:p>
       <w:pPr>
         <w:suppressAutoHyphens w:val="0"/>
-        <w:jc w:val="both"/>
+        <w:autoSpaceDN/>
+        <w:spacing w:line="259" w:lineRule="auto"/>
         <w:rPr>
-          <w:noProof/>
-          <w:color w:val="4472C4"/>
+          <w:rFonts w:asciiTheme="majorHAnsi" w:eastAsiaTheme="majorEastAsia" w:hAnsiTheme="majorHAnsi" w:cstheme="majorBidi"/>
+          <w:color w:val="2F5496" w:themeColor="accent1" w:themeShade="BF"/>
+          <w:sz w:val="32"/>
+          <w:szCs w:val="32"/>
+          <w:lang w:val="en-US"/>
         </w:rPr>
       </w:pPr>
       <w:r>
+        <w:br w:type="page"/>
+      </w:r>
+    </w:p>
+    <w:p>
+      <w:pPr>
+        <w:pStyle w:val="Heading1"/>
         <w:rPr>
-          <w:noProof/>
-          <w:color w:val="4472C4"/>
+          <w:rFonts w:asciiTheme="majorHAnsi" w:eastAsiaTheme="majorEastAsia" w:hAnsiTheme="majorHAnsi"/>
+          <w:sz w:val="32"/>
+          <w:szCs w:val="32"/>
+          <w:lang w:val="en-US"/>
         </w:rPr>
-        <w:br w:type="page"/>
-      </w:r>
-    </w:p>
-    <w:p>
-      <w:pPr>
-        <w:pStyle w:val="Heading1"/>
-      </w:pPr>
-      <w:bookmarkStart w:id="0" w:name="_Toc242875084"/>
+      </w:pPr>
       <w:r>
         <w:lastRenderedPageBreak/>
         <w:t>Introduction</w:t>
@@ -4115,9 +4116,6 @@
       </w:r>
     </w:p>
     <w:p>
-      <w:pPr>
-        <w:jc w:val="both"/>
-      </w:pPr>
       <w:r>
         <w:t xml:space="preserve">Nowadays, E-commerce plays a significant role in the retail industry, allowing businesses to reach customers through online platforms. </w:t>
       </w:r>
@@ -4126,9 +4124,6 @@
       </w:r>
     </w:p>
     <w:p>
-      <w:pPr>
-        <w:jc w:val="both"/>
-      </w:pPr>
       <w:r>
         <w:t>Understanding online customer purchasing behaviour is therefore important for identifying opportunities to increase conversion rates and improve sales.</w:t>
       </w:r>
@@ -4140,9 +4135,6 @@
       </w:r>
     </w:p>
     <w:p>
-      <w:pPr>
-        <w:jc w:val="both"/>
-      </w:pPr>
       <w:r>
         <w:t xml:space="preserve">This project will investigate how data analytics and machine learning can help online retailers understand customer behaviour and predict purchasing decisions. </w:t>
       </w:r>
@@ -4164,9 +4156,6 @@
       </w:r>
     </w:p>
     <w:p>
-      <w:pPr>
-        <w:jc w:val="both"/>
-      </w:pPr>
       <w:r>
         <w:t>This project's findings will provide insights into online purchasing behaviour and identify opportunities for retailers to improve customer engagement, marketing decisions,</w:t>
       </w:r>
@@ -4174,16 +4163,8 @@
         <w:t xml:space="preserve"> and conversion strategies.</w:t>
       </w:r>
     </w:p>
-    <w:p>
-      <w:pPr>
-        <w:spacing w:after="0" w:line="259" w:lineRule="auto"/>
-        <w:jc w:val="both"/>
-      </w:pPr>
-    </w:p>
-    <w:p>
-      <w:pPr>
-        <w:suppressAutoHyphens w:val="0"/>
-      </w:pPr>
+    <w:p/>
+    <w:p>
       <w:r>
         <w:br w:type="page"/>
       </w:r>
@@ -4192,12 +4173,14 @@
       <w:pPr>
         <w:pStyle w:val="Heading1"/>
       </w:pPr>
-      <w:bookmarkStart w:id="1" w:name="_Toc242875085"/>
+      <w:bookmarkStart w:id="1" w:name="_Toc243430764"/>
+      <w:bookmarkStart w:id="2" w:name="_Toc243431117"/>
       <w:r>
         <w:lastRenderedPageBreak/>
         <w:t>Project Title</w:t>
       </w:r>
       <w:bookmarkEnd w:id="1"/>
+      <w:bookmarkEnd w:id="2"/>
     </w:p>
     <w:p>
       <w:pPr>
@@ -4237,17 +4220,16 @@
       <w:pPr>
         <w:pStyle w:val="Heading1"/>
       </w:pPr>
-      <w:bookmarkStart w:id="2" w:name="_Toc242875086"/>
+      <w:bookmarkStart w:id="3" w:name="_Toc243430765"/>
+      <w:bookmarkStart w:id="4" w:name="_Toc243431118"/>
       <w:r>
         <w:lastRenderedPageBreak/>
         <w:t>Problem Definition</w:t>
       </w:r>
-      <w:bookmarkEnd w:id="2"/>
-    </w:p>
-    <w:p>
-      <w:pPr>
-        <w:jc w:val="both"/>
-      </w:pPr>
+      <w:bookmarkEnd w:id="3"/>
+      <w:bookmarkEnd w:id="4"/>
+    </w:p>
+    <w:p>
       <w:r>
         <w:t xml:space="preserve">One of the main challenges faced by e-commerce businesses is </w:t>
       </w:r>
@@ -4263,17 +4245,11 @@
       </w:r>
     </w:p>
     <w:p>
-      <w:pPr>
-        <w:jc w:val="both"/>
-      </w:pPr>
       <w:r>
         <w:t>Without these insights, online retailers may miss sales opportunities and struggle to develop effective marketing and customer engagement strategies.</w:t>
       </w:r>
     </w:p>
     <w:p>
-      <w:pPr>
-        <w:jc w:val="both"/>
-      </w:pPr>
       <w:r>
         <w:rPr>
           <w:b/>
@@ -4308,9 +4284,6 @@
       </w:r>
     </w:p>
     <w:p>
-      <w:pPr>
-        <w:jc w:val="both"/>
-      </w:pPr>
       <w:r>
         <w:rPr>
           <w:b/>
@@ -4366,9 +4339,6 @@
       </w:r>
     </w:p>
     <w:p>
-      <w:pPr>
-        <w:jc w:val="both"/>
-      </w:pPr>
       <w:r>
         <w:br w:type="page"/>
       </w:r>
@@ -4377,12 +4347,14 @@
       <w:pPr>
         <w:pStyle w:val="Heading1"/>
       </w:pPr>
-      <w:bookmarkStart w:id="3" w:name="_Toc242875087"/>
+      <w:bookmarkStart w:id="5" w:name="_Toc243430766"/>
+      <w:bookmarkStart w:id="6" w:name="_Toc243431119"/>
       <w:r>
         <w:lastRenderedPageBreak/>
         <w:t>Aim and Objectives</w:t>
       </w:r>
-      <w:bookmarkEnd w:id="3"/>
+      <w:bookmarkEnd w:id="5"/>
+      <w:bookmarkEnd w:id="6"/>
       <w:r>
         <w:t xml:space="preserve"> </w:t>
       </w:r>
@@ -4391,16 +4363,15 @@
       <w:pPr>
         <w:pStyle w:val="Heading2"/>
       </w:pPr>
-      <w:bookmarkStart w:id="4" w:name="_Toc242875088"/>
+      <w:bookmarkStart w:id="7" w:name="_Toc243430767"/>
+      <w:bookmarkStart w:id="8" w:name="_Toc243431120"/>
       <w:r>
         <w:t>Aim</w:t>
       </w:r>
-      <w:bookmarkEnd w:id="4"/>
-    </w:p>
-    <w:p>
-      <w:pPr>
-        <w:jc w:val="both"/>
-      </w:pPr>
+      <w:bookmarkEnd w:id="7"/>
+      <w:bookmarkEnd w:id="8"/>
+    </w:p>
+    <w:p>
       <w:r>
         <w:t>The aim of this project is to use data analytics and machine learning to analyse the Online Shoppers Purchasing Intention dataset, identify browsing patterns associated with purchases, and develop and evaluate predictive models that classify shopping sessions as purchases or non-purchases. The findings will support data-driven recommendations to help online retailers improve customer engagement, identify sales opportunities and improve conversion strategies.</w:t>
       </w:r>
@@ -4410,21 +4381,25 @@
       <w:pPr>
         <w:pStyle w:val="Heading2"/>
       </w:pPr>
-      <w:bookmarkStart w:id="5" w:name="_Toc242875089"/>
+      <w:bookmarkStart w:id="9" w:name="_Toc243430768"/>
+      <w:bookmarkStart w:id="10" w:name="_Toc243431121"/>
       <w:r>
         <w:t>Project Objectives</w:t>
       </w:r>
-      <w:bookmarkEnd w:id="5"/>
+      <w:bookmarkEnd w:id="9"/>
+      <w:bookmarkEnd w:id="10"/>
     </w:p>
     <w:p>
       <w:pPr>
         <w:pStyle w:val="Heading3"/>
       </w:pPr>
-      <w:bookmarkStart w:id="6" w:name="_Toc242875090"/>
+      <w:bookmarkStart w:id="11" w:name="_Toc243430769"/>
+      <w:bookmarkStart w:id="12" w:name="_Toc243431122"/>
       <w:r>
         <w:t>Objective #1</w:t>
       </w:r>
-      <w:bookmarkEnd w:id="6"/>
+      <w:bookmarkEnd w:id="11"/>
+      <w:bookmarkEnd w:id="12"/>
     </w:p>
     <w:p>
       <w:r>
@@ -4445,11 +4420,13 @@
       <w:pPr>
         <w:pStyle w:val="Heading3"/>
       </w:pPr>
-      <w:bookmarkStart w:id="7" w:name="_Toc242875091"/>
+      <w:bookmarkStart w:id="13" w:name="_Toc243430770"/>
+      <w:bookmarkStart w:id="14" w:name="_Toc243431123"/>
       <w:r>
         <w:t>Objective #2</w:t>
       </w:r>
-      <w:bookmarkEnd w:id="7"/>
+      <w:bookmarkEnd w:id="13"/>
+      <w:bookmarkEnd w:id="14"/>
     </w:p>
     <w:p>
       <w:r>
@@ -4479,11 +4456,13 @@
       <w:pPr>
         <w:pStyle w:val="Heading3"/>
       </w:pPr>
-      <w:bookmarkStart w:id="8" w:name="_Toc242875092"/>
+      <w:bookmarkStart w:id="15" w:name="_Toc243430771"/>
+      <w:bookmarkStart w:id="16" w:name="_Toc243431124"/>
       <w:r>
         <w:t>Objective #3</w:t>
       </w:r>
-      <w:bookmarkEnd w:id="8"/>
+      <w:bookmarkEnd w:id="15"/>
+      <w:bookmarkEnd w:id="16"/>
     </w:p>
     <w:p>
       <w:r>
@@ -4501,11 +4480,13 @@
       <w:pPr>
         <w:pStyle w:val="Heading3"/>
       </w:pPr>
-      <w:bookmarkStart w:id="9" w:name="_Toc242875093"/>
+      <w:bookmarkStart w:id="17" w:name="_Toc243430772"/>
+      <w:bookmarkStart w:id="18" w:name="_Toc243431125"/>
       <w:r>
         <w:t>Objective #4</w:t>
       </w:r>
-      <w:bookmarkEnd w:id="9"/>
+      <w:bookmarkEnd w:id="17"/>
+      <w:bookmarkEnd w:id="18"/>
     </w:p>
     <w:p>
       <w:r>
@@ -4523,11 +4504,13 @@
       <w:pPr>
         <w:pStyle w:val="Heading3"/>
       </w:pPr>
-      <w:bookmarkStart w:id="10" w:name="_Toc242875094"/>
+      <w:bookmarkStart w:id="19" w:name="_Toc243430773"/>
+      <w:bookmarkStart w:id="20" w:name="_Toc243431126"/>
       <w:r>
         <w:t>Objective #5</w:t>
       </w:r>
-      <w:bookmarkEnd w:id="10"/>
+      <w:bookmarkEnd w:id="19"/>
+      <w:bookmarkEnd w:id="20"/>
     </w:p>
     <w:p>
       <w:r>
@@ -4546,18 +4529,18 @@
       <w:pPr>
         <w:pStyle w:val="Heading2"/>
       </w:pPr>
-      <w:bookmarkStart w:id="11" w:name="_Toc242875095"/>
+      <w:bookmarkStart w:id="21" w:name="_Toc243430774"/>
+      <w:bookmarkStart w:id="22" w:name="_Toc243431127"/>
       <w:r>
         <w:t>Business objective</w:t>
       </w:r>
-      <w:bookmarkEnd w:id="11"/>
+      <w:bookmarkEnd w:id="21"/>
+      <w:bookmarkEnd w:id="22"/>
     </w:p>
     <w:p>
       <w:pPr>
         <w:pStyle w:val="NormalWeb"/>
-        <w:jc w:val="both"/>
-      </w:pPr>
-      <w:bookmarkStart w:id="12" w:name="_Toc242875096"/>
+      </w:pPr>
       <w:r>
         <w:t>To identify browsing patterns associated with completed purchases, evaluate the ability of machine learning models to distinguish purchasing from non-purchasing sessions, and provide actionable recommendations that online retailers could test to improve customer engagement and conversion strategies.</w:t>
       </w:r>
@@ -4583,11 +4566,14 @@
       <w:pPr>
         <w:pStyle w:val="Heading1"/>
       </w:pPr>
+      <w:bookmarkStart w:id="23" w:name="_Toc243430775"/>
+      <w:bookmarkStart w:id="24" w:name="_Toc243431128"/>
       <w:r>
         <w:lastRenderedPageBreak/>
         <w:t>Scope</w:t>
       </w:r>
-      <w:bookmarkEnd w:id="12"/>
+      <w:bookmarkEnd w:id="23"/>
+      <w:bookmarkEnd w:id="24"/>
       <w:r>
         <w:t xml:space="preserve"> </w:t>
       </w:r>
@@ -4602,11 +4588,13 @@
       <w:pPr>
         <w:pStyle w:val="Heading2"/>
       </w:pPr>
-      <w:bookmarkStart w:id="13" w:name="_Toc242875097"/>
+      <w:bookmarkStart w:id="25" w:name="_Toc243430776"/>
+      <w:bookmarkStart w:id="26" w:name="_Toc243431129"/>
       <w:r>
         <w:t>Included:</w:t>
       </w:r>
-      <w:bookmarkEnd w:id="13"/>
+      <w:bookmarkEnd w:id="25"/>
+      <w:bookmarkEnd w:id="26"/>
       <w:r>
         <w:t xml:space="preserve"> </w:t>
       </w:r>
@@ -4724,14 +4712,16 @@
       <w:pPr>
         <w:pStyle w:val="Heading2"/>
       </w:pPr>
-      <w:bookmarkStart w:id="14" w:name="_Toc242875098"/>
+      <w:bookmarkStart w:id="27" w:name="_Toc243430777"/>
+      <w:bookmarkStart w:id="28" w:name="_Toc243431130"/>
       <w:r>
         <w:t>Excluded</w:t>
       </w:r>
       <w:r>
         <w:t>:</w:t>
       </w:r>
-      <w:bookmarkEnd w:id="14"/>
+      <w:bookmarkEnd w:id="27"/>
+      <w:bookmarkEnd w:id="28"/>
       <w:r>
         <w:t xml:space="preserve"> </w:t>
       </w:r>
@@ -4805,11 +4795,13 @@
       <w:pPr>
         <w:pStyle w:val="Heading2"/>
       </w:pPr>
-      <w:bookmarkStart w:id="15" w:name="_Toc242875099"/>
+      <w:bookmarkStart w:id="29" w:name="_Toc243430778"/>
+      <w:bookmarkStart w:id="30" w:name="_Toc243431131"/>
       <w:r>
         <w:t>Time Scope:</w:t>
       </w:r>
-      <w:bookmarkEnd w:id="15"/>
+      <w:bookmarkEnd w:id="29"/>
+      <w:bookmarkEnd w:id="30"/>
     </w:p>
     <w:p>
       <w:r>
@@ -4836,17 +4828,16 @@
       <w:pPr>
         <w:pStyle w:val="Heading1"/>
       </w:pPr>
-      <w:bookmarkStart w:id="16" w:name="_Toc242875100"/>
+      <w:bookmarkStart w:id="31" w:name="_Toc243430779"/>
+      <w:bookmarkStart w:id="32" w:name="_Toc243431132"/>
       <w:r>
         <w:lastRenderedPageBreak/>
         <w:t>Methodology</w:t>
       </w:r>
-      <w:bookmarkEnd w:id="16"/>
-    </w:p>
-    <w:p>
-      <w:pPr>
-        <w:jc w:val="both"/>
-      </w:pPr>
+      <w:bookmarkEnd w:id="31"/>
+      <w:bookmarkEnd w:id="32"/>
+    </w:p>
+    <w:p>
       <w:r>
         <w:t xml:space="preserve">The project will follow the </w:t>
       </w:r>
@@ -4855,24 +4846,20 @@
           <w:b/>
           <w:bCs/>
         </w:rPr>
-        <w:t>Cross-Industry Standard Process for Data Mining (CRISP-DM),</w:t>
-      </w:r>
-      <w:r>
-        <w:t xml:space="preserve"> a structured framework with six stages: business understanding, data understanding, data preparation, modelling, evaluation and deployment (Chapman et al., 2000).</w:t>
-      </w:r>
-    </w:p>
-    <w:p>
-      <w:pPr>
-        <w:jc w:val="both"/>
-      </w:pPr>
-      <w:r>
-        <w:t>CRISP-DM was selected because it aligns business objectives with data analysis and predictive modelling, while allowing data preparation and models to be refined as needed.</w:t>
-      </w:r>
-      <w:r>
-        <w:t xml:space="preserve"> </w:t>
-      </w:r>
-      <w:r>
-        <w:t>Data analytics identifies purchasing patterns. Machine learning uses those patterns to predict future purchasing outcomes.</w:t>
+        <w:t>Cross-Industry Standard Process for Data Mining (CRISP-DM)</w:t>
+      </w:r>
+      <w:r>
+        <w:t>, a structured framework with six stages: business understanding, data understanding, data preparation, modelling, evaluation and deployment (Chapman et al., 2000).</w:t>
+      </w:r>
+    </w:p>
+    <w:p>
+      <w:r>
+        <w:t>CRISP-DM was selected because it connects business objectives with data analysis and predictive modelling. The process is iterative, allowing further data preparation, feature selection and model tuning based on evaluation results.</w:t>
+      </w:r>
+    </w:p>
+    <w:p>
+      <w:r>
+        <w:t>.</w:t>
       </w:r>
     </w:p>
     <w:p>
@@ -4883,11 +4870,13 @@
           <w:numId w:val="18"/>
         </w:numPr>
       </w:pPr>
-      <w:bookmarkStart w:id="17" w:name="_Toc242875101"/>
+      <w:bookmarkStart w:id="33" w:name="_Toc243430780"/>
+      <w:bookmarkStart w:id="34" w:name="_Toc243431133"/>
       <w:r>
         <w:t>Business Understanding:</w:t>
       </w:r>
-      <w:bookmarkEnd w:id="17"/>
+      <w:bookmarkEnd w:id="33"/>
+      <w:bookmarkEnd w:id="34"/>
     </w:p>
     <w:p>
       <w:pPr>
@@ -4908,11 +4897,13 @@
           <w:numId w:val="18"/>
         </w:numPr>
       </w:pPr>
-      <w:bookmarkStart w:id="18" w:name="_Toc242875102"/>
+      <w:bookmarkStart w:id="35" w:name="_Toc243430781"/>
+      <w:bookmarkStart w:id="36" w:name="_Toc243431134"/>
       <w:r>
         <w:t>Data Understanding:</w:t>
       </w:r>
-      <w:bookmarkEnd w:id="18"/>
+      <w:bookmarkEnd w:id="35"/>
+      <w:bookmarkEnd w:id="36"/>
       <w:r>
         <w:t xml:space="preserve"> </w:t>
       </w:r>
@@ -4939,11 +4930,13 @@
           <w:numId w:val="18"/>
         </w:numPr>
       </w:pPr>
-      <w:bookmarkStart w:id="19" w:name="_Toc242875103"/>
+      <w:bookmarkStart w:id="37" w:name="_Toc243430782"/>
+      <w:bookmarkStart w:id="38" w:name="_Toc243431135"/>
       <w:r>
         <w:t>Data Preparation:</w:t>
       </w:r>
-      <w:bookmarkEnd w:id="19"/>
+      <w:bookmarkEnd w:id="37"/>
+      <w:bookmarkEnd w:id="38"/>
       <w:r>
         <w:t xml:space="preserve"> </w:t>
       </w:r>
@@ -4964,11 +4957,13 @@
           <w:numId w:val="18"/>
         </w:numPr>
       </w:pPr>
-      <w:bookmarkStart w:id="20" w:name="_Toc242875104"/>
+      <w:bookmarkStart w:id="39" w:name="_Toc243430783"/>
+      <w:bookmarkStart w:id="40" w:name="_Toc243431136"/>
       <w:r>
         <w:t>Modelling:</w:t>
       </w:r>
-      <w:bookmarkEnd w:id="20"/>
+      <w:bookmarkEnd w:id="39"/>
+      <w:bookmarkEnd w:id="40"/>
     </w:p>
     <w:p>
       <w:pPr>
@@ -5060,11 +5055,13 @@
           <w:numId w:val="18"/>
         </w:numPr>
       </w:pPr>
-      <w:bookmarkStart w:id="21" w:name="_Toc242875105"/>
+      <w:bookmarkStart w:id="41" w:name="_Toc243430784"/>
+      <w:bookmarkStart w:id="42" w:name="_Toc243431137"/>
       <w:r>
         <w:t>Evaluation:</w:t>
       </w:r>
-      <w:bookmarkEnd w:id="21"/>
+      <w:bookmarkEnd w:id="41"/>
+      <w:bookmarkEnd w:id="42"/>
       <w:r>
         <w:t xml:space="preserve"> </w:t>
       </w:r>
@@ -5072,7 +5069,6 @@
     <w:p>
       <w:pPr>
         <w:ind w:left="720"/>
-        <w:jc w:val="both"/>
         <w:rPr>
           <w:rFonts w:eastAsiaTheme="majorEastAsia"/>
         </w:rPr>
@@ -5095,11 +5091,13 @@
           <w:numId w:val="18"/>
         </w:numPr>
       </w:pPr>
-      <w:bookmarkStart w:id="22" w:name="_Toc242875106"/>
+      <w:bookmarkStart w:id="43" w:name="_Toc243430785"/>
+      <w:bookmarkStart w:id="44" w:name="_Toc243431138"/>
       <w:r>
         <w:t>Deployment and Business Recommendations:</w:t>
       </w:r>
-      <w:bookmarkEnd w:id="22"/>
+      <w:bookmarkEnd w:id="43"/>
+      <w:bookmarkEnd w:id="44"/>
       <w:r>
         <w:t xml:space="preserve"> </w:t>
       </w:r>
@@ -5107,29 +5105,28 @@
     <w:p>
       <w:pPr>
         <w:pStyle w:val="ListParagraph"/>
-        <w:jc w:val="both"/>
-      </w:pPr>
-      <w:r>
-        <w:t xml:space="preserve">Present </w:t>
-      </w:r>
-      <w:r>
-        <w:t>findings through a Tableau dashboard and recommend data-driven strategies that retailers could test to improve customer engagement, marketing decisions, conversion rates and sales opportunities.</w:t>
-      </w:r>
-    </w:p>
-    <w:p>
-      <w:pPr>
-        <w:jc w:val="both"/>
+      </w:pPr>
+      <w:r>
+        <w:t>Present findings through a Tableau dashboard to help e-commerce marketing teams identify purchasing patterns and decide which website pages and engagement strategies to improve to increase conversion rates. Recommendations will be proposed for future testing, while implementation and measuring actual sales improvements remain outside the project's scope.</w:t>
+      </w:r>
+    </w:p>
+    <w:p>
+      <w:pPr>
+        <w:pStyle w:val="ListParagraph"/>
       </w:pPr>
     </w:p>
     <w:p>
       <w:pPr>
         <w:pStyle w:val="Heading2"/>
       </w:pPr>
-      <w:bookmarkStart w:id="23" w:name="_Toc242875107"/>
-      <w:r>
+      <w:bookmarkStart w:id="45" w:name="_Toc243430786"/>
+      <w:bookmarkStart w:id="46" w:name="_Toc243431139"/>
+      <w:r>
+        <w:lastRenderedPageBreak/>
         <w:t>Tools and Technologies</w:t>
       </w:r>
-      <w:bookmarkEnd w:id="23"/>
+      <w:bookmarkEnd w:id="45"/>
+      <w:bookmarkEnd w:id="46"/>
     </w:p>
     <w:p>
       <w:pPr>
@@ -5170,7 +5167,6 @@
         </w:numPr>
       </w:pPr>
       <w:r>
-        <w:lastRenderedPageBreak/>
         <w:t>Scikit-learn will support model development and evaluation</w:t>
       </w:r>
       <w:r>
@@ -5237,19 +5233,18 @@
       <w:pPr>
         <w:pStyle w:val="Heading2"/>
       </w:pPr>
-      <w:bookmarkStart w:id="24" w:name="_Toc242875108"/>
+      <w:bookmarkStart w:id="47" w:name="_Toc243430787"/>
+      <w:bookmarkStart w:id="48" w:name="_Toc243431140"/>
       <w:r>
         <w:t>Proposed System Architecture</w:t>
       </w:r>
-      <w:bookmarkEnd w:id="24"/>
+      <w:bookmarkEnd w:id="47"/>
+      <w:bookmarkEnd w:id="48"/>
       <w:r>
         <w:t xml:space="preserve"> </w:t>
       </w:r>
     </w:p>
     <w:p>
-      <w:pPr>
-        <w:jc w:val="both"/>
-      </w:pPr>
       <w:r>
         <w:t>Figure 1 illustrates the proposed workflow from data acquisition to business reporting. The UCI dataset will be explored and prepared using Python before developing and evaluating three machine learning classification models. The results will be presented through a Tableau dashboard and final report, supporting recommendations to improve marketing decisions, conversion strategies and sales opportunities. Live system integration is outside the project scope.</w:t>
       </w:r>
@@ -5320,23 +5315,40 @@
       <w:pPr>
         <w:pStyle w:val="Caption"/>
       </w:pPr>
+      <w:bookmarkStart w:id="49" w:name="_Toc243431146"/>
+      <w:bookmarkStart w:id="50" w:name="_Toc243431198"/>
       <w:r>
         <w:t xml:space="preserve">Figure </w:t>
       </w:r>
-      <w:fldSimple w:instr=" SEQ Figure \* ARABIC ">
-        <w:r>
-          <w:rPr>
-            <w:noProof/>
-          </w:rPr>
-          <w:t>1</w:t>
-        </w:r>
-      </w:fldSimple>
+      <w:r>
+        <w:fldChar w:fldCharType="begin"/>
+      </w:r>
+      <w:r>
+        <w:instrText xml:space="preserve"> SEQ Figure \* ARABIC </w:instrText>
+      </w:r>
+      <w:r>
+        <w:fldChar w:fldCharType="separate"/>
+      </w:r>
+      <w:r>
+        <w:rPr>
+          <w:noProof/>
+        </w:rPr>
+        <w:t>1</w:t>
+      </w:r>
+      <w:r>
+        <w:rPr>
+          <w:noProof/>
+        </w:rPr>
+        <w:fldChar w:fldCharType="end"/>
+      </w:r>
       <w:r>
         <w:t xml:space="preserve"> </w:t>
       </w:r>
       <w:r>
         <w:t>High-level architectural diagram</w:t>
       </w:r>
+      <w:bookmarkEnd w:id="49"/>
+      <w:bookmarkEnd w:id="50"/>
     </w:p>
     <w:p>
       <w:pPr>
@@ -5358,67 +5370,113 @@
       <w:pPr>
         <w:pStyle w:val="Heading1"/>
       </w:pPr>
-      <w:bookmarkStart w:id="25" w:name="_Toc242875109"/>
+      <w:bookmarkStart w:id="51" w:name="_Toc243430788"/>
+      <w:bookmarkStart w:id="52" w:name="_Toc243431141"/>
       <w:r>
         <w:lastRenderedPageBreak/>
         <w:t>Data Sources</w:t>
       </w:r>
-      <w:bookmarkEnd w:id="25"/>
-    </w:p>
-    <w:p>
-      <w:pPr>
-        <w:jc w:val="both"/>
+      <w:bookmarkEnd w:id="51"/>
+      <w:bookmarkEnd w:id="52"/>
+    </w:p>
+    <w:p>
+      <w:pPr>
+        <w:pStyle w:val="NormalWeb"/>
       </w:pPr>
       <w:r>
         <w:t xml:space="preserve">The project will use the </w:t>
+      </w:r>
+      <w:r>
+        <w:rPr>
+          <w:rStyle w:val="Strong"/>
+        </w:rPr>
+        <w:t>Online Shoppers Purchasing Intention Dataset</w:t>
+      </w:r>
+      <w:r>
+        <w:t xml:space="preserve">, available from the UCI Machine Learning Repository (Sakar and </w:t>
+      </w:r>
+      <w:proofErr w:type="spellStart"/>
+      <w:r>
+        <w:t>Kastro</w:t>
+      </w:r>
+      <w:proofErr w:type="spellEnd"/>
+      <w:r>
+        <w:t>, 2018).</w:t>
+      </w:r>
+    </w:p>
+    <w:p>
+      <w:pPr>
+        <w:pStyle w:val="NormalWeb"/>
+      </w:pPr>
+      <w:r>
+        <w:t xml:space="preserve">The dataset contains </w:t>
+      </w:r>
+      <w:r>
+        <w:rPr>
+          <w:rStyle w:val="Strong"/>
+        </w:rPr>
+        <w:t>12,330 website sessions, 17 independent variables and one target variable, Revenue</w:t>
+      </w:r>
+      <w:r>
+        <w:t>, indicating whether a purchase occurred. The variables include product-page visits, browsing duration, bounce rates, exit rates, visitor type and other session characteristics (Figure 2).</w:t>
+      </w:r>
+    </w:p>
+    <w:p>
+      <w:pPr>
+        <w:pStyle w:val="NormalWeb"/>
+      </w:pPr>
+      <w:r>
+        <w:t xml:space="preserve">This dataset is suitable for the project because it supports binary classification of purchasing outcomes and helps identify browsing patterns </w:t>
+      </w:r>
+      <w:r>
+        <w:t>linked</w:t>
+      </w:r>
+      <w:r>
+        <w:t xml:space="preserve"> </w:t>
+      </w:r>
+      <w:r>
+        <w:t>to</w:t>
+      </w:r>
+      <w:r>
+        <w:t xml:space="preserve"> purchases.</w:t>
+      </w:r>
+    </w:p>
+    <w:p>
+      <w:pPr>
+        <w:pStyle w:val="NormalWeb"/>
+      </w:pPr>
+      <w:r>
+        <w:t xml:space="preserve">The dataset is publicly available under the </w:t>
       </w:r>
       <w:r>
         <w:rPr>
           <w:b/>
           <w:bCs/>
         </w:rPr>
-        <w:t>Online Shoppers Purchasing Intention dataset</w:t>
-      </w:r>
-      <w:r>
-        <w:t>, available from the UCI Machine Learning Repository (Sakar and Kastro, 2018).</w:t>
-      </w:r>
-    </w:p>
-    <w:p>
-      <w:pPr>
-        <w:jc w:val="both"/>
-      </w:pPr>
-      <w:r>
-        <w:t xml:space="preserve">The dataset contains approximately </w:t>
+        <w:t>Creative Commons Attribution 4.0 (CC BY 4.0)</w:t>
+      </w:r>
+      <w:r>
+        <w:t xml:space="preserve"> </w:t>
       </w:r>
       <w:r>
         <w:rPr>
           <w:b/>
           <w:bCs/>
         </w:rPr>
-        <w:t>12,330 website sessions, with 17 independent  variables and one target variable, Revenue,</w:t>
-      </w:r>
-      <w:r>
-        <w:t xml:space="preserve"> indicating whether a purchase occurred. The variables include product-page visits, browsing duration, bounce rates, exit rates, visitor type and other session characteristics. Figure 2.</w:t>
-      </w:r>
-    </w:p>
-    <w:p>
-      <w:pPr>
-        <w:jc w:val="both"/>
-      </w:pPr>
-      <w:r>
-        <w:t>This dataset is appropriate because it directly supports binary classification of purchasing outcomes and allows investigation of browsing patterns associated with completed purchases.</w:t>
-      </w:r>
-    </w:p>
-    <w:p>
-      <w:pPr>
-        <w:jc w:val="both"/>
-      </w:pPr>
-      <w:r>
-        <w:t>The dataset is publicly available under the Creative Commons Attribution 4.0 (CC BY 4.0) licence, allowing its use for academic research with appropriate acknowledgement of the original authors and source.</w:t>
-      </w:r>
-    </w:p>
-    <w:p/>
-    <w:p/>
+        <w:t>licence</w:t>
+      </w:r>
+      <w:r>
+        <w:t>, allowing its use for academic research with appropriate acknowledgement of the original authors and source.</w:t>
+      </w:r>
+    </w:p>
+    <w:p>
+      <w:pPr>
+        <w:pStyle w:val="NormalWeb"/>
+      </w:pPr>
+      <w:r>
+        <w:t>However, the dataset has some limitations. It contains historical data from a specific e-commerce setting, so the findings may not fully reflect current online shopping behaviour or apply to all retailers. These limitations will be considered when interpreting the results and making business recommendations.</w:t>
+      </w:r>
+    </w:p>
     <w:p>
       <w:r>
         <w:t xml:space="preserve"> </w:t>
@@ -5473,25 +5531,42 @@
       <w:pPr>
         <w:pStyle w:val="Caption"/>
       </w:pPr>
-      <w:bookmarkStart w:id="26" w:name="_Toc242874954"/>
+      <w:bookmarkStart w:id="53" w:name="_Toc242874954"/>
+      <w:bookmarkStart w:id="54" w:name="_Toc243431147"/>
+      <w:bookmarkStart w:id="55" w:name="_Toc243431199"/>
       <w:r>
         <w:t xml:space="preserve">Figure </w:t>
       </w:r>
-      <w:fldSimple w:instr=" SEQ Figure \* ARABIC ">
-        <w:r>
-          <w:rPr>
-            <w:noProof/>
-          </w:rPr>
-          <w:t>2</w:t>
-        </w:r>
-      </w:fldSimple>
+      <w:r>
+        <w:fldChar w:fldCharType="begin"/>
+      </w:r>
+      <w:r>
+        <w:instrText xml:space="preserve"> SEQ Figure \* ARABIC </w:instrText>
+      </w:r>
+      <w:r>
+        <w:fldChar w:fldCharType="separate"/>
+      </w:r>
+      <w:r>
+        <w:rPr>
+          <w:noProof/>
+        </w:rPr>
+        <w:t>2</w:t>
+      </w:r>
+      <w:r>
+        <w:rPr>
+          <w:noProof/>
+        </w:rPr>
+        <w:fldChar w:fldCharType="end"/>
+      </w:r>
       <w:r>
         <w:t xml:space="preserve"> </w:t>
       </w:r>
       <w:r>
         <w:t xml:space="preserve"> Data Info</w:t>
       </w:r>
-      <w:bookmarkEnd w:id="26"/>
+      <w:bookmarkEnd w:id="53"/>
+      <w:bookmarkEnd w:id="54"/>
+      <w:bookmarkEnd w:id="55"/>
     </w:p>
     <w:p>
       <w:r>
@@ -5512,12 +5587,14 @@
       <w:pPr>
         <w:pStyle w:val="Heading1"/>
       </w:pPr>
-      <w:bookmarkStart w:id="27" w:name="_Toc242875110"/>
+      <w:bookmarkStart w:id="56" w:name="_Toc243430789"/>
+      <w:bookmarkStart w:id="57" w:name="_Toc243431142"/>
       <w:r>
         <w:lastRenderedPageBreak/>
         <w:t>Expected Deliverables</w:t>
       </w:r>
-      <w:bookmarkEnd w:id="27"/>
+      <w:bookmarkEnd w:id="56"/>
+      <w:bookmarkEnd w:id="57"/>
       <w:r>
         <w:t xml:space="preserve"> </w:t>
       </w:r>
@@ -5612,17 +5689,15 @@
       </w:r>
     </w:p>
     <w:p>
-      <w:r>
-        <w:t>The main outcome will be evaluated predictive models and recommendations to improve customer engagement, marketing decisions, conversion strategies and sales opportunities.</w:t>
-      </w:r>
-    </w:p>
-    <w:p>
       <w:pPr>
         <w:suppressAutoHyphens w:val="0"/>
         <w:autoSpaceDN/>
         <w:spacing w:line="259" w:lineRule="auto"/>
       </w:pPr>
       <w:r>
+        <w:t>The main outcome will be evaluated predictive models and data-driven recommendations to support customer engagement, marketing decisions and future conversion improvement strategies.</w:t>
+      </w:r>
+      <w:r>
         <w:br w:type="page"/>
       </w:r>
     </w:p>
@@ -5630,25 +5705,24 @@
       <w:pPr>
         <w:pStyle w:val="Heading1"/>
       </w:pPr>
-      <w:bookmarkStart w:id="28" w:name="_Toc242875111"/>
+      <w:bookmarkStart w:id="58" w:name="_Toc243430790"/>
+      <w:bookmarkStart w:id="59" w:name="_Toc243431143"/>
       <w:r>
         <w:lastRenderedPageBreak/>
         <w:t>Project Timeline</w:t>
       </w:r>
-      <w:bookmarkEnd w:id="28"/>
-    </w:p>
-    <w:p>
-      <w:pPr>
-        <w:jc w:val="both"/>
-      </w:pPr>
+      <w:bookmarkEnd w:id="58"/>
+      <w:bookmarkEnd w:id="59"/>
+    </w:p>
+    <w:p>
       <w:r>
         <w:t>The project will be completed over two semesters, from September 2026 to May 2027.</w:t>
       </w:r>
     </w:p>
     <w:p>
-      <w:pPr>
-        <w:jc w:val="both"/>
-      </w:pPr>
+      <w:r>
+        <w:t xml:space="preserve">The project will be completed over two semesters, from September 2026 to May 2027. </w:t>
+      </w:r>
       <w:r>
         <w:rPr>
           <w:b/>
@@ -5657,13 +5731,8 @@
         <w:t>Semester 1</w:t>
       </w:r>
       <w:r>
-        <w:t xml:space="preserve"> will focus on research, defining the business problem, dataset exploration and data preparation. </w:t>
-      </w:r>
-    </w:p>
-    <w:p>
-      <w:pPr>
-        <w:jc w:val="both"/>
-      </w:pPr>
+        <w:t xml:space="preserve"> will focus on research, defining the business problem and initial data exploration and preparation. </w:t>
+      </w:r>
       <w:r>
         <w:rPr>
           <w:b/>
@@ -5672,13 +5741,7 @@
         <w:t>Semester 2</w:t>
       </w:r>
       <w:r>
-        <w:t xml:space="preserve"> will </w:t>
-      </w:r>
-      <w:r>
-        <w:t xml:space="preserve">complete data preparation and then </w:t>
-      </w:r>
-      <w:r>
-        <w:t>focus on feature engineering, predictive modelling, model evaluation, Tableau dashboard development, business recommendations and the final report.</w:t>
+        <w:t xml:space="preserve"> will complete data preparation, followed by machine learning development, model evaluation, Tableau dashboard development, business recommendations and the final report.</w:t>
       </w:r>
     </w:p>
     <w:p>
@@ -5822,7 +5885,10 @@
         <w:t xml:space="preserve">the </w:t>
       </w:r>
       <w:r>
-        <w:t>Gantt chart below.</w:t>
+        <w:t>Gantt chart below</w:t>
+      </w:r>
+      <w:r>
+        <w:t xml:space="preserve"> (Fig 3).</w:t>
       </w:r>
     </w:p>
     <w:p>
@@ -5837,10 +5903,10 @@
           <w:noProof/>
         </w:rPr>
         <w:drawing>
-          <wp:inline distT="0" distB="0" distL="0" distR="0" wp14:anchorId="3F257EF7" wp14:editId="12002EE7">
-            <wp:extent cx="5657850" cy="3220278"/>
-            <wp:effectExtent l="0" t="0" r="0" b="0"/>
-            <wp:docPr id="1417010127" name="Picture 1"/>
+          <wp:inline distT="0" distB="0" distL="0" distR="0" wp14:anchorId="559B3F78" wp14:editId="564AB1B3">
+            <wp:extent cx="6233528" cy="3615070"/>
+            <wp:effectExtent l="0" t="0" r="0" b="4445"/>
+            <wp:docPr id="1056951040" name="Picture 4"/>
             <wp:cNvGraphicFramePr>
               <a:graphicFrameLocks xmlns:a="http://schemas.openxmlformats.org/drawingml/2006/main" noChangeAspect="1"/>
             </wp:cNvGraphicFramePr>
@@ -5848,23 +5914,41 @@
               <a:graphicData uri="http://schemas.openxmlformats.org/drawingml/2006/picture">
                 <pic:pic xmlns:pic="http://schemas.openxmlformats.org/drawingml/2006/picture">
                   <pic:nvPicPr>
-                    <pic:cNvPr id="1417010127" name=""/>
-                    <pic:cNvPicPr/>
+                    <pic:cNvPr id="0" name="Picture 2"/>
+                    <pic:cNvPicPr>
+                      <a:picLocks noChangeAspect="1" noChangeArrowheads="1"/>
+                    </pic:cNvPicPr>
                   </pic:nvPicPr>
-                  <pic:blipFill>
-                    <a:blip r:embed="rId10"/>
+                  <pic:blipFill rotWithShape="1">
+                    <a:blip r:embed="rId10">
+                      <a:extLst>
+                        <a:ext uri="{28A0092B-C50C-407E-A947-70E740481C1C}">
+                          <a14:useLocalDpi xmlns:a14="http://schemas.microsoft.com/office/drawing/2010/main" val="0"/>
+                        </a:ext>
+                      </a:extLst>
+                    </a:blip>
+                    <a:srcRect b="19236"/>
                     <a:stretch>
                       <a:fillRect/>
                     </a:stretch>
                   </pic:blipFill>
-                  <pic:spPr>
+                  <pic:spPr bwMode="auto">
                     <a:xfrm>
                       <a:off x="0" y="0"/>
-                      <a:ext cx="5665711" cy="3224752"/>
+                      <a:ext cx="6245131" cy="3621799"/>
                     </a:xfrm>
                     <a:prstGeom prst="rect">
                       <a:avLst/>
                     </a:prstGeom>
+                    <a:noFill/>
+                    <a:ln>
+                      <a:noFill/>
+                    </a:ln>
+                    <a:extLst>
+                      <a:ext uri="{53640926-AAD7-44D8-BBD7-CCE9431645EC}">
+                        <a14:shadowObscured xmlns:a14="http://schemas.microsoft.com/office/drawing/2010/main"/>
+                      </a:ext>
+                    </a:extLst>
                   </pic:spPr>
                 </pic:pic>
               </a:graphicData>
@@ -5876,23 +5960,39 @@
     <w:p>
       <w:pPr>
         <w:pStyle w:val="Caption"/>
-      </w:pPr>
-      <w:bookmarkStart w:id="29" w:name="_Toc242874955"/>
+        <w:jc w:val="left"/>
+      </w:pPr>
+      <w:bookmarkStart w:id="60" w:name="_Toc243431148"/>
+      <w:bookmarkStart w:id="61" w:name="_Toc243431200"/>
       <w:r>
         <w:t xml:space="preserve">Figure </w:t>
       </w:r>
-      <w:fldSimple w:instr=" SEQ Figure \* ARABIC ">
-        <w:r>
-          <w:rPr>
-            <w:noProof/>
-          </w:rPr>
-          <w:t>3</w:t>
-        </w:r>
-      </w:fldSimple>
-      <w:r>
-        <w:t xml:space="preserve"> Gantt chart</w:t>
-      </w:r>
-      <w:bookmarkEnd w:id="29"/>
+      <w:r>
+        <w:fldChar w:fldCharType="begin"/>
+      </w:r>
+      <w:r>
+        <w:instrText xml:space="preserve"> SEQ Figure \* ARABIC </w:instrText>
+      </w:r>
+      <w:r>
+        <w:fldChar w:fldCharType="separate"/>
+      </w:r>
+      <w:r>
+        <w:rPr>
+          <w:noProof/>
+        </w:rPr>
+        <w:t>3</w:t>
+      </w:r>
+      <w:r>
+        <w:fldChar w:fldCharType="end"/>
+      </w:r>
+      <w:r>
+        <w:t xml:space="preserve"> </w:t>
+      </w:r>
+      <w:r>
+        <w:t>Gantt chart</w:t>
+      </w:r>
+      <w:bookmarkEnd w:id="60"/>
+      <w:bookmarkEnd w:id="61"/>
     </w:p>
     <w:p>
       <w:pPr>
@@ -5915,55 +6015,68 @@
       <w:pPr>
         <w:pStyle w:val="Heading1"/>
       </w:pPr>
-      <w:bookmarkStart w:id="30" w:name="_Toc242875112"/>
+      <w:bookmarkStart w:id="62" w:name="_Toc243430791"/>
+      <w:bookmarkStart w:id="63" w:name="_Toc243431144"/>
       <w:r>
         <w:lastRenderedPageBreak/>
-        <w:t xml:space="preserve">Ethical and Legal Considerations </w:t>
-      </w:r>
-      <w:bookmarkEnd w:id="30"/>
-    </w:p>
-    <w:p>
-      <w:pPr>
-        <w:jc w:val="both"/>
-      </w:pPr>
-      <w:r>
-        <w:t>The project will use a publicly available dataset without collecting personal customer information or direct identifiers.</w:t>
-      </w:r>
-    </w:p>
-    <w:p>
-      <w:pPr>
-        <w:jc w:val="both"/>
-      </w:pPr>
-      <w:r>
-        <w:t>GDPR principles, including data minimisation, purpose limitation and secure storage, will guide responsible data handling (European Union, 2016). The dataset's CC BY 4.0 licence will be respected through proper attribution, and GitHub uploads will be checked for confidential information.</w:t>
-      </w:r>
-    </w:p>
-    <w:p>
-      <w:pPr>
-        <w:jc w:val="both"/>
-      </w:pPr>
-      <w:r>
-        <w:t>Ethical considerations will include class imbalance, potential model bias, misleading predictions and data leakage.</w:t>
-      </w:r>
-    </w:p>
-    <w:p>
-      <w:pPr>
-        <w:jc w:val="both"/>
-      </w:pPr>
-      <w:r>
-        <w:t>As the dataset is historical, findings may not fully reflect current e-commerce behaviour. Recommendations will therefore be evidence-based rather than guarantees of increased sales.</w:t>
-      </w:r>
-    </w:p>
-    <w:p>
-      <w:pPr>
-        <w:pStyle w:val="Caption"/>
-      </w:pPr>
-    </w:p>
-    <w:p>
-      <w:pPr>
-        <w:suppressAutoHyphens w:val="0"/>
-        <w:autoSpaceDN/>
-        <w:spacing w:line="259" w:lineRule="auto"/>
+        <w:t>Ethical and Legal Considerations</w:t>
+      </w:r>
+      <w:bookmarkEnd w:id="62"/>
+      <w:bookmarkEnd w:id="63"/>
+      <w:r>
+        <w:t xml:space="preserve"> </w:t>
+      </w:r>
+    </w:p>
+    <w:p>
+      <w:pPr>
+        <w:rPr>
+          <w:rFonts w:eastAsia="Times New Roman"/>
+        </w:rPr>
+      </w:pPr>
+      <w:r>
+        <w:t xml:space="preserve">The project will use a public dataset without direct personal identifiers. GDPR principles, including data minimisation, transparency and security, will be considered (European Union, 2016; Ahmed, n.d.). The dataset will be used under its CC BY 4.0 licence, with appropriate attribution (Sakar and </w:t>
+      </w:r>
+      <w:proofErr w:type="spellStart"/>
+      <w:r>
+        <w:t>Kastro</w:t>
+      </w:r>
+      <w:proofErr w:type="spellEnd"/>
+      <w:r>
+        <w:t>, 2018).</w:t>
+      </w:r>
+    </w:p>
+    <w:p>
+      <w:r>
+        <w:t>Data preparation and modelling decisions will be documented, project files stored securely, and sensitive information excluded from GitHub.</w:t>
+      </w:r>
+    </w:p>
+    <w:p>
+      <w:r>
+        <w:t>Class imbalance and potential bias will be assessed using suitable metrics and comparisons across visitor groups where possible. Data leakage will be prevented by fitting preprocessing steps on training data only.</w:t>
+      </w:r>
+    </w:p>
+    <w:p>
+      <w:r>
+        <w:rPr>
+          <w:rFonts w:eastAsia="Times New Roman"/>
+          <w:i/>
+          <w:iCs/>
+          <w:szCs w:val="24"/>
+          <w:lang w:eastAsia="en-IE"/>
+        </w:rPr>
+        <w:t>A</w:t>
+      </w:r>
+      <w:r>
+        <w:rPr>
+          <w:rFonts w:eastAsia="Times New Roman"/>
+          <w:szCs w:val="24"/>
+          <w:lang w:eastAsia="en-IE"/>
+        </w:rPr>
+        <w:t>s the dataset contains older information, the results may not reflect how people shop online today. The findings will show patterns and connections, but will not prove that one behaviour causes another.</w:t>
+      </w:r>
+    </w:p>
+    <w:p>
+      <w:pPr>
         <w:rPr>
           <w:rFonts w:eastAsia="Times New Roman" w:cstheme="majorBidi"/>
           <w:b/>
@@ -5980,50 +6093,150 @@
       <w:pPr>
         <w:pStyle w:val="Heading1"/>
       </w:pPr>
+      <w:bookmarkStart w:id="64" w:name="_Toc243430792"/>
+      <w:bookmarkStart w:id="65" w:name="_Toc243431145"/>
       <w:r>
         <w:lastRenderedPageBreak/>
         <w:t>References</w:t>
       </w:r>
+      <w:bookmarkEnd w:id="64"/>
+      <w:bookmarkEnd w:id="65"/>
     </w:p>
     <w:p>
       <w:pPr>
         <w:pStyle w:val="NormalWeb"/>
-      </w:pPr>
-      <w:r>
-        <w:t xml:space="preserve">Tavares, A. (2024) 'The complete guide to predicting customer behavior by leveraging data', </w:t>
+        <w:ind w:left="720" w:hanging="720"/>
+      </w:pPr>
+      <w:r>
+        <w:t xml:space="preserve">Ahmed, T. (n.d.-a) </w:t>
       </w:r>
       <w:r>
         <w:rPr>
           <w:rStyle w:val="Emphasis"/>
         </w:rPr>
-        <w:t>Noibu</w:t>
-      </w:r>
-      <w:r>
-        <w:t xml:space="preserve">. Available at: </w:t>
+        <w:t>Data Protection &amp; Privacy</w:t>
+      </w:r>
+      <w:r>
+        <w:t>. Strategic Business &amp; Professional Development. Unpublished lecture slides. CCT College Dublin. Available via Moodle.</w:t>
+      </w:r>
+    </w:p>
+    <w:p>
+      <w:pPr>
+        <w:pStyle w:val="NormalWeb"/>
+        <w:ind w:left="720" w:hanging="720"/>
+      </w:pPr>
+      <w:r>
+        <w:t xml:space="preserve">Ahmed, T. (n.d.-b) </w:t>
+      </w:r>
+      <w:r>
+        <w:rPr>
+          <w:rStyle w:val="Emphasis"/>
+        </w:rPr>
+        <w:t>IT Governance</w:t>
+      </w:r>
+      <w:r>
+        <w:t>. Strategic Business &amp; Professional Development. Unpublished lecture slides. CCT College Dublin. Available via Moodle.</w:t>
+      </w:r>
+    </w:p>
+    <w:p>
+      <w:pPr>
+        <w:pStyle w:val="NormalWeb"/>
+        <w:ind w:left="720" w:hanging="720"/>
+      </w:pPr>
+      <w:r>
+        <w:t xml:space="preserve">Ahmed, T. (n.d.-c) </w:t>
+      </w:r>
+      <w:r>
+        <w:rPr>
+          <w:rStyle w:val="Emphasis"/>
+        </w:rPr>
+        <w:t>Machine Learning: When Should I Use Which Method?</w:t>
+      </w:r>
+      <w:r>
+        <w:t xml:space="preserve"> Student handbook. CCT College Dublin. Available via Moodle.</w:t>
+      </w:r>
+    </w:p>
+    <w:p>
+      <w:pPr>
+        <w:pStyle w:val="NormalWeb"/>
+        <w:ind w:left="720" w:hanging="720"/>
+      </w:pPr>
+      <w:r>
+        <w:t xml:space="preserve">Ahmed, T. (n.d.-d) </w:t>
+      </w:r>
+      <w:r>
+        <w:rPr>
+          <w:rStyle w:val="Emphasis"/>
+        </w:rPr>
+        <w:t>Strategic Business &amp; Professional Development: Understanding Goals, Strategy, Objectives &amp; Tactics with Real-Time Examples</w:t>
+      </w:r>
+      <w:r>
+        <w:t>. Unpublished lecture slides. CCT College Dublin. Available via Moodle.</w:t>
+      </w:r>
+    </w:p>
+    <w:p>
+      <w:pPr>
+        <w:pStyle w:val="NormalWeb"/>
+        <w:ind w:left="720" w:hanging="720"/>
+      </w:pPr>
+      <w:r>
+        <w:t xml:space="preserve">Ahmed, T. (n.d.-e) </w:t>
+      </w:r>
+      <w:r>
+        <w:rPr>
+          <w:rStyle w:val="Emphasis"/>
+        </w:rPr>
+        <w:t>Strategic Thinking: Week 1 – Introduction to Strategic Thinking</w:t>
+      </w:r>
+      <w:r>
+        <w:t>. Student handbook. CCT College Dublin. Available via Moodle.</w:t>
+      </w:r>
+    </w:p>
+    <w:p>
+      <w:pPr>
+        <w:pStyle w:val="NormalWeb"/>
+        <w:ind w:left="720" w:hanging="720"/>
+      </w:pPr>
+      <w:r>
+        <w:t xml:space="preserve">European Union (2016) 'Regulation (EU) 2016/679 of the European Parliament and of the Council of 27 April 2016 (General Data Protection Regulation)', </w:t>
+      </w:r>
+      <w:r>
+        <w:rPr>
+          <w:rStyle w:val="Emphasis"/>
+        </w:rPr>
+        <w:t>Official Journal of the European Union</w:t>
+      </w:r>
+      <w:r>
+        <w:t xml:space="preserve">, L119, pp. 1–88. Available at: </w:t>
       </w:r>
       <w:hyperlink r:id="rId11" w:history="1">
         <w:r>
           <w:rPr>
             <w:rStyle w:val="Hyperlink"/>
           </w:rPr>
-          <w:t>https://www.noibu.com/blog/the-complete-guide-to-predicting-customer-behavior-by-leveraging-data</w:t>
+          <w:t>https://eur-lex.europa.eu/eli/reg/2016/679/oj</w:t>
         </w:r>
       </w:hyperlink>
-      <w:r>
-        <w:t xml:space="preserve"> (Accessed: 20 October 2026).</w:t>
-      </w:r>
     </w:p>
     <w:p>
       <w:pPr>
         <w:pStyle w:val="NormalWeb"/>
-      </w:pPr>
-      <w:r>
-        <w:t xml:space="preserve">Moe, W.W. and Fader, P.S. (2004) 'Dynamic conversion behavior at e-commerce sites', </w:t>
+        <w:ind w:left="720" w:hanging="720"/>
+      </w:pPr>
+      <w:r>
+        <w:t xml:space="preserve">Moe, W.W. and Fader, P.S. (2004) 'Dynamic conversion </w:t>
+      </w:r>
+      <w:proofErr w:type="spellStart"/>
+      <w:r>
+        <w:t>behavior</w:t>
+      </w:r>
+      <w:proofErr w:type="spellEnd"/>
+      <w:r>
+        <w:t xml:space="preserve"> at e-commerce sites', </w:t>
       </w:r>
       <w:r>
         <w:rPr>
-          <w:i/>
-          <w:iCs/>
+          <w:rStyle w:val="Emphasis"/>
         </w:rPr>
         <w:t>Management Science</w:t>
       </w:r>
@@ -6038,21 +6251,26 @@
           <w:t>https://doi.org/10.1287/mnsc.1040.0153</w:t>
         </w:r>
       </w:hyperlink>
-      <w:r>
-        <w:t>.</w:t>
-      </w:r>
     </w:p>
     <w:p>
       <w:pPr>
         <w:pStyle w:val="NormalWeb"/>
-      </w:pPr>
-      <w:r>
-        <w:t xml:space="preserve">Montgomery, A.L., Li, S., Srinivasan, K. and Liechty, J.C. (2004) 'Modeling online browsing and path analysis using clickstream data', </w:t>
+        <w:ind w:left="720" w:hanging="720"/>
+      </w:pPr>
+      <w:r>
+        <w:t>Montgomery, A.L., Li, S., Srinivasan, K. and Liechty, J.C. (2004) '</w:t>
+      </w:r>
+      <w:proofErr w:type="spellStart"/>
+      <w:r>
+        <w:t>Modeling</w:t>
+      </w:r>
+      <w:proofErr w:type="spellEnd"/>
+      <w:r>
+        <w:t xml:space="preserve"> online browsing and path analysis using clickstream data', </w:t>
       </w:r>
       <w:r>
         <w:rPr>
-          <w:i/>
-          <w:iCs/>
+          <w:rStyle w:val="Emphasis"/>
         </w:rPr>
         <w:t>Marketing Science</w:t>
       </w:r>
@@ -6067,28 +6285,78 @@
           <w:t>https://doi.org/10.1287/mksc.1040.0073</w:t>
         </w:r>
       </w:hyperlink>
-      <w:r>
-        <w:t>.</w:t>
-      </w:r>
     </w:p>
     <w:p>
       <w:pPr>
         <w:pStyle w:val="NormalWeb"/>
-      </w:pPr>
-      <w:r>
-        <w:t xml:space="preserve">Sakar, C.O., Polat, S.O., Katircioglu, M. and Kastro, Y. (2019) 'Real-time prediction of online shoppers’ purchasing intention using multilayer perceptron and LSTM recurrent neural networks', </w:t>
+        <w:ind w:left="720" w:hanging="720"/>
+      </w:pPr>
+      <w:r>
+        <w:t xml:space="preserve">Sakar, C. and </w:t>
+      </w:r>
+      <w:proofErr w:type="spellStart"/>
+      <w:r>
+        <w:t>Kastro</w:t>
+      </w:r>
+      <w:proofErr w:type="spellEnd"/>
+      <w:r>
+        <w:t xml:space="preserve">, Y. (2018) </w:t>
       </w:r>
       <w:r>
         <w:rPr>
-          <w:i/>
-          <w:iCs/>
+          <w:rStyle w:val="Emphasis"/>
+        </w:rPr>
+        <w:t>Online Shoppers Purchasing Intention Dataset</w:t>
+      </w:r>
+      <w:r>
+        <w:t xml:space="preserve"> [Dataset]. UCI Machine Learning Repository. Available at: </w:t>
+      </w:r>
+      <w:hyperlink r:id="rId14" w:history="1">
+        <w:r>
+          <w:rPr>
+            <w:rStyle w:val="Hyperlink"/>
+          </w:rPr>
+          <w:t>https://doi.org/10.24432/C5F88Q</w:t>
+        </w:r>
+      </w:hyperlink>
+      <w:r>
+        <w:t xml:space="preserve"> (Accessed: 20 October 2026).</w:t>
+      </w:r>
+    </w:p>
+    <w:p>
+      <w:pPr>
+        <w:pStyle w:val="NormalWeb"/>
+        <w:ind w:left="720" w:hanging="720"/>
+      </w:pPr>
+      <w:r>
+        <w:t xml:space="preserve">Sakar, C.O., Polat, S.O., </w:t>
+      </w:r>
+      <w:proofErr w:type="spellStart"/>
+      <w:r>
+        <w:t>Katircioglu</w:t>
+      </w:r>
+      <w:proofErr w:type="spellEnd"/>
+      <w:r>
+        <w:t xml:space="preserve">, M. and </w:t>
+      </w:r>
+      <w:proofErr w:type="spellStart"/>
+      <w:r>
+        <w:t>Kastro</w:t>
+      </w:r>
+      <w:proofErr w:type="spellEnd"/>
+      <w:r>
+        <w:t xml:space="preserve">, Y. (2019) 'Real-time prediction of online shoppers’ purchasing intention using multilayer perceptron and LSTM recurrent neural networks', </w:t>
+      </w:r>
+      <w:r>
+        <w:rPr>
+          <w:rStyle w:val="Emphasis"/>
         </w:rPr>
         <w:t>Neural Computing and Applications</w:t>
       </w:r>
       <w:r>
         <w:t xml:space="preserve">, 31, pp. 6893–6908. Available at: </w:t>
       </w:r>
-      <w:hyperlink r:id="rId14" w:history="1">
+      <w:hyperlink r:id="rId15" w:history="1">
         <w:r>
           <w:rPr>
             <w:rStyle w:val="Hyperlink"/>
@@ -6096,8 +6364,71 @@
           <w:t>https://doi.org/10.1007/s00521-018-3523-0</w:t>
         </w:r>
       </w:hyperlink>
-      <w:r>
-        <w:t>.</w:t>
+    </w:p>
+    <w:p>
+      <w:pPr>
+        <w:pStyle w:val="NormalWeb"/>
+        <w:ind w:left="720" w:hanging="720"/>
+      </w:pPr>
+      <w:r>
+        <w:t xml:space="preserve">Tavares, A. (2024) 'The complete guide to predicting customer </w:t>
+      </w:r>
+      <w:proofErr w:type="spellStart"/>
+      <w:r>
+        <w:t>behavior</w:t>
+      </w:r>
+      <w:proofErr w:type="spellEnd"/>
+      <w:r>
+        <w:t xml:space="preserve"> by leveraging data', </w:t>
+      </w:r>
+      <w:proofErr w:type="spellStart"/>
+      <w:r>
+        <w:rPr>
+          <w:rStyle w:val="Emphasis"/>
+        </w:rPr>
+        <w:t>Noibu</w:t>
+      </w:r>
+      <w:proofErr w:type="spellEnd"/>
+      <w:r>
+        <w:t xml:space="preserve">. Available at: </w:t>
+      </w:r>
+      <w:hyperlink r:id="rId16" w:history="1">
+        <w:r>
+          <w:rPr>
+            <w:rStyle w:val="Hyperlink"/>
+          </w:rPr>
+          <w:t>https://www.noibu.com/blog/the-complete-guide-to-predicting-customer-behavior-by-leveraging-data</w:t>
+        </w:r>
+      </w:hyperlink>
+      <w:r>
+        <w:t xml:space="preserve"> (Accessed: 20 October 2026).</w:t>
+      </w:r>
+    </w:p>
+    <w:p>
+      <w:pPr>
+        <w:pStyle w:val="NormalWeb"/>
+        <w:ind w:left="720" w:hanging="720"/>
+      </w:pPr>
+    </w:p>
+    <w:p>
+      <w:pPr>
+        <w:pStyle w:val="NormalWeb"/>
+        <w:ind w:left="720" w:hanging="720"/>
+      </w:pPr>
+    </w:p>
+    <w:p>
+      <w:pPr>
+        <w:pStyle w:val="NormalWeb"/>
+        <w:ind w:left="720" w:hanging="720"/>
+      </w:pPr>
+    </w:p>
+    <w:p>
+      <w:pPr>
+        <w:pStyle w:val="Heading1"/>
+      </w:pPr>
+      <w:r>
+        <w:lastRenderedPageBreak/>
+        <w:t xml:space="preserve">Anexo </w:t>
       </w:r>
     </w:p>
     <w:p>
@@ -6112,9 +6443,9 @@
     </w:p>
     <w:p/>
     <w:sectPr>
-      <w:headerReference w:type="default" r:id="rId15"/>
-      <w:footerReference w:type="default" r:id="rId16"/>
-      <w:headerReference w:type="first" r:id="rId17"/>
+      <w:headerReference w:type="default" r:id="rId17"/>
+      <w:footerReference w:type="default" r:id="rId18"/>
+      <w:headerReference w:type="first" r:id="rId19"/>
       <w:pgSz w:w="11906" w:h="16838"/>
       <w:pgMar w:top="1440" w:right="1440" w:bottom="1440" w:left="1440" w:header="708" w:footer="708" w:gutter="0"/>
       <w:pgNumType w:start="0"/>
@@ -6153,53 +6484,43 @@
 
 <file path=word/footer1.xml><?xml version="1.0" encoding="utf-8"?>
 <w:ftr xmlns:wpc="http://schemas.microsoft.com/office/word/2010/wordprocessingCanvas" xmlns:cx="http://schemas.microsoft.com/office/drawing/2014/chartex" xmlns:cx1="http://schemas.microsoft.com/office/drawing/2015/9/8/chartex" xmlns:cx2="http://schemas.microsoft.com/office/drawing/2015/10/21/chartex" xmlns:cx3="http://schemas.microsoft.com/office/drawing/2016/5/9/chartex" xmlns:cx4="http://schemas.microsoft.com/office/drawing/2016/5/10/chartex" xmlns:cx5="http://schemas.microsoft.com/office/drawing/2016/5/11/chartex" xmlns:cx6="http://schemas.microsoft.com/office/drawing/2016/5/12/chartex" xmlns:cx7="http://schemas.microsoft.com/office/drawing/2016/5/13/chartex" xmlns:cx8="http://schemas.microsoft.com/office/drawing/2016/5/14/chartex" xmlns:mc="http://schemas.openxmlformats.org/markup-compatibility/2006" xmlns:aink="http://schemas.microsoft.com/office/drawing/2016/ink" xmlns:am3d="http://schemas.microsoft.com/office/drawing/2017/model3d" xmlns:o="urn:schemas-microsoft-com:office:office" xmlns:oel="http://schemas.microsoft.com/office/2019/extlst" xmlns:r="http://schemas.openxmlformats.org/officeDocument/2006/relationships" xmlns:m="http://schemas.openxmlformats.org/officeDocument/2006/math" xmlns:v="urn:schemas-microsoft-com:vml" xmlns:wp14="http://schemas.microsoft.com/office/word/2010/wordprocessingDrawing" xmlns:wp="http://schemas.openxmlformats.org/drawingml/2006/wordprocessingDrawing" xmlns:w10="urn:schemas-microsoft-com:office:word" xmlns:w="http://schemas.openxmlformats.org/wordprocessingml/2006/main" xmlns:w14="http://schemas.microsoft.com/office/word/2010/wordml" xmlns:w15="http://schemas.microsoft.com/office/word/2012/wordml" xmlns:w16cex="http://schemas.microsoft.com/office/word/2018/wordml/cex" xmlns:w16cid="http://schemas.microsoft.com/office/word/2016/wordml/cid" xmlns:w16="http://schemas.microsoft.com/office/word/2018/wordml" xmlns:w16du="http://schemas.microsoft.com/office/word/2023/wordml/word16du" xmlns:w16sdtdh="http://schemas.microsoft.com/office/word/2020/wordml/sdtdatahash" xmlns:w16sdtfl="http://schemas.microsoft.com/office/word/2024/wordml/sdtformatlock" xmlns:w16se="http://schemas.microsoft.com/office/word/2015/wordml/symex" xmlns:wpg="http://schemas.microsoft.com/office/word/2010/wordprocessingGroup" xmlns:wpi="http://schemas.microsoft.com/office/word/2010/wordprocessingInk" xmlns:wne="http://schemas.microsoft.com/office/word/2006/wordml" xmlns:wps="http://schemas.microsoft.com/office/word/2010/wordprocessingShape" mc:Ignorable="w14 w15 w16se w16cid w16 w16cex w16sdtdh w16sdtfl w16du wp14">
-  <w:sdt>
-    <w:sdtPr>
-      <w:id w:val="1186876748"/>
-      <w:docPartObj>
-        <w:docPartGallery w:val="Page Numbers (Bottom of Page)"/>
-        <w:docPartUnique/>
-      </w:docPartObj>
-    </w:sdtPr>
-    <w:sdtEndPr>
-      <w:rPr>
-        <w:noProof/>
-      </w:rPr>
-    </w:sdtEndPr>
-    <w:sdtContent>
-      <w:p>
-        <w:pPr>
-          <w:pStyle w:val="Footer"/>
-          <w:jc w:val="center"/>
-        </w:pPr>
-        <w:r>
-          <w:fldChar w:fldCharType="begin"/>
-        </w:r>
-        <w:r>
-          <w:instrText xml:space="preserve"> PAGE   \* MERGEFORMAT </w:instrText>
-        </w:r>
-        <w:r>
-          <w:fldChar w:fldCharType="separate"/>
-        </w:r>
-        <w:r>
-          <w:rPr>
-            <w:noProof/>
-          </w:rPr>
-          <w:t>2</w:t>
-        </w:r>
-        <w:r>
-          <w:rPr>
-            <w:noProof/>
-          </w:rPr>
-          <w:fldChar w:fldCharType="end"/>
-        </w:r>
-      </w:p>
-    </w:sdtContent>
-  </w:sdt>
   <w:p>
     <w:pPr>
       <w:pStyle w:val="Footer"/>
     </w:pPr>
+    <w:r>
+      <w:t>HDSDAB Sep26 PT SB -  Strategic Thinking</w:t>
+    </w:r>
+    <w:r>
+      <w:t xml:space="preserve"> </w:t>
+    </w:r>
+    <w:r>
+      <w:ptab w:relativeTo="margin" w:alignment="center" w:leader="none"/>
+    </w:r>
+    <w:r>
+      <w:ptab w:relativeTo="margin" w:alignment="right" w:leader="none"/>
+    </w:r>
+    <w:r>
+      <w:fldChar w:fldCharType="begin"/>
+    </w:r>
+    <w:r>
+      <w:instrText xml:space="preserve"> PAGE   \* MERGEFORMAT </w:instrText>
+    </w:r>
+    <w:r>
+      <w:fldChar w:fldCharType="separate"/>
+    </w:r>
+    <w:r>
+      <w:rPr>
+        <w:noProof/>
+      </w:rPr>
+      <w:t>1</w:t>
+    </w:r>
+    <w:r>
+      <w:rPr>
+        <w:noProof/>
+      </w:rPr>
+      <w:fldChar w:fldCharType="end"/>
+    </w:r>
   </w:p>
 </w:ftr>
 </file>
@@ -9568,11 +9889,12 @@
   <w:style w:type="paragraph" w:default="1" w:styleId="Normal">
     <w:name w:val="Normal"/>
     <w:qFormat/>
-    <w:rsid w:val="00432E09"/>
+    <w:rsid w:val="00BA74F1"/>
     <w:pPr>
       <w:suppressAutoHyphens/>
       <w:autoSpaceDN w:val="0"/>
       <w:spacing w:line="256" w:lineRule="auto"/>
+      <w:jc w:val="both"/>
     </w:pPr>
     <w:rPr>
       <w:rFonts w:ascii="Times New Roman" w:eastAsia="Calibri" w:hAnsi="Times New Roman" w:cs="Times New Roman"/>
@@ -9595,7 +9917,6 @@
         <w:numId w:val="26"/>
       </w:numPr>
       <w:spacing w:before="360" w:after="80"/>
-      <w:jc w:val="both"/>
       <w:outlineLvl w:val="0"/>
     </w:pPr>
     <w:rPr>
@@ -10385,6 +10706,17 @@
       <w:shd w:val="clear" w:color="auto" w:fill="E1DFDD"/>
     </w:rPr>
   </w:style>
+  <w:style w:type="character" w:styleId="Strong">
+    <w:name w:val="Strong"/>
+    <w:basedOn w:val="DefaultParagraphFont"/>
+    <w:uiPriority w:val="22"/>
+    <w:qFormat/>
+    <w:rsid w:val="002541E8"/>
+    <w:rPr>
+      <w:b/>
+      <w:bCs/>
+    </w:rPr>
+  </w:style>
 </w:styles>
 </file>
 

</xml_diff>

<commit_message>
Changed Gantt Chart dates
</commit_message>
<xml_diff>
--- a/Capstone_Project_2026.docx
+++ b/Capstone_Project_2026.docx
@@ -625,16 +625,16 @@
             <mc:AlternateContent>
               <mc:Choice Requires="wpg">
                 <w:drawing>
-                  <wp:anchor distT="0" distB="0" distL="114300" distR="114300" simplePos="0" relativeHeight="251659264" behindDoc="1" locked="0" layoutInCell="1" allowOverlap="1" wp14:anchorId="55DDB836" wp14:editId="35F0C02B">
+                  <wp:anchor distT="0" distB="0" distL="114300" distR="114300" simplePos="0" relativeHeight="251659264" behindDoc="1" locked="0" layoutInCell="1" allowOverlap="1" wp14:anchorId="55DDB836" wp14:editId="0ADE501A">
                     <wp:simplePos x="0" y="0"/>
                     <wp:positionH relativeFrom="page">
-                      <wp:posOffset>445135</wp:posOffset>
+                      <wp:posOffset>443986</wp:posOffset>
                     </wp:positionH>
                     <wp:positionV relativeFrom="page">
-                      <wp:posOffset>770890</wp:posOffset>
+                      <wp:posOffset>771690</wp:posOffset>
                     </wp:positionV>
-                    <wp:extent cx="6864350" cy="9123045"/>
-                    <wp:effectExtent l="0" t="0" r="0" b="0"/>
+                    <wp:extent cx="6864350" cy="8774012"/>
+                    <wp:effectExtent l="0" t="0" r="0" b="8255"/>
                     <wp:wrapNone/>
                     <wp:docPr id="1002737273" name="Group 198"/>
                     <wp:cNvGraphicFramePr/>
@@ -645,9 +645,9 @@
                           <wpg:grpSpPr>
                             <a:xfrm>
                               <a:off x="0" y="0"/>
-                              <a:ext cx="6864350" cy="9123045"/>
+                              <a:ext cx="6864350" cy="8774012"/>
                               <a:chOff x="0" y="0"/>
-                              <a:chExt cx="6864824" cy="9123528"/>
+                              <a:chExt cx="6864824" cy="8774477"/>
                             </a:xfrm>
                           </wpg:grpSpPr>
                           <wps:wsp>
@@ -683,8 +683,8 @@
                             <wps:cNvSpPr/>
                             <wps:spPr>
                               <a:xfrm>
-                                <a:off x="0" y="4094328"/>
-                                <a:ext cx="6858000" cy="5029200"/>
+                                <a:off x="0" y="4361925"/>
+                                <a:ext cx="6858000" cy="4412552"/>
                               </a:xfrm>
                               <a:prstGeom prst="rect">
                                 <a:avLst/>
@@ -704,7 +704,10 @@
                                 <w:sdt>
                                   <w:sdtPr>
                                     <w:rPr>
+                                      <w:rFonts w:ascii="Times New Roman" w:eastAsia="Calibri" w:hAnsi="Times New Roman" w:cs="Times New Roman"/>
                                       <w:color w:val="FFFFFF" w:themeColor="background1"/>
+                                      <w:sz w:val="24"/>
+                                      <w:lang w:val="en-IE"/>
                                     </w:rPr>
                                     <w:alias w:val="Author"/>
                                     <w:tag w:val=""/>
@@ -717,16 +720,83 @@
                                       <w:pPr>
                                         <w:pStyle w:val="NoSpacing"/>
                                         <w:spacing w:before="120"/>
-                                        <w:jc w:val="center"/>
                                         <w:rPr>
                                           <w:color w:val="FFFFFF" w:themeColor="background1"/>
                                         </w:rPr>
                                       </w:pPr>
                                       <w:r>
                                         <w:rPr>
+                                          <w:rFonts w:ascii="Times New Roman" w:eastAsia="Calibri" w:hAnsi="Times New Roman" w:cs="Times New Roman"/>
                                           <w:color w:val="FFFFFF" w:themeColor="background1"/>
+                                          <w:sz w:val="24"/>
+                                          <w:lang w:val="en-IE"/>
                                         </w:rPr>
-                                        <w:t>Mariana Garcia</w:t>
+                                        <w:t xml:space="preserve">Module Title: HDSDAB Sep26 PT SB -  Strategic Thinking                                                        Student: Mariana Garcia </w:t>
+                                      </w:r>
+                                      <w:r>
+                                        <w:rPr>
+                                          <w:rFonts w:ascii="Times New Roman" w:eastAsia="Calibri" w:hAnsi="Times New Roman" w:cs="Times New Roman"/>
+                                          <w:color w:val="FFFFFF" w:themeColor="background1"/>
+                                          <w:sz w:val="24"/>
+                                          <w:lang w:val="en-IE"/>
+                                        </w:rPr>
+                                        <w:t xml:space="preserve"> - </w:t>
+                                      </w:r>
+                                      <w:r>
+                                        <w:rPr>
+                                          <w:rFonts w:ascii="Times New Roman" w:eastAsia="Calibri" w:hAnsi="Times New Roman" w:cs="Times New Roman"/>
+                                          <w:color w:val="FFFFFF" w:themeColor="background1"/>
+                                          <w:sz w:val="24"/>
+                                          <w:lang w:val="en-IE"/>
+                                        </w:rPr>
+                                        <w:t xml:space="preserve">sba25049  </w:t>
+                                      </w:r>
+                                      <w:r>
+                                        <w:rPr>
+                                          <w:rFonts w:ascii="Times New Roman" w:eastAsia="Calibri" w:hAnsi="Times New Roman" w:cs="Times New Roman"/>
+                                          <w:color w:val="FFFFFF" w:themeColor="background1"/>
+                                          <w:sz w:val="24"/>
+                                          <w:lang w:val="en-IE"/>
+                                        </w:rPr>
+                                        <w:t xml:space="preserve">                                                                                  </w:t>
+                                      </w:r>
+                                      <w:r>
+                                        <w:rPr>
+                                          <w:rFonts w:ascii="Times New Roman" w:eastAsia="Calibri" w:hAnsi="Times New Roman" w:cs="Times New Roman"/>
+                                          <w:color w:val="FFFFFF" w:themeColor="background1"/>
+                                          <w:sz w:val="24"/>
+                                          <w:lang w:val="en-IE"/>
+                                        </w:rPr>
+                                        <w:t>Lecturer Name:</w:t>
+                                      </w:r>
+                                      <w:r>
+                                        <w:rPr>
+                                          <w:rFonts w:ascii="Times New Roman" w:eastAsia="Calibri" w:hAnsi="Times New Roman" w:cs="Times New Roman"/>
+                                          <w:color w:val="FFFFFF" w:themeColor="background1"/>
+                                          <w:sz w:val="24"/>
+                                          <w:lang w:val="en-IE"/>
+                                        </w:rPr>
+                                        <w:t xml:space="preserve"> </w:t>
+                                      </w:r>
+                                      <w:proofErr w:type="spellStart"/>
+                                      <w:r>
+                                        <w:rPr>
+                                          <w:rFonts w:ascii="Times New Roman" w:eastAsia="Calibri" w:hAnsi="Times New Roman" w:cs="Times New Roman"/>
+                                          <w:color w:val="FFFFFF" w:themeColor="background1"/>
+                                          <w:sz w:val="24"/>
+                                          <w:lang w:val="en-IE"/>
+                                        </w:rPr>
+                                        <w:t>Taufique</w:t>
+                                      </w:r>
+                                      <w:proofErr w:type="spellEnd"/>
+                                      <w:r>
+                                        <w:rPr>
+                                          <w:rFonts w:ascii="Times New Roman" w:eastAsia="Calibri" w:hAnsi="Times New Roman" w:cs="Times New Roman"/>
+                                          <w:color w:val="FFFFFF" w:themeColor="background1"/>
+                                          <w:sz w:val="24"/>
+                                          <w:lang w:val="en-IE"/>
+                                        </w:rPr>
+                                        <w:t xml:space="preserve"> Ahmed                                                                                                    </w:t>
                                       </w:r>
                                     </w:p>
                                   </w:sdtContent>
@@ -878,22 +948,25 @@
                       <wp14:pctWidth>88200</wp14:pctWidth>
                     </wp14:sizeRelH>
                     <wp14:sizeRelV relativeFrom="page">
-                      <wp14:pctHeight>90900</wp14:pctHeight>
+                      <wp14:pctHeight>0</wp14:pctHeight>
                     </wp14:sizeRelV>
                   </wp:anchor>
                 </w:drawing>
               </mc:Choice>
               <mc:Fallback>
                 <w:pict>
-                  <v:group w14:anchorId="55DDB836" id="Group 198" o:spid="_x0000_s1026" style="position:absolute;left:0;text-align:left;margin-left:35.05pt;margin-top:60.7pt;width:540.5pt;height:718.35pt;z-index:-251657216;mso-width-percent:882;mso-height-percent:909;mso-position-horizontal-relative:page;mso-position-vertical-relative:page;mso-width-percent:882;mso-height-percent:909" coordsize="68648,91235" o:gfxdata="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">
+                  <v:group w14:anchorId="55DDB836" id="Group 198" o:spid="_x0000_s1026" style="position:absolute;left:0;text-align:left;margin-left:34.95pt;margin-top:60.75pt;width:540.5pt;height:690.85pt;z-index:-251657216;mso-width-percent:882;mso-position-horizontal-relative:page;mso-position-vertical-relative:page;mso-width-percent:882" coordsize="68648,87744" o:gfxdata="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">
                     <v:rect id="Rectangle 776233169" o:spid="_x0000_s1027" style="position:absolute;width:68580;height:13716;visibility:visible;mso-wrap-style:square;v-text-anchor:middle" o:gfxdata="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" fillcolor="#4472c4" stroked="f" strokeweight="1pt"/>
-                    <v:rect id="Rectangle 1442692755" o:spid="_x0000_s1028" style="position:absolute;top:40943;width:68580;height:50292;visibility:visible;mso-wrap-style:square;v-text-anchor:bottom" o:gfxdata="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" fillcolor="#4472c4" stroked="f" strokeweight="1pt">
+                    <v:rect id="Rectangle 1442692755" o:spid="_x0000_s1028" style="position:absolute;top:43619;width:68580;height:44125;visibility:visible;mso-wrap-style:square;v-text-anchor:bottom" o:gfxdata="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" fillcolor="#4472c4" stroked="f" strokeweight="1pt">
                       <v:textbox inset="36pt,57.6pt,36pt,36pt">
                         <w:txbxContent>
                           <w:sdt>
                             <w:sdtPr>
                               <w:rPr>
+                                <w:rFonts w:ascii="Times New Roman" w:eastAsia="Calibri" w:hAnsi="Times New Roman" w:cs="Times New Roman"/>
                                 <w:color w:val="FFFFFF" w:themeColor="background1"/>
+                                <w:sz w:val="24"/>
+                                <w:lang w:val="en-IE"/>
                               </w:rPr>
                               <w:alias w:val="Author"/>
                               <w:tag w:val=""/>
@@ -906,16 +979,83 @@
                                 <w:pPr>
                                   <w:pStyle w:val="NoSpacing"/>
                                   <w:spacing w:before="120"/>
-                                  <w:jc w:val="center"/>
                                   <w:rPr>
                                     <w:color w:val="FFFFFF" w:themeColor="background1"/>
                                   </w:rPr>
                                 </w:pPr>
                                 <w:r>
                                   <w:rPr>
+                                    <w:rFonts w:ascii="Times New Roman" w:eastAsia="Calibri" w:hAnsi="Times New Roman" w:cs="Times New Roman"/>
                                     <w:color w:val="FFFFFF" w:themeColor="background1"/>
+                                    <w:sz w:val="24"/>
+                                    <w:lang w:val="en-IE"/>
                                   </w:rPr>
-                                  <w:t>Mariana Garcia</w:t>
+                                  <w:t xml:space="preserve">Module Title: HDSDAB Sep26 PT SB -  Strategic Thinking                                                        Student: Mariana Garcia </w:t>
+                                </w:r>
+                                <w:r>
+                                  <w:rPr>
+                                    <w:rFonts w:ascii="Times New Roman" w:eastAsia="Calibri" w:hAnsi="Times New Roman" w:cs="Times New Roman"/>
+                                    <w:color w:val="FFFFFF" w:themeColor="background1"/>
+                                    <w:sz w:val="24"/>
+                                    <w:lang w:val="en-IE"/>
+                                  </w:rPr>
+                                  <w:t xml:space="preserve"> - </w:t>
+                                </w:r>
+                                <w:r>
+                                  <w:rPr>
+                                    <w:rFonts w:ascii="Times New Roman" w:eastAsia="Calibri" w:hAnsi="Times New Roman" w:cs="Times New Roman"/>
+                                    <w:color w:val="FFFFFF" w:themeColor="background1"/>
+                                    <w:sz w:val="24"/>
+                                    <w:lang w:val="en-IE"/>
+                                  </w:rPr>
+                                  <w:t xml:space="preserve">sba25049  </w:t>
+                                </w:r>
+                                <w:r>
+                                  <w:rPr>
+                                    <w:rFonts w:ascii="Times New Roman" w:eastAsia="Calibri" w:hAnsi="Times New Roman" w:cs="Times New Roman"/>
+                                    <w:color w:val="FFFFFF" w:themeColor="background1"/>
+                                    <w:sz w:val="24"/>
+                                    <w:lang w:val="en-IE"/>
+                                  </w:rPr>
+                                  <w:t xml:space="preserve">                                                                                  </w:t>
+                                </w:r>
+                                <w:r>
+                                  <w:rPr>
+                                    <w:rFonts w:ascii="Times New Roman" w:eastAsia="Calibri" w:hAnsi="Times New Roman" w:cs="Times New Roman"/>
+                                    <w:color w:val="FFFFFF" w:themeColor="background1"/>
+                                    <w:sz w:val="24"/>
+                                    <w:lang w:val="en-IE"/>
+                                  </w:rPr>
+                                  <w:t>Lecturer Name:</w:t>
+                                </w:r>
+                                <w:r>
+                                  <w:rPr>
+                                    <w:rFonts w:ascii="Times New Roman" w:eastAsia="Calibri" w:hAnsi="Times New Roman" w:cs="Times New Roman"/>
+                                    <w:color w:val="FFFFFF" w:themeColor="background1"/>
+                                    <w:sz w:val="24"/>
+                                    <w:lang w:val="en-IE"/>
+                                  </w:rPr>
+                                  <w:t xml:space="preserve"> </w:t>
+                                </w:r>
+                                <w:proofErr w:type="spellStart"/>
+                                <w:r>
+                                  <w:rPr>
+                                    <w:rFonts w:ascii="Times New Roman" w:eastAsia="Calibri" w:hAnsi="Times New Roman" w:cs="Times New Roman"/>
+                                    <w:color w:val="FFFFFF" w:themeColor="background1"/>
+                                    <w:sz w:val="24"/>
+                                    <w:lang w:val="en-IE"/>
+                                  </w:rPr>
+                                  <w:t>Taufique</w:t>
+                                </w:r>
+                                <w:proofErr w:type="spellEnd"/>
+                                <w:r>
+                                  <w:rPr>
+                                    <w:rFonts w:ascii="Times New Roman" w:eastAsia="Calibri" w:hAnsi="Times New Roman" w:cs="Times New Roman"/>
+                                    <w:color w:val="FFFFFF" w:themeColor="background1"/>
+                                    <w:sz w:val="24"/>
+                                    <w:lang w:val="en-IE"/>
+                                  </w:rPr>
+                                  <w:t xml:space="preserve"> Ahmed                                                                                                    </w:t>
                                 </w:r>
                               </w:p>
                             </w:sdtContent>
@@ -1078,27 +1218,10 @@
         </w:p>
       </w:sdtContent>
     </w:sdt>
-    <w:p>
-      <w:pPr>
-        <w:suppressAutoHyphens w:val="0"/>
-        <w:rPr>
-          <w:noProof/>
-          <w:color w:val="4472C4"/>
-        </w:rPr>
-      </w:pPr>
-      <w:r>
-        <w:rPr>
-          <w:noProof/>
-          <w:color w:val="4472C4"/>
-        </w:rPr>
-        <w:lastRenderedPageBreak/>
-        <w:br w:type="page"/>
-      </w:r>
-    </w:p>
-    <w:bookmarkStart w:id="0" w:name="_Toc243430763" w:displacedByCustomXml="next"/>
+    <w:bookmarkStart w:id="0" w:name="_Toc243430763" w:displacedByCustomXml="prev"/>
     <w:sdt>
       <w:sdtPr>
-        <w:id w:val="-1935191373"/>
+        <w:id w:val="636848535"/>
         <w:docPartObj>
           <w:docPartGallery w:val="Table of Contents"/>
           <w:docPartUnique/>
@@ -1120,9 +1243,19 @@
         <w:p>
           <w:pPr>
             <w:pStyle w:val="TOCHeading"/>
+            <w:rPr>
+              <w:rFonts w:ascii="Times New Roman" w:hAnsi="Times New Roman" w:cs="Times New Roman"/>
+              <w:b/>
+              <w:bCs/>
+            </w:rPr>
           </w:pPr>
           <w:r>
-            <w:t>Contents</w:t>
+            <w:rPr>
+              <w:rFonts w:ascii="Times New Roman" w:hAnsi="Times New Roman" w:cs="Times New Roman"/>
+              <w:b/>
+              <w:bCs/>
+            </w:rPr>
+            <w:t>Table of Contents</w:t>
           </w:r>
         </w:p>
         <w:p>
@@ -1146,11 +1279,13 @@
           <w:r>
             <w:fldChar w:fldCharType="separate"/>
           </w:r>
-          <w:hyperlink w:anchor="_Toc243431117" w:history="1">
+          <w:hyperlink w:anchor="_Toc243479153" w:history="1">
             <w:r>
               <w:rPr>
                 <w:rStyle w:val="Hyperlink"/>
-                <w:noProof/>
+                <w:rFonts w:asciiTheme="majorHAnsi" w:eastAsiaTheme="majorEastAsia" w:hAnsiTheme="majorHAnsi"/>
+                <w:noProof/>
+                <w:lang w:val="en-US"/>
               </w:rPr>
               <w:t>1</w:t>
             </w:r>
@@ -1170,7 +1305,7 @@
                 <w:rStyle w:val="Hyperlink"/>
                 <w:noProof/>
               </w:rPr>
-              <w:t>Project Title</w:t>
+              <w:t>Introduction</w:t>
             </w:r>
             <w:r>
               <w:rPr>
@@ -1191,7 +1326,7 @@
                 <w:noProof/>
                 <w:webHidden/>
               </w:rPr>
-              <w:instrText xml:space="preserve"> PAGEREF _Toc243431117 \h </w:instrText>
+              <w:instrText xml:space="preserve"> PAGEREF _Toc243479153 \h </w:instrText>
             </w:r>
             <w:r>
               <w:rPr>
@@ -1234,7 +1369,7 @@
               <w14:ligatures w14:val="standardContextual"/>
             </w:rPr>
           </w:pPr>
-          <w:hyperlink w:anchor="_Toc243431118" w:history="1">
+          <w:hyperlink w:anchor="_Toc243479154" w:history="1">
             <w:r>
               <w:rPr>
                 <w:rStyle w:val="Hyperlink"/>
@@ -1258,7 +1393,7 @@
                 <w:rStyle w:val="Hyperlink"/>
                 <w:noProof/>
               </w:rPr>
-              <w:t>Problem Definition</w:t>
+              <w:t>Project Title</w:t>
             </w:r>
             <w:r>
               <w:rPr>
@@ -1279,7 +1414,7 @@
                 <w:noProof/>
                 <w:webHidden/>
               </w:rPr>
-              <w:instrText xml:space="preserve"> PAGEREF _Toc243431118 \h </w:instrText>
+              <w:instrText xml:space="preserve"> PAGEREF _Toc243479154 \h </w:instrText>
             </w:r>
             <w:r>
               <w:rPr>
@@ -1322,7 +1457,7 @@
               <w14:ligatures w14:val="standardContextual"/>
             </w:rPr>
           </w:pPr>
-          <w:hyperlink w:anchor="_Toc243431119" w:history="1">
+          <w:hyperlink w:anchor="_Toc243479155" w:history="1">
             <w:r>
               <w:rPr>
                 <w:rStyle w:val="Hyperlink"/>
@@ -1346,7 +1481,7 @@
                 <w:rStyle w:val="Hyperlink"/>
                 <w:noProof/>
               </w:rPr>
-              <w:t>Aim and Objectives</w:t>
+              <w:t>Problem Definition</w:t>
             </w:r>
             <w:r>
               <w:rPr>
@@ -1367,7 +1502,7 @@
                 <w:noProof/>
                 <w:webHidden/>
               </w:rPr>
-              <w:instrText xml:space="preserve"> PAGEREF _Toc243431119 \h </w:instrText>
+              <w:instrText xml:space="preserve"> PAGEREF _Toc243479155 \h </w:instrText>
             </w:r>
             <w:r>
               <w:rPr>
@@ -1414,7 +1549,7 @@
               <w14:ligatures w14:val="standardContextual"/>
             </w:rPr>
           </w:pPr>
-          <w:hyperlink w:anchor="_Toc243431120" w:history="1">
+          <w:hyperlink w:anchor="_Toc243479156" w:history="1">
             <w:r>
               <w:rPr>
                 <w:rStyle w:val="Hyperlink"/>
@@ -1438,7 +1573,7 @@
                 <w:rStyle w:val="Hyperlink"/>
                 <w:noProof/>
               </w:rPr>
-              <w:t>Aim</w:t>
+              <w:t>Research question</w:t>
             </w:r>
             <w:r>
               <w:rPr>
@@ -1459,7 +1594,7 @@
                 <w:noProof/>
                 <w:webHidden/>
               </w:rPr>
-              <w:instrText xml:space="preserve"> PAGEREF _Toc243431120 \h </w:instrText>
+              <w:instrText xml:space="preserve"> PAGEREF _Toc243479156 \h </w:instrText>
             </w:r>
             <w:r>
               <w:rPr>
@@ -1480,6 +1615,94 @@
                 <w:webHidden/>
               </w:rPr>
               <w:t>6</w:t>
+            </w:r>
+            <w:r>
+              <w:rPr>
+                <w:noProof/>
+                <w:webHidden/>
+              </w:rPr>
+              <w:fldChar w:fldCharType="end"/>
+            </w:r>
+          </w:hyperlink>
+        </w:p>
+        <w:p>
+          <w:pPr>
+            <w:pStyle w:val="TOC1"/>
+            <w:rPr>
+              <w:rFonts w:asciiTheme="minorHAnsi" w:eastAsiaTheme="minorEastAsia" w:hAnsiTheme="minorHAnsi" w:cstheme="minorBidi"/>
+              <w:noProof/>
+              <w:kern w:val="2"/>
+              <w:szCs w:val="24"/>
+              <w:lang w:eastAsia="en-IE"/>
+              <w14:ligatures w14:val="standardContextual"/>
+            </w:rPr>
+          </w:pPr>
+          <w:hyperlink w:anchor="_Toc243479157" w:history="1">
+            <w:r>
+              <w:rPr>
+                <w:rStyle w:val="Hyperlink"/>
+                <w:noProof/>
+              </w:rPr>
+              <w:t>4</w:t>
+            </w:r>
+            <w:r>
+              <w:rPr>
+                <w:rFonts w:asciiTheme="minorHAnsi" w:eastAsiaTheme="minorEastAsia" w:hAnsiTheme="minorHAnsi" w:cstheme="minorBidi"/>
+                <w:noProof/>
+                <w:kern w:val="2"/>
+                <w:szCs w:val="24"/>
+                <w:lang w:eastAsia="en-IE"/>
+                <w14:ligatures w14:val="standardContextual"/>
+              </w:rPr>
+              <w:tab/>
+            </w:r>
+            <w:r>
+              <w:rPr>
+                <w:rStyle w:val="Hyperlink"/>
+                <w:noProof/>
+              </w:rPr>
+              <w:t>Aim and Objectives</w:t>
+            </w:r>
+            <w:r>
+              <w:rPr>
+                <w:noProof/>
+                <w:webHidden/>
+              </w:rPr>
+              <w:tab/>
+            </w:r>
+            <w:r>
+              <w:rPr>
+                <w:noProof/>
+                <w:webHidden/>
+              </w:rPr>
+              <w:fldChar w:fldCharType="begin"/>
+            </w:r>
+            <w:r>
+              <w:rPr>
+                <w:noProof/>
+                <w:webHidden/>
+              </w:rPr>
+              <w:instrText xml:space="preserve"> PAGEREF _Toc243479157 \h </w:instrText>
+            </w:r>
+            <w:r>
+              <w:rPr>
+                <w:noProof/>
+                <w:webHidden/>
+              </w:rPr>
+            </w:r>
+            <w:r>
+              <w:rPr>
+                <w:noProof/>
+                <w:webHidden/>
+              </w:rPr>
+              <w:fldChar w:fldCharType="separate"/>
+            </w:r>
+            <w:r>
+              <w:rPr>
+                <w:noProof/>
+                <w:webHidden/>
+              </w:rPr>
+              <w:t>7</w:t>
             </w:r>
             <w:r>
               <w:rPr>
@@ -1506,13 +1729,13 @@
               <w14:ligatures w14:val="standardContextual"/>
             </w:rPr>
           </w:pPr>
-          <w:hyperlink w:anchor="_Toc243431121" w:history="1">
+          <w:hyperlink w:anchor="_Toc243479158" w:history="1">
             <w:r>
               <w:rPr>
                 <w:rStyle w:val="Hyperlink"/>
                 <w:noProof/>
               </w:rPr>
-              <w:t>3.2</w:t>
+              <w:t>4.1</w:t>
             </w:r>
             <w:r>
               <w:rPr>
@@ -1530,6 +1753,98 @@
                 <w:rStyle w:val="Hyperlink"/>
                 <w:noProof/>
               </w:rPr>
+              <w:t>Aim</w:t>
+            </w:r>
+            <w:r>
+              <w:rPr>
+                <w:noProof/>
+                <w:webHidden/>
+              </w:rPr>
+              <w:tab/>
+            </w:r>
+            <w:r>
+              <w:rPr>
+                <w:noProof/>
+                <w:webHidden/>
+              </w:rPr>
+              <w:fldChar w:fldCharType="begin"/>
+            </w:r>
+            <w:r>
+              <w:rPr>
+                <w:noProof/>
+                <w:webHidden/>
+              </w:rPr>
+              <w:instrText xml:space="preserve"> PAGEREF _Toc243479158 \h </w:instrText>
+            </w:r>
+            <w:r>
+              <w:rPr>
+                <w:noProof/>
+                <w:webHidden/>
+              </w:rPr>
+            </w:r>
+            <w:r>
+              <w:rPr>
+                <w:noProof/>
+                <w:webHidden/>
+              </w:rPr>
+              <w:fldChar w:fldCharType="separate"/>
+            </w:r>
+            <w:r>
+              <w:rPr>
+                <w:noProof/>
+                <w:webHidden/>
+              </w:rPr>
+              <w:t>7</w:t>
+            </w:r>
+            <w:r>
+              <w:rPr>
+                <w:noProof/>
+                <w:webHidden/>
+              </w:rPr>
+              <w:fldChar w:fldCharType="end"/>
+            </w:r>
+          </w:hyperlink>
+        </w:p>
+        <w:p>
+          <w:pPr>
+            <w:pStyle w:val="TOC2"/>
+            <w:tabs>
+              <w:tab w:val="left" w:pos="960"/>
+              <w:tab w:val="right" w:leader="dot" w:pos="9016"/>
+            </w:tabs>
+            <w:rPr>
+              <w:rFonts w:asciiTheme="minorHAnsi" w:eastAsiaTheme="minorEastAsia" w:hAnsiTheme="minorHAnsi" w:cstheme="minorBidi"/>
+              <w:noProof/>
+              <w:kern w:val="2"/>
+              <w:szCs w:val="24"/>
+              <w:lang w:eastAsia="en-IE"/>
+              <w14:ligatures w14:val="standardContextual"/>
+            </w:rPr>
+          </w:pPr>
+          <w:hyperlink w:anchor="_Toc243479159" w:history="1">
+            <w:r>
+              <w:rPr>
+                <w:rStyle w:val="Hyperlink"/>
+                <w:noProof/>
+              </w:rPr>
+              <w:t>4.2</w:t>
+            </w:r>
+            <w:r>
+              <w:rPr>
+                <w:rFonts w:asciiTheme="minorHAnsi" w:eastAsiaTheme="minorEastAsia" w:hAnsiTheme="minorHAnsi" w:cstheme="minorBidi"/>
+                <w:noProof/>
+                <w:kern w:val="2"/>
+                <w:szCs w:val="24"/>
+                <w:lang w:eastAsia="en-IE"/>
+                <w14:ligatures w14:val="standardContextual"/>
+              </w:rPr>
+              <w:tab/>
+            </w:r>
+            <w:r>
+              <w:rPr>
+                <w:rStyle w:val="Hyperlink"/>
+                <w:noProof/>
+              </w:rPr>
               <w:t>Project Objectives</w:t>
             </w:r>
             <w:r>
@@ -1551,7 +1866,7 @@
                 <w:noProof/>
                 <w:webHidden/>
               </w:rPr>
-              <w:instrText xml:space="preserve"> PAGEREF _Toc243431121 \h </w:instrText>
+              <w:instrText xml:space="preserve"> PAGEREF _Toc243479159 \h </w:instrText>
             </w:r>
             <w:r>
               <w:rPr>
@@ -1571,7 +1886,7 @@
                 <w:noProof/>
                 <w:webHidden/>
               </w:rPr>
-              <w:t>6</w:t>
+              <w:t>7</w:t>
             </w:r>
             <w:r>
               <w:rPr>
@@ -1598,13 +1913,13 @@
               <w14:ligatures w14:val="standardContextual"/>
             </w:rPr>
           </w:pPr>
-          <w:hyperlink w:anchor="_Toc243431122" w:history="1">
+          <w:hyperlink w:anchor="_Toc243479160" w:history="1">
             <w:r>
               <w:rPr>
                 <w:rStyle w:val="Hyperlink"/>
                 <w:noProof/>
               </w:rPr>
-              <w:t>3.2.1</w:t>
+              <w:t>4.2.1</w:t>
             </w:r>
             <w:r>
               <w:rPr>
@@ -1643,7 +1958,7 @@
                 <w:noProof/>
                 <w:webHidden/>
               </w:rPr>
-              <w:instrText xml:space="preserve"> PAGEREF _Toc243431122 \h </w:instrText>
+              <w:instrText xml:space="preserve"> PAGEREF _Toc243479160 \h </w:instrText>
             </w:r>
             <w:r>
               <w:rPr>
@@ -1663,7 +1978,7 @@
                 <w:noProof/>
                 <w:webHidden/>
               </w:rPr>
-              <w:t>6</w:t>
+              <w:t>7</w:t>
             </w:r>
             <w:r>
               <w:rPr>
@@ -1690,13 +2005,13 @@
               <w14:ligatures w14:val="standardContextual"/>
             </w:rPr>
           </w:pPr>
-          <w:hyperlink w:anchor="_Toc243431123" w:history="1">
+          <w:hyperlink w:anchor="_Toc243479161" w:history="1">
             <w:r>
               <w:rPr>
                 <w:rStyle w:val="Hyperlink"/>
                 <w:noProof/>
               </w:rPr>
-              <w:t>3.2.2</w:t>
+              <w:t>4.2.2</w:t>
             </w:r>
             <w:r>
               <w:rPr>
@@ -1735,7 +2050,7 @@
                 <w:noProof/>
                 <w:webHidden/>
               </w:rPr>
-              <w:instrText xml:space="preserve"> PAGEREF _Toc243431123 \h </w:instrText>
+              <w:instrText xml:space="preserve"> PAGEREF _Toc243479161 \h </w:instrText>
             </w:r>
             <w:r>
               <w:rPr>
@@ -1755,7 +2070,7 @@
                 <w:noProof/>
                 <w:webHidden/>
               </w:rPr>
-              <w:t>6</w:t>
+              <w:t>7</w:t>
             </w:r>
             <w:r>
               <w:rPr>
@@ -1782,13 +2097,13 @@
               <w14:ligatures w14:val="standardContextual"/>
             </w:rPr>
           </w:pPr>
-          <w:hyperlink w:anchor="_Toc243431124" w:history="1">
+          <w:hyperlink w:anchor="_Toc243479162" w:history="1">
             <w:r>
               <w:rPr>
                 <w:rStyle w:val="Hyperlink"/>
                 <w:noProof/>
               </w:rPr>
-              <w:t>3.2.3</w:t>
+              <w:t>4.2.3</w:t>
             </w:r>
             <w:r>
               <w:rPr>
@@ -1827,7 +2142,7 @@
                 <w:noProof/>
                 <w:webHidden/>
               </w:rPr>
-              <w:instrText xml:space="preserve"> PAGEREF _Toc243431124 \h </w:instrText>
+              <w:instrText xml:space="preserve"> PAGEREF _Toc243479162 \h </w:instrText>
             </w:r>
             <w:r>
               <w:rPr>
@@ -1847,7 +2162,7 @@
                 <w:noProof/>
                 <w:webHidden/>
               </w:rPr>
-              <w:t>6</w:t>
+              <w:t>7</w:t>
             </w:r>
             <w:r>
               <w:rPr>
@@ -1874,13 +2189,13 @@
               <w14:ligatures w14:val="standardContextual"/>
             </w:rPr>
           </w:pPr>
-          <w:hyperlink w:anchor="_Toc243431125" w:history="1">
+          <w:hyperlink w:anchor="_Toc243479163" w:history="1">
             <w:r>
               <w:rPr>
                 <w:rStyle w:val="Hyperlink"/>
                 <w:noProof/>
               </w:rPr>
-              <w:t>3.2.4</w:t>
+              <w:t>4.2.4</w:t>
             </w:r>
             <w:r>
               <w:rPr>
@@ -1919,7 +2234,7 @@
                 <w:noProof/>
                 <w:webHidden/>
               </w:rPr>
-              <w:instrText xml:space="preserve"> PAGEREF _Toc243431125 \h </w:instrText>
+              <w:instrText xml:space="preserve"> PAGEREF _Toc243479163 \h </w:instrText>
             </w:r>
             <w:r>
               <w:rPr>
@@ -1939,7 +2254,7 @@
                 <w:noProof/>
                 <w:webHidden/>
               </w:rPr>
-              <w:t>6</w:t>
+              <w:t>7</w:t>
             </w:r>
             <w:r>
               <w:rPr>
@@ -1966,13 +2281,13 @@
               <w14:ligatures w14:val="standardContextual"/>
             </w:rPr>
           </w:pPr>
-          <w:hyperlink w:anchor="_Toc243431126" w:history="1">
+          <w:hyperlink w:anchor="_Toc243479164" w:history="1">
             <w:r>
               <w:rPr>
                 <w:rStyle w:val="Hyperlink"/>
                 <w:noProof/>
               </w:rPr>
-              <w:t>3.2.5</w:t>
+              <w:t>4.2.5</w:t>
             </w:r>
             <w:r>
               <w:rPr>
@@ -2011,7 +2326,7 @@
                 <w:noProof/>
                 <w:webHidden/>
               </w:rPr>
-              <w:instrText xml:space="preserve"> PAGEREF _Toc243431126 \h </w:instrText>
+              <w:instrText xml:space="preserve"> PAGEREF _Toc243479164 \h </w:instrText>
             </w:r>
             <w:r>
               <w:rPr>
@@ -2031,7 +2346,7 @@
                 <w:noProof/>
                 <w:webHidden/>
               </w:rPr>
-              <w:t>6</w:t>
+              <w:t>7</w:t>
             </w:r>
             <w:r>
               <w:rPr>
@@ -2058,13 +2373,13 @@
               <w14:ligatures w14:val="standardContextual"/>
             </w:rPr>
           </w:pPr>
-          <w:hyperlink w:anchor="_Toc243431127" w:history="1">
+          <w:hyperlink w:anchor="_Toc243479165" w:history="1">
             <w:r>
               <w:rPr>
                 <w:rStyle w:val="Hyperlink"/>
                 <w:noProof/>
               </w:rPr>
-              <w:t>3.3</w:t>
+              <w:t>4.3</w:t>
             </w:r>
             <w:r>
               <w:rPr>
@@ -2103,7 +2418,7 @@
                 <w:noProof/>
                 <w:webHidden/>
               </w:rPr>
-              <w:instrText xml:space="preserve"> PAGEREF _Toc243431127 \h </w:instrText>
+              <w:instrText xml:space="preserve"> PAGEREF _Toc243479165 \h </w:instrText>
             </w:r>
             <w:r>
               <w:rPr>
@@ -2123,7 +2438,7 @@
                 <w:noProof/>
                 <w:webHidden/>
               </w:rPr>
-              <w:t>6</w:t>
+              <w:t>7</w:t>
             </w:r>
             <w:r>
               <w:rPr>
@@ -2146,13 +2461,13 @@
               <w14:ligatures w14:val="standardContextual"/>
             </w:rPr>
           </w:pPr>
-          <w:hyperlink w:anchor="_Toc243431128" w:history="1">
+          <w:hyperlink w:anchor="_Toc243479166" w:history="1">
             <w:r>
               <w:rPr>
                 <w:rStyle w:val="Hyperlink"/>
                 <w:noProof/>
               </w:rPr>
-              <w:t>4</w:t>
+              <w:t>5</w:t>
             </w:r>
             <w:r>
               <w:rPr>
@@ -2191,7 +2506,7 @@
                 <w:noProof/>
                 <w:webHidden/>
               </w:rPr>
-              <w:instrText xml:space="preserve"> PAGEREF _Toc243431128 \h </w:instrText>
+              <w:instrText xml:space="preserve"> PAGEREF _Toc243479166 \h </w:instrText>
             </w:r>
             <w:r>
               <w:rPr>
@@ -2211,7 +2526,7 @@
                 <w:noProof/>
                 <w:webHidden/>
               </w:rPr>
-              <w:t>7</w:t>
+              <w:t>8</w:t>
             </w:r>
             <w:r>
               <w:rPr>
@@ -2238,13 +2553,13 @@
               <w14:ligatures w14:val="standardContextual"/>
             </w:rPr>
           </w:pPr>
-          <w:hyperlink w:anchor="_Toc243431129" w:history="1">
+          <w:hyperlink w:anchor="_Toc243479167" w:history="1">
             <w:r>
               <w:rPr>
                 <w:rStyle w:val="Hyperlink"/>
                 <w:noProof/>
               </w:rPr>
-              <w:t>4.1</w:t>
+              <w:t>5.1</w:t>
             </w:r>
             <w:r>
               <w:rPr>
@@ -2283,7 +2598,7 @@
                 <w:noProof/>
                 <w:webHidden/>
               </w:rPr>
-              <w:instrText xml:space="preserve"> PAGEREF _Toc243431129 \h </w:instrText>
+              <w:instrText xml:space="preserve"> PAGEREF _Toc243479167 \h </w:instrText>
             </w:r>
             <w:r>
               <w:rPr>
@@ -2303,7 +2618,7 @@
                 <w:noProof/>
                 <w:webHidden/>
               </w:rPr>
-              <w:t>7</w:t>
+              <w:t>8</w:t>
             </w:r>
             <w:r>
               <w:rPr>
@@ -2330,13 +2645,13 @@
               <w14:ligatures w14:val="standardContextual"/>
             </w:rPr>
           </w:pPr>
-          <w:hyperlink w:anchor="_Toc243431130" w:history="1">
+          <w:hyperlink w:anchor="_Toc243479168" w:history="1">
             <w:r>
               <w:rPr>
                 <w:rStyle w:val="Hyperlink"/>
                 <w:noProof/>
               </w:rPr>
-              <w:t>4.2</w:t>
+              <w:t>5.2</w:t>
             </w:r>
             <w:r>
               <w:rPr>
@@ -2375,7 +2690,7 @@
                 <w:noProof/>
                 <w:webHidden/>
               </w:rPr>
-              <w:instrText xml:space="preserve"> PAGEREF _Toc243431130 \h </w:instrText>
+              <w:instrText xml:space="preserve"> PAGEREF _Toc243479168 \h </w:instrText>
             </w:r>
             <w:r>
               <w:rPr>
@@ -2395,7 +2710,7 @@
                 <w:noProof/>
                 <w:webHidden/>
               </w:rPr>
-              <w:t>7</w:t>
+              <w:t>8</w:t>
             </w:r>
             <w:r>
               <w:rPr>
@@ -2422,13 +2737,13 @@
               <w14:ligatures w14:val="standardContextual"/>
             </w:rPr>
           </w:pPr>
-          <w:hyperlink w:anchor="_Toc243431131" w:history="1">
+          <w:hyperlink w:anchor="_Toc243479169" w:history="1">
             <w:r>
               <w:rPr>
                 <w:rStyle w:val="Hyperlink"/>
                 <w:noProof/>
               </w:rPr>
-              <w:t>4.3</w:t>
+              <w:t>5.3</w:t>
             </w:r>
             <w:r>
               <w:rPr>
@@ -2467,7 +2782,7 @@
                 <w:noProof/>
                 <w:webHidden/>
               </w:rPr>
-              <w:instrText xml:space="preserve"> PAGEREF _Toc243431131 \h </w:instrText>
+              <w:instrText xml:space="preserve"> PAGEREF _Toc243479169 \h </w:instrText>
             </w:r>
             <w:r>
               <w:rPr>
@@ -2487,7 +2802,7 @@
                 <w:noProof/>
                 <w:webHidden/>
               </w:rPr>
-              <w:t>7</w:t>
+              <w:t>8</w:t>
             </w:r>
             <w:r>
               <w:rPr>
@@ -2510,13 +2825,13 @@
               <w14:ligatures w14:val="standardContextual"/>
             </w:rPr>
           </w:pPr>
-          <w:hyperlink w:anchor="_Toc243431132" w:history="1">
+          <w:hyperlink w:anchor="_Toc243479170" w:history="1">
             <w:r>
               <w:rPr>
                 <w:rStyle w:val="Hyperlink"/>
                 <w:noProof/>
               </w:rPr>
-              <w:t>5</w:t>
+              <w:t>6</w:t>
             </w:r>
             <w:r>
               <w:rPr>
@@ -2555,7 +2870,7 @@
                 <w:noProof/>
                 <w:webHidden/>
               </w:rPr>
-              <w:instrText xml:space="preserve"> PAGEREF _Toc243431132 \h </w:instrText>
+              <w:instrText xml:space="preserve"> PAGEREF _Toc243479170 \h </w:instrText>
             </w:r>
             <w:r>
               <w:rPr>
@@ -2575,7 +2890,7 @@
                 <w:noProof/>
                 <w:webHidden/>
               </w:rPr>
-              <w:t>8</w:t>
+              <w:t>9</w:t>
             </w:r>
             <w:r>
               <w:rPr>
@@ -2602,7 +2917,7 @@
               <w14:ligatures w14:val="standardContextual"/>
             </w:rPr>
           </w:pPr>
-          <w:hyperlink w:anchor="_Toc243431133" w:history="1">
+          <w:hyperlink w:anchor="_Toc243479171" w:history="1">
             <w:r>
               <w:rPr>
                 <w:rStyle w:val="Hyperlink"/>
@@ -2648,7 +2963,7 @@
                 <w:noProof/>
                 <w:webHidden/>
               </w:rPr>
-              <w:instrText xml:space="preserve"> PAGEREF _Toc243431133 \h </w:instrText>
+              <w:instrText xml:space="preserve"> PAGEREF _Toc243479171 \h </w:instrText>
             </w:r>
             <w:r>
               <w:rPr>
@@ -2668,7 +2983,7 @@
                 <w:noProof/>
                 <w:webHidden/>
               </w:rPr>
-              <w:t>8</w:t>
+              <w:t>9</w:t>
             </w:r>
             <w:r>
               <w:rPr>
@@ -2695,7 +3010,7 @@
               <w14:ligatures w14:val="standardContextual"/>
             </w:rPr>
           </w:pPr>
-          <w:hyperlink w:anchor="_Toc243431134" w:history="1">
+          <w:hyperlink w:anchor="_Toc243479172" w:history="1">
             <w:r>
               <w:rPr>
                 <w:rStyle w:val="Hyperlink"/>
@@ -2741,7 +3056,7 @@
                 <w:noProof/>
                 <w:webHidden/>
               </w:rPr>
-              <w:instrText xml:space="preserve"> PAGEREF _Toc243431134 \h </w:instrText>
+              <w:instrText xml:space="preserve"> PAGEREF _Toc243479172 \h </w:instrText>
             </w:r>
             <w:r>
               <w:rPr>
@@ -2761,7 +3076,7 @@
                 <w:noProof/>
                 <w:webHidden/>
               </w:rPr>
-              <w:t>8</w:t>
+              <w:t>9</w:t>
             </w:r>
             <w:r>
               <w:rPr>
@@ -2788,7 +3103,7 @@
               <w14:ligatures w14:val="standardContextual"/>
             </w:rPr>
           </w:pPr>
-          <w:hyperlink w:anchor="_Toc243431135" w:history="1">
+          <w:hyperlink w:anchor="_Toc243479173" w:history="1">
             <w:r>
               <w:rPr>
                 <w:rStyle w:val="Hyperlink"/>
@@ -2834,7 +3149,7 @@
                 <w:noProof/>
                 <w:webHidden/>
               </w:rPr>
-              <w:instrText xml:space="preserve"> PAGEREF _Toc243431135 \h </w:instrText>
+              <w:instrText xml:space="preserve"> PAGEREF _Toc243479173 \h </w:instrText>
             </w:r>
             <w:r>
               <w:rPr>
@@ -2854,7 +3169,7 @@
                 <w:noProof/>
                 <w:webHidden/>
               </w:rPr>
-              <w:t>8</w:t>
+              <w:t>9</w:t>
             </w:r>
             <w:r>
               <w:rPr>
@@ -2881,7 +3196,7 @@
               <w14:ligatures w14:val="standardContextual"/>
             </w:rPr>
           </w:pPr>
-          <w:hyperlink w:anchor="_Toc243431136" w:history="1">
+          <w:hyperlink w:anchor="_Toc243479174" w:history="1">
             <w:r>
               <w:rPr>
                 <w:rStyle w:val="Hyperlink"/>
@@ -2927,7 +3242,7 @@
                 <w:noProof/>
                 <w:webHidden/>
               </w:rPr>
-              <w:instrText xml:space="preserve"> PAGEREF _Toc243431136 \h </w:instrText>
+              <w:instrText xml:space="preserve"> PAGEREF _Toc243479174 \h </w:instrText>
             </w:r>
             <w:r>
               <w:rPr>
@@ -2947,7 +3262,7 @@
                 <w:noProof/>
                 <w:webHidden/>
               </w:rPr>
-              <w:t>8</w:t>
+              <w:t>9</w:t>
             </w:r>
             <w:r>
               <w:rPr>
@@ -2974,7 +3289,7 @@
               <w14:ligatures w14:val="standardContextual"/>
             </w:rPr>
           </w:pPr>
-          <w:hyperlink w:anchor="_Toc243431137" w:history="1">
+          <w:hyperlink w:anchor="_Toc243479175" w:history="1">
             <w:r>
               <w:rPr>
                 <w:rStyle w:val="Hyperlink"/>
@@ -3020,7 +3335,7 @@
                 <w:noProof/>
                 <w:webHidden/>
               </w:rPr>
-              <w:instrText xml:space="preserve"> PAGEREF _Toc243431137 \h </w:instrText>
+              <w:instrText xml:space="preserve"> PAGEREF _Toc243479175 \h </w:instrText>
             </w:r>
             <w:r>
               <w:rPr>
@@ -3040,7 +3355,7 @@
                 <w:noProof/>
                 <w:webHidden/>
               </w:rPr>
-              <w:t>8</w:t>
+              <w:t>9</w:t>
             </w:r>
             <w:r>
               <w:rPr>
@@ -3067,7 +3382,7 @@
               <w14:ligatures w14:val="standardContextual"/>
             </w:rPr>
           </w:pPr>
-          <w:hyperlink w:anchor="_Toc243431138" w:history="1">
+          <w:hyperlink w:anchor="_Toc243479176" w:history="1">
             <w:r>
               <w:rPr>
                 <w:rStyle w:val="Hyperlink"/>
@@ -3113,7 +3428,7 @@
                 <w:noProof/>
                 <w:webHidden/>
               </w:rPr>
-              <w:instrText xml:space="preserve"> PAGEREF _Toc243431138 \h </w:instrText>
+              <w:instrText xml:space="preserve"> PAGEREF _Toc243479176 \h </w:instrText>
             </w:r>
             <w:r>
               <w:rPr>
@@ -3133,7 +3448,7 @@
                 <w:noProof/>
                 <w:webHidden/>
               </w:rPr>
-              <w:t>8</w:t>
+              <w:t>9</w:t>
             </w:r>
             <w:r>
               <w:rPr>
@@ -3160,13 +3475,13 @@
               <w14:ligatures w14:val="standardContextual"/>
             </w:rPr>
           </w:pPr>
-          <w:hyperlink w:anchor="_Toc243431139" w:history="1">
+          <w:hyperlink w:anchor="_Toc243479177" w:history="1">
             <w:r>
               <w:rPr>
                 <w:rStyle w:val="Hyperlink"/>
                 <w:noProof/>
               </w:rPr>
-              <w:t>5.1</w:t>
+              <w:t>6.1</w:t>
             </w:r>
             <w:r>
               <w:rPr>
@@ -3205,7 +3520,7 @@
                 <w:noProof/>
                 <w:webHidden/>
               </w:rPr>
-              <w:instrText xml:space="preserve"> PAGEREF _Toc243431139 \h </w:instrText>
+              <w:instrText xml:space="preserve"> PAGEREF _Toc243479177 \h </w:instrText>
             </w:r>
             <w:r>
               <w:rPr>
@@ -3225,7 +3540,7 @@
                 <w:noProof/>
                 <w:webHidden/>
               </w:rPr>
-              <w:t>9</w:t>
+              <w:t>10</w:t>
             </w:r>
             <w:r>
               <w:rPr>
@@ -3252,13 +3567,13 @@
               <w14:ligatures w14:val="standardContextual"/>
             </w:rPr>
           </w:pPr>
-          <w:hyperlink w:anchor="_Toc243431140" w:history="1">
+          <w:hyperlink w:anchor="_Toc243479178" w:history="1">
             <w:r>
               <w:rPr>
                 <w:rStyle w:val="Hyperlink"/>
                 <w:noProof/>
               </w:rPr>
-              <w:t>5.2</w:t>
+              <w:t>6.2</w:t>
             </w:r>
             <w:r>
               <w:rPr>
@@ -3297,7 +3612,7 @@
                 <w:noProof/>
                 <w:webHidden/>
               </w:rPr>
-              <w:instrText xml:space="preserve"> PAGEREF _Toc243431140 \h </w:instrText>
+              <w:instrText xml:space="preserve"> PAGEREF _Toc243479178 \h </w:instrText>
             </w:r>
             <w:r>
               <w:rPr>
@@ -3317,7 +3632,7 @@
                 <w:noProof/>
                 <w:webHidden/>
               </w:rPr>
-              <w:t>9</w:t>
+              <w:t>10</w:t>
             </w:r>
             <w:r>
               <w:rPr>
@@ -3340,13 +3655,13 @@
               <w14:ligatures w14:val="standardContextual"/>
             </w:rPr>
           </w:pPr>
-          <w:hyperlink w:anchor="_Toc243431141" w:history="1">
+          <w:hyperlink w:anchor="_Toc243479179" w:history="1">
             <w:r>
               <w:rPr>
                 <w:rStyle w:val="Hyperlink"/>
                 <w:noProof/>
               </w:rPr>
-              <w:t>6</w:t>
+              <w:t>7</w:t>
             </w:r>
             <w:r>
               <w:rPr>
@@ -3385,7 +3700,7 @@
                 <w:noProof/>
                 <w:webHidden/>
               </w:rPr>
-              <w:instrText xml:space="preserve"> PAGEREF _Toc243431141 \h </w:instrText>
+              <w:instrText xml:space="preserve"> PAGEREF _Toc243479179 \h </w:instrText>
             </w:r>
             <w:r>
               <w:rPr>
@@ -3405,7 +3720,7 @@
                 <w:noProof/>
                 <w:webHidden/>
               </w:rPr>
-              <w:t>11</w:t>
+              <w:t>12</w:t>
             </w:r>
             <w:r>
               <w:rPr>
@@ -3428,13 +3743,13 @@
               <w14:ligatures w14:val="standardContextual"/>
             </w:rPr>
           </w:pPr>
-          <w:hyperlink w:anchor="_Toc243431142" w:history="1">
+          <w:hyperlink w:anchor="_Toc243479180" w:history="1">
             <w:r>
               <w:rPr>
                 <w:rStyle w:val="Hyperlink"/>
                 <w:noProof/>
               </w:rPr>
-              <w:t>7</w:t>
+              <w:t>8</w:t>
             </w:r>
             <w:r>
               <w:rPr>
@@ -3473,7 +3788,7 @@
                 <w:noProof/>
                 <w:webHidden/>
               </w:rPr>
-              <w:instrText xml:space="preserve"> PAGEREF _Toc243431142 \h </w:instrText>
+              <w:instrText xml:space="preserve"> PAGEREF _Toc243479180 \h </w:instrText>
             </w:r>
             <w:r>
               <w:rPr>
@@ -3493,7 +3808,7 @@
                 <w:noProof/>
                 <w:webHidden/>
               </w:rPr>
-              <w:t>12</w:t>
+              <w:t>13</w:t>
             </w:r>
             <w:r>
               <w:rPr>
@@ -3516,13 +3831,13 @@
               <w14:ligatures w14:val="standardContextual"/>
             </w:rPr>
           </w:pPr>
-          <w:hyperlink w:anchor="_Toc243431143" w:history="1">
+          <w:hyperlink w:anchor="_Toc243479181" w:history="1">
             <w:r>
               <w:rPr>
                 <w:rStyle w:val="Hyperlink"/>
                 <w:noProof/>
               </w:rPr>
-              <w:t>8</w:t>
+              <w:t>9</w:t>
             </w:r>
             <w:r>
               <w:rPr>
@@ -3561,7 +3876,7 @@
                 <w:noProof/>
                 <w:webHidden/>
               </w:rPr>
-              <w:instrText xml:space="preserve"> PAGEREF _Toc243431143 \h </w:instrText>
+              <w:instrText xml:space="preserve"> PAGEREF _Toc243479181 \h </w:instrText>
             </w:r>
             <w:r>
               <w:rPr>
@@ -3581,7 +3896,7 @@
                 <w:noProof/>
                 <w:webHidden/>
               </w:rPr>
-              <w:t>13</w:t>
+              <w:t>14</w:t>
             </w:r>
             <w:r>
               <w:rPr>
@@ -3604,13 +3919,13 @@
               <w14:ligatures w14:val="standardContextual"/>
             </w:rPr>
           </w:pPr>
-          <w:hyperlink w:anchor="_Toc243431144" w:history="1">
+          <w:hyperlink w:anchor="_Toc243479182" w:history="1">
             <w:r>
               <w:rPr>
                 <w:rStyle w:val="Hyperlink"/>
                 <w:noProof/>
               </w:rPr>
-              <w:t>9</w:t>
+              <w:t>10</w:t>
             </w:r>
             <w:r>
               <w:rPr>
@@ -3649,7 +3964,7 @@
                 <w:noProof/>
                 <w:webHidden/>
               </w:rPr>
-              <w:instrText xml:space="preserve"> PAGEREF _Toc243431144 \h </w:instrText>
+              <w:instrText xml:space="preserve"> PAGEREF _Toc243479182 \h </w:instrText>
             </w:r>
             <w:r>
               <w:rPr>
@@ -3669,7 +3984,7 @@
                 <w:noProof/>
                 <w:webHidden/>
               </w:rPr>
-              <w:t>14</w:t>
+              <w:t>15</w:t>
             </w:r>
             <w:r>
               <w:rPr>
@@ -3692,13 +4007,13 @@
               <w14:ligatures w14:val="standardContextual"/>
             </w:rPr>
           </w:pPr>
-          <w:hyperlink w:anchor="_Toc243431145" w:history="1">
+          <w:hyperlink w:anchor="_Toc243479183" w:history="1">
             <w:r>
               <w:rPr>
                 <w:rStyle w:val="Hyperlink"/>
                 <w:noProof/>
               </w:rPr>
-              <w:t>10</w:t>
+              <w:t>11</w:t>
             </w:r>
             <w:r>
               <w:rPr>
@@ -3737,7 +4052,7 @@
                 <w:noProof/>
                 <w:webHidden/>
               </w:rPr>
-              <w:instrText xml:space="preserve"> PAGEREF _Toc243431145 \h </w:instrText>
+              <w:instrText xml:space="preserve"> PAGEREF _Toc243479183 \h </w:instrText>
             </w:r>
             <w:r>
               <w:rPr>
@@ -3757,7 +4072,95 @@
                 <w:noProof/>
                 <w:webHidden/>
               </w:rPr>
-              <w:t>15</w:t>
+              <w:t>16</w:t>
+            </w:r>
+            <w:r>
+              <w:rPr>
+                <w:noProof/>
+                <w:webHidden/>
+              </w:rPr>
+              <w:fldChar w:fldCharType="end"/>
+            </w:r>
+          </w:hyperlink>
+        </w:p>
+        <w:p>
+          <w:pPr>
+            <w:pStyle w:val="TOC1"/>
+            <w:rPr>
+              <w:rFonts w:asciiTheme="minorHAnsi" w:eastAsiaTheme="minorEastAsia" w:hAnsiTheme="minorHAnsi" w:cstheme="minorBidi"/>
+              <w:noProof/>
+              <w:kern w:val="2"/>
+              <w:szCs w:val="24"/>
+              <w:lang w:eastAsia="en-IE"/>
+              <w14:ligatures w14:val="standardContextual"/>
+            </w:rPr>
+          </w:pPr>
+          <w:hyperlink w:anchor="_Toc243479184" w:history="1">
+            <w:r>
+              <w:rPr>
+                <w:rStyle w:val="Hyperlink"/>
+                <w:noProof/>
+              </w:rPr>
+              <w:t>12</w:t>
+            </w:r>
+            <w:r>
+              <w:rPr>
+                <w:rFonts w:asciiTheme="minorHAnsi" w:eastAsiaTheme="minorEastAsia" w:hAnsiTheme="minorHAnsi" w:cstheme="minorBidi"/>
+                <w:noProof/>
+                <w:kern w:val="2"/>
+                <w:szCs w:val="24"/>
+                <w:lang w:eastAsia="en-IE"/>
+                <w14:ligatures w14:val="standardContextual"/>
+              </w:rPr>
+              <w:tab/>
+            </w:r>
+            <w:r>
+              <w:rPr>
+                <w:rStyle w:val="Hyperlink"/>
+                <w:noProof/>
+              </w:rPr>
+              <w:t>Appendix A - AI Use Declaration and Prompt Log</w:t>
+            </w:r>
+            <w:r>
+              <w:rPr>
+                <w:noProof/>
+                <w:webHidden/>
+              </w:rPr>
+              <w:tab/>
+            </w:r>
+            <w:r>
+              <w:rPr>
+                <w:noProof/>
+                <w:webHidden/>
+              </w:rPr>
+              <w:fldChar w:fldCharType="begin"/>
+            </w:r>
+            <w:r>
+              <w:rPr>
+                <w:noProof/>
+                <w:webHidden/>
+              </w:rPr>
+              <w:instrText xml:space="preserve"> PAGEREF _Toc243479184 \h </w:instrText>
+            </w:r>
+            <w:r>
+              <w:rPr>
+                <w:noProof/>
+                <w:webHidden/>
+              </w:rPr>
+            </w:r>
+            <w:r>
+              <w:rPr>
+                <w:noProof/>
+                <w:webHidden/>
+              </w:rPr>
+              <w:fldChar w:fldCharType="separate"/>
+            </w:r>
+            <w:r>
+              <w:rPr>
+                <w:noProof/>
+                <w:webHidden/>
+              </w:rPr>
+              <w:t>18</w:t>
             </w:r>
             <w:r>
               <w:rPr>
@@ -3782,58 +4185,11 @@
     </w:sdt>
     <w:p>
       <w:pPr>
-        <w:pStyle w:val="TableofFigures"/>
-        <w:tabs>
-          <w:tab w:val="right" w:leader="dot" w:pos="9016"/>
-        </w:tabs>
-      </w:pPr>
-    </w:p>
-    <w:p>
-      <w:pPr>
-        <w:pStyle w:val="TableofFigures"/>
-        <w:tabs>
-          <w:tab w:val="right" w:leader="dot" w:pos="9016"/>
-        </w:tabs>
-      </w:pPr>
-    </w:p>
-    <w:p>
-      <w:pPr>
-        <w:pStyle w:val="TableofFigures"/>
-        <w:tabs>
-          <w:tab w:val="right" w:leader="dot" w:pos="9016"/>
-        </w:tabs>
-      </w:pPr>
-    </w:p>
-    <w:p>
-      <w:pPr>
-        <w:pStyle w:val="TableofFigures"/>
-        <w:tabs>
-          <w:tab w:val="right" w:leader="dot" w:pos="9016"/>
-        </w:tabs>
-      </w:pPr>
-    </w:p>
-    <w:p>
-      <w:pPr>
-        <w:pStyle w:val="TableofFigures"/>
-        <w:tabs>
-          <w:tab w:val="right" w:leader="dot" w:pos="9016"/>
-        </w:tabs>
-      </w:pPr>
-    </w:p>
-    <w:p>
-      <w:pPr>
-        <w:pStyle w:val="TableofFigures"/>
-        <w:tabs>
-          <w:tab w:val="right" w:leader="dot" w:pos="9016"/>
-        </w:tabs>
-      </w:pPr>
-    </w:p>
-    <w:p>
-      <w:pPr>
-        <w:pStyle w:val="TableofFigures"/>
-        <w:tabs>
-          <w:tab w:val="right" w:leader="dot" w:pos="9016"/>
-        </w:tabs>
+        <w:suppressAutoHyphens w:val="0"/>
+        <w:rPr>
+          <w:noProof/>
+          <w:color w:val="4472C4"/>
+        </w:rPr>
       </w:pPr>
     </w:p>
     <w:p>
@@ -3852,6 +4208,7 @@
         </w:rPr>
       </w:pPr>
       <w:r>
+        <w:lastRenderedPageBreak/>
         <w:fldChar w:fldCharType="begin"/>
       </w:r>
       <w:r>
@@ -3860,7 +4217,7 @@
       <w:r>
         <w:fldChar w:fldCharType="separate"/>
       </w:r>
-      <w:hyperlink w:anchor="_Toc243431198" w:history="1">
+      <w:hyperlink w:anchor="_Toc243433233" w:history="1">
         <w:r>
           <w:rPr>
             <w:rStyle w:val="Hyperlink"/>
@@ -3887,7 +4244,80 @@
             <w:noProof/>
             <w:webHidden/>
           </w:rPr>
-          <w:instrText xml:space="preserve"> PAGEREF _Toc243431198 \h </w:instrText>
+          <w:instrText xml:space="preserve"> PAGEREF _Toc243433233 \h </w:instrText>
+        </w:r>
+        <w:r>
+          <w:rPr>
+            <w:noProof/>
+            <w:webHidden/>
+          </w:rPr>
+        </w:r>
+        <w:r>
+          <w:rPr>
+            <w:noProof/>
+            <w:webHidden/>
+          </w:rPr>
+          <w:fldChar w:fldCharType="separate"/>
+        </w:r>
+        <w:r>
+          <w:rPr>
+            <w:noProof/>
+            <w:webHidden/>
+          </w:rPr>
+          <w:t>12</w:t>
+        </w:r>
+        <w:r>
+          <w:rPr>
+            <w:noProof/>
+            <w:webHidden/>
+          </w:rPr>
+          <w:fldChar w:fldCharType="end"/>
+        </w:r>
+      </w:hyperlink>
+    </w:p>
+    <w:p>
+      <w:pPr>
+        <w:pStyle w:val="TableofFigures"/>
+        <w:tabs>
+          <w:tab w:val="right" w:leader="dot" w:pos="9016"/>
+        </w:tabs>
+        <w:rPr>
+          <w:rFonts w:asciiTheme="minorHAnsi" w:eastAsiaTheme="minorEastAsia" w:hAnsiTheme="minorHAnsi" w:cstheme="minorBidi"/>
+          <w:noProof/>
+          <w:kern w:val="2"/>
+          <w:szCs w:val="24"/>
+          <w:lang w:eastAsia="en-IE"/>
+          <w14:ligatures w14:val="standardContextual"/>
+        </w:rPr>
+      </w:pPr>
+      <w:hyperlink w:anchor="_Toc243433234" w:history="1">
+        <w:r>
+          <w:rPr>
+            <w:rStyle w:val="Hyperlink"/>
+            <w:noProof/>
+          </w:rPr>
+          <w:t>Figure 2  Dataset Structure and Variables</w:t>
+        </w:r>
+        <w:r>
+          <w:rPr>
+            <w:noProof/>
+            <w:webHidden/>
+          </w:rPr>
+          <w:tab/>
+        </w:r>
+        <w:r>
+          <w:rPr>
+            <w:noProof/>
+            <w:webHidden/>
+          </w:rPr>
+          <w:fldChar w:fldCharType="begin"/>
+        </w:r>
+        <w:r>
+          <w:rPr>
+            <w:noProof/>
+            <w:webHidden/>
+          </w:rPr>
+          <w:instrText xml:space="preserve"> PAGEREF _Toc243433234 \h </w:instrText>
         </w:r>
         <w:r>
           <w:rPr>
@@ -3933,80 +4363,7 @@
           <w14:ligatures w14:val="standardContextual"/>
         </w:rPr>
       </w:pPr>
-      <w:hyperlink w:anchor="_Toc243431199" w:history="1">
-        <w:r>
-          <w:rPr>
-            <w:rStyle w:val="Hyperlink"/>
-            <w:noProof/>
-          </w:rPr>
-          <w:t>Figure 2  Data Info</w:t>
-        </w:r>
-        <w:r>
-          <w:rPr>
-            <w:noProof/>
-            <w:webHidden/>
-          </w:rPr>
-          <w:tab/>
-        </w:r>
-        <w:r>
-          <w:rPr>
-            <w:noProof/>
-            <w:webHidden/>
-          </w:rPr>
-          <w:fldChar w:fldCharType="begin"/>
-        </w:r>
-        <w:r>
-          <w:rPr>
-            <w:noProof/>
-            <w:webHidden/>
-          </w:rPr>
-          <w:instrText xml:space="preserve"> PAGEREF _Toc243431199 \h </w:instrText>
-        </w:r>
-        <w:r>
-          <w:rPr>
-            <w:noProof/>
-            <w:webHidden/>
-          </w:rPr>
-        </w:r>
-        <w:r>
-          <w:rPr>
-            <w:noProof/>
-            <w:webHidden/>
-          </w:rPr>
-          <w:fldChar w:fldCharType="separate"/>
-        </w:r>
-        <w:r>
-          <w:rPr>
-            <w:noProof/>
-            <w:webHidden/>
-          </w:rPr>
-          <w:t>14</w:t>
-        </w:r>
-        <w:r>
-          <w:rPr>
-            <w:noProof/>
-            <w:webHidden/>
-          </w:rPr>
-          <w:fldChar w:fldCharType="end"/>
-        </w:r>
-      </w:hyperlink>
-    </w:p>
-    <w:p>
-      <w:pPr>
-        <w:pStyle w:val="TableofFigures"/>
-        <w:tabs>
-          <w:tab w:val="right" w:leader="dot" w:pos="9016"/>
-        </w:tabs>
-        <w:rPr>
-          <w:rFonts w:asciiTheme="minorHAnsi" w:eastAsiaTheme="minorEastAsia" w:hAnsiTheme="minorHAnsi" w:cstheme="minorBidi"/>
-          <w:noProof/>
-          <w:kern w:val="2"/>
-          <w:szCs w:val="24"/>
-          <w:lang w:eastAsia="en-IE"/>
-          <w14:ligatures w14:val="standardContextual"/>
-        </w:rPr>
-      </w:pPr>
-      <w:hyperlink w:anchor="_Toc243431200" w:history="1">
+      <w:hyperlink w:anchor="_Toc243433235" w:history="1">
         <w:r>
           <w:rPr>
             <w:rStyle w:val="Hyperlink"/>
@@ -4033,7 +4390,7 @@
             <w:noProof/>
             <w:webHidden/>
           </w:rPr>
-          <w:instrText xml:space="preserve"> PAGEREF _Toc243431200 \h </w:instrText>
+          <w:instrText xml:space="preserve"> PAGEREF _Toc243433235 \h </w:instrText>
         </w:r>
         <w:r>
           <w:rPr>
@@ -4053,7 +4410,7 @@
             <w:noProof/>
             <w:webHidden/>
           </w:rPr>
-          <w:t>16</w:t>
+          <w:t>15</w:t>
         </w:r>
         <w:r>
           <w:rPr>
@@ -4106,11 +4463,15 @@
           <w:lang w:val="en-US"/>
         </w:rPr>
       </w:pPr>
+      <w:bookmarkStart w:id="1" w:name="_Toc243433201"/>
+      <w:bookmarkStart w:id="2" w:name="_Toc243479153"/>
       <w:r>
         <w:lastRenderedPageBreak/>
         <w:t>Introduction</w:t>
       </w:r>
       <w:bookmarkEnd w:id="0"/>
+      <w:bookmarkEnd w:id="1"/>
+      <w:bookmarkEnd w:id="2"/>
       <w:r>
         <w:t xml:space="preserve"> </w:t>
       </w:r>
@@ -4173,14 +4534,16 @@
       <w:pPr>
         <w:pStyle w:val="Heading1"/>
       </w:pPr>
-      <w:bookmarkStart w:id="1" w:name="_Toc243430764"/>
-      <w:bookmarkStart w:id="2" w:name="_Toc243431117"/>
+      <w:bookmarkStart w:id="3" w:name="_Toc243430764"/>
+      <w:bookmarkStart w:id="4" w:name="_Toc243433202"/>
+      <w:bookmarkStart w:id="5" w:name="_Toc243479154"/>
       <w:r>
         <w:lastRenderedPageBreak/>
         <w:t>Project Title</w:t>
       </w:r>
-      <w:bookmarkEnd w:id="1"/>
-      <w:bookmarkEnd w:id="2"/>
+      <w:bookmarkEnd w:id="3"/>
+      <w:bookmarkEnd w:id="4"/>
+      <w:bookmarkEnd w:id="5"/>
     </w:p>
     <w:p>
       <w:pPr>
@@ -4220,14 +4583,16 @@
       <w:pPr>
         <w:pStyle w:val="Heading1"/>
       </w:pPr>
-      <w:bookmarkStart w:id="3" w:name="_Toc243430765"/>
-      <w:bookmarkStart w:id="4" w:name="_Toc243431118"/>
+      <w:bookmarkStart w:id="6" w:name="_Toc243430765"/>
+      <w:bookmarkStart w:id="7" w:name="_Toc243433203"/>
+      <w:bookmarkStart w:id="8" w:name="_Toc243479155"/>
       <w:r>
         <w:lastRenderedPageBreak/>
         <w:t>Problem Definition</w:t>
       </w:r>
-      <w:bookmarkEnd w:id="3"/>
-      <w:bookmarkEnd w:id="4"/>
+      <w:bookmarkEnd w:id="6"/>
+      <w:bookmarkEnd w:id="7"/>
+      <w:bookmarkEnd w:id="8"/>
     </w:p>
     <w:p>
       <w:r>
@@ -4339,6 +4704,40 @@
       </w:r>
     </w:p>
     <w:p>
+      <w:pPr>
+        <w:pStyle w:val="Heading2"/>
+      </w:pPr>
+      <w:bookmarkStart w:id="9" w:name="_Toc243433204"/>
+      <w:bookmarkStart w:id="10" w:name="_Toc243479156"/>
+      <w:r>
+        <w:t>Research question</w:t>
+      </w:r>
+      <w:bookmarkEnd w:id="9"/>
+      <w:bookmarkEnd w:id="10"/>
+    </w:p>
+    <w:p>
+      <w:pPr>
+        <w:suppressAutoHyphens w:val="0"/>
+        <w:autoSpaceDN/>
+        <w:spacing w:before="100" w:beforeAutospacing="1" w:after="100" w:afterAutospacing="1" w:line="240" w:lineRule="auto"/>
+        <w:jc w:val="center"/>
+        <w:rPr>
+          <w:rFonts w:eastAsia="Times New Roman"/>
+          <w:szCs w:val="24"/>
+          <w:lang w:eastAsia="en-IE"/>
+        </w:rPr>
+      </w:pPr>
+      <w:r>
+        <w:rPr>
+          <w:rFonts w:eastAsia="Times New Roman"/>
+          <w:szCs w:val="24"/>
+          <w:lang w:eastAsia="en-IE"/>
+        </w:rPr>
+        <w:t>How can machine learning be used to predict online purchasing behaviour and identify browsing patterns that support e-commerce conversion strategies?</w:t>
+      </w:r>
+    </w:p>
+    <w:p/>
+    <w:p>
       <w:r>
         <w:br w:type="page"/>
       </w:r>
@@ -4347,59 +4746,67 @@
       <w:pPr>
         <w:pStyle w:val="Heading1"/>
       </w:pPr>
-      <w:bookmarkStart w:id="5" w:name="_Toc243430766"/>
-      <w:bookmarkStart w:id="6" w:name="_Toc243431119"/>
+      <w:bookmarkStart w:id="11" w:name="_Toc243430766"/>
+      <w:bookmarkStart w:id="12" w:name="_Toc243433205"/>
+      <w:bookmarkStart w:id="13" w:name="_Toc243479157"/>
       <w:r>
         <w:lastRenderedPageBreak/>
         <w:t>Aim and Objectives</w:t>
       </w:r>
-      <w:bookmarkEnd w:id="5"/>
-      <w:bookmarkEnd w:id="6"/>
-      <w:r>
-        <w:t xml:space="preserve"> </w:t>
-      </w:r>
-    </w:p>
-    <w:p>
-      <w:pPr>
-        <w:pStyle w:val="Heading2"/>
-      </w:pPr>
-      <w:bookmarkStart w:id="7" w:name="_Toc243430767"/>
-      <w:bookmarkStart w:id="8" w:name="_Toc243431120"/>
-      <w:r>
-        <w:t>Aim</w:t>
-      </w:r>
-      <w:bookmarkEnd w:id="7"/>
-      <w:bookmarkEnd w:id="8"/>
-    </w:p>
-    <w:p>
-      <w:r>
-        <w:t>The aim of this project is to use data analytics and machine learning to analyse the Online Shoppers Purchasing Intention dataset, identify browsing patterns associated with purchases, and develop and evaluate predictive models that classify shopping sessions as purchases or non-purchases. The findings will support data-driven recommendations to help online retailers improve customer engagement, identify sales opportunities and improve conversion strategies.</w:t>
-      </w:r>
-    </w:p>
-    <w:p/>
-    <w:p>
-      <w:pPr>
-        <w:pStyle w:val="Heading2"/>
-      </w:pPr>
-      <w:bookmarkStart w:id="9" w:name="_Toc243430768"/>
-      <w:bookmarkStart w:id="10" w:name="_Toc243431121"/>
-      <w:r>
-        <w:t>Project Objectives</w:t>
-      </w:r>
-      <w:bookmarkEnd w:id="9"/>
-      <w:bookmarkEnd w:id="10"/>
-    </w:p>
-    <w:p>
-      <w:pPr>
-        <w:pStyle w:val="Heading3"/>
-      </w:pPr>
-      <w:bookmarkStart w:id="11" w:name="_Toc243430769"/>
-      <w:bookmarkStart w:id="12" w:name="_Toc243431122"/>
-      <w:r>
-        <w:t>Objective #1</w:t>
-      </w:r>
       <w:bookmarkEnd w:id="11"/>
       <w:bookmarkEnd w:id="12"/>
+      <w:bookmarkEnd w:id="13"/>
+      <w:r>
+        <w:t xml:space="preserve"> </w:t>
+      </w:r>
+    </w:p>
+    <w:p>
+      <w:pPr>
+        <w:pStyle w:val="Heading2"/>
+      </w:pPr>
+      <w:bookmarkStart w:id="14" w:name="_Toc243430767"/>
+      <w:bookmarkStart w:id="15" w:name="_Toc243433206"/>
+      <w:bookmarkStart w:id="16" w:name="_Toc243479158"/>
+      <w:r>
+        <w:t>Aim</w:t>
+      </w:r>
+      <w:bookmarkEnd w:id="14"/>
+      <w:bookmarkEnd w:id="15"/>
+      <w:bookmarkEnd w:id="16"/>
+    </w:p>
+    <w:p>
+      <w:r>
+        <w:t>The aim of this project is to use data analytics and machine learning to analyse the Online Shoppers Purchasing Intention dataset, identify browsing patterns associated with purchases, and develop and evaluate predictive models that classify shopping sessions as purchases or non-purchases. The findings will support data-driven recommendations to help online retailers improve customer engagement, identify sales opportunities and improve conversion strategies.</w:t>
+      </w:r>
+    </w:p>
+    <w:p/>
+    <w:p>
+      <w:pPr>
+        <w:pStyle w:val="Heading2"/>
+      </w:pPr>
+      <w:bookmarkStart w:id="17" w:name="_Toc243430768"/>
+      <w:bookmarkStart w:id="18" w:name="_Toc243433207"/>
+      <w:bookmarkStart w:id="19" w:name="_Toc243479159"/>
+      <w:r>
+        <w:t>Project Objectives</w:t>
+      </w:r>
+      <w:bookmarkEnd w:id="17"/>
+      <w:bookmarkEnd w:id="18"/>
+      <w:bookmarkEnd w:id="19"/>
+    </w:p>
+    <w:p>
+      <w:pPr>
+        <w:pStyle w:val="Heading3"/>
+      </w:pPr>
+      <w:bookmarkStart w:id="20" w:name="_Toc243430769"/>
+      <w:bookmarkStart w:id="21" w:name="_Toc243433208"/>
+      <w:bookmarkStart w:id="22" w:name="_Toc243479160"/>
+      <w:r>
+        <w:t>Objective #1</w:t>
+      </w:r>
+      <w:bookmarkEnd w:id="20"/>
+      <w:bookmarkEnd w:id="21"/>
+      <w:bookmarkEnd w:id="22"/>
     </w:p>
     <w:p>
       <w:r>
@@ -4420,13 +4827,15 @@
       <w:pPr>
         <w:pStyle w:val="Heading3"/>
       </w:pPr>
-      <w:bookmarkStart w:id="13" w:name="_Toc243430770"/>
-      <w:bookmarkStart w:id="14" w:name="_Toc243431123"/>
+      <w:bookmarkStart w:id="23" w:name="_Toc243430770"/>
+      <w:bookmarkStart w:id="24" w:name="_Toc243433209"/>
+      <w:bookmarkStart w:id="25" w:name="_Toc243479161"/>
       <w:r>
         <w:t>Objective #2</w:t>
       </w:r>
-      <w:bookmarkEnd w:id="13"/>
-      <w:bookmarkEnd w:id="14"/>
+      <w:bookmarkEnd w:id="23"/>
+      <w:bookmarkEnd w:id="24"/>
+      <w:bookmarkEnd w:id="25"/>
     </w:p>
     <w:p>
       <w:r>
@@ -4456,13 +4865,15 @@
       <w:pPr>
         <w:pStyle w:val="Heading3"/>
       </w:pPr>
-      <w:bookmarkStart w:id="15" w:name="_Toc243430771"/>
-      <w:bookmarkStart w:id="16" w:name="_Toc243431124"/>
+      <w:bookmarkStart w:id="26" w:name="_Toc243430771"/>
+      <w:bookmarkStart w:id="27" w:name="_Toc243433210"/>
+      <w:bookmarkStart w:id="28" w:name="_Toc243479162"/>
       <w:r>
         <w:t>Objective #3</w:t>
       </w:r>
-      <w:bookmarkEnd w:id="15"/>
-      <w:bookmarkEnd w:id="16"/>
+      <w:bookmarkEnd w:id="26"/>
+      <w:bookmarkEnd w:id="27"/>
+      <w:bookmarkEnd w:id="28"/>
     </w:p>
     <w:p>
       <w:r>
@@ -4480,13 +4891,15 @@
       <w:pPr>
         <w:pStyle w:val="Heading3"/>
       </w:pPr>
-      <w:bookmarkStart w:id="17" w:name="_Toc243430772"/>
-      <w:bookmarkStart w:id="18" w:name="_Toc243431125"/>
+      <w:bookmarkStart w:id="29" w:name="_Toc243430772"/>
+      <w:bookmarkStart w:id="30" w:name="_Toc243433211"/>
+      <w:bookmarkStart w:id="31" w:name="_Toc243479163"/>
       <w:r>
         <w:t>Objective #4</w:t>
       </w:r>
-      <w:bookmarkEnd w:id="17"/>
-      <w:bookmarkEnd w:id="18"/>
+      <w:bookmarkEnd w:id="29"/>
+      <w:bookmarkEnd w:id="30"/>
+      <w:bookmarkEnd w:id="31"/>
     </w:p>
     <w:p>
       <w:r>
@@ -4504,13 +4917,15 @@
       <w:pPr>
         <w:pStyle w:val="Heading3"/>
       </w:pPr>
-      <w:bookmarkStart w:id="19" w:name="_Toc243430773"/>
-      <w:bookmarkStart w:id="20" w:name="_Toc243431126"/>
+      <w:bookmarkStart w:id="32" w:name="_Toc243430773"/>
+      <w:bookmarkStart w:id="33" w:name="_Toc243433212"/>
+      <w:bookmarkStart w:id="34" w:name="_Toc243479164"/>
       <w:r>
         <w:t>Objective #5</w:t>
       </w:r>
-      <w:bookmarkEnd w:id="19"/>
-      <w:bookmarkEnd w:id="20"/>
+      <w:bookmarkEnd w:id="32"/>
+      <w:bookmarkEnd w:id="33"/>
+      <w:bookmarkEnd w:id="34"/>
     </w:p>
     <w:p>
       <w:r>
@@ -4529,13 +4944,15 @@
       <w:pPr>
         <w:pStyle w:val="Heading2"/>
       </w:pPr>
-      <w:bookmarkStart w:id="21" w:name="_Toc243430774"/>
-      <w:bookmarkStart w:id="22" w:name="_Toc243431127"/>
+      <w:bookmarkStart w:id="35" w:name="_Toc243430774"/>
+      <w:bookmarkStart w:id="36" w:name="_Toc243433213"/>
+      <w:bookmarkStart w:id="37" w:name="_Toc243479165"/>
       <w:r>
         <w:t>Business objective</w:t>
       </w:r>
-      <w:bookmarkEnd w:id="21"/>
-      <w:bookmarkEnd w:id="22"/>
+      <w:bookmarkEnd w:id="35"/>
+      <w:bookmarkEnd w:id="36"/>
+      <w:bookmarkEnd w:id="37"/>
     </w:p>
     <w:p>
       <w:pPr>
@@ -4566,14 +4983,16 @@
       <w:pPr>
         <w:pStyle w:val="Heading1"/>
       </w:pPr>
-      <w:bookmarkStart w:id="23" w:name="_Toc243430775"/>
-      <w:bookmarkStart w:id="24" w:name="_Toc243431128"/>
+      <w:bookmarkStart w:id="38" w:name="_Toc243430775"/>
+      <w:bookmarkStart w:id="39" w:name="_Toc243433214"/>
+      <w:bookmarkStart w:id="40" w:name="_Toc243479166"/>
       <w:r>
         <w:lastRenderedPageBreak/>
         <w:t>Scope</w:t>
       </w:r>
-      <w:bookmarkEnd w:id="23"/>
-      <w:bookmarkEnd w:id="24"/>
+      <w:bookmarkEnd w:id="38"/>
+      <w:bookmarkEnd w:id="39"/>
+      <w:bookmarkEnd w:id="40"/>
       <w:r>
         <w:t xml:space="preserve"> </w:t>
       </w:r>
@@ -4588,13 +5007,15 @@
       <w:pPr>
         <w:pStyle w:val="Heading2"/>
       </w:pPr>
-      <w:bookmarkStart w:id="25" w:name="_Toc243430776"/>
-      <w:bookmarkStart w:id="26" w:name="_Toc243431129"/>
+      <w:bookmarkStart w:id="41" w:name="_Toc243430776"/>
+      <w:bookmarkStart w:id="42" w:name="_Toc243433215"/>
+      <w:bookmarkStart w:id="43" w:name="_Toc243479167"/>
       <w:r>
         <w:t>Included:</w:t>
       </w:r>
-      <w:bookmarkEnd w:id="25"/>
-      <w:bookmarkEnd w:id="26"/>
+      <w:bookmarkEnd w:id="41"/>
+      <w:bookmarkEnd w:id="42"/>
+      <w:bookmarkEnd w:id="43"/>
       <w:r>
         <w:t xml:space="preserve"> </w:t>
       </w:r>
@@ -4712,16 +5133,18 @@
       <w:pPr>
         <w:pStyle w:val="Heading2"/>
       </w:pPr>
-      <w:bookmarkStart w:id="27" w:name="_Toc243430777"/>
-      <w:bookmarkStart w:id="28" w:name="_Toc243431130"/>
+      <w:bookmarkStart w:id="44" w:name="_Toc243430777"/>
+      <w:bookmarkStart w:id="45" w:name="_Toc243433216"/>
+      <w:bookmarkStart w:id="46" w:name="_Toc243479168"/>
       <w:r>
         <w:t>Excluded</w:t>
       </w:r>
       <w:r>
         <w:t>:</w:t>
       </w:r>
-      <w:bookmarkEnd w:id="27"/>
-      <w:bookmarkEnd w:id="28"/>
+      <w:bookmarkEnd w:id="44"/>
+      <w:bookmarkEnd w:id="45"/>
+      <w:bookmarkEnd w:id="46"/>
       <w:r>
         <w:t xml:space="preserve"> </w:t>
       </w:r>
@@ -4795,13 +5218,15 @@
       <w:pPr>
         <w:pStyle w:val="Heading2"/>
       </w:pPr>
-      <w:bookmarkStart w:id="29" w:name="_Toc243430778"/>
-      <w:bookmarkStart w:id="30" w:name="_Toc243431131"/>
+      <w:bookmarkStart w:id="47" w:name="_Toc243430778"/>
+      <w:bookmarkStart w:id="48" w:name="_Toc243433217"/>
+      <w:bookmarkStart w:id="49" w:name="_Toc243479169"/>
       <w:r>
         <w:t>Time Scope:</w:t>
       </w:r>
-      <w:bookmarkEnd w:id="29"/>
-      <w:bookmarkEnd w:id="30"/>
+      <w:bookmarkEnd w:id="47"/>
+      <w:bookmarkEnd w:id="48"/>
+      <w:bookmarkEnd w:id="49"/>
     </w:p>
     <w:p>
       <w:r>
@@ -4828,14 +5253,16 @@
       <w:pPr>
         <w:pStyle w:val="Heading1"/>
       </w:pPr>
-      <w:bookmarkStart w:id="31" w:name="_Toc243430779"/>
-      <w:bookmarkStart w:id="32" w:name="_Toc243431132"/>
+      <w:bookmarkStart w:id="50" w:name="_Toc243430779"/>
+      <w:bookmarkStart w:id="51" w:name="_Toc243433218"/>
+      <w:bookmarkStart w:id="52" w:name="_Toc243479170"/>
       <w:r>
         <w:lastRenderedPageBreak/>
         <w:t>Methodology</w:t>
       </w:r>
-      <w:bookmarkEnd w:id="31"/>
-      <w:bookmarkEnd w:id="32"/>
+      <w:bookmarkEnd w:id="50"/>
+      <w:bookmarkEnd w:id="51"/>
+      <w:bookmarkEnd w:id="52"/>
     </w:p>
     <w:p>
       <w:r>
@@ -4870,13 +5297,15 @@
           <w:numId w:val="18"/>
         </w:numPr>
       </w:pPr>
-      <w:bookmarkStart w:id="33" w:name="_Toc243430780"/>
-      <w:bookmarkStart w:id="34" w:name="_Toc243431133"/>
+      <w:bookmarkStart w:id="53" w:name="_Toc243430780"/>
+      <w:bookmarkStart w:id="54" w:name="_Toc243433219"/>
+      <w:bookmarkStart w:id="55" w:name="_Toc243479171"/>
       <w:r>
         <w:t>Business Understanding:</w:t>
       </w:r>
-      <w:bookmarkEnd w:id="33"/>
-      <w:bookmarkEnd w:id="34"/>
+      <w:bookmarkEnd w:id="53"/>
+      <w:bookmarkEnd w:id="54"/>
+      <w:bookmarkEnd w:id="55"/>
     </w:p>
     <w:p>
       <w:pPr>
@@ -4897,13 +5326,15 @@
           <w:numId w:val="18"/>
         </w:numPr>
       </w:pPr>
-      <w:bookmarkStart w:id="35" w:name="_Toc243430781"/>
-      <w:bookmarkStart w:id="36" w:name="_Toc243431134"/>
+      <w:bookmarkStart w:id="56" w:name="_Toc243430781"/>
+      <w:bookmarkStart w:id="57" w:name="_Toc243433220"/>
+      <w:bookmarkStart w:id="58" w:name="_Toc243479172"/>
       <w:r>
         <w:t>Data Understanding:</w:t>
       </w:r>
-      <w:bookmarkEnd w:id="35"/>
-      <w:bookmarkEnd w:id="36"/>
+      <w:bookmarkEnd w:id="56"/>
+      <w:bookmarkEnd w:id="57"/>
+      <w:bookmarkEnd w:id="58"/>
       <w:r>
         <w:t xml:space="preserve"> </w:t>
       </w:r>
@@ -4930,13 +5361,15 @@
           <w:numId w:val="18"/>
         </w:numPr>
       </w:pPr>
-      <w:bookmarkStart w:id="37" w:name="_Toc243430782"/>
-      <w:bookmarkStart w:id="38" w:name="_Toc243431135"/>
+      <w:bookmarkStart w:id="59" w:name="_Toc243430782"/>
+      <w:bookmarkStart w:id="60" w:name="_Toc243433221"/>
+      <w:bookmarkStart w:id="61" w:name="_Toc243479173"/>
       <w:r>
         <w:t>Data Preparation:</w:t>
       </w:r>
-      <w:bookmarkEnd w:id="37"/>
-      <w:bookmarkEnd w:id="38"/>
+      <w:bookmarkEnd w:id="59"/>
+      <w:bookmarkEnd w:id="60"/>
+      <w:bookmarkEnd w:id="61"/>
       <w:r>
         <w:t xml:space="preserve"> </w:t>
       </w:r>
@@ -4957,13 +5390,15 @@
           <w:numId w:val="18"/>
         </w:numPr>
       </w:pPr>
-      <w:bookmarkStart w:id="39" w:name="_Toc243430783"/>
-      <w:bookmarkStart w:id="40" w:name="_Toc243431136"/>
+      <w:bookmarkStart w:id="62" w:name="_Toc243430783"/>
+      <w:bookmarkStart w:id="63" w:name="_Toc243433222"/>
+      <w:bookmarkStart w:id="64" w:name="_Toc243479174"/>
       <w:r>
         <w:t>Modelling:</w:t>
       </w:r>
-      <w:bookmarkEnd w:id="39"/>
-      <w:bookmarkEnd w:id="40"/>
+      <w:bookmarkEnd w:id="62"/>
+      <w:bookmarkEnd w:id="63"/>
+      <w:bookmarkEnd w:id="64"/>
     </w:p>
     <w:p>
       <w:pPr>
@@ -5055,13 +5490,15 @@
           <w:numId w:val="18"/>
         </w:numPr>
       </w:pPr>
-      <w:bookmarkStart w:id="41" w:name="_Toc243430784"/>
-      <w:bookmarkStart w:id="42" w:name="_Toc243431137"/>
+      <w:bookmarkStart w:id="65" w:name="_Toc243430784"/>
+      <w:bookmarkStart w:id="66" w:name="_Toc243433223"/>
+      <w:bookmarkStart w:id="67" w:name="_Toc243479175"/>
       <w:r>
         <w:t>Evaluation:</w:t>
       </w:r>
-      <w:bookmarkEnd w:id="41"/>
-      <w:bookmarkEnd w:id="42"/>
+      <w:bookmarkEnd w:id="65"/>
+      <w:bookmarkEnd w:id="66"/>
+      <w:bookmarkEnd w:id="67"/>
       <w:r>
         <w:t xml:space="preserve"> </w:t>
       </w:r>
@@ -5074,13 +5511,7 @@
         </w:rPr>
       </w:pPr>
       <w:r>
-        <w:t xml:space="preserve">The models will be compared using precision, recall, F1-score, and confusion matrices. After training and tuning, the models will be tested on unseen </w:t>
-      </w:r>
-      <w:r>
-        <w:t xml:space="preserve">data </w:t>
-      </w:r>
-      <w:r>
-        <w:t>to evaluate their classification performance. The final model will be selected based on predictive performance and usefulness for business decision-making.</w:t>
+        <w:t>The models will be compared using precision, recall, F1-score, and confusion matrices. After training and tuning, the models will be tested on unseen data to evaluate their classification performance. The final model will be selected based on predictive performance and usefulness for business decision-making.</w:t>
       </w:r>
     </w:p>
     <w:p>
@@ -5091,13 +5522,15 @@
           <w:numId w:val="18"/>
         </w:numPr>
       </w:pPr>
-      <w:bookmarkStart w:id="43" w:name="_Toc243430785"/>
-      <w:bookmarkStart w:id="44" w:name="_Toc243431138"/>
+      <w:bookmarkStart w:id="68" w:name="_Toc243430785"/>
+      <w:bookmarkStart w:id="69" w:name="_Toc243433224"/>
+      <w:bookmarkStart w:id="70" w:name="_Toc243479176"/>
       <w:r>
         <w:t>Deployment and Business Recommendations:</w:t>
       </w:r>
-      <w:bookmarkEnd w:id="43"/>
-      <w:bookmarkEnd w:id="44"/>
+      <w:bookmarkEnd w:id="68"/>
+      <w:bookmarkEnd w:id="69"/>
+      <w:bookmarkEnd w:id="70"/>
       <w:r>
         <w:t xml:space="preserve"> </w:t>
       </w:r>
@@ -5119,14 +5552,16 @@
       <w:pPr>
         <w:pStyle w:val="Heading2"/>
       </w:pPr>
-      <w:bookmarkStart w:id="45" w:name="_Toc243430786"/>
-      <w:bookmarkStart w:id="46" w:name="_Toc243431139"/>
+      <w:bookmarkStart w:id="71" w:name="_Toc243430786"/>
+      <w:bookmarkStart w:id="72" w:name="_Toc243433225"/>
+      <w:bookmarkStart w:id="73" w:name="_Toc243479177"/>
       <w:r>
         <w:lastRenderedPageBreak/>
         <w:t>Tools and Technologies</w:t>
       </w:r>
-      <w:bookmarkEnd w:id="45"/>
-      <w:bookmarkEnd w:id="46"/>
+      <w:bookmarkEnd w:id="71"/>
+      <w:bookmarkEnd w:id="72"/>
+      <w:bookmarkEnd w:id="73"/>
     </w:p>
     <w:p>
       <w:pPr>
@@ -5233,13 +5668,15 @@
       <w:pPr>
         <w:pStyle w:val="Heading2"/>
       </w:pPr>
-      <w:bookmarkStart w:id="47" w:name="_Toc243430787"/>
-      <w:bookmarkStart w:id="48" w:name="_Toc243431140"/>
+      <w:bookmarkStart w:id="74" w:name="_Toc243430787"/>
+      <w:bookmarkStart w:id="75" w:name="_Toc243433226"/>
+      <w:bookmarkStart w:id="76" w:name="_Toc243479178"/>
       <w:r>
         <w:t>Proposed System Architecture</w:t>
       </w:r>
-      <w:bookmarkEnd w:id="47"/>
-      <w:bookmarkEnd w:id="48"/>
+      <w:bookmarkEnd w:id="74"/>
+      <w:bookmarkEnd w:id="75"/>
+      <w:bookmarkEnd w:id="76"/>
       <w:r>
         <w:t xml:space="preserve"> </w:t>
       </w:r>
@@ -5315,40 +5752,27 @@
       <w:pPr>
         <w:pStyle w:val="Caption"/>
       </w:pPr>
-      <w:bookmarkStart w:id="49" w:name="_Toc243431146"/>
-      <w:bookmarkStart w:id="50" w:name="_Toc243431198"/>
+      <w:bookmarkStart w:id="77" w:name="_Toc243431146"/>
+      <w:bookmarkStart w:id="78" w:name="_Toc243433233"/>
       <w:r>
         <w:t xml:space="preserve">Figure </w:t>
       </w:r>
-      <w:r>
-        <w:fldChar w:fldCharType="begin"/>
-      </w:r>
-      <w:r>
-        <w:instrText xml:space="preserve"> SEQ Figure \* ARABIC </w:instrText>
-      </w:r>
-      <w:r>
-        <w:fldChar w:fldCharType="separate"/>
-      </w:r>
-      <w:r>
-        <w:rPr>
-          <w:noProof/>
-        </w:rPr>
-        <w:t>1</w:t>
-      </w:r>
-      <w:r>
-        <w:rPr>
-          <w:noProof/>
-        </w:rPr>
-        <w:fldChar w:fldCharType="end"/>
-      </w:r>
+      <w:fldSimple w:instr=" SEQ Figure \* ARABIC ">
+        <w:r>
+          <w:rPr>
+            <w:noProof/>
+          </w:rPr>
+          <w:t>1</w:t>
+        </w:r>
+      </w:fldSimple>
       <w:r>
         <w:t xml:space="preserve"> </w:t>
       </w:r>
       <w:r>
         <w:t>High-level architectural diagram</w:t>
       </w:r>
-      <w:bookmarkEnd w:id="49"/>
-      <w:bookmarkEnd w:id="50"/>
+      <w:bookmarkEnd w:id="77"/>
+      <w:bookmarkEnd w:id="78"/>
     </w:p>
     <w:p>
       <w:pPr>
@@ -5370,14 +5794,16 @@
       <w:pPr>
         <w:pStyle w:val="Heading1"/>
       </w:pPr>
-      <w:bookmarkStart w:id="51" w:name="_Toc243430788"/>
-      <w:bookmarkStart w:id="52" w:name="_Toc243431141"/>
+      <w:bookmarkStart w:id="79" w:name="_Toc243430788"/>
+      <w:bookmarkStart w:id="80" w:name="_Toc243433227"/>
+      <w:bookmarkStart w:id="81" w:name="_Toc243479179"/>
       <w:r>
         <w:lastRenderedPageBreak/>
         <w:t>Data Sources</w:t>
       </w:r>
-      <w:bookmarkEnd w:id="51"/>
-      <w:bookmarkEnd w:id="52"/>
+      <w:bookmarkEnd w:id="79"/>
+      <w:bookmarkEnd w:id="80"/>
+      <w:bookmarkEnd w:id="81"/>
     </w:p>
     <w:p>
       <w:pPr>
@@ -5426,19 +5852,7 @@
         <w:pStyle w:val="NormalWeb"/>
       </w:pPr>
       <w:r>
-        <w:t xml:space="preserve">This dataset is suitable for the project because it supports binary classification of purchasing outcomes and helps identify browsing patterns </w:t>
-      </w:r>
-      <w:r>
-        <w:t>linked</w:t>
-      </w:r>
-      <w:r>
-        <w:t xml:space="preserve"> </w:t>
-      </w:r>
-      <w:r>
-        <w:t>to</w:t>
-      </w:r>
-      <w:r>
-        <w:t xml:space="preserve"> purchases.</w:t>
+        <w:t>This dataset is suitable for the project because it supports binary classification of purchasing outcomes and helps identify browsing patterns linked to purchases.</w:t>
       </w:r>
     </w:p>
     <w:p>
@@ -5531,42 +5945,32 @@
       <w:pPr>
         <w:pStyle w:val="Caption"/>
       </w:pPr>
-      <w:bookmarkStart w:id="53" w:name="_Toc242874954"/>
-      <w:bookmarkStart w:id="54" w:name="_Toc243431147"/>
-      <w:bookmarkStart w:id="55" w:name="_Toc243431199"/>
+      <w:bookmarkStart w:id="82" w:name="_Toc242874954"/>
+      <w:bookmarkStart w:id="83" w:name="_Toc243431147"/>
+      <w:bookmarkStart w:id="84" w:name="_Toc243433234"/>
       <w:r>
         <w:t xml:space="preserve">Figure </w:t>
       </w:r>
-      <w:r>
-        <w:fldChar w:fldCharType="begin"/>
-      </w:r>
-      <w:r>
-        <w:instrText xml:space="preserve"> SEQ Figure \* ARABIC </w:instrText>
-      </w:r>
-      <w:r>
-        <w:fldChar w:fldCharType="separate"/>
-      </w:r>
-      <w:r>
-        <w:rPr>
-          <w:noProof/>
-        </w:rPr>
-        <w:t>2</w:t>
-      </w:r>
-      <w:r>
-        <w:rPr>
-          <w:noProof/>
-        </w:rPr>
-        <w:fldChar w:fldCharType="end"/>
-      </w:r>
+      <w:fldSimple w:instr=" SEQ Figure \* ARABIC ">
+        <w:r>
+          <w:rPr>
+            <w:noProof/>
+          </w:rPr>
+          <w:t>2</w:t>
+        </w:r>
+      </w:fldSimple>
       <w:r>
         <w:t xml:space="preserve"> </w:t>
       </w:r>
       <w:r>
-        <w:t xml:space="preserve"> Data Info</w:t>
-      </w:r>
-      <w:bookmarkEnd w:id="53"/>
-      <w:bookmarkEnd w:id="54"/>
-      <w:bookmarkEnd w:id="55"/>
+        <w:t xml:space="preserve"> </w:t>
+      </w:r>
+      <w:bookmarkEnd w:id="82"/>
+      <w:bookmarkEnd w:id="83"/>
+      <w:r>
+        <w:t>Dataset Structure and Variables</w:t>
+      </w:r>
+      <w:bookmarkEnd w:id="84"/>
     </w:p>
     <w:p>
       <w:r>
@@ -5587,14 +5991,16 @@
       <w:pPr>
         <w:pStyle w:val="Heading1"/>
       </w:pPr>
-      <w:bookmarkStart w:id="56" w:name="_Toc243430789"/>
-      <w:bookmarkStart w:id="57" w:name="_Toc243431142"/>
+      <w:bookmarkStart w:id="85" w:name="_Toc243430789"/>
+      <w:bookmarkStart w:id="86" w:name="_Toc243433228"/>
+      <w:bookmarkStart w:id="87" w:name="_Toc243479180"/>
       <w:r>
         <w:lastRenderedPageBreak/>
         <w:t>Expected Deliverables</w:t>
       </w:r>
-      <w:bookmarkEnd w:id="56"/>
-      <w:bookmarkEnd w:id="57"/>
+      <w:bookmarkEnd w:id="85"/>
+      <w:bookmarkEnd w:id="86"/>
+      <w:bookmarkEnd w:id="87"/>
       <w:r>
         <w:t xml:space="preserve"> </w:t>
       </w:r>
@@ -5705,14 +6111,16 @@
       <w:pPr>
         <w:pStyle w:val="Heading1"/>
       </w:pPr>
-      <w:bookmarkStart w:id="58" w:name="_Toc243430790"/>
-      <w:bookmarkStart w:id="59" w:name="_Toc243431143"/>
+      <w:bookmarkStart w:id="88" w:name="_Toc243430790"/>
+      <w:bookmarkStart w:id="89" w:name="_Toc243433229"/>
+      <w:bookmarkStart w:id="90" w:name="_Toc243479181"/>
       <w:r>
         <w:lastRenderedPageBreak/>
         <w:t>Project Timeline</w:t>
       </w:r>
-      <w:bookmarkEnd w:id="58"/>
-      <w:bookmarkEnd w:id="59"/>
+      <w:bookmarkEnd w:id="88"/>
+      <w:bookmarkEnd w:id="89"/>
+      <w:bookmarkEnd w:id="90"/>
     </w:p>
     <w:p>
       <w:r>
@@ -5721,7 +6129,7 @@
     </w:p>
     <w:p>
       <w:r>
-        <w:t xml:space="preserve">The project will be completed over two semesters, from September 2026 to May 2027. </w:t>
+        <w:t xml:space="preserve"> </w:t>
       </w:r>
       <w:r>
         <w:rPr>
@@ -5733,6 +6141,8 @@
       <w:r>
         <w:t xml:space="preserve"> will focus on research, defining the business problem and initial data exploration and preparation. </w:t>
       </w:r>
+    </w:p>
+    <w:p>
       <w:r>
         <w:rPr>
           <w:b/>
@@ -5814,7 +6224,7 @@
           <w:b/>
           <w:bCs/>
         </w:rPr>
-        <w:t>28</w:t>
+        <w:t>30</w:t>
       </w:r>
       <w:r>
         <w:rPr>
@@ -5846,7 +6256,7 @@
           <w:b/>
           <w:bCs/>
         </w:rPr>
-        <w:t>23</w:t>
+        <w:t>30</w:t>
       </w:r>
       <w:r>
         <w:rPr>
@@ -5899,14 +6309,11 @@
         <w:t xml:space="preserve"> </w:t>
       </w:r>
       <w:r>
-        <w:rPr>
-          <w:noProof/>
-        </w:rPr>
         <w:drawing>
-          <wp:inline distT="0" distB="0" distL="0" distR="0" wp14:anchorId="559B3F78" wp14:editId="564AB1B3">
-            <wp:extent cx="6233528" cy="3615070"/>
-            <wp:effectExtent l="0" t="0" r="0" b="4445"/>
-            <wp:docPr id="1056951040" name="Picture 4"/>
+          <wp:inline distT="0" distB="0" distL="0" distR="0" wp14:anchorId="1ED5AC31" wp14:editId="4DEE5A5E">
+            <wp:extent cx="5731510" cy="2581910"/>
+            <wp:effectExtent l="0" t="0" r="2540" b="8890"/>
+            <wp:docPr id="1410346949" name="Picture 1"/>
             <wp:cNvGraphicFramePr>
               <a:graphicFrameLocks xmlns:a="http://schemas.openxmlformats.org/drawingml/2006/main" noChangeAspect="1"/>
             </wp:cNvGraphicFramePr>
@@ -5914,41 +6321,23 @@
               <a:graphicData uri="http://schemas.openxmlformats.org/drawingml/2006/picture">
                 <pic:pic xmlns:pic="http://schemas.openxmlformats.org/drawingml/2006/picture">
                   <pic:nvPicPr>
-                    <pic:cNvPr id="0" name="Picture 2"/>
-                    <pic:cNvPicPr>
-                      <a:picLocks noChangeAspect="1" noChangeArrowheads="1"/>
-                    </pic:cNvPicPr>
+                    <pic:cNvPr id="1410346949" name=""/>
+                    <pic:cNvPicPr/>
                   </pic:nvPicPr>
-                  <pic:blipFill rotWithShape="1">
-                    <a:blip r:embed="rId10">
-                      <a:extLst>
-                        <a:ext uri="{28A0092B-C50C-407E-A947-70E740481C1C}">
-                          <a14:useLocalDpi xmlns:a14="http://schemas.microsoft.com/office/drawing/2010/main" val="0"/>
-                        </a:ext>
-                      </a:extLst>
-                    </a:blip>
-                    <a:srcRect b="19236"/>
+                  <pic:blipFill>
+                    <a:blip r:embed="rId10"/>
                     <a:stretch>
                       <a:fillRect/>
                     </a:stretch>
                   </pic:blipFill>
-                  <pic:spPr bwMode="auto">
+                  <pic:spPr>
                     <a:xfrm>
                       <a:off x="0" y="0"/>
-                      <a:ext cx="6245131" cy="3621799"/>
+                      <a:ext cx="5731510" cy="2581910"/>
                     </a:xfrm>
                     <a:prstGeom prst="rect">
                       <a:avLst/>
                     </a:prstGeom>
-                    <a:noFill/>
-                    <a:ln>
-                      <a:noFill/>
-                    </a:ln>
-                    <a:extLst>
-                      <a:ext uri="{53640926-AAD7-44D8-BBD7-CCE9431645EC}">
-                        <a14:shadowObscured xmlns:a14="http://schemas.microsoft.com/office/drawing/2010/main"/>
-                      </a:ext>
-                    </a:extLst>
                   </pic:spPr>
                 </pic:pic>
               </a:graphicData>
@@ -5960,39 +6349,24 @@
     <w:p>
       <w:pPr>
         <w:pStyle w:val="Caption"/>
-        <w:jc w:val="left"/>
-      </w:pPr>
-      <w:bookmarkStart w:id="60" w:name="_Toc243431148"/>
-      <w:bookmarkStart w:id="61" w:name="_Toc243431200"/>
+      </w:pPr>
       <w:r>
         <w:t xml:space="preserve">Figure </w:t>
       </w:r>
-      <w:r>
-        <w:fldChar w:fldCharType="begin"/>
-      </w:r>
-      <w:r>
-        <w:instrText xml:space="preserve"> SEQ Figure \* ARABIC </w:instrText>
-      </w:r>
-      <w:r>
-        <w:fldChar w:fldCharType="separate"/>
-      </w:r>
-      <w:r>
-        <w:rPr>
-          <w:noProof/>
-        </w:rPr>
-        <w:t>3</w:t>
-      </w:r>
-      <w:r>
-        <w:fldChar w:fldCharType="end"/>
-      </w:r>
+      <w:fldSimple w:instr=" SEQ Figure \* ARABIC ">
+        <w:r>
+          <w:rPr>
+            <w:noProof/>
+          </w:rPr>
+          <w:t>3</w:t>
+        </w:r>
+      </w:fldSimple>
       <w:r>
         <w:t xml:space="preserve"> </w:t>
       </w:r>
       <w:r>
         <w:t>Gantt chart</w:t>
       </w:r>
-      <w:bookmarkEnd w:id="60"/>
-      <w:bookmarkEnd w:id="61"/>
     </w:p>
     <w:p>
       <w:pPr>
@@ -6015,14 +6389,16 @@
       <w:pPr>
         <w:pStyle w:val="Heading1"/>
       </w:pPr>
-      <w:bookmarkStart w:id="62" w:name="_Toc243430791"/>
-      <w:bookmarkStart w:id="63" w:name="_Toc243431144"/>
+      <w:bookmarkStart w:id="91" w:name="_Toc243430791"/>
+      <w:bookmarkStart w:id="92" w:name="_Toc243433230"/>
+      <w:bookmarkStart w:id="93" w:name="_Toc243479182"/>
       <w:r>
         <w:lastRenderedPageBreak/>
         <w:t>Ethical and Legal Considerations</w:t>
       </w:r>
-      <w:bookmarkEnd w:id="62"/>
-      <w:bookmarkEnd w:id="63"/>
+      <w:bookmarkEnd w:id="91"/>
+      <w:bookmarkEnd w:id="92"/>
+      <w:bookmarkEnd w:id="93"/>
       <w:r>
         <w:t xml:space="preserve"> </w:t>
       </w:r>
@@ -6093,14 +6469,16 @@
       <w:pPr>
         <w:pStyle w:val="Heading1"/>
       </w:pPr>
-      <w:bookmarkStart w:id="64" w:name="_Toc243430792"/>
-      <w:bookmarkStart w:id="65" w:name="_Toc243431145"/>
+      <w:bookmarkStart w:id="94" w:name="_Toc243430792"/>
+      <w:bookmarkStart w:id="95" w:name="_Toc243433231"/>
+      <w:bookmarkStart w:id="96" w:name="_Toc243479183"/>
       <w:r>
         <w:lastRenderedPageBreak/>
         <w:t>References</w:t>
       </w:r>
-      <w:bookmarkEnd w:id="64"/>
-      <w:bookmarkEnd w:id="65"/>
+      <w:bookmarkEnd w:id="94"/>
+      <w:bookmarkEnd w:id="95"/>
+      <w:bookmarkEnd w:id="96"/>
     </w:p>
     <w:p>
       <w:pPr>
@@ -6108,16 +6486,7 @@
         <w:ind w:left="720" w:hanging="720"/>
       </w:pPr>
       <w:r>
-        <w:t xml:space="preserve">Ahmed, T. (n.d.-a) </w:t>
-      </w:r>
-      <w:r>
-        <w:rPr>
-          <w:rStyle w:val="Emphasis"/>
-        </w:rPr>
-        <w:t>Data Protection &amp; Privacy</w:t>
-      </w:r>
-      <w:r>
-        <w:t>. Strategic Business &amp; Professional Development. Unpublished lecture slides. CCT College Dublin. Available via Moodle.</w:t>
+        <w:t>Ahmed, T. (n.d.-a) Data Protection &amp; Privacy. Strategic Business &amp; Professional Development. Unpublished lecture slides. CCT College Dublin. Available via Moodle.</w:t>
       </w:r>
     </w:p>
     <w:p>
@@ -6125,18 +6494,6 @@
         <w:pStyle w:val="NormalWeb"/>
         <w:ind w:left="720" w:hanging="720"/>
       </w:pPr>
-      <w:r>
-        <w:t xml:space="preserve">Ahmed, T. (n.d.-b) </w:t>
-      </w:r>
-      <w:r>
-        <w:rPr>
-          <w:rStyle w:val="Emphasis"/>
-        </w:rPr>
-        <w:t>IT Governance</w:t>
-      </w:r>
-      <w:r>
-        <w:t>. Strategic Business &amp; Professional Development. Unpublished lecture slides. CCT College Dublin. Available via Moodle.</w:t>
-      </w:r>
     </w:p>
     <w:p>
       <w:pPr>
@@ -6144,16 +6501,7 @@
         <w:ind w:left="720" w:hanging="720"/>
       </w:pPr>
       <w:r>
-        <w:t xml:space="preserve">Ahmed, T. (n.d.-c) </w:t>
-      </w:r>
-      <w:r>
-        <w:rPr>
-          <w:rStyle w:val="Emphasis"/>
-        </w:rPr>
-        <w:t>Machine Learning: When Should I Use Which Method?</w:t>
-      </w:r>
-      <w:r>
-        <w:t xml:space="preserve"> Student handbook. CCT College Dublin. Available via Moodle.</w:t>
+        <w:t>Ahmed, T. (n.d.-b) IT Governance. Strategic Business &amp; Professional Development. Unpublished lecture slides. CCT College Dublin. Available via Moodle.</w:t>
       </w:r>
     </w:p>
     <w:p>
@@ -6161,18 +6509,6 @@
         <w:pStyle w:val="NormalWeb"/>
         <w:ind w:left="720" w:hanging="720"/>
       </w:pPr>
-      <w:r>
-        <w:t xml:space="preserve">Ahmed, T. (n.d.-d) </w:t>
-      </w:r>
-      <w:r>
-        <w:rPr>
-          <w:rStyle w:val="Emphasis"/>
-        </w:rPr>
-        <w:t>Strategic Business &amp; Professional Development: Understanding Goals, Strategy, Objectives &amp; Tactics with Real-Time Examples</w:t>
-      </w:r>
-      <w:r>
-        <w:t>. Unpublished lecture slides. CCT College Dublin. Available via Moodle.</w:t>
-      </w:r>
     </w:p>
     <w:p>
       <w:pPr>
@@ -6180,16 +6516,7 @@
         <w:ind w:left="720" w:hanging="720"/>
       </w:pPr>
       <w:r>
-        <w:t xml:space="preserve">Ahmed, T. (n.d.-e) </w:t>
-      </w:r>
-      <w:r>
-        <w:rPr>
-          <w:rStyle w:val="Emphasis"/>
-        </w:rPr>
-        <w:t>Strategic Thinking: Week 1 – Introduction to Strategic Thinking</w:t>
-      </w:r>
-      <w:r>
-        <w:t>. Student handbook. CCT College Dublin. Available via Moodle.</w:t>
+        <w:t>Ahmed, T. (n.d.-c) Machine Learning: When Should I Use Which Method? Student handbook. CCT College Dublin. Available via Moodle.</w:t>
       </w:r>
     </w:p>
     <w:p>
@@ -6197,26 +6524,6 @@
         <w:pStyle w:val="NormalWeb"/>
         <w:ind w:left="720" w:hanging="720"/>
       </w:pPr>
-      <w:r>
-        <w:t xml:space="preserve">European Union (2016) 'Regulation (EU) 2016/679 of the European Parliament and of the Council of 27 April 2016 (General Data Protection Regulation)', </w:t>
-      </w:r>
-      <w:r>
-        <w:rPr>
-          <w:rStyle w:val="Emphasis"/>
-        </w:rPr>
-        <w:t>Official Journal of the European Union</w:t>
-      </w:r>
-      <w:r>
-        <w:t xml:space="preserve">, L119, pp. 1–88. Available at: </w:t>
-      </w:r>
-      <w:hyperlink r:id="rId11" w:history="1">
-        <w:r>
-          <w:rPr>
-            <w:rStyle w:val="Hyperlink"/>
-          </w:rPr>
-          <w:t>https://eur-lex.europa.eu/eli/reg/2016/679/oj</w:t>
-        </w:r>
-      </w:hyperlink>
     </w:p>
     <w:p>
       <w:pPr>
@@ -6224,67 +6531,14 @@
         <w:ind w:left="720" w:hanging="720"/>
       </w:pPr>
       <w:r>
-        <w:t xml:space="preserve">Moe, W.W. and Fader, P.S. (2004) 'Dynamic conversion </w:t>
-      </w:r>
-      <w:proofErr w:type="spellStart"/>
-      <w:r>
-        <w:t>behavior</w:t>
-      </w:r>
-      <w:proofErr w:type="spellEnd"/>
-      <w:r>
-        <w:t xml:space="preserve"> at e-commerce sites', </w:t>
-      </w:r>
-      <w:r>
-        <w:rPr>
-          <w:rStyle w:val="Emphasis"/>
-        </w:rPr>
-        <w:t>Management Science</w:t>
-      </w:r>
-      <w:r>
-        <w:t xml:space="preserve">, 50(3), pp. 326–335. Available at: </w:t>
-      </w:r>
-      <w:hyperlink r:id="rId12" w:history="1">
-        <w:r>
-          <w:rPr>
-            <w:rStyle w:val="Hyperlink"/>
-          </w:rPr>
-          <w:t>https://doi.org/10.1287/mnsc.1040.0153</w:t>
-        </w:r>
-      </w:hyperlink>
+        <w:t>Ahmed, T. (n.d.-d) Strategic Business &amp; Professional Development: Understanding Goals, Strategy, Objectives &amp; Tactics with Real-Time Examples. Unpublished lecture slides. CCT College Dublin. Available via Moodle.</w:t>
+      </w:r>
     </w:p>
     <w:p>
       <w:pPr>
         <w:pStyle w:val="NormalWeb"/>
         <w:ind w:left="720" w:hanging="720"/>
       </w:pPr>
-      <w:r>
-        <w:t>Montgomery, A.L., Li, S., Srinivasan, K. and Liechty, J.C. (2004) '</w:t>
-      </w:r>
-      <w:proofErr w:type="spellStart"/>
-      <w:r>
-        <w:t>Modeling</w:t>
-      </w:r>
-      <w:proofErr w:type="spellEnd"/>
-      <w:r>
-        <w:t xml:space="preserve"> online browsing and path analysis using clickstream data', </w:t>
-      </w:r>
-      <w:r>
-        <w:rPr>
-          <w:rStyle w:val="Emphasis"/>
-        </w:rPr>
-        <w:t>Marketing Science</w:t>
-      </w:r>
-      <w:r>
-        <w:t xml:space="preserve">, 23(4), pp. 579–595. Available at: </w:t>
-      </w:r>
-      <w:hyperlink r:id="rId13" w:history="1">
-        <w:r>
-          <w:rPr>
-            <w:rStyle w:val="Hyperlink"/>
-          </w:rPr>
-          <w:t>https://doi.org/10.1287/mksc.1040.0073</w:t>
-        </w:r>
-      </w:hyperlink>
     </w:p>
     <w:p>
       <w:pPr>
@@ -6292,35 +6546,7 @@
         <w:ind w:left="720" w:hanging="720"/>
       </w:pPr>
       <w:r>
-        <w:t xml:space="preserve">Sakar, C. and </w:t>
-      </w:r>
-      <w:proofErr w:type="spellStart"/>
-      <w:r>
-        <w:t>Kastro</w:t>
-      </w:r>
-      <w:proofErr w:type="spellEnd"/>
-      <w:r>
-        <w:t xml:space="preserve">, Y. (2018) </w:t>
-      </w:r>
-      <w:r>
-        <w:rPr>
-          <w:rStyle w:val="Emphasis"/>
-        </w:rPr>
-        <w:t>Online Shoppers Purchasing Intention Dataset</w:t>
-      </w:r>
-      <w:r>
-        <w:t xml:space="preserve"> [Dataset]. UCI Machine Learning Repository. Available at: </w:t>
-      </w:r>
-      <w:hyperlink r:id="rId14" w:history="1">
-        <w:r>
-          <w:rPr>
-            <w:rStyle w:val="Hyperlink"/>
-          </w:rPr>
-          <w:t>https://doi.org/10.24432/C5F88Q</w:t>
-        </w:r>
-      </w:hyperlink>
-      <w:r>
-        <w:t xml:space="preserve"> (Accessed: 20 October 2026).</w:t>
+        <w:t>Ahmed, T. (n.d.-e) Strategic Thinking: Week 1 – Introduction to Strategic Thinking. Student handbook. CCT College Dublin. Available via Moodle.</w:t>
       </w:r>
     </w:p>
     <w:p>
@@ -6328,42 +6554,6 @@
         <w:pStyle w:val="NormalWeb"/>
         <w:ind w:left="720" w:hanging="720"/>
       </w:pPr>
-      <w:r>
-        <w:t xml:space="preserve">Sakar, C.O., Polat, S.O., </w:t>
-      </w:r>
-      <w:proofErr w:type="spellStart"/>
-      <w:r>
-        <w:t>Katircioglu</w:t>
-      </w:r>
-      <w:proofErr w:type="spellEnd"/>
-      <w:r>
-        <w:t xml:space="preserve">, M. and </w:t>
-      </w:r>
-      <w:proofErr w:type="spellStart"/>
-      <w:r>
-        <w:t>Kastro</w:t>
-      </w:r>
-      <w:proofErr w:type="spellEnd"/>
-      <w:r>
-        <w:t xml:space="preserve">, Y. (2019) 'Real-time prediction of online shoppers’ purchasing intention using multilayer perceptron and LSTM recurrent neural networks', </w:t>
-      </w:r>
-      <w:r>
-        <w:rPr>
-          <w:rStyle w:val="Emphasis"/>
-        </w:rPr>
-        <w:t>Neural Computing and Applications</w:t>
-      </w:r>
-      <w:r>
-        <w:t xml:space="preserve">, 31, pp. 6893–6908. Available at: </w:t>
-      </w:r>
-      <w:hyperlink r:id="rId15" w:history="1">
-        <w:r>
-          <w:rPr>
-            <w:rStyle w:val="Hyperlink"/>
-          </w:rPr>
-          <w:t>https://doi.org/10.1007/s00521-018-3523-0</w:t>
-        </w:r>
-      </w:hyperlink>
     </w:p>
     <w:p>
       <w:pPr>
@@ -6371,37 +6561,15 @@
         <w:ind w:left="720" w:hanging="720"/>
       </w:pPr>
       <w:r>
-        <w:t xml:space="preserve">Tavares, A. (2024) 'The complete guide to predicting customer </w:t>
+        <w:t xml:space="preserve">Chapman, P., Clinton, J., Kerber, R., </w:t>
       </w:r>
       <w:proofErr w:type="spellStart"/>
       <w:r>
-        <w:t>behavior</w:t>
+        <w:t>Khabaza</w:t>
       </w:r>
       <w:proofErr w:type="spellEnd"/>
       <w:r>
-        <w:t xml:space="preserve"> by leveraging data', </w:t>
-      </w:r>
-      <w:proofErr w:type="spellStart"/>
-      <w:r>
-        <w:rPr>
-          <w:rStyle w:val="Emphasis"/>
-        </w:rPr>
-        <w:t>Noibu</w:t>
-      </w:r>
-      <w:proofErr w:type="spellEnd"/>
-      <w:r>
-        <w:t xml:space="preserve">. Available at: </w:t>
-      </w:r>
-      <w:hyperlink r:id="rId16" w:history="1">
-        <w:r>
-          <w:rPr>
-            <w:rStyle w:val="Hyperlink"/>
-          </w:rPr>
-          <w:t>https://www.noibu.com/blog/the-complete-guide-to-predicting-customer-behavior-by-leveraging-data</w:t>
-        </w:r>
-      </w:hyperlink>
-      <w:r>
-        <w:t xml:space="preserve"> (Accessed: 20 October 2026).</w:t>
+        <w:t>, T., Reinartz, T., Shearer, C. and Wirth, R. (2000) CRISP-DM 1.0: Step-by-step data mining guide. CRISP-DM Consortium. Available at: https://www.the-modeling-agency.com/crisp-dm.pdf (Accessed: 20 October 2026).</w:t>
       </w:r>
     </w:p>
     <w:p>
@@ -6415,6 +6583,9 @@
         <w:pStyle w:val="NormalWeb"/>
         <w:ind w:left="720" w:hanging="720"/>
       </w:pPr>
+      <w:r>
+        <w:t>European Union (2016) 'Regulation (EU) 2016/679 of the European Parliament and of the Council of 27 April 2016 (General Data Protection Regulation)', Official Journal of the European Union, L119, pp. 1–88. Available at: https://eur-lex.europa.eu/eli/reg/2016/679/oj</w:t>
+      </w:r>
     </w:p>
     <w:p>
       <w:pPr>
@@ -6424,18 +6595,379 @@
     </w:p>
     <w:p>
       <w:pPr>
+        <w:pStyle w:val="NormalWeb"/>
+        <w:ind w:left="720" w:hanging="720"/>
+      </w:pPr>
+      <w:r>
+        <w:t xml:space="preserve">Moe, W.W. and Fader, P.S. (2004) 'Dynamic conversion </w:t>
+      </w:r>
+      <w:proofErr w:type="spellStart"/>
+      <w:r>
+        <w:t>behavior</w:t>
+      </w:r>
+      <w:proofErr w:type="spellEnd"/>
+      <w:r>
+        <w:t xml:space="preserve"> at e-commerce sites', Management Science, 50(3), pp. 326–335. Available at: https://doi.org/10.1287/mnsc.1040.0153</w:t>
+      </w:r>
+    </w:p>
+    <w:p>
+      <w:pPr>
+        <w:pStyle w:val="NormalWeb"/>
+        <w:ind w:left="720" w:hanging="720"/>
+      </w:pPr>
+    </w:p>
+    <w:p>
+      <w:pPr>
+        <w:pStyle w:val="NormalWeb"/>
+        <w:ind w:left="720" w:hanging="720"/>
+      </w:pPr>
+      <w:r>
+        <w:lastRenderedPageBreak/>
+        <w:t>Montgomery, A.L., Li, S., Srinivasan, K. and Liechty, J.C. (2004) '</w:t>
+      </w:r>
+      <w:proofErr w:type="spellStart"/>
+      <w:r>
+        <w:t>Modeling</w:t>
+      </w:r>
+      <w:proofErr w:type="spellEnd"/>
+      <w:r>
+        <w:t xml:space="preserve"> online browsing and path analysis using clickstream data', Marketing Science, 23(4), pp. 579–595. Available at: https://doi.org/10.1287/mksc.1040.0073</w:t>
+      </w:r>
+    </w:p>
+    <w:p>
+      <w:pPr>
+        <w:pStyle w:val="NormalWeb"/>
+        <w:ind w:left="720" w:hanging="720"/>
+      </w:pPr>
+    </w:p>
+    <w:p>
+      <w:pPr>
+        <w:pStyle w:val="NormalWeb"/>
+        <w:ind w:left="720" w:hanging="720"/>
+      </w:pPr>
+      <w:r>
+        <w:t xml:space="preserve">Sakar, C. and </w:t>
+      </w:r>
+      <w:proofErr w:type="spellStart"/>
+      <w:r>
+        <w:t>Kastro</w:t>
+      </w:r>
+      <w:proofErr w:type="spellEnd"/>
+      <w:r>
+        <w:t>, Y. (2018) Online Shoppers Purchasing Intention Dataset [Dataset]. UCI Machine Learning Repository. Available at: https://doi.org/10.24432/C5F88Q (Accessed: 20 October 2026).</w:t>
+      </w:r>
+    </w:p>
+    <w:p>
+      <w:pPr>
+        <w:pStyle w:val="NormalWeb"/>
+        <w:ind w:left="720" w:hanging="720"/>
+      </w:pPr>
+    </w:p>
+    <w:p>
+      <w:pPr>
+        <w:pStyle w:val="NormalWeb"/>
+        <w:ind w:left="720" w:hanging="720"/>
+      </w:pPr>
+      <w:r>
+        <w:t xml:space="preserve">Sakar, C.O., Polat, S.O., </w:t>
+      </w:r>
+      <w:proofErr w:type="spellStart"/>
+      <w:r>
+        <w:t>Katircioglu</w:t>
+      </w:r>
+      <w:proofErr w:type="spellEnd"/>
+      <w:r>
+        <w:t xml:space="preserve">, M. and </w:t>
+      </w:r>
+      <w:proofErr w:type="spellStart"/>
+      <w:r>
+        <w:t>Kastro</w:t>
+      </w:r>
+      <w:proofErr w:type="spellEnd"/>
+      <w:r>
+        <w:t>, Y. (2019) 'Real-time prediction of online shoppers’ purchasing intention using multilayer perceptron and LSTM recurrent neural networks', Neural Computing and Applications, 31, pp. 6893–6908. Available at: https://doi.org/10.1007/s00521-018-3523-0</w:t>
+      </w:r>
+    </w:p>
+    <w:p>
+      <w:pPr>
+        <w:pStyle w:val="NormalWeb"/>
+        <w:ind w:left="720" w:hanging="720"/>
+      </w:pPr>
+    </w:p>
+    <w:p>
+      <w:pPr>
+        <w:pStyle w:val="NormalWeb"/>
+        <w:ind w:left="720" w:hanging="720"/>
+      </w:pPr>
+      <w:r>
+        <w:t xml:space="preserve">Tavares, A. (2024) 'The complete guide to predicting customer </w:t>
+      </w:r>
+      <w:proofErr w:type="spellStart"/>
+      <w:r>
+        <w:t>behavior</w:t>
+      </w:r>
+      <w:proofErr w:type="spellEnd"/>
+      <w:r>
+        <w:t xml:space="preserve"> by leveraging data', </w:t>
+      </w:r>
+      <w:proofErr w:type="spellStart"/>
+      <w:r>
+        <w:t>Noibu</w:t>
+      </w:r>
+      <w:proofErr w:type="spellEnd"/>
+      <w:r>
+        <w:t>. Available at: https://www.noibu.com/blog/the-complete-guide-to-predicting-customer-behavior-by-leveraging-data (Accessed: 20 October 2026).</w:t>
+      </w:r>
+    </w:p>
+    <w:p>
+      <w:pPr>
+        <w:pStyle w:val="NormalWeb"/>
+        <w:ind w:left="720" w:hanging="720"/>
+      </w:pPr>
+    </w:p>
+    <w:p>
+      <w:pPr>
+        <w:pStyle w:val="NormalWeb"/>
+        <w:ind w:left="720" w:hanging="720"/>
+      </w:pPr>
+    </w:p>
+    <w:p>
+      <w:pPr>
+        <w:suppressAutoHyphens w:val="0"/>
+        <w:autoSpaceDN/>
+        <w:spacing w:line="259" w:lineRule="auto"/>
+        <w:jc w:val="left"/>
+        <w:rPr>
+          <w:rFonts w:eastAsia="Times New Roman" w:cstheme="majorBidi"/>
+          <w:b/>
+          <w:color w:val="2F5496" w:themeColor="accent1" w:themeShade="BF"/>
+          <w:sz w:val="28"/>
+          <w:szCs w:val="40"/>
+          <w:highlight w:val="lightGray"/>
+        </w:rPr>
+      </w:pPr>
+      <w:r>
+        <w:rPr>
+          <w:highlight w:val="lightGray"/>
+        </w:rPr>
+        <w:br w:type="page"/>
+      </w:r>
+    </w:p>
+    <w:p>
+      <w:pPr>
         <w:pStyle w:val="Heading1"/>
       </w:pPr>
+      <w:bookmarkStart w:id="97" w:name="_Toc243433232"/>
+      <w:bookmarkStart w:id="98" w:name="_Toc243479184"/>
       <w:r>
         <w:lastRenderedPageBreak/>
-        <w:t xml:space="preserve">Anexo </w:t>
-      </w:r>
-    </w:p>
-    <w:p>
-      <w:pPr>
-        <w:pStyle w:val="NormalWeb"/>
-      </w:pPr>
-    </w:p>
+        <w:t>Appendix</w:t>
+      </w:r>
+      <w:r>
+        <w:t xml:space="preserve"> </w:t>
+      </w:r>
+      <w:r>
+        <w:t xml:space="preserve">A </w:t>
+      </w:r>
+      <w:r>
+        <w:t xml:space="preserve">- </w:t>
+      </w:r>
+      <w:r>
+        <w:t>AI Use Declaration and Prompt Log</w:t>
+      </w:r>
+      <w:bookmarkEnd w:id="97"/>
+      <w:bookmarkEnd w:id="98"/>
+    </w:p>
+    <w:p>
+      <w:r>
+        <w:rPr>
+          <w:b/>
+          <w:bCs/>
+        </w:rPr>
+        <w:t>AI Tool Used:</w:t>
+      </w:r>
+      <w:r>
+        <w:t xml:space="preserve"> ChatGPT (OpenAI)</w:t>
+      </w:r>
+    </w:p>
+    <w:p>
+      <w:r>
+        <w:rPr>
+          <w:b/>
+          <w:bCs/>
+        </w:rPr>
+        <w:t>Purpose of AI Use:</w:t>
+      </w:r>
+      <w:r>
+        <w:t xml:space="preserve"> ChatGPT was used to support brainstorming, dataset research and referencing during the development of the Capstone Project Proposal.</w:t>
+      </w:r>
+    </w:p>
+    <w:p>
+      <w:pPr>
+        <w:numPr>
+          <w:ilvl w:val="0"/>
+          <w:numId w:val="26"/>
+        </w:numPr>
+        <w:rPr>
+          <w:b/>
+          <w:bCs/>
+        </w:rPr>
+      </w:pPr>
+      <w:r>
+        <w:rPr>
+          <w:b/>
+          <w:bCs/>
+        </w:rPr>
+        <w:t>Prompt 1 – Brainstorming</w:t>
+      </w:r>
+    </w:p>
+    <w:p>
+      <w:r>
+        <w:rPr>
+          <w:b/>
+          <w:bCs/>
+        </w:rPr>
+        <w:t>Prompt:</w:t>
+      </w:r>
+      <w:r>
+        <w:br/>
+        <w:t xml:space="preserve">Brainstorm ideas for </w:t>
+      </w:r>
+      <w:r>
+        <w:t xml:space="preserve">a </w:t>
+      </w:r>
+      <w:r>
+        <w:t>capstone project, focusing on real business problems.</w:t>
+      </w:r>
+    </w:p>
+    <w:p>
+      <w:r>
+        <w:rPr>
+          <w:b/>
+          <w:bCs/>
+        </w:rPr>
+        <w:t>Purpose:</w:t>
+      </w:r>
+      <w:r>
+        <w:br/>
+        <w:t>To explore project ideas and identify a suitable real-world business problem that could be addressed using data analytics and machine learning.</w:t>
+      </w:r>
+    </w:p>
+    <w:p>
+      <w:pPr>
+        <w:numPr>
+          <w:ilvl w:val="0"/>
+          <w:numId w:val="26"/>
+        </w:numPr>
+        <w:rPr>
+          <w:b/>
+          <w:bCs/>
+        </w:rPr>
+      </w:pPr>
+      <w:r>
+        <w:rPr>
+          <w:b/>
+          <w:bCs/>
+        </w:rPr>
+        <w:t>Prompt 2 – Dataset Research</w:t>
+      </w:r>
+    </w:p>
+    <w:p>
+      <w:r>
+        <w:rPr>
+          <w:b/>
+          <w:bCs/>
+        </w:rPr>
+        <w:t>Prompt:</w:t>
+      </w:r>
+      <w:r>
+        <w:br/>
+        <w:t>Help find and compare suitable datasets for my capstone project on online purchasing behaviour.</w:t>
+      </w:r>
+    </w:p>
+    <w:p>
+      <w:r>
+        <w:rPr>
+          <w:b/>
+          <w:bCs/>
+        </w:rPr>
+        <w:t>Purpose:</w:t>
+      </w:r>
+      <w:r>
+        <w:br/>
+        <w:t>To explore and compare publicly available datasets, including government and other free data sources, and identify a suitable dataset for the project.</w:t>
+      </w:r>
+    </w:p>
+    <w:p>
+      <w:pPr>
+        <w:numPr>
+          <w:ilvl w:val="0"/>
+          <w:numId w:val="26"/>
+        </w:numPr>
+        <w:rPr>
+          <w:b/>
+          <w:bCs/>
+        </w:rPr>
+      </w:pPr>
+      <w:r>
+        <w:rPr>
+          <w:b/>
+          <w:bCs/>
+        </w:rPr>
+        <w:t>Prompt 3 – Referencing Support</w:t>
+      </w:r>
+    </w:p>
+    <w:p>
+      <w:r>
+        <w:rPr>
+          <w:b/>
+          <w:bCs/>
+        </w:rPr>
+        <w:t>Prompt:</w:t>
+      </w:r>
+      <w:r>
+        <w:br/>
+        <w:t>Check Harvard references and arrange them in alphabetical order.</w:t>
+      </w:r>
+    </w:p>
+    <w:p>
+      <w:r>
+        <w:rPr>
+          <w:b/>
+          <w:bCs/>
+        </w:rPr>
+        <w:t>Purpose:</w:t>
+      </w:r>
+      <w:r>
+        <w:br/>
+        <w:t>To review the reference list, improve consistency with Harvard referencing guidelines and ensure references are presented in alphabetical order.</w:t>
+      </w:r>
+    </w:p>
+    <w:p>
+      <w:pPr>
+        <w:numPr>
+          <w:ilvl w:val="0"/>
+          <w:numId w:val="26"/>
+        </w:numPr>
+        <w:rPr>
+          <w:b/>
+          <w:bCs/>
+        </w:rPr>
+      </w:pPr>
+      <w:r>
+        <w:rPr>
+          <w:b/>
+          <w:bCs/>
+        </w:rPr>
+        <w:t>AI Use Declaration</w:t>
+      </w:r>
+    </w:p>
+    <w:p>
+      <w:r>
+        <w:t>ChatGPT was used as a supporting tool for brainstorming, dataset exploration and referencing. The final selection of the project topic, dataset and methodology, as well as the submitted work, remains my responsibility.</w:t>
+      </w:r>
+    </w:p>
+    <w:p/>
     <w:p>
       <w:pPr>
         <w:pStyle w:val="NormalWeb"/>
@@ -6443,9 +6975,9 @@
     </w:p>
     <w:p/>
     <w:sectPr>
-      <w:headerReference w:type="default" r:id="rId17"/>
-      <w:footerReference w:type="default" r:id="rId18"/>
-      <w:headerReference w:type="first" r:id="rId19"/>
+      <w:headerReference w:type="default" r:id="rId11"/>
+      <w:footerReference w:type="default" r:id="rId12"/>
+      <w:headerReference w:type="first" r:id="rId13"/>
       <w:pgSz w:w="11906" w:h="16838"/>
       <w:pgMar w:top="1440" w:right="1440" w:bottom="1440" w:left="1440" w:header="708" w:footer="708" w:gutter="0"/>
       <w:pgNumType w:start="0"/>
@@ -10135,6 +10667,7 @@
   <w:style w:type="character" w:default="1" w:styleId="DefaultParagraphFont">
     <w:name w:val="Default Paragraph Font"/>
     <w:uiPriority w:val="1"/>
+    <w:semiHidden/>
     <w:unhideWhenUsed/>
   </w:style>
   <w:style w:type="table" w:default="1" w:styleId="TableNormal">

</xml_diff>